<commit_message>
Ocena Funkcjonalna: czcionka treści min. 12 pt, druk ciągły z numeracją w marginesie
HTML/PDF: skalowanie rozmiarów (treść 16 px), sekcje jako rozdziały
z break-before, stopka i numer strony przez @page margin boxes.
Word: rozmiary 24 half-points dla treści, węższe marginesy.
PDF 33 stron, Word 43 stron, opinia 7 stron.

Co-Authored-By: Claude Fable 5.1 <noreply@anthropic.com>
Claude-Session: https://claude.ai/code/session_01FpF7vCSW7jSofte5z6wEKy
</commit_message>
<xml_diff>
--- a/eduplaner2026/raport_oceny_funkcjonalnej/Opinia_dla_poradni.docx
+++ b/eduplaner2026/raport_oceny_funkcjonalnej/Opinia_dla_poradni.docx
@@ -4,7 +4,7 @@
   <w:body>
     <w:tbl>
       <w:tblPr>
-        <w:tblW w:type="dxa" w:w="9906"/>
+        <w:tblW w:type="dxa" w:w="10206"/>
         <w:tblBorders>
           <w:top w:val="single" w:color="auto" w:sz="4"/>
           <w:left w:val="single" w:color="auto" w:sz="4"/>
@@ -15,8 +15,8 @@
         </w:tblBorders>
       </w:tblPr>
       <w:tblGrid>
-        <w:gridCol w:w="4953"/>
-        <w:gridCol w:w="4953"/>
+        <w:gridCol w:w="5103"/>
+        <w:gridCol w:w="5103"/>
       </w:tblGrid>
       <w:tr>
         <w:trPr>
@@ -24,12 +24,12 @@
         </w:trPr>
         <w:tc>
           <w:tcPr>
-            <w:tcW w:type="dxa" w:w="4953"/>
-            <w:tcBorders>
-              <w:top w:val="dashed" w:color="D9D0F0" w:sz="4"/>
-              <w:left w:val="dashed" w:color="D9D0F0" w:sz="4"/>
-              <w:bottom w:val="dashed" w:color="D9D0F0" w:sz="4"/>
-              <w:right w:val="dashed" w:color="D9D0F0" w:sz="4"/>
+            <w:tcW w:type="dxa" w:w="5103"/>
+            <w:tcBorders>
+              <w:top w:val="dashed" w:color="D9D0F0" w:sz="18"/>
+              <w:left w:val="dashed" w:color="D9D0F0" w:sz="18"/>
+              <w:bottom w:val="dashed" w:color="D9D0F0" w:sz="18"/>
+              <w:right w:val="dashed" w:color="D9D0F0" w:sz="18"/>
             </w:tcBorders>
             <w:tcMar>
               <w:top w:type="dxa" w:w="120"/>
@@ -53,8 +53,8 @@
                 <w:iCs w:val="false"/>
                 <w:caps w:val="false"/>
                 <w:color w:val="2D1B69"/>
-                <w:sz w:val="17"/>
-                <w:szCs w:val="17"/>
+                <w:sz w:val="24"/>
+                <w:szCs w:val="24"/>
               </w:rPr>
               <w:t xml:space="preserve">[Nazwa przedszkola / szkoły]</w:t>
             </w:r>
@@ -73,8 +73,8 @@
                 <w:iCs w:val="false"/>
                 <w:caps w:val="false"/>
                 <w:color w:val="6B6378"/>
-                <w:sz w:val="13"/>
-                <w:szCs w:val="13"/>
+                <w:sz w:val="18"/>
+                <w:szCs w:val="18"/>
               </w:rPr>
               <w:t xml:space="preserve">[Adres placówki, tel., e-mail]</w:t>
             </w:r>
@@ -93,8 +93,8 @@
                 <w:iCs w:val="false"/>
                 <w:caps w:val="false"/>
                 <w:color w:val="6B6378"/>
-                <w:sz w:val="11"/>
-                <w:szCs w:val="11"/>
+                <w:sz w:val="18"/>
+                <w:szCs w:val="18"/>
               </w:rPr>
               <w:t xml:space="preserve">(pieczęć placówki)</w:t>
             </w:r>
@@ -102,7 +102,7 @@
         </w:tc>
         <w:tc>
           <w:tcPr>
-            <w:tcW w:type="dxa" w:w="4953"/>
+            <w:tcW w:type="dxa" w:w="5103"/>
             <w:tcBorders>
               <w:top w:val="nil"/>
               <w:left w:val="nil"/>
@@ -131,8 +131,8 @@
                 <w:iCs w:val="false"/>
                 <w:caps w:val="false"/>
                 <w:color w:val="6B6378"/>
-                <w:sz w:val="14"/>
-                <w:szCs w:val="14"/>
+                <w:sz w:val="18"/>
+                <w:szCs w:val="18"/>
               </w:rPr>
               <w:t xml:space="preserve">[Miejscowość], dnia ………………………</w:t>
             </w:r>
@@ -151,8 +151,8 @@
                 <w:iCs w:val="false"/>
                 <w:caps w:val="false"/>
                 <w:color w:val="6B6378"/>
-                <w:sz w:val="14"/>
-                <w:szCs w:val="14"/>
+                <w:sz w:val="18"/>
+                <w:szCs w:val="18"/>
               </w:rPr>
               <w:t xml:space="preserve">Znak sprawy: ………………………</w:t>
             </w:r>
@@ -171,8 +171,8 @@
                 <w:iCs w:val="false"/>
                 <w:caps w:val="false"/>
                 <w:color w:val="6B6378"/>
-                <w:sz w:val="14"/>
-                <w:szCs w:val="14"/>
+                <w:sz w:val="18"/>
+                <w:szCs w:val="18"/>
               </w:rPr>
               <w:t xml:space="preserve">Zespół orzekający: [Nazwa Poradni Psychologiczno-Pedagogicznej]</w:t>
             </w:r>
@@ -220,15 +220,15 @@
           <w:caps w:val="false"/>
           <w:color w:val="E74509"/>
           <w:spacing w:val="30"/>
-          <w:sz w:val="13"/>
-          <w:szCs w:val="13"/>
+          <w:sz w:val="18"/>
+          <w:szCs w:val="18"/>
         </w:rPr>
         <w:t xml:space="preserve">W PRZEDSZKOLU / SZKOLE – DLA ZESPOŁU ORZEKAJĄCEGO PORADNI PSYCHOLOGICZNO-PEDAGOGICZNEJ</w:t>
       </w:r>
     </w:p>
     <w:tbl>
       <w:tblPr>
-        <w:tblW w:type="dxa" w:w="9906"/>
+        <w:tblW w:type="dxa" w:w="10206"/>
         <w:tblBorders>
           <w:top w:val="single" w:color="auto" w:sz="4"/>
           <w:left w:val="single" w:color="auto" w:sz="4"/>
@@ -239,7 +239,7 @@
         </w:tblBorders>
       </w:tblPr>
       <w:tblGrid>
-        <w:gridCol w:w="9906"/>
+        <w:gridCol w:w="10206"/>
       </w:tblGrid>
       <w:tr>
         <w:trPr>
@@ -247,7 +247,7 @@
         </w:trPr>
         <w:tc>
           <w:tcPr>
-            <w:tcW w:type="dxa" w:w="9906"/>
+            <w:tcW w:type="dxa" w:w="10206"/>
             <w:tcBorders>
               <w:top w:val="single" w:color="D9D0F0" w:sz="4"/>
               <w:left w:val="single" w:color="D9D0F0" w:sz="4"/>
@@ -276,8 +276,8 @@
                 <w:iCs w:val="false"/>
                 <w:caps w:val="false"/>
                 <w:color w:val="2D1B69"/>
-                <w:sz w:val="13"/>
-                <w:szCs w:val="13"/>
+                <w:sz w:val="18"/>
+                <w:szCs w:val="18"/>
               </w:rPr>
               <w:t xml:space="preserve">Podstawa prawna: </w:t>
             </w:r>
@@ -290,8 +290,8 @@
                 <w:iCs w:val="false"/>
                 <w:caps w:val="false"/>
                 <w:color w:val="6B6378"/>
-                <w:sz w:val="13"/>
-                <w:szCs w:val="13"/>
+                <w:sz w:val="18"/>
+                <w:szCs w:val="18"/>
               </w:rPr>
               <w:t xml:space="preserve">§ 7 ust. 2–7 rozporządzenia Ministra Edukacji z dnia 2 marca 2026 r. w sprawie orzeczeń i opinii wydawanych przez zespoły orzekające działające w publicznych poradniach psychologiczno-pedagogicznych (Dz. U. z 2026 r. poz. 428).</w:t>
             </w:r>
@@ -310,8 +310,8 @@
                 <w:iCs w:val="false"/>
                 <w:caps w:val="false"/>
                 <w:color w:val="2D1B69"/>
-                <w:sz w:val="13"/>
-                <w:szCs w:val="13"/>
+                <w:sz w:val="18"/>
+                <w:szCs w:val="18"/>
               </w:rPr>
               <w:t xml:space="preserve">Tryb: </w:t>
             </w:r>
@@ -324,8 +324,8 @@
                 <w:iCs w:val="false"/>
                 <w:caps w:val="false"/>
                 <w:color w:val="6B6378"/>
-                <w:sz w:val="13"/>
-                <w:szCs w:val="13"/>
+                <w:sz w:val="18"/>
+                <w:szCs w:val="18"/>
               </w:rPr>
               <w:t xml:space="preserve">Opinię wydaje dyrektor na prośbę przewodniczącego zespołu orzekającego (§ 7 ust. 2) lub wnioskodawcy (ust. 4), w terminie 10 dni od dnia otrzymania prośby (ust. 3). Opinia uwzględnia wyniki obserwacji funkcjonowania dziecka/ucznia i działań diagnostycznych prowadzonych w placówce (ust. 6). Kopię opinii przekazuje się rodzicom dziecka lub ucznia albo pełnoletniemu uczniowi (ust. 5).</w:t>
             </w:r>
@@ -337,7 +337,7 @@
       <w:pPr>
         <w:keepNext/>
         <w:pBdr>
-          <w:bottom w:val="single" w:color="D9D0F0" w:sz="4" w:space="4"/>
+          <w:bottom w:val="single" w:color="D9D0F0" w:sz="18" w:space="4"/>
         </w:pBdr>
         <w:spacing w:after="100" w:before="180"/>
       </w:pPr>
@@ -350,8 +350,8 @@
           <w:iCs w:val="false"/>
           <w:caps w:val="false"/>
           <w:color w:val="E74509"/>
-          <w:sz w:val="18"/>
-          <w:szCs w:val="18"/>
+          <w:sz w:val="24"/>
+          <w:szCs w:val="24"/>
         </w:rPr>
         <w:t xml:space="preserve">1.  </w:t>
       </w:r>
@@ -365,15 +365,15 @@
           <w:caps w:val="false"/>
           <w:color w:val="2D1B69"/>
           <w:spacing w:val="8"/>
-          <w:sz w:val="17"/>
-          <w:szCs w:val="17"/>
+          <w:sz w:val="24"/>
+          <w:szCs w:val="24"/>
         </w:rPr>
         <w:t xml:space="preserve">DATA WYDANIA OPINII I DANE DZIECKA / UCZNIA (§ 7 UST. 6 PKT 1–2)</w:t>
       </w:r>
     </w:p>
     <w:tbl>
       <w:tblPr>
-        <w:tblW w:type="dxa" w:w="9906"/>
+        <w:tblW w:type="dxa" w:w="10206"/>
         <w:tblBorders>
           <w:top w:val="single" w:color="auto" w:sz="4"/>
           <w:left w:val="single" w:color="auto" w:sz="4"/>
@@ -385,7 +385,7 @@
       </w:tblPr>
       <w:tblGrid>
         <w:gridCol w:w="3000"/>
-        <w:gridCol w:w="6906"/>
+        <w:gridCol w:w="7206"/>
       </w:tblGrid>
       <w:tr>
         <w:trPr>
@@ -411,7 +411,7 @@
           </w:tcPr>
           <w:p>
             <w:pPr>
-              <w:spacing w:after="0" w:before="0" w:line="230"/>
+              <w:spacing w:after="0" w:before="0" w:line="250"/>
               <w:jc w:val="left"/>
             </w:pPr>
             <w:r>
@@ -423,8 +423,8 @@
                 <w:iCs w:val="false"/>
                 <w:caps w:val="false"/>
                 <w:color w:val="2D1B69"/>
-                <w:sz w:val="14"/>
-                <w:szCs w:val="14"/>
+                <w:sz w:val="18"/>
+                <w:szCs w:val="18"/>
               </w:rPr>
               <w:t xml:space="preserve">Data wydania opinii (pkt 1)</w:t>
             </w:r>
@@ -432,7 +432,7 @@
         </w:tc>
         <w:tc>
           <w:tcPr>
-            <w:tcW w:type="dxa" w:w="6906"/>
+            <w:tcW w:type="dxa" w:w="7206"/>
             <w:tcBorders>
               <w:top w:val="single" w:color="E3E1EC" w:sz="4"/>
               <w:left w:val="single" w:color="E3E1EC" w:sz="4"/>
@@ -449,7 +449,7 @@
           </w:tcPr>
           <w:p>
             <w:pPr>
-              <w:spacing w:after="0" w:before="0" w:line="230"/>
+              <w:spacing w:after="0" w:before="0" w:line="250"/>
               <w:jc w:val="left"/>
             </w:pPr>
             <w:r>
@@ -461,8 +461,8 @@
                 <w:iCs w:val="false"/>
                 <w:caps w:val="false"/>
                 <w:color w:val="1A1530"/>
-                <w:sz w:val="14"/>
-                <w:szCs w:val="14"/>
+                <w:sz w:val="18"/>
+                <w:szCs w:val="18"/>
               </w:rPr>
               <w:t xml:space="preserve">[Data wydania]</w:t>
             </w:r>
@@ -493,7 +493,7 @@
           </w:tcPr>
           <w:p>
             <w:pPr>
-              <w:spacing w:after="0" w:before="0" w:line="230"/>
+              <w:spacing w:after="0" w:before="0" w:line="250"/>
               <w:jc w:val="left"/>
             </w:pPr>
             <w:r>
@@ -505,8 +505,8 @@
                 <w:iCs w:val="false"/>
                 <w:caps w:val="false"/>
                 <w:color w:val="2D1B69"/>
-                <w:sz w:val="14"/>
-                <w:szCs w:val="14"/>
+                <w:sz w:val="18"/>
+                <w:szCs w:val="18"/>
               </w:rPr>
               <w:t xml:space="preserve">Imię i nazwisko dziecka / ucznia (pkt 2)</w:t>
             </w:r>
@@ -514,7 +514,7 @@
         </w:tc>
         <w:tc>
           <w:tcPr>
-            <w:tcW w:type="dxa" w:w="6906"/>
+            <w:tcW w:type="dxa" w:w="7206"/>
             <w:tcBorders>
               <w:top w:val="single" w:color="E3E1EC" w:sz="4"/>
               <w:left w:val="single" w:color="E3E1EC" w:sz="4"/>
@@ -531,7 +531,7 @@
           </w:tcPr>
           <w:p>
             <w:pPr>
-              <w:spacing w:after="0" w:before="0" w:line="230"/>
+              <w:spacing w:after="0" w:before="0" w:line="250"/>
               <w:jc w:val="left"/>
             </w:pPr>
             <w:r>
@@ -543,8 +543,8 @@
                 <w:iCs w:val="false"/>
                 <w:caps w:val="false"/>
                 <w:color w:val="1A1530"/>
-                <w:sz w:val="14"/>
-                <w:szCs w:val="14"/>
+                <w:sz w:val="18"/>
+                <w:szCs w:val="18"/>
               </w:rPr>
               <w:t xml:space="preserve">[Imię i Nazwisko]</w:t>
             </w:r>
@@ -575,7 +575,7 @@
           </w:tcPr>
           <w:p>
             <w:pPr>
-              <w:spacing w:after="0" w:before="0" w:line="230"/>
+              <w:spacing w:after="0" w:before="0" w:line="250"/>
               <w:jc w:val="left"/>
             </w:pPr>
             <w:r>
@@ -587,8 +587,8 @@
                 <w:iCs w:val="false"/>
                 <w:caps w:val="false"/>
                 <w:color w:val="2D1B69"/>
-                <w:sz w:val="14"/>
-                <w:szCs w:val="14"/>
+                <w:sz w:val="18"/>
+                <w:szCs w:val="18"/>
               </w:rPr>
               <w:t xml:space="preserve">Data urodzenia · PESEL</w:t>
             </w:r>
@@ -596,7 +596,7 @@
         </w:tc>
         <w:tc>
           <w:tcPr>
-            <w:tcW w:type="dxa" w:w="6906"/>
+            <w:tcW w:type="dxa" w:w="7206"/>
             <w:tcBorders>
               <w:top w:val="single" w:color="E3E1EC" w:sz="4"/>
               <w:left w:val="single" w:color="E3E1EC" w:sz="4"/>
@@ -613,7 +613,7 @@
           </w:tcPr>
           <w:p>
             <w:pPr>
-              <w:spacing w:after="0" w:before="0" w:line="230"/>
+              <w:spacing w:after="0" w:before="0" w:line="250"/>
               <w:jc w:val="left"/>
             </w:pPr>
             <w:r>
@@ -625,8 +625,8 @@
                 <w:iCs w:val="false"/>
                 <w:caps w:val="false"/>
                 <w:color w:val="1A1530"/>
-                <w:sz w:val="14"/>
-                <w:szCs w:val="14"/>
+                <w:sz w:val="18"/>
+                <w:szCs w:val="18"/>
               </w:rPr>
               <w:t xml:space="preserve">[Data urodzenia] · [PESEL]</w:t>
             </w:r>
@@ -657,7 +657,7 @@
           </w:tcPr>
           <w:p>
             <w:pPr>
-              <w:spacing w:after="0" w:before="0" w:line="230"/>
+              <w:spacing w:after="0" w:before="0" w:line="250"/>
               <w:jc w:val="left"/>
             </w:pPr>
             <w:r>
@@ -669,8 +669,8 @@
                 <w:iCs w:val="false"/>
                 <w:caps w:val="false"/>
                 <w:color w:val="2D1B69"/>
-                <w:sz w:val="14"/>
-                <w:szCs w:val="14"/>
+                <w:sz w:val="18"/>
+                <w:szCs w:val="18"/>
               </w:rPr>
               <w:t xml:space="preserve">Przedszkole / szkoła (nazwa, adres) · grupa / oddział</w:t>
             </w:r>
@@ -678,7 +678,7 @@
         </w:tc>
         <w:tc>
           <w:tcPr>
-            <w:tcW w:type="dxa" w:w="6906"/>
+            <w:tcW w:type="dxa" w:w="7206"/>
             <w:tcBorders>
               <w:top w:val="single" w:color="E3E1EC" w:sz="4"/>
               <w:left w:val="single" w:color="E3E1EC" w:sz="4"/>
@@ -695,7 +695,7 @@
           </w:tcPr>
           <w:p>
             <w:pPr>
-              <w:spacing w:after="0" w:before="0" w:line="230"/>
+              <w:spacing w:after="0" w:before="0" w:line="250"/>
               <w:jc w:val="left"/>
             </w:pPr>
             <w:r>
@@ -707,8 +707,8 @@
                 <w:iCs w:val="false"/>
                 <w:caps w:val="false"/>
                 <w:color w:val="1A1530"/>
-                <w:sz w:val="14"/>
-                <w:szCs w:val="14"/>
+                <w:sz w:val="18"/>
+                <w:szCs w:val="18"/>
               </w:rPr>
               <w:t xml:space="preserve">[Nazwa i adres placówki] · [grupa / klasa] · ☐ dziecko do ukończenia wychowania przedszkolnego  ☐ uczeń</w:t>
             </w:r>
@@ -739,7 +739,7 @@
           </w:tcPr>
           <w:p>
             <w:pPr>
-              <w:spacing w:after="0" w:before="0" w:line="230"/>
+              <w:spacing w:after="0" w:before="0" w:line="250"/>
               <w:jc w:val="left"/>
             </w:pPr>
             <w:r>
@@ -751,8 +751,8 @@
                 <w:iCs w:val="false"/>
                 <w:caps w:val="false"/>
                 <w:color w:val="2D1B69"/>
-                <w:sz w:val="14"/>
-                <w:szCs w:val="14"/>
+                <w:sz w:val="18"/>
+                <w:szCs w:val="18"/>
               </w:rPr>
               <w:t xml:space="preserve">Rodzice / opiekunowie prawni (pełnoletni uczeń)</w:t>
             </w:r>
@@ -760,7 +760,7 @@
         </w:tc>
         <w:tc>
           <w:tcPr>
-            <w:tcW w:type="dxa" w:w="6906"/>
+            <w:tcW w:type="dxa" w:w="7206"/>
             <w:tcBorders>
               <w:top w:val="single" w:color="E3E1EC" w:sz="4"/>
               <w:left w:val="single" w:color="E3E1EC" w:sz="4"/>
@@ -777,7 +777,7 @@
           </w:tcPr>
           <w:p>
             <w:pPr>
-              <w:spacing w:after="0" w:before="0" w:line="230"/>
+              <w:spacing w:after="0" w:before="0" w:line="250"/>
               <w:jc w:val="left"/>
             </w:pPr>
             <w:r>
@@ -789,8 +789,8 @@
                 <w:iCs w:val="false"/>
                 <w:caps w:val="false"/>
                 <w:color w:val="1A1530"/>
-                <w:sz w:val="14"/>
-                <w:szCs w:val="14"/>
+                <w:sz w:val="18"/>
+                <w:szCs w:val="18"/>
               </w:rPr>
               <w:t xml:space="preserve">[Imiona i nazwiska, adres do korespondencji]</w:t>
             </w:r>
@@ -821,7 +821,7 @@
           </w:tcPr>
           <w:p>
             <w:pPr>
-              <w:spacing w:after="0" w:before="0" w:line="230"/>
+              <w:spacing w:after="0" w:before="0" w:line="250"/>
               <w:jc w:val="left"/>
             </w:pPr>
             <w:r>
@@ -833,8 +833,8 @@
                 <w:iCs w:val="false"/>
                 <w:caps w:val="false"/>
                 <w:color w:val="2D1B69"/>
-                <w:sz w:val="14"/>
-                <w:szCs w:val="14"/>
+                <w:sz w:val="18"/>
+                <w:szCs w:val="18"/>
               </w:rPr>
               <w:t xml:space="preserve">Prośba o wydanie opinii</w:t>
             </w:r>
@@ -842,7 +842,7 @@
         </w:tc>
         <w:tc>
           <w:tcPr>
-            <w:tcW w:type="dxa" w:w="6906"/>
+            <w:tcW w:type="dxa" w:w="7206"/>
             <w:tcBorders>
               <w:top w:val="single" w:color="E3E1EC" w:sz="4"/>
               <w:left w:val="single" w:color="E3E1EC" w:sz="4"/>
@@ -859,7 +859,7 @@
           </w:tcPr>
           <w:p>
             <w:pPr>
-              <w:spacing w:after="0" w:before="0" w:line="230"/>
+              <w:spacing w:after="0" w:before="0" w:line="250"/>
               <w:jc w:val="left"/>
             </w:pPr>
             <w:r>
@@ -871,8 +871,8 @@
                 <w:iCs w:val="false"/>
                 <w:caps w:val="false"/>
                 <w:color w:val="1A1530"/>
-                <w:sz w:val="14"/>
-                <w:szCs w:val="14"/>
+                <w:sz w:val="18"/>
+                <w:szCs w:val="18"/>
               </w:rPr>
               <w:t xml:space="preserve">☐ przewodniczący zespołu orzekającego (§ 7 ust. 2)  ☐ wnioskodawca (§ 7 ust. 4) · z dnia [Data otrzymania] · znak [Znak sprawy] · termin: 10 dni</w:t>
             </w:r>
@@ -903,7 +903,7 @@
           </w:tcPr>
           <w:p>
             <w:pPr>
-              <w:spacing w:after="0" w:before="0" w:line="230"/>
+              <w:spacing w:after="0" w:before="0" w:line="250"/>
               <w:jc w:val="left"/>
             </w:pPr>
             <w:r>
@@ -915,8 +915,8 @@
                 <w:iCs w:val="false"/>
                 <w:caps w:val="false"/>
                 <w:color w:val="2D1B69"/>
-                <w:sz w:val="14"/>
-                <w:szCs w:val="14"/>
+                <w:sz w:val="18"/>
+                <w:szCs w:val="18"/>
               </w:rPr>
               <w:t xml:space="preserve">Dotychczasowe orzeczenie / opinia poradni</w:t>
             </w:r>
@@ -924,7 +924,7 @@
         </w:tc>
         <w:tc>
           <w:tcPr>
-            <w:tcW w:type="dxa" w:w="6906"/>
+            <w:tcW w:type="dxa" w:w="7206"/>
             <w:tcBorders>
               <w:top w:val="single" w:color="E3E1EC" w:sz="4"/>
               <w:left w:val="single" w:color="E3E1EC" w:sz="4"/>
@@ -941,7 +941,7 @@
           </w:tcPr>
           <w:p>
             <w:pPr>
-              <w:spacing w:after="0" w:before="0" w:line="230"/>
+              <w:spacing w:after="0" w:before="0" w:line="250"/>
               <w:jc w:val="left"/>
             </w:pPr>
             <w:r>
@@ -953,8 +953,8 @@
                 <w:iCs w:val="false"/>
                 <w:caps w:val="false"/>
                 <w:color w:val="1A1530"/>
-                <w:sz w:val="14"/>
-                <w:szCs w:val="14"/>
+                <w:sz w:val="18"/>
+                <w:szCs w:val="18"/>
               </w:rPr>
               <w:t xml:space="preserve">☐ brak  ☐ [Orzeczenie / Opinia] nr [Numer] z dnia [Data], wydane przez [Nazwa Poradni]</w:t>
             </w:r>
@@ -966,7 +966,7 @@
       <w:pPr>
         <w:keepNext/>
         <w:pBdr>
-          <w:bottom w:val="single" w:color="D9D0F0" w:sz="4" w:space="4"/>
+          <w:bottom w:val="single" w:color="D9D0F0" w:sz="18" w:space="4"/>
         </w:pBdr>
         <w:spacing w:after="100" w:before="180"/>
       </w:pPr>
@@ -979,8 +979,8 @@
           <w:iCs w:val="false"/>
           <w:caps w:val="false"/>
           <w:color w:val="E74509"/>
-          <w:sz w:val="18"/>
-          <w:szCs w:val="18"/>
+          <w:sz w:val="24"/>
+          <w:szCs w:val="24"/>
         </w:rPr>
         <w:t xml:space="preserve">2.  </w:t>
       </w:r>
@@ -994,15 +994,15 @@
           <w:caps w:val="false"/>
           <w:color w:val="2D1B69"/>
           <w:spacing w:val="8"/>
-          <w:sz w:val="17"/>
-          <w:szCs w:val="17"/>
+          <w:sz w:val="24"/>
+          <w:szCs w:val="24"/>
         </w:rPr>
         <w:t xml:space="preserve">PODSTAWA OPINII – WYNIKI OBSERWACJI I DZIAŁAŃ DIAGNOSTYCZNYCH PROWADZONYCH W PLACÓWCE (§ 7 UST. 6)</w:t>
       </w:r>
     </w:p>
     <w:tbl>
       <w:tblPr>
-        <w:tblW w:type="dxa" w:w="9906"/>
+        <w:tblW w:type="dxa" w:w="10206"/>
         <w:tblBorders>
           <w:top w:val="single" w:color="auto" w:sz="4"/>
           <w:left w:val="single" w:color="auto" w:sz="4"/>
@@ -1014,7 +1014,7 @@
       </w:tblPr>
       <w:tblGrid>
         <w:gridCol w:w="3000"/>
-        <w:gridCol w:w="6906"/>
+        <w:gridCol w:w="7206"/>
       </w:tblGrid>
       <w:tr>
         <w:trPr>
@@ -1040,7 +1040,7 @@
           </w:tcPr>
           <w:p>
             <w:pPr>
-              <w:spacing w:after="0" w:before="0" w:line="230"/>
+              <w:spacing w:after="0" w:before="0" w:line="250"/>
               <w:jc w:val="left"/>
             </w:pPr>
             <w:r>
@@ -1052,8 +1052,8 @@
                 <w:iCs w:val="false"/>
                 <w:caps w:val="false"/>
                 <w:color w:val="2D1B69"/>
-                <w:sz w:val="14"/>
-                <w:szCs w:val="14"/>
+                <w:sz w:val="18"/>
+                <w:szCs w:val="18"/>
               </w:rPr>
               <w:t xml:space="preserve">Okres obserwacji</w:t>
             </w:r>
@@ -1061,7 +1061,7 @@
         </w:tc>
         <w:tc>
           <w:tcPr>
-            <w:tcW w:type="dxa" w:w="6906"/>
+            <w:tcW w:type="dxa" w:w="7206"/>
             <w:tcBorders>
               <w:top w:val="single" w:color="E3E1EC" w:sz="4"/>
               <w:left w:val="single" w:color="E3E1EC" w:sz="4"/>
@@ -1078,7 +1078,7 @@
           </w:tcPr>
           <w:p>
             <w:pPr>
-              <w:spacing w:after="0" w:before="0" w:line="230"/>
+              <w:spacing w:after="0" w:before="0" w:line="250"/>
               <w:jc w:val="left"/>
             </w:pPr>
             <w:r>
@@ -1090,8 +1090,8 @@
                 <w:iCs w:val="false"/>
                 <w:caps w:val="false"/>
                 <w:color w:val="1A1530"/>
-                <w:sz w:val="14"/>
-                <w:szCs w:val="14"/>
+                <w:sz w:val="18"/>
+                <w:szCs w:val="18"/>
               </w:rPr>
               <w:t xml:space="preserve">wrzesień [rok] – [miesiąc rok]; obserwacja wstępna i pogłębiona w naturalnych sytuacjach (zajęcia kierowane, zabawa swobodna, posiłki, przejścia, wydarzenia grupowe)</w:t>
             </w:r>
@@ -1122,7 +1122,7 @@
           </w:tcPr>
           <w:p>
             <w:pPr>
-              <w:spacing w:after="0" w:before="0" w:line="230"/>
+              <w:spacing w:after="0" w:before="0" w:line="250"/>
               <w:jc w:val="left"/>
             </w:pPr>
             <w:r>
@@ -1134,8 +1134,8 @@
                 <w:iCs w:val="false"/>
                 <w:caps w:val="false"/>
                 <w:color w:val="2D1B69"/>
-                <w:sz w:val="14"/>
-                <w:szCs w:val="14"/>
+                <w:sz w:val="18"/>
+                <w:szCs w:val="18"/>
               </w:rPr>
               <w:t xml:space="preserve">Narzędzia i działania diagnostyczne</w:t>
             </w:r>
@@ -1143,7 +1143,7 @@
         </w:tc>
         <w:tc>
           <w:tcPr>
-            <w:tcW w:type="dxa" w:w="6906"/>
+            <w:tcW w:type="dxa" w:w="7206"/>
             <w:tcBorders>
               <w:top w:val="single" w:color="E3E1EC" w:sz="4"/>
               <w:left w:val="single" w:color="E3E1EC" w:sz="4"/>
@@ -1160,7 +1160,7 @@
           </w:tcPr>
           <w:p>
             <w:pPr>
-              <w:spacing w:after="0" w:before="0" w:line="230"/>
+              <w:spacing w:after="0" w:before="0" w:line="250"/>
               <w:jc w:val="left"/>
             </w:pPr>
             <w:r>
@@ -1172,8 +1172,8 @@
                 <w:iCs w:val="false"/>
                 <w:caps w:val="false"/>
                 <w:color w:val="1A1530"/>
-                <w:sz w:val="14"/>
-                <w:szCs w:val="14"/>
+                <w:sz w:val="18"/>
+                <w:szCs w:val="18"/>
               </w:rPr>
               <w:t xml:space="preserve">Kwestionariusz Przedszkolnej / Szkolnej Oceny Funkcjonalnej (KPOF / KSzOF – 9 domen ICF); Profil Biopsychospołeczny; Arkusz Obserwacji Behawioralnej ABC; Profil Sensoryczny; Arkusz Oceny Rozwoju Mowy i Komunikacji; Arkusz Poziomu Rozwoju Teorii Umysłu (ToM); analiza dokumentacji pomocy psychologiczno-pedagogicznej</w:t>
             </w:r>
@@ -1204,7 +1204,7 @@
           </w:tcPr>
           <w:p>
             <w:pPr>
-              <w:spacing w:after="0" w:before="0" w:line="230"/>
+              <w:spacing w:after="0" w:before="0" w:line="250"/>
               <w:jc w:val="left"/>
             </w:pPr>
             <w:r>
@@ -1216,8 +1216,8 @@
                 <w:iCs w:val="false"/>
                 <w:caps w:val="false"/>
                 <w:color w:val="2D1B69"/>
-                <w:sz w:val="14"/>
-                <w:szCs w:val="14"/>
+                <w:sz w:val="18"/>
+                <w:szCs w:val="18"/>
               </w:rPr>
               <w:t xml:space="preserve">Osoby rozpoznające trudności, mocne strony i uzdolnienia</w:t>
             </w:r>
@@ -1225,7 +1225,7 @@
         </w:tc>
         <w:tc>
           <w:tcPr>
-            <w:tcW w:type="dxa" w:w="6906"/>
+            <w:tcW w:type="dxa" w:w="7206"/>
             <w:tcBorders>
               <w:top w:val="single" w:color="E3E1EC" w:sz="4"/>
               <w:left w:val="single" w:color="E3E1EC" w:sz="4"/>
@@ -1242,7 +1242,7 @@
           </w:tcPr>
           <w:p>
             <w:pPr>
-              <w:spacing w:after="0" w:before="0" w:line="230"/>
+              <w:spacing w:after="0" w:before="0" w:line="250"/>
               <w:jc w:val="left"/>
             </w:pPr>
             <w:r>
@@ -1254,8 +1254,8 @@
                 <w:iCs w:val="false"/>
                 <w:caps w:val="false"/>
                 <w:color w:val="1A1530"/>
-                <w:sz w:val="14"/>
-                <w:szCs w:val="14"/>
+                <w:sz w:val="18"/>
+                <w:szCs w:val="18"/>
               </w:rPr>
               <w:t xml:space="preserve">wychowawca / nauczyciele oddziału, pedagog specjalny, psycholog, logopeda, terapeuta SI (imiona i nazwiska w części 9); informacje uzupełniające od rodziców i od dziecka w formie dostosowanej do jego rozwoju</w:t>
             </w:r>
@@ -1277,15 +1277,15 @@
           <w:iCs w:val="false"/>
           <w:caps w:val="false"/>
           <w:color w:val="1A1530"/>
-          <w:sz w:val="2"/>
-          <w:szCs w:val="2"/>
+          <w:sz w:val="18"/>
+          <w:szCs w:val="18"/>
         </w:rPr>
         <w:t xml:space="preserve"/>
       </w:r>
     </w:p>
     <w:tbl>
       <w:tblPr>
-        <w:tblW w:type="dxa" w:w="9906"/>
+        <w:tblW w:type="dxa" w:w="10206"/>
         <w:tblBorders>
           <w:top w:val="single" w:color="auto" w:sz="4"/>
           <w:left w:val="single" w:color="auto" w:sz="4"/>
@@ -1296,8 +1296,8 @@
         </w:tblBorders>
       </w:tblPr>
       <w:tblGrid>
-        <w:gridCol w:w="4953"/>
-        <w:gridCol w:w="4953"/>
+        <w:gridCol w:w="5103"/>
+        <w:gridCol w:w="5103"/>
       </w:tblGrid>
       <w:tr>
         <w:trPr>
@@ -1305,12 +1305,12 @@
         </w:trPr>
         <w:tc>
           <w:tcPr>
-            <w:tcW w:type="dxa" w:w="4953"/>
-            <w:tcBorders>
-              <w:top w:val="dashed" w:color="D9D0F0" w:sz="4"/>
-              <w:left w:val="dashed" w:color="D9D0F0" w:sz="4"/>
-              <w:bottom w:val="dashed" w:color="D9D0F0" w:sz="4"/>
-              <w:right w:val="dashed" w:color="D9D0F0" w:sz="4"/>
+            <w:tcW w:type="dxa" w:w="5103"/>
+            <w:tcBorders>
+              <w:top w:val="dashed" w:color="D9D0F0" w:sz="18"/>
+              <w:left w:val="dashed" w:color="D9D0F0" w:sz="18"/>
+              <w:bottom w:val="dashed" w:color="D9D0F0" w:sz="18"/>
+              <w:right w:val="dashed" w:color="D9D0F0" w:sz="18"/>
             </w:tcBorders>
             <w:tcMar>
               <w:top w:type="dxa" w:w="120"/>
@@ -1334,8 +1334,8 @@
                 <w:iCs w:val="false"/>
                 <w:caps w:val="false"/>
                 <w:color w:val="2D1B69"/>
-                <w:sz w:val="17"/>
-                <w:szCs w:val="17"/>
+                <w:sz w:val="24"/>
+                <w:szCs w:val="24"/>
               </w:rPr>
               <w:t xml:space="preserve">[Nazwa przedszkola / szkoły]</w:t>
             </w:r>
@@ -1354,8 +1354,8 @@
                 <w:iCs w:val="false"/>
                 <w:caps w:val="false"/>
                 <w:color w:val="6B6378"/>
-                <w:sz w:val="13"/>
-                <w:szCs w:val="13"/>
+                <w:sz w:val="18"/>
+                <w:szCs w:val="18"/>
               </w:rPr>
               <w:t xml:space="preserve">[Adres placówki, tel., e-mail]</w:t>
             </w:r>
@@ -1374,8 +1374,8 @@
                 <w:iCs w:val="false"/>
                 <w:caps w:val="false"/>
                 <w:color w:val="6B6378"/>
-                <w:sz w:val="11"/>
-                <w:szCs w:val="11"/>
+                <w:sz w:val="18"/>
+                <w:szCs w:val="18"/>
               </w:rPr>
               <w:t xml:space="preserve">(pieczęć placówki)</w:t>
             </w:r>
@@ -1383,7 +1383,7 @@
         </w:tc>
         <w:tc>
           <w:tcPr>
-            <w:tcW w:type="dxa" w:w="4953"/>
+            <w:tcW w:type="dxa" w:w="5103"/>
             <w:tcBorders>
               <w:top w:val="nil"/>
               <w:left w:val="nil"/>
@@ -1412,8 +1412,8 @@
                 <w:iCs w:val="false"/>
                 <w:caps w:val="false"/>
                 <w:color w:val="6B6378"/>
-                <w:sz w:val="14"/>
-                <w:szCs w:val="14"/>
+                <w:sz w:val="18"/>
+                <w:szCs w:val="18"/>
               </w:rPr>
               <w:t xml:space="preserve">[Miejscowość], dnia ………………………</w:t>
             </w:r>
@@ -1432,8 +1432,8 @@
                 <w:iCs w:val="false"/>
                 <w:caps w:val="false"/>
                 <w:color w:val="6B6378"/>
-                <w:sz w:val="14"/>
-                <w:szCs w:val="14"/>
+                <w:sz w:val="18"/>
+                <w:szCs w:val="18"/>
               </w:rPr>
               <w:t xml:space="preserve">Znak sprawy: ………………………</w:t>
             </w:r>
@@ -1452,8 +1452,8 @@
                 <w:iCs w:val="false"/>
                 <w:caps w:val="false"/>
                 <w:color w:val="6B6378"/>
-                <w:sz w:val="14"/>
-                <w:szCs w:val="14"/>
+                <w:sz w:val="18"/>
+                <w:szCs w:val="18"/>
               </w:rPr>
               <w:t xml:space="preserve">Zespół orzekający: [Nazwa Poradni Psychologiczno-Pedagogicznej]</w:t>
             </w:r>
@@ -1470,7 +1470,7 @@
       <w:pPr>
         <w:keepNext/>
         <w:pBdr>
-          <w:bottom w:val="single" w:color="D9D0F0" w:sz="4" w:space="4"/>
+          <w:bottom w:val="single" w:color="D9D0F0" w:sz="18" w:space="4"/>
         </w:pBdr>
         <w:spacing w:after="100" w:before="180"/>
       </w:pPr>
@@ -1483,8 +1483,8 @@
           <w:iCs w:val="false"/>
           <w:caps w:val="false"/>
           <w:color w:val="E74509"/>
-          <w:sz w:val="18"/>
-          <w:szCs w:val="18"/>
+          <w:sz w:val="24"/>
+          <w:szCs w:val="24"/>
         </w:rPr>
         <w:t xml:space="preserve">3.  </w:t>
       </w:r>
@@ -1498,8 +1498,8 @@
           <w:caps w:val="false"/>
           <w:color w:val="2D1B69"/>
           <w:spacing w:val="8"/>
-          <w:sz w:val="17"/>
-          <w:szCs w:val="17"/>
+          <w:sz w:val="24"/>
+          <w:szCs w:val="24"/>
         </w:rPr>
         <w:t xml:space="preserve">INFORMACJA O FUNKCJONOWANIU DZIECKA / UCZNIA W PLACÓWCE – TRUDNOŚCI, MOCNE STRONY I UZDOLNIENIA (§ 7 UST. 6 PKT 3, UST. 7 PKT 1)</w:t>
       </w:r>
@@ -1518,8 +1518,8 @@
           <w:iCs w:val="false"/>
           <w:caps w:val="false"/>
           <w:color w:val="6B6378"/>
-          <w:sz w:val="16"/>
-          <w:szCs w:val="16"/>
+          <w:sz w:val="24"/>
+          <w:szCs w:val="24"/>
         </w:rPr>
         <w:t xml:space="preserve">Aktywność i uczestniczenie zgodnie z obszarami ICF, adekwatnie do wieku i poziomu rozwoju psychofizycznego. Wypełnia się tabelę A (dziecko do ukończenia wychowania przedszkolnego – 5 obszarów) albo B (uczeń – 7 obszarów). Poziom potrzeby wsparcia: średnia z KPOF / KSzOF w skali 0–5 (steny wyłącznie dla KSzOF).</w:t>
       </w:r>
@@ -1538,8 +1538,8 @@
           <w:iCs w:val="false"/>
           <w:caps w:val="false"/>
           <w:color w:val="FFFFFF"/>
-          <w:sz w:val="16"/>
-          <w:szCs w:val="16"/>
+          <w:sz w:val="24"/>
+          <w:szCs w:val="24"/>
           <w:shd w:fill="E74509" w:color="auto" w:val="clear"/>
         </w:rPr>
         <w:t xml:space="preserve"> A </w:t>
@@ -1553,8 +1553,8 @@
           <w:iCs w:val="false"/>
           <w:caps w:val="false"/>
           <w:color w:val="2D1B69"/>
-          <w:sz w:val="18"/>
-          <w:szCs w:val="18"/>
+          <w:sz w:val="24"/>
+          <w:szCs w:val="24"/>
         </w:rPr>
         <w:t xml:space="preserve">   A · Dziecko do ukończenia wychowania przedszkolnego – 5 obszarów (ust. 7 pkt 1 lit. a)</w:t>
       </w:r>
@@ -1567,8 +1567,8 @@
           <w:iCs w:val="false"/>
           <w:caps w:val="false"/>
           <w:color w:val="6B6378"/>
-          <w:sz w:val="14"/>
-          <w:szCs w:val="14"/>
+          <w:sz w:val="18"/>
+          <w:szCs w:val="18"/>
         </w:rPr>
         <w:t xml:space="preserve"/>
       </w:r>
@@ -1628,8 +1628,8 @@
                 <w:caps/>
                 <w:color w:val="2D1B69"/>
                 <w:spacing w:val="10"/>
-                <w:sz w:val="13"/>
-                <w:szCs w:val="13"/>
+                <w:sz w:val="18"/>
+                <w:szCs w:val="18"/>
               </w:rPr>
               <w:t xml:space="preserve">Obszar (ICF)</w:t>
             </w:r>
@@ -1668,8 +1668,8 @@
                 <w:caps/>
                 <w:color w:val="2E7D45"/>
                 <w:spacing w:val="10"/>
-                <w:sz w:val="13"/>
-                <w:szCs w:val="13"/>
+                <w:sz w:val="18"/>
+                <w:szCs w:val="18"/>
               </w:rPr>
               <w:t xml:space="preserve">Mocne strony i uzdolnienia</w:t>
             </w:r>
@@ -1708,8 +1708,8 @@
                 <w:caps/>
                 <w:color w:val="BF382A"/>
                 <w:spacing w:val="10"/>
-                <w:sz w:val="13"/>
-                <w:szCs w:val="13"/>
+                <w:sz w:val="18"/>
+                <w:szCs w:val="18"/>
               </w:rPr>
               <w:t xml:space="preserve">Trudności</w:t>
             </w:r>
@@ -1748,8 +1748,8 @@
                 <w:caps/>
                 <w:color w:val="2D1B69"/>
                 <w:spacing w:val="10"/>
-                <w:sz w:val="13"/>
-                <w:szCs w:val="13"/>
+                <w:sz w:val="18"/>
+                <w:szCs w:val="18"/>
               </w:rPr>
               <w:t xml:space="preserve">Poziom potrzeby wsparcia</w:t>
             </w:r>
@@ -1780,7 +1780,7 @@
           </w:tcPr>
           <w:p>
             <w:pPr>
-              <w:spacing w:after="0" w:before="0" w:line="230"/>
+              <w:spacing w:after="0" w:before="0" w:line="250"/>
               <w:jc w:val="left"/>
             </w:pPr>
             <w:r>
@@ -1792,8 +1792,8 @@
                 <w:iCs w:val="false"/>
                 <w:caps w:val="false"/>
                 <w:color w:val="2D1B69"/>
-                <w:sz w:val="13"/>
-                <w:szCs w:val="13"/>
+                <w:sz w:val="18"/>
+                <w:szCs w:val="18"/>
               </w:rPr>
               <w:t xml:space="preserve">1 · Uczenie się i stosowanie wiedzy</w:t>
             </w:r>
@@ -1818,7 +1818,7 @@
           </w:tcPr>
           <w:p>
             <w:pPr>
-              <w:spacing w:after="0" w:before="0" w:line="230"/>
+              <w:spacing w:after="0" w:before="0" w:line="250"/>
               <w:jc w:val="left"/>
             </w:pPr>
             <w:r>
@@ -1830,8 +1830,8 @@
                 <w:iCs w:val="false"/>
                 <w:caps w:val="false"/>
                 <w:color w:val="1A1530"/>
-                <w:sz w:val="13"/>
-                <w:szCs w:val="13"/>
+                <w:sz w:val="18"/>
+                <w:szCs w:val="18"/>
               </w:rPr>
               <w:t xml:space="preserve">pamięć wzrokowa, schematy graficzne, zainteresowania tematyczne, motywacja do pracy z ulubionymi pomocami</w:t>
             </w:r>
@@ -1856,7 +1856,7 @@
           </w:tcPr>
           <w:p>
             <w:pPr>
-              <w:spacing w:after="0" w:before="0" w:line="230"/>
+              <w:spacing w:after="0" w:before="0" w:line="250"/>
               <w:jc w:val="left"/>
             </w:pPr>
             <w:r>
@@ -1868,8 +1868,8 @@
                 <w:iCs w:val="false"/>
                 <w:caps w:val="false"/>
                 <w:color w:val="1A1530"/>
-                <w:sz w:val="13"/>
-                <w:szCs w:val="13"/>
+                <w:sz w:val="18"/>
+                <w:szCs w:val="18"/>
               </w:rPr>
               <w:t xml:space="preserve">przerzutność i podzielność uwagi, instrukcje wieloetapowe, uogólnianie wiedzy, stres przy zmianie planu, potrzeba nadzoru nauczyciela</w:t>
             </w:r>
@@ -1894,7 +1894,7 @@
           </w:tcPr>
           <w:p>
             <w:pPr>
-              <w:spacing w:after="0" w:before="0" w:line="230"/>
+              <w:spacing w:after="0" w:before="0" w:line="250"/>
               <w:jc w:val="left"/>
             </w:pPr>
             <w:r>
@@ -1906,8 +1906,8 @@
                 <w:iCs w:val="false"/>
                 <w:caps w:val="false"/>
                 <w:color w:val="2D1B69"/>
-                <w:sz w:val="13"/>
-                <w:szCs w:val="13"/>
+                <w:sz w:val="18"/>
+                <w:szCs w:val="18"/>
               </w:rPr>
               <w:t xml:space="preserve">d1 śr. 2,4 · d2 śr. 1,8 · d8 śr. 2,0 – poziom średni / wysoki</w:t>
             </w:r>
@@ -1938,7 +1938,7 @@
           </w:tcPr>
           <w:p>
             <w:pPr>
-              <w:spacing w:after="0" w:before="0" w:line="230"/>
+              <w:spacing w:after="0" w:before="0" w:line="250"/>
               <w:jc w:val="left"/>
             </w:pPr>
             <w:r>
@@ -1950,8 +1950,8 @@
                 <w:iCs w:val="false"/>
                 <w:caps w:val="false"/>
                 <w:color w:val="2D1B69"/>
-                <w:sz w:val="13"/>
-                <w:szCs w:val="13"/>
+                <w:sz w:val="18"/>
+                <w:szCs w:val="18"/>
               </w:rPr>
               <w:t xml:space="preserve">2 · Zachowania społeczne we wzajemnych kontaktach – przystosowanie społeczne i emocjonalne</w:t>
             </w:r>
@@ -1976,7 +1976,7 @@
           </w:tcPr>
           <w:p>
             <w:pPr>
-              <w:spacing w:after="0" w:before="0" w:line="230"/>
+              <w:spacing w:after="0" w:before="0" w:line="250"/>
               <w:jc w:val="left"/>
             </w:pPr>
             <w:r>
@@ -1988,8 +1988,8 @@
                 <w:iCs w:val="false"/>
                 <w:caps w:val="false"/>
                 <w:color w:val="1A1530"/>
-                <w:sz w:val="13"/>
-                <w:szCs w:val="13"/>
+                <w:sz w:val="18"/>
+                <w:szCs w:val="18"/>
               </w:rPr>
               <w:t xml:space="preserve">chęć przebywania blisko grupy, reakcja na stałych dorosłych, przestrzeganie zasad wizualnych</w:t>
             </w:r>
@@ -2014,7 +2014,7 @@
           </w:tcPr>
           <w:p>
             <w:pPr>
-              <w:spacing w:after="0" w:before="0" w:line="230"/>
+              <w:spacing w:after="0" w:before="0" w:line="250"/>
               <w:jc w:val="left"/>
             </w:pPr>
             <w:r>
@@ -2026,8 +2026,8 @@
                 <w:iCs w:val="false"/>
                 <w:caps w:val="false"/>
                 <w:color w:val="1A1530"/>
-                <w:sz w:val="13"/>
-                <w:szCs w:val="13"/>
+                <w:sz w:val="18"/>
+                <w:szCs w:val="18"/>
               </w:rPr>
               <w:t xml:space="preserve">odczytywanie emocji i intencji, tolerancja frustracji, wycofanie lub zachowania trudne w apelach i wyjściach</w:t>
             </w:r>
@@ -2052,7 +2052,7 @@
           </w:tcPr>
           <w:p>
             <w:pPr>
-              <w:spacing w:after="0" w:before="0" w:line="230"/>
+              <w:spacing w:after="0" w:before="0" w:line="250"/>
               <w:jc w:val="left"/>
             </w:pPr>
             <w:r>
@@ -2064,8 +2064,8 @@
                 <w:iCs w:val="false"/>
                 <w:caps w:val="false"/>
                 <w:color w:val="2D1B69"/>
-                <w:sz w:val="13"/>
-                <w:szCs w:val="13"/>
+                <w:sz w:val="18"/>
+                <w:szCs w:val="18"/>
               </w:rPr>
               <w:t xml:space="preserve">d7 śr. 1,6 · d9 śr. 1,8 – poziom wysoki</w:t>
             </w:r>
@@ -2096,7 +2096,7 @@
           </w:tcPr>
           <w:p>
             <w:pPr>
-              <w:spacing w:after="0" w:before="0" w:line="230"/>
+              <w:spacing w:after="0" w:before="0" w:line="250"/>
               <w:jc w:val="left"/>
             </w:pPr>
             <w:r>
@@ -2108,8 +2108,8 @@
                 <w:iCs w:val="false"/>
                 <w:caps w:val="false"/>
                 <w:color w:val="2D1B69"/>
-                <w:sz w:val="13"/>
-                <w:szCs w:val="13"/>
+                <w:sz w:val="18"/>
+                <w:szCs w:val="18"/>
               </w:rPr>
               <w:t xml:space="preserve">3 · Porozumiewanie się</w:t>
             </w:r>
@@ -2134,7 +2134,7 @@
           </w:tcPr>
           <w:p>
             <w:pPr>
-              <w:spacing w:after="0" w:before="0" w:line="230"/>
+              <w:spacing w:after="0" w:before="0" w:line="250"/>
               <w:jc w:val="left"/>
             </w:pPr>
             <w:r>
@@ -2146,8 +2146,8 @@
                 <w:iCs w:val="false"/>
                 <w:caps w:val="false"/>
                 <w:color w:val="1A1530"/>
-                <w:sz w:val="13"/>
-                <w:szCs w:val="13"/>
+                <w:sz w:val="18"/>
+                <w:szCs w:val="18"/>
               </w:rPr>
               <w:t xml:space="preserve">rozumienie prostych komunikatów wspartych gestem, sygnalizowanie potrzeb</w:t>
             </w:r>
@@ -2172,7 +2172,7 @@
           </w:tcPr>
           <w:p>
             <w:pPr>
-              <w:spacing w:after="0" w:before="0" w:line="230"/>
+              <w:spacing w:after="0" w:before="0" w:line="250"/>
               <w:jc w:val="left"/>
             </w:pPr>
             <w:r>
@@ -2184,8 +2184,8 @@
                 <w:iCs w:val="false"/>
                 <w:caps w:val="false"/>
                 <w:color w:val="1A1530"/>
-                <w:sz w:val="13"/>
-                <w:szCs w:val="13"/>
+                <w:sz w:val="18"/>
+                <w:szCs w:val="18"/>
               </w:rPr>
               <w:t xml:space="preserve">dosłowność, echolalie, inicjowanie i naprzemienność dialogu, potrzeba AAC</w:t>
             </w:r>
@@ -2210,7 +2210,7 @@
           </w:tcPr>
           <w:p>
             <w:pPr>
-              <w:spacing w:after="0" w:before="0" w:line="230"/>
+              <w:spacing w:after="0" w:before="0" w:line="250"/>
               <w:jc w:val="left"/>
             </w:pPr>
             <w:r>
@@ -2222,8 +2222,8 @@
                 <w:iCs w:val="false"/>
                 <w:caps w:val="false"/>
                 <w:color w:val="2D1B69"/>
-                <w:sz w:val="13"/>
-                <w:szCs w:val="13"/>
+                <w:sz w:val="18"/>
+                <w:szCs w:val="18"/>
               </w:rPr>
               <w:t xml:space="preserve">d3 śr. 2,0 – poziom średni</w:t>
             </w:r>
@@ -2254,7 +2254,7 @@
           </w:tcPr>
           <w:p>
             <w:pPr>
-              <w:spacing w:after="0" w:before="0" w:line="230"/>
+              <w:spacing w:after="0" w:before="0" w:line="250"/>
               <w:jc w:val="left"/>
             </w:pPr>
             <w:r>
@@ -2266,8 +2266,8 @@
                 <w:iCs w:val="false"/>
                 <w:caps w:val="false"/>
                 <w:color w:val="2D1B69"/>
-                <w:sz w:val="13"/>
-                <w:szCs w:val="13"/>
+                <w:sz w:val="18"/>
+                <w:szCs w:val="18"/>
               </w:rPr>
               <w:t xml:space="preserve">4 · Aktywność ruchowa – poruszanie się</w:t>
             </w:r>
@@ -2292,7 +2292,7 @@
           </w:tcPr>
           <w:p>
             <w:pPr>
-              <w:spacing w:after="0" w:before="0" w:line="230"/>
+              <w:spacing w:after="0" w:before="0" w:line="250"/>
               <w:jc w:val="left"/>
             </w:pPr>
             <w:r>
@@ -2304,8 +2304,8 @@
                 <w:iCs w:val="false"/>
                 <w:caps w:val="false"/>
                 <w:color w:val="1A1530"/>
-                <w:sz w:val="13"/>
-                <w:szCs w:val="13"/>
+                <w:sz w:val="18"/>
+                <w:szCs w:val="18"/>
               </w:rPr>
               <w:t xml:space="preserve">motoryka duża, chętny udział w zabawach ruchowych</w:t>
             </w:r>
@@ -2330,7 +2330,7 @@
           </w:tcPr>
           <w:p>
             <w:pPr>
-              <w:spacing w:after="0" w:before="0" w:line="230"/>
+              <w:spacing w:after="0" w:before="0" w:line="250"/>
               <w:jc w:val="left"/>
             </w:pPr>
             <w:r>
@@ -2342,8 +2342,8 @@
                 <w:iCs w:val="false"/>
                 <w:caps w:val="false"/>
                 <w:color w:val="1A1530"/>
-                <w:sz w:val="13"/>
-                <w:szCs w:val="13"/>
+                <w:sz w:val="18"/>
+                <w:szCs w:val="18"/>
               </w:rPr>
               <w:t xml:space="preserve">motoryka mała, koordynacja wzrokowo-ruchowa, chwyt, napięcie posturalne</w:t>
             </w:r>
@@ -2368,7 +2368,7 @@
           </w:tcPr>
           <w:p>
             <w:pPr>
-              <w:spacing w:after="0" w:before="0" w:line="230"/>
+              <w:spacing w:after="0" w:before="0" w:line="250"/>
               <w:jc w:val="left"/>
             </w:pPr>
             <w:r>
@@ -2380,8 +2380,8 @@
                 <w:iCs w:val="false"/>
                 <w:caps w:val="false"/>
                 <w:color w:val="2D1B69"/>
-                <w:sz w:val="13"/>
-                <w:szCs w:val="13"/>
+                <w:sz w:val="18"/>
+                <w:szCs w:val="18"/>
               </w:rPr>
               <w:t xml:space="preserve">d4 śr. 3,2 – poziom niski</w:t>
             </w:r>
@@ -2412,7 +2412,7 @@
           </w:tcPr>
           <w:p>
             <w:pPr>
-              <w:spacing w:after="0" w:before="0" w:line="230"/>
+              <w:spacing w:after="0" w:before="0" w:line="250"/>
               <w:jc w:val="left"/>
             </w:pPr>
             <w:r>
@@ -2424,8 +2424,8 @@
                 <w:iCs w:val="false"/>
                 <w:caps w:val="false"/>
                 <w:color w:val="2D1B69"/>
-                <w:sz w:val="13"/>
-                <w:szCs w:val="13"/>
+                <w:sz w:val="18"/>
+                <w:szCs w:val="18"/>
               </w:rPr>
               <w:t xml:space="preserve">5 · Dbanie o siebie</w:t>
             </w:r>
@@ -2450,7 +2450,7 @@
           </w:tcPr>
           <w:p>
             <w:pPr>
-              <w:spacing w:after="0" w:before="0" w:line="230"/>
+              <w:spacing w:after="0" w:before="0" w:line="250"/>
               <w:jc w:val="left"/>
             </w:pPr>
             <w:r>
@@ -2462,8 +2462,8 @@
                 <w:iCs w:val="false"/>
                 <w:caps w:val="false"/>
                 <w:color w:val="1A1530"/>
-                <w:sz w:val="13"/>
-                <w:szCs w:val="13"/>
+                <w:sz w:val="18"/>
+                <w:szCs w:val="18"/>
               </w:rPr>
               <w:t xml:space="preserve">podstawowe nawyki higieniczne i toaletowe, znajomość swoich rzeczy, obowiązki po przypomnieniu</w:t>
             </w:r>
@@ -2488,7 +2488,7 @@
           </w:tcPr>
           <w:p>
             <w:pPr>
-              <w:spacing w:after="0" w:before="0" w:line="230"/>
+              <w:spacing w:after="0" w:before="0" w:line="250"/>
               <w:jc w:val="left"/>
             </w:pPr>
             <w:r>
@@ -2500,8 +2500,8 @@
                 <w:iCs w:val="false"/>
                 <w:caps w:val="false"/>
                 <w:color w:val="1A1530"/>
-                <w:sz w:val="13"/>
-                <w:szCs w:val="13"/>
+                <w:sz w:val="18"/>
+                <w:szCs w:val="18"/>
               </w:rPr>
               <w:t xml:space="preserve">opór sensoryczny przy myciu rąk, wybiórczość pokarmowa, trudne zapięcia, brak inicjowania obowiązków</w:t>
             </w:r>
@@ -2526,7 +2526,7 @@
           </w:tcPr>
           <w:p>
             <w:pPr>
-              <w:spacing w:after="0" w:before="0" w:line="230"/>
+              <w:spacing w:after="0" w:before="0" w:line="250"/>
               <w:jc w:val="left"/>
             </w:pPr>
             <w:r>
@@ -2538,8 +2538,8 @@
                 <w:iCs w:val="false"/>
                 <w:caps w:val="false"/>
                 <w:color w:val="2D1B69"/>
-                <w:sz w:val="13"/>
-                <w:szCs w:val="13"/>
+                <w:sz w:val="18"/>
+                <w:szCs w:val="18"/>
               </w:rPr>
               <w:t xml:space="preserve">d5 śr. 2,2 · d6 śr. 2,8 – poziom średni / niski</w:t>
             </w:r>
@@ -2561,15 +2561,15 @@
           <w:iCs w:val="false"/>
           <w:caps w:val="false"/>
           <w:color w:val="1A1530"/>
-          <w:sz w:val="2"/>
-          <w:szCs w:val="2"/>
+          <w:sz w:val="18"/>
+          <w:szCs w:val="18"/>
         </w:rPr>
         <w:t xml:space="preserve"/>
       </w:r>
     </w:p>
     <w:tbl>
       <w:tblPr>
-        <w:tblW w:type="dxa" w:w="9906"/>
+        <w:tblW w:type="dxa" w:w="10206"/>
         <w:tblBorders>
           <w:top w:val="single" w:color="auto" w:sz="4"/>
           <w:left w:val="single" w:color="auto" w:sz="4"/>
@@ -2580,8 +2580,8 @@
         </w:tblBorders>
       </w:tblPr>
       <w:tblGrid>
-        <w:gridCol w:w="4953"/>
-        <w:gridCol w:w="4953"/>
+        <w:gridCol w:w="5103"/>
+        <w:gridCol w:w="5103"/>
       </w:tblGrid>
       <w:tr>
         <w:trPr>
@@ -2589,12 +2589,12 @@
         </w:trPr>
         <w:tc>
           <w:tcPr>
-            <w:tcW w:type="dxa" w:w="4953"/>
-            <w:tcBorders>
-              <w:top w:val="dashed" w:color="D9D0F0" w:sz="4"/>
-              <w:left w:val="dashed" w:color="D9D0F0" w:sz="4"/>
-              <w:bottom w:val="dashed" w:color="D9D0F0" w:sz="4"/>
-              <w:right w:val="dashed" w:color="D9D0F0" w:sz="4"/>
+            <w:tcW w:type="dxa" w:w="5103"/>
+            <w:tcBorders>
+              <w:top w:val="dashed" w:color="D9D0F0" w:sz="18"/>
+              <w:left w:val="dashed" w:color="D9D0F0" w:sz="18"/>
+              <w:bottom w:val="dashed" w:color="D9D0F0" w:sz="18"/>
+              <w:right w:val="dashed" w:color="D9D0F0" w:sz="18"/>
             </w:tcBorders>
             <w:tcMar>
               <w:top w:type="dxa" w:w="120"/>
@@ -2618,8 +2618,8 @@
                 <w:iCs w:val="false"/>
                 <w:caps w:val="false"/>
                 <w:color w:val="2D1B69"/>
-                <w:sz w:val="17"/>
-                <w:szCs w:val="17"/>
+                <w:sz w:val="24"/>
+                <w:szCs w:val="24"/>
               </w:rPr>
               <w:t xml:space="preserve">[Nazwa przedszkola / szkoły]</w:t>
             </w:r>
@@ -2638,8 +2638,8 @@
                 <w:iCs w:val="false"/>
                 <w:caps w:val="false"/>
                 <w:color w:val="6B6378"/>
-                <w:sz w:val="13"/>
-                <w:szCs w:val="13"/>
+                <w:sz w:val="18"/>
+                <w:szCs w:val="18"/>
               </w:rPr>
               <w:t xml:space="preserve">[Adres placówki, tel., e-mail]</w:t>
             </w:r>
@@ -2658,8 +2658,8 @@
                 <w:iCs w:val="false"/>
                 <w:caps w:val="false"/>
                 <w:color w:val="6B6378"/>
-                <w:sz w:val="11"/>
-                <w:szCs w:val="11"/>
+                <w:sz w:val="18"/>
+                <w:szCs w:val="18"/>
               </w:rPr>
               <w:t xml:space="preserve">(pieczęć placówki)</w:t>
             </w:r>
@@ -2667,7 +2667,7 @@
         </w:tc>
         <w:tc>
           <w:tcPr>
-            <w:tcW w:type="dxa" w:w="4953"/>
+            <w:tcW w:type="dxa" w:w="5103"/>
             <w:tcBorders>
               <w:top w:val="nil"/>
               <w:left w:val="nil"/>
@@ -2696,8 +2696,8 @@
                 <w:iCs w:val="false"/>
                 <w:caps w:val="false"/>
                 <w:color w:val="6B6378"/>
-                <w:sz w:val="14"/>
-                <w:szCs w:val="14"/>
+                <w:sz w:val="18"/>
+                <w:szCs w:val="18"/>
               </w:rPr>
               <w:t xml:space="preserve">[Miejscowość], dnia ………………………</w:t>
             </w:r>
@@ -2716,8 +2716,8 @@
                 <w:iCs w:val="false"/>
                 <w:caps w:val="false"/>
                 <w:color w:val="6B6378"/>
-                <w:sz w:val="14"/>
-                <w:szCs w:val="14"/>
+                <w:sz w:val="18"/>
+                <w:szCs w:val="18"/>
               </w:rPr>
               <w:t xml:space="preserve">Znak sprawy: ………………………</w:t>
             </w:r>
@@ -2736,8 +2736,8 @@
                 <w:iCs w:val="false"/>
                 <w:caps w:val="false"/>
                 <w:color w:val="6B6378"/>
-                <w:sz w:val="14"/>
-                <w:szCs w:val="14"/>
+                <w:sz w:val="18"/>
+                <w:szCs w:val="18"/>
               </w:rPr>
               <w:t xml:space="preserve">Zespół orzekający: [Nazwa Poradni Psychologiczno-Pedagogicznej]</w:t>
             </w:r>
@@ -2754,7 +2754,7 @@
       <w:pPr>
         <w:keepNext/>
         <w:pBdr>
-          <w:bottom w:val="single" w:color="D9D0F0" w:sz="4" w:space="4"/>
+          <w:bottom w:val="single" w:color="D9D0F0" w:sz="18" w:space="4"/>
         </w:pBdr>
         <w:spacing w:after="100" w:before="180"/>
       </w:pPr>
@@ -2767,8 +2767,8 @@
           <w:iCs w:val="false"/>
           <w:caps w:val="false"/>
           <w:color w:val="E74509"/>
-          <w:sz w:val="18"/>
-          <w:szCs w:val="18"/>
+          <w:sz w:val="24"/>
+          <w:szCs w:val="24"/>
         </w:rPr>
         <w:t xml:space="preserve">3.  </w:t>
       </w:r>
@@ -2782,8 +2782,8 @@
           <w:caps w:val="false"/>
           <w:color w:val="2D1B69"/>
           <w:spacing w:val="8"/>
-          <w:sz w:val="17"/>
-          <w:szCs w:val="17"/>
+          <w:sz w:val="24"/>
+          <w:szCs w:val="24"/>
         </w:rPr>
         <w:t xml:space="preserve">INFORMACJA O FUNKCJONOWANIU DZIECKA / UCZNIA W PLACÓWCE – TRUDNOŚCI, MOCNE STRONY I UZDOLNIENIA (§ 7 UST. 6 PKT 3, UST. 7 PKT 1) · CD.</w:t>
       </w:r>
@@ -2802,8 +2802,8 @@
           <w:iCs w:val="false"/>
           <w:caps w:val="false"/>
           <w:color w:val="FFFFFF"/>
-          <w:sz w:val="16"/>
-          <w:szCs w:val="16"/>
+          <w:sz w:val="24"/>
+          <w:szCs w:val="24"/>
           <w:shd w:fill="2D6BB3" w:color="auto" w:val="clear"/>
         </w:rPr>
         <w:t xml:space="preserve"> B </w:t>
@@ -2817,8 +2817,8 @@
           <w:iCs w:val="false"/>
           <w:caps w:val="false"/>
           <w:color w:val="2D1B69"/>
-          <w:sz w:val="18"/>
-          <w:szCs w:val="18"/>
+          <w:sz w:val="24"/>
+          <w:szCs w:val="24"/>
         </w:rPr>
         <w:t xml:space="preserve">   B · Uczeń – 7 obszarów (ust. 7 pkt 1 lit. b)</w:t>
       </w:r>
@@ -2831,8 +2831,8 @@
           <w:iCs w:val="false"/>
           <w:caps w:val="false"/>
           <w:color w:val="6B6378"/>
-          <w:sz w:val="14"/>
-          <w:szCs w:val="14"/>
+          <w:sz w:val="18"/>
+          <w:szCs w:val="18"/>
         </w:rPr>
         <w:t xml:space="preserve"/>
       </w:r>
@@ -2892,8 +2892,8 @@
                 <w:caps/>
                 <w:color w:val="2D1B69"/>
                 <w:spacing w:val="10"/>
-                <w:sz w:val="13"/>
-                <w:szCs w:val="13"/>
+                <w:sz w:val="18"/>
+                <w:szCs w:val="18"/>
               </w:rPr>
               <w:t xml:space="preserve">Obszar (ICF)</w:t>
             </w:r>
@@ -2932,8 +2932,8 @@
                 <w:caps/>
                 <w:color w:val="2E7D45"/>
                 <w:spacing w:val="10"/>
-                <w:sz w:val="13"/>
-                <w:szCs w:val="13"/>
+                <w:sz w:val="18"/>
+                <w:szCs w:val="18"/>
               </w:rPr>
               <w:t xml:space="preserve">Mocne strony i uzdolnienia</w:t>
             </w:r>
@@ -2972,8 +2972,8 @@
                 <w:caps/>
                 <w:color w:val="BF382A"/>
                 <w:spacing w:val="10"/>
-                <w:sz w:val="13"/>
-                <w:szCs w:val="13"/>
+                <w:sz w:val="18"/>
+                <w:szCs w:val="18"/>
               </w:rPr>
               <w:t xml:space="preserve">Trudności</w:t>
             </w:r>
@@ -3012,8 +3012,8 @@
                 <w:caps/>
                 <w:color w:val="2D1B69"/>
                 <w:spacing w:val="10"/>
-                <w:sz w:val="13"/>
-                <w:szCs w:val="13"/>
+                <w:sz w:val="18"/>
+                <w:szCs w:val="18"/>
               </w:rPr>
               <w:t xml:space="preserve">Poziom potrzeby wsparcia</w:t>
             </w:r>
@@ -3044,7 +3044,7 @@
           </w:tcPr>
           <w:p>
             <w:pPr>
-              <w:spacing w:after="0" w:before="0" w:line="230"/>
+              <w:spacing w:after="0" w:before="0" w:line="250"/>
               <w:jc w:val="left"/>
             </w:pPr>
             <w:r>
@@ -3056,8 +3056,8 @@
                 <w:iCs w:val="false"/>
                 <w:caps w:val="false"/>
                 <w:color w:val="2D1B69"/>
-                <w:sz w:val="13"/>
-                <w:szCs w:val="13"/>
+                <w:sz w:val="18"/>
+                <w:szCs w:val="18"/>
               </w:rPr>
               <w:t xml:space="preserve">1 · Uczenie się i stosowanie wiedzy</w:t>
             </w:r>
@@ -3082,7 +3082,7 @@
           </w:tcPr>
           <w:p>
             <w:pPr>
-              <w:spacing w:after="0" w:before="0" w:line="230"/>
+              <w:spacing w:after="0" w:before="0" w:line="250"/>
               <w:jc w:val="left"/>
             </w:pPr>
             <w:r>
@@ -3094,8 +3094,8 @@
                 <w:iCs w:val="false"/>
                 <w:caps w:val="false"/>
                 <w:color w:val="1A1530"/>
-                <w:sz w:val="13"/>
-                <w:szCs w:val="13"/>
+                <w:sz w:val="18"/>
+                <w:szCs w:val="18"/>
               </w:rPr>
               <w:t xml:space="preserve">pamięć wzrokowa, schematy graficzne, zainteresowania, zaangażowanie przy zadaniach z obrazem</w:t>
             </w:r>
@@ -3120,7 +3120,7 @@
           </w:tcPr>
           <w:p>
             <w:pPr>
-              <w:spacing w:after="0" w:before="0" w:line="230"/>
+              <w:spacing w:after="0" w:before="0" w:line="250"/>
               <w:jc w:val="left"/>
             </w:pPr>
             <w:r>
@@ -3132,8 +3132,8 @@
                 <w:iCs w:val="false"/>
                 <w:caps w:val="false"/>
                 <w:color w:val="1A1530"/>
-                <w:sz w:val="13"/>
-                <w:szCs w:val="13"/>
+                <w:sz w:val="18"/>
+                <w:szCs w:val="18"/>
               </w:rPr>
               <w:t xml:space="preserve">uwaga, instrukcje wieloetapowe, uogólnianie, męczliwość przy pisaniu, potrzeba nadzoru</w:t>
             </w:r>
@@ -3158,7 +3158,7 @@
           </w:tcPr>
           <w:p>
             <w:pPr>
-              <w:spacing w:after="0" w:before="0" w:line="230"/>
+              <w:spacing w:after="0" w:before="0" w:line="250"/>
               <w:jc w:val="left"/>
             </w:pPr>
             <w:r>
@@ -3170,8 +3170,8 @@
                 <w:iCs w:val="false"/>
                 <w:caps w:val="false"/>
                 <w:color w:val="2D1B69"/>
-                <w:sz w:val="13"/>
-                <w:szCs w:val="13"/>
+                <w:sz w:val="18"/>
+                <w:szCs w:val="18"/>
               </w:rPr>
               <w:t xml:space="preserve">d1 śr. 2,4 · d8 śr. 2,0 – średni</w:t>
             </w:r>
@@ -3202,7 +3202,7 @@
           </w:tcPr>
           <w:p>
             <w:pPr>
-              <w:spacing w:after="0" w:before="0" w:line="230"/>
+              <w:spacing w:after="0" w:before="0" w:line="250"/>
               <w:jc w:val="left"/>
             </w:pPr>
             <w:r>
@@ -3214,8 +3214,8 @@
                 <w:iCs w:val="false"/>
                 <w:caps w:val="false"/>
                 <w:color w:val="2D1B69"/>
-                <w:sz w:val="13"/>
-                <w:szCs w:val="13"/>
+                <w:sz w:val="18"/>
+                <w:szCs w:val="18"/>
               </w:rPr>
               <w:t xml:space="preserve">2 · Ogólne zadania i obowiązki</w:t>
             </w:r>
@@ -3240,7 +3240,7 @@
           </w:tcPr>
           <w:p>
             <w:pPr>
-              <w:spacing w:after="0" w:before="0" w:line="230"/>
+              <w:spacing w:after="0" w:before="0" w:line="250"/>
               <w:jc w:val="left"/>
             </w:pPr>
             <w:r>
@@ -3252,8 +3252,8 @@
                 <w:iCs w:val="false"/>
                 <w:caps w:val="false"/>
                 <w:color w:val="1A1530"/>
-                <w:sz w:val="13"/>
-                <w:szCs w:val="13"/>
+                <w:sz w:val="18"/>
+                <w:szCs w:val="18"/>
               </w:rPr>
               <w:t xml:space="preserve">zadania o stałej strukturze, zasady wizualne</w:t>
             </w:r>
@@ -3278,7 +3278,7 @@
           </w:tcPr>
           <w:p>
             <w:pPr>
-              <w:spacing w:after="0" w:before="0" w:line="230"/>
+              <w:spacing w:after="0" w:before="0" w:line="250"/>
               <w:jc w:val="left"/>
             </w:pPr>
             <w:r>
@@ -3290,8 +3290,8 @@
                 <w:iCs w:val="false"/>
                 <w:caps w:val="false"/>
                 <w:color w:val="1A1530"/>
-                <w:sz w:val="13"/>
-                <w:szCs w:val="13"/>
+                <w:sz w:val="18"/>
+                <w:szCs w:val="18"/>
               </w:rPr>
               <w:t xml:space="preserve">organizacja pracy, zadania wieloetapowe, stres przy zmianach</w:t>
             </w:r>
@@ -3316,7 +3316,7 @@
           </w:tcPr>
           <w:p>
             <w:pPr>
-              <w:spacing w:after="0" w:before="0" w:line="230"/>
+              <w:spacing w:after="0" w:before="0" w:line="250"/>
               <w:jc w:val="left"/>
             </w:pPr>
             <w:r>
@@ -3328,8 +3328,8 @@
                 <w:iCs w:val="false"/>
                 <w:caps w:val="false"/>
                 <w:color w:val="2D1B69"/>
-                <w:sz w:val="13"/>
-                <w:szCs w:val="13"/>
+                <w:sz w:val="18"/>
+                <w:szCs w:val="18"/>
               </w:rPr>
               <w:t xml:space="preserve">d2 śr. 1,8 – wysoki</w:t>
             </w:r>
@@ -3360,7 +3360,7 @@
           </w:tcPr>
           <w:p>
             <w:pPr>
-              <w:spacing w:after="0" w:before="0" w:line="230"/>
+              <w:spacing w:after="0" w:before="0" w:line="250"/>
               <w:jc w:val="left"/>
             </w:pPr>
             <w:r>
@@ -3372,8 +3372,8 @@
                 <w:iCs w:val="false"/>
                 <w:caps w:val="false"/>
                 <w:color w:val="2D1B69"/>
-                <w:sz w:val="13"/>
-                <w:szCs w:val="13"/>
+                <w:sz w:val="18"/>
+                <w:szCs w:val="18"/>
               </w:rPr>
               <w:t xml:space="preserve">3 · Porozumiewanie się</w:t>
             </w:r>
@@ -3398,7 +3398,7 @@
           </w:tcPr>
           <w:p>
             <w:pPr>
-              <w:spacing w:after="0" w:before="0" w:line="230"/>
+              <w:spacing w:after="0" w:before="0" w:line="250"/>
               <w:jc w:val="left"/>
             </w:pPr>
             <w:r>
@@ -3410,8 +3410,8 @@
                 <w:iCs w:val="false"/>
                 <w:caps w:val="false"/>
                 <w:color w:val="1A1530"/>
-                <w:sz w:val="13"/>
-                <w:szCs w:val="13"/>
+                <w:sz w:val="18"/>
+                <w:szCs w:val="18"/>
               </w:rPr>
               <w:t xml:space="preserve">rozumienie prostych komunikatów z gestem, sygnalizowanie potrzeb</w:t>
             </w:r>
@@ -3436,7 +3436,7 @@
           </w:tcPr>
           <w:p>
             <w:pPr>
-              <w:spacing w:after="0" w:before="0" w:line="230"/>
+              <w:spacing w:after="0" w:before="0" w:line="250"/>
               <w:jc w:val="left"/>
             </w:pPr>
             <w:r>
@@ -3448,8 +3448,8 @@
                 <w:iCs w:val="false"/>
                 <w:caps w:val="false"/>
                 <w:color w:val="1A1530"/>
-                <w:sz w:val="13"/>
-                <w:szCs w:val="13"/>
+                <w:sz w:val="18"/>
+                <w:szCs w:val="18"/>
               </w:rPr>
               <w:t xml:space="preserve">dosłowność, echolalie, inicjowanie dialogu, potrzeba AAC</w:t>
             </w:r>
@@ -3474,7 +3474,7 @@
           </w:tcPr>
           <w:p>
             <w:pPr>
-              <w:spacing w:after="0" w:before="0" w:line="230"/>
+              <w:spacing w:after="0" w:before="0" w:line="250"/>
               <w:jc w:val="left"/>
             </w:pPr>
             <w:r>
@@ -3486,8 +3486,8 @@
                 <w:iCs w:val="false"/>
                 <w:caps w:val="false"/>
                 <w:color w:val="2D1B69"/>
-                <w:sz w:val="13"/>
-                <w:szCs w:val="13"/>
+                <w:sz w:val="18"/>
+                <w:szCs w:val="18"/>
               </w:rPr>
               <w:t xml:space="preserve">d3 śr. 2,0 – średni</w:t>
             </w:r>
@@ -3518,7 +3518,7 @@
           </w:tcPr>
           <w:p>
             <w:pPr>
-              <w:spacing w:after="0" w:before="0" w:line="230"/>
+              <w:spacing w:after="0" w:before="0" w:line="250"/>
               <w:jc w:val="left"/>
             </w:pPr>
             <w:r>
@@ -3530,8 +3530,8 @@
                 <w:iCs w:val="false"/>
                 <w:caps w:val="false"/>
                 <w:color w:val="2D1B69"/>
-                <w:sz w:val="13"/>
-                <w:szCs w:val="13"/>
+                <w:sz w:val="18"/>
+                <w:szCs w:val="18"/>
               </w:rPr>
               <w:t xml:space="preserve">4 · Motoryka, poruszanie się, w tym mobilność i aktywność manualna</w:t>
             </w:r>
@@ -3556,7 +3556,7 @@
           </w:tcPr>
           <w:p>
             <w:pPr>
-              <w:spacing w:after="0" w:before="0" w:line="230"/>
+              <w:spacing w:after="0" w:before="0" w:line="250"/>
               <w:jc w:val="left"/>
             </w:pPr>
             <w:r>
@@ -3568,8 +3568,8 @@
                 <w:iCs w:val="false"/>
                 <w:caps w:val="false"/>
                 <w:color w:val="1A1530"/>
-                <w:sz w:val="13"/>
-                <w:szCs w:val="13"/>
+                <w:sz w:val="18"/>
+                <w:szCs w:val="18"/>
               </w:rPr>
               <w:t xml:space="preserve">motoryka duża, zabawy ruchowe</w:t>
             </w:r>
@@ -3594,7 +3594,7 @@
           </w:tcPr>
           <w:p>
             <w:pPr>
-              <w:spacing w:after="0" w:before="0" w:line="230"/>
+              <w:spacing w:after="0" w:before="0" w:line="250"/>
               <w:jc w:val="left"/>
             </w:pPr>
             <w:r>
@@ -3606,8 +3606,8 @@
                 <w:iCs w:val="false"/>
                 <w:caps w:val="false"/>
                 <w:color w:val="1A1530"/>
-                <w:sz w:val="13"/>
-                <w:szCs w:val="13"/>
+                <w:sz w:val="18"/>
+                <w:szCs w:val="18"/>
               </w:rPr>
               <w:t xml:space="preserve">motoryka mała, koordynacja, chwyt</w:t>
             </w:r>
@@ -3632,7 +3632,7 @@
           </w:tcPr>
           <w:p>
             <w:pPr>
-              <w:spacing w:after="0" w:before="0" w:line="230"/>
+              <w:spacing w:after="0" w:before="0" w:line="250"/>
               <w:jc w:val="left"/>
             </w:pPr>
             <w:r>
@@ -3644,8 +3644,8 @@
                 <w:iCs w:val="false"/>
                 <w:caps w:val="false"/>
                 <w:color w:val="2D1B69"/>
-                <w:sz w:val="13"/>
-                <w:szCs w:val="13"/>
+                <w:sz w:val="18"/>
+                <w:szCs w:val="18"/>
               </w:rPr>
               <w:t xml:space="preserve">d4 śr. 3,2 – niski</w:t>
             </w:r>
@@ -3676,7 +3676,7 @@
           </w:tcPr>
           <w:p>
             <w:pPr>
-              <w:spacing w:after="0" w:before="0" w:line="230"/>
+              <w:spacing w:after="0" w:before="0" w:line="250"/>
               <w:jc w:val="left"/>
             </w:pPr>
             <w:r>
@@ -3688,8 +3688,8 @@
                 <w:iCs w:val="false"/>
                 <w:caps w:val="false"/>
                 <w:color w:val="2D1B69"/>
-                <w:sz w:val="13"/>
-                <w:szCs w:val="13"/>
+                <w:sz w:val="18"/>
+                <w:szCs w:val="18"/>
               </w:rPr>
               <w:t xml:space="preserve">5 · Dbanie o siebie, samoobsługa i samodzielność</w:t>
             </w:r>
@@ -3714,7 +3714,7 @@
           </w:tcPr>
           <w:p>
             <w:pPr>
-              <w:spacing w:after="0" w:before="0" w:line="230"/>
+              <w:spacing w:after="0" w:before="0" w:line="250"/>
               <w:jc w:val="left"/>
             </w:pPr>
             <w:r>
@@ -3726,8 +3726,8 @@
                 <w:iCs w:val="false"/>
                 <w:caps w:val="false"/>
                 <w:color w:val="1A1530"/>
-                <w:sz w:val="13"/>
-                <w:szCs w:val="13"/>
+                <w:sz w:val="18"/>
+                <w:szCs w:val="18"/>
               </w:rPr>
               <w:t xml:space="preserve">higiena i toaleta, znajomość swoich rzeczy</w:t>
             </w:r>
@@ -3752,7 +3752,7 @@
           </w:tcPr>
           <w:p>
             <w:pPr>
-              <w:spacing w:after="0" w:before="0" w:line="230"/>
+              <w:spacing w:after="0" w:before="0" w:line="250"/>
               <w:jc w:val="left"/>
             </w:pPr>
             <w:r>
@@ -3764,8 +3764,8 @@
                 <w:iCs w:val="false"/>
                 <w:caps w:val="false"/>
                 <w:color w:val="1A1530"/>
-                <w:sz w:val="13"/>
-                <w:szCs w:val="13"/>
+                <w:sz w:val="18"/>
+                <w:szCs w:val="18"/>
               </w:rPr>
               <w:t xml:space="preserve">opór sensoryczny przy myciu rąk, wybiórczość pokarmowa, zapięcia</w:t>
             </w:r>
@@ -3790,7 +3790,7 @@
           </w:tcPr>
           <w:p>
             <w:pPr>
-              <w:spacing w:after="0" w:before="0" w:line="230"/>
+              <w:spacing w:after="0" w:before="0" w:line="250"/>
               <w:jc w:val="left"/>
             </w:pPr>
             <w:r>
@@ -3802,8 +3802,8 @@
                 <w:iCs w:val="false"/>
                 <w:caps w:val="false"/>
                 <w:color w:val="2D1B69"/>
-                <w:sz w:val="13"/>
-                <w:szCs w:val="13"/>
+                <w:sz w:val="18"/>
+                <w:szCs w:val="18"/>
               </w:rPr>
               <w:t xml:space="preserve">d5 śr. 2,2 – średni</w:t>
             </w:r>
@@ -3834,7 +3834,7 @@
           </w:tcPr>
           <w:p>
             <w:pPr>
-              <w:spacing w:after="0" w:before="0" w:line="230"/>
+              <w:spacing w:after="0" w:before="0" w:line="250"/>
               <w:jc w:val="left"/>
             </w:pPr>
             <w:r>
@@ -3846,8 +3846,8 @@
                 <w:iCs w:val="false"/>
                 <w:caps w:val="false"/>
                 <w:color w:val="2D1B69"/>
-                <w:sz w:val="13"/>
-                <w:szCs w:val="13"/>
+                <w:sz w:val="18"/>
+                <w:szCs w:val="18"/>
               </w:rPr>
               <w:t xml:space="preserve">6 · Życie domowe</w:t>
             </w:r>
@@ -3872,7 +3872,7 @@
           </w:tcPr>
           <w:p>
             <w:pPr>
-              <w:spacing w:after="0" w:before="0" w:line="230"/>
+              <w:spacing w:after="0" w:before="0" w:line="250"/>
               <w:jc w:val="left"/>
             </w:pPr>
             <w:r>
@@ -3884,8 +3884,8 @@
                 <w:iCs w:val="false"/>
                 <w:caps w:val="false"/>
                 <w:color w:val="1A1530"/>
-                <w:sz w:val="13"/>
-                <w:szCs w:val="13"/>
+                <w:sz w:val="18"/>
+                <w:szCs w:val="18"/>
               </w:rPr>
               <w:t xml:space="preserve">dyżur i sprzątanie po przypomnieniu</w:t>
             </w:r>
@@ -3910,7 +3910,7 @@
           </w:tcPr>
           <w:p>
             <w:pPr>
-              <w:spacing w:after="0" w:before="0" w:line="230"/>
+              <w:spacing w:after="0" w:before="0" w:line="250"/>
               <w:jc w:val="left"/>
             </w:pPr>
             <w:r>
@@ -3922,8 +3922,8 @@
                 <w:iCs w:val="false"/>
                 <w:caps w:val="false"/>
                 <w:color w:val="1A1530"/>
-                <w:sz w:val="13"/>
-                <w:szCs w:val="13"/>
+                <w:sz w:val="18"/>
+                <w:szCs w:val="18"/>
               </w:rPr>
               <w:t xml:space="preserve">brak inicjowania, niedoprowadzanie do końca</w:t>
             </w:r>
@@ -3948,7 +3948,7 @@
           </w:tcPr>
           <w:p>
             <w:pPr>
-              <w:spacing w:after="0" w:before="0" w:line="230"/>
+              <w:spacing w:after="0" w:before="0" w:line="250"/>
               <w:jc w:val="left"/>
             </w:pPr>
             <w:r>
@@ -3960,8 +3960,8 @@
                 <w:iCs w:val="false"/>
                 <w:caps w:val="false"/>
                 <w:color w:val="2D1B69"/>
-                <w:sz w:val="13"/>
-                <w:szCs w:val="13"/>
+                <w:sz w:val="18"/>
+                <w:szCs w:val="18"/>
               </w:rPr>
               <w:t xml:space="preserve">d6 śr. 2,8 – niski</w:t>
             </w:r>
@@ -3992,7 +3992,7 @@
           </w:tcPr>
           <w:p>
             <w:pPr>
-              <w:spacing w:after="0" w:before="0" w:line="230"/>
+              <w:spacing w:after="0" w:before="0" w:line="250"/>
               <w:jc w:val="left"/>
             </w:pPr>
             <w:r>
@@ -4004,8 +4004,8 @@
                 <w:iCs w:val="false"/>
                 <w:caps w:val="false"/>
                 <w:color w:val="2D1B69"/>
-                <w:sz w:val="13"/>
-                <w:szCs w:val="13"/>
+                <w:sz w:val="18"/>
+                <w:szCs w:val="18"/>
               </w:rPr>
               <w:t xml:space="preserve">7 · Wzajemne kontakty i związki międzyludzkie, życie w społeczności szkolnej i lokalnej</w:t>
             </w:r>
@@ -4030,7 +4030,7 @@
           </w:tcPr>
           <w:p>
             <w:pPr>
-              <w:spacing w:after="0" w:before="0" w:line="230"/>
+              <w:spacing w:after="0" w:before="0" w:line="250"/>
               <w:jc w:val="left"/>
             </w:pPr>
             <w:r>
@@ -4042,8 +4042,8 @@
                 <w:iCs w:val="false"/>
                 <w:caps w:val="false"/>
                 <w:color w:val="1A1530"/>
-                <w:sz w:val="13"/>
-                <w:szCs w:val="13"/>
+                <w:sz w:val="18"/>
+                <w:szCs w:val="18"/>
               </w:rPr>
               <w:t xml:space="preserve">bliskość grupy, reakcja na stałych dorosłych; udział w wydarzeniach po przygotowaniu</w:t>
             </w:r>
@@ -4068,7 +4068,7 @@
           </w:tcPr>
           <w:p>
             <w:pPr>
-              <w:spacing w:after="0" w:before="0" w:line="230"/>
+              <w:spacing w:after="0" w:before="0" w:line="250"/>
               <w:jc w:val="left"/>
             </w:pPr>
             <w:r>
@@ -4080,8 +4080,8 @@
                 <w:iCs w:val="false"/>
                 <w:caps w:val="false"/>
                 <w:color w:val="1A1530"/>
-                <w:sz w:val="13"/>
-                <w:szCs w:val="13"/>
+                <w:sz w:val="18"/>
+                <w:szCs w:val="18"/>
               </w:rPr>
               <w:t xml:space="preserve">odczytywanie emocji i intencji, tolerancja frustracji, konflikty; przeciążenie w apelach i wyjściach – wycofanie lub zachowania trudne</w:t>
             </w:r>
@@ -4106,7 +4106,7 @@
           </w:tcPr>
           <w:p>
             <w:pPr>
-              <w:spacing w:after="0" w:before="0" w:line="230"/>
+              <w:spacing w:after="0" w:before="0" w:line="250"/>
               <w:jc w:val="left"/>
             </w:pPr>
             <w:r>
@@ -4118,8 +4118,8 @@
                 <w:iCs w:val="false"/>
                 <w:caps w:val="false"/>
                 <w:color w:val="2D1B69"/>
-                <w:sz w:val="13"/>
-                <w:szCs w:val="13"/>
+                <w:sz w:val="18"/>
+                <w:szCs w:val="18"/>
               </w:rPr>
               <w:t xml:space="preserve">d7 śr. 1,6 · d9 śr. 1,8 – wysoki</w:t>
             </w:r>
@@ -4141,8 +4141,8 @@
           <w:iCs w:val="false"/>
           <w:caps w:val="false"/>
           <w:color w:val="2D1B69"/>
-          <w:sz w:val="14"/>
-          <w:szCs w:val="14"/>
+          <w:sz w:val="18"/>
+          <w:szCs w:val="18"/>
         </w:rPr>
         <w:t xml:space="preserve">Wynik ogólny: 68 / 180 pkt, średnia 2,1 (skala 0–5) – umiarkowana potrzeba wsparcia; trzy domeny na poziomie wysokim (d2, d7, d9).</w:t>
       </w:r>
@@ -4151,7 +4151,7 @@
       <w:pPr>
         <w:keepNext/>
         <w:pBdr>
-          <w:bottom w:val="single" w:color="D9D0F0" w:sz="4" w:space="4"/>
+          <w:bottom w:val="single" w:color="D9D0F0" w:sz="18" w:space="4"/>
         </w:pBdr>
         <w:spacing w:after="100" w:before="180"/>
       </w:pPr>
@@ -4164,8 +4164,8 @@
           <w:iCs w:val="false"/>
           <w:caps w:val="false"/>
           <w:color w:val="E74509"/>
-          <w:sz w:val="18"/>
-          <w:szCs w:val="18"/>
+          <w:sz w:val="24"/>
+          <w:szCs w:val="24"/>
         </w:rPr>
         <w:t xml:space="preserve">4.  </w:t>
       </w:r>
@@ -4179,8 +4179,8 @@
           <w:caps w:val="false"/>
           <w:color w:val="2D1B69"/>
           <w:spacing w:val="8"/>
-          <w:sz w:val="17"/>
-          <w:szCs w:val="17"/>
+          <w:sz w:val="24"/>
+          <w:szCs w:val="24"/>
         </w:rPr>
         <w:t xml:space="preserve">ZAKRES I RODZAJ TRUDNOŚCI W REALIZACJI PROGRAMU WYCHOWANIA PRZEDSZKOLNEGO / PROGRAMÓW NAUCZANIA REALIZOWANYCH W ODDZIALE (§ 7 UST. 7 PKT 2)</w:t>
       </w:r>
@@ -4199,8 +4199,8 @@
           <w:iCs w:val="false"/>
           <w:caps w:val="false"/>
           <w:color w:val="E74509"/>
-          <w:sz w:val="14"/>
-          <w:szCs w:val="14"/>
+          <w:sz w:val="18"/>
+          <w:szCs w:val="18"/>
         </w:rPr>
         <w:t xml:space="preserve">•  </w:t>
       </w:r>
@@ -4213,8 +4213,8 @@
           <w:iCs w:val="false"/>
           <w:caps w:val="false"/>
           <w:color w:val="1A1530"/>
-          <w:sz w:val="14"/>
-          <w:szCs w:val="14"/>
+          <w:sz w:val="18"/>
+          <w:szCs w:val="18"/>
         </w:rPr>
         <w:t xml:space="preserve">Program wychowania przedszkolnego / programy nauczania: [nazwa programu, oddział].</w:t>
       </w:r>
@@ -4233,8 +4233,8 @@
           <w:iCs w:val="false"/>
           <w:caps w:val="false"/>
           <w:color w:val="E74509"/>
-          <w:sz w:val="14"/>
-          <w:szCs w:val="14"/>
+          <w:sz w:val="18"/>
+          <w:szCs w:val="18"/>
         </w:rPr>
         <w:t xml:space="preserve">•  </w:t>
       </w:r>
@@ -4247,8 +4247,8 @@
           <w:iCs w:val="false"/>
           <w:caps w:val="false"/>
           <w:color w:val="1A1530"/>
-          <w:sz w:val="14"/>
-          <w:szCs w:val="14"/>
+          <w:sz w:val="18"/>
+          <w:szCs w:val="18"/>
         </w:rPr>
         <w:t xml:space="preserve">Rozumienie poleceń złożonych i samodzielna organizacja pracy – wymaga instrukcji krok po kroku wspartych obrazem; bez dostosowania rezygnuje z zadania.</w:t>
       </w:r>
@@ -4267,8 +4267,8 @@
           <w:iCs w:val="false"/>
           <w:caps w:val="false"/>
           <w:color w:val="E74509"/>
-          <w:sz w:val="14"/>
-          <w:szCs w:val="14"/>
+          <w:sz w:val="18"/>
+          <w:szCs w:val="18"/>
         </w:rPr>
         <w:t xml:space="preserve">•  </w:t>
       </w:r>
@@ -4281,8 +4281,8 @@
           <w:iCs w:val="false"/>
           <w:caps w:val="false"/>
           <w:color w:val="1A1530"/>
-          <w:sz w:val="14"/>
-          <w:szCs w:val="14"/>
+          <w:sz w:val="18"/>
+          <w:szCs w:val="18"/>
         </w:rPr>
         <w:t xml:space="preserve">Utrzymanie uwagi na zadaniu (obecnie do 8 min po dostosowaniu środowiska) i szybka męczliwość przy zadaniach pisemnych i wykonawczych.</w:t>
       </w:r>
@@ -4301,8 +4301,8 @@
           <w:iCs w:val="false"/>
           <w:caps w:val="false"/>
           <w:color w:val="E74509"/>
-          <w:sz w:val="14"/>
-          <w:szCs w:val="14"/>
+          <w:sz w:val="18"/>
+          <w:szCs w:val="18"/>
         </w:rPr>
         <w:t xml:space="preserve">•  </w:t>
       </w:r>
@@ -4315,8 +4315,8 @@
           <w:iCs w:val="false"/>
           <w:caps w:val="false"/>
           <w:color w:val="1A1530"/>
-          <w:sz w:val="14"/>
-          <w:szCs w:val="14"/>
+          <w:sz w:val="18"/>
+          <w:szCs w:val="18"/>
         </w:rPr>
         <w:t xml:space="preserve">Uczestnictwo w zajęciach grupowych, apelach i wyjściach – przeciążenie sensoryczne prowadzi do wycofania lub zachowań trudnych.</w:t>
       </w:r>
@@ -4335,8 +4335,8 @@
           <w:iCs w:val="false"/>
           <w:caps w:val="false"/>
           <w:color w:val="E74509"/>
-          <w:sz w:val="14"/>
-          <w:szCs w:val="14"/>
+          <w:sz w:val="18"/>
+          <w:szCs w:val="18"/>
         </w:rPr>
         <w:t xml:space="preserve">•  </w:t>
       </w:r>
@@ -4349,8 +4349,8 @@
           <w:iCs w:val="false"/>
           <w:caps w:val="false"/>
           <w:color w:val="1A1530"/>
-          <w:sz w:val="14"/>
-          <w:szCs w:val="14"/>
+          <w:sz w:val="18"/>
+          <w:szCs w:val="18"/>
         </w:rPr>
         <w:t xml:space="preserve">Komunikacja z rówieśnikami i nauczycielem w sytuacjach swobodnych – potrzeba wsparcia AAC i skryptów dialogowych.</w:t>
       </w:r>
@@ -4369,8 +4369,8 @@
           <w:iCs w:val="false"/>
           <w:caps w:val="false"/>
           <w:color w:val="E74509"/>
-          <w:sz w:val="14"/>
-          <w:szCs w:val="14"/>
+          <w:sz w:val="18"/>
+          <w:szCs w:val="18"/>
         </w:rPr>
         <w:t xml:space="preserve">•  </w:t>
       </w:r>
@@ -4383,8 +4383,8 @@
           <w:iCs w:val="false"/>
           <w:caps w:val="false"/>
           <w:color w:val="1A1530"/>
-          <w:sz w:val="14"/>
-          <w:szCs w:val="14"/>
+          <w:sz w:val="18"/>
+          <w:szCs w:val="18"/>
         </w:rPr>
         <w:t xml:space="preserve">Grafomotoryka, czynności manualne (chwyt, wycinanie) oraz samoobsługa przy posiłkach i toalecie – realizowane w wydłużonym czasie z dostosowanymi przyborami.</w:t>
       </w:r>
@@ -4403,8 +4403,8 @@
           <w:iCs w:val="false"/>
           <w:caps w:val="false"/>
           <w:color w:val="E74509"/>
-          <w:sz w:val="14"/>
-          <w:szCs w:val="14"/>
+          <w:sz w:val="18"/>
+          <w:szCs w:val="18"/>
         </w:rPr>
         <w:t xml:space="preserve">•  </w:t>
       </w:r>
@@ -4417,8 +4417,8 @@
           <w:iCs w:val="false"/>
           <w:caps w:val="false"/>
           <w:color w:val="1A1530"/>
-          <w:sz w:val="14"/>
-          <w:szCs w:val="14"/>
+          <w:sz w:val="18"/>
+          <w:szCs w:val="18"/>
         </w:rPr>
         <w:t xml:space="preserve">Wprowadzone dostosowania w toku realizacji programu: plany aktywności, instrukcje jednoetapowe, wydłużony czas, przerwy sensoryczne, ocena postępu względem samego siebie.</w:t>
       </w:r>
@@ -4437,15 +4437,15 @@
           <w:iCs w:val="false"/>
           <w:caps w:val="false"/>
           <w:color w:val="1A1530"/>
-          <w:sz w:val="2"/>
-          <w:szCs w:val="2"/>
+          <w:sz w:val="18"/>
+          <w:szCs w:val="18"/>
         </w:rPr>
         <w:t xml:space="preserve"/>
       </w:r>
     </w:p>
     <w:tbl>
       <w:tblPr>
-        <w:tblW w:type="dxa" w:w="9906"/>
+        <w:tblW w:type="dxa" w:w="10206"/>
         <w:tblBorders>
           <w:top w:val="single" w:color="auto" w:sz="4"/>
           <w:left w:val="single" w:color="auto" w:sz="4"/>
@@ -4456,8 +4456,8 @@
         </w:tblBorders>
       </w:tblPr>
       <w:tblGrid>
-        <w:gridCol w:w="4953"/>
-        <w:gridCol w:w="4953"/>
+        <w:gridCol w:w="5103"/>
+        <w:gridCol w:w="5103"/>
       </w:tblGrid>
       <w:tr>
         <w:trPr>
@@ -4465,12 +4465,12 @@
         </w:trPr>
         <w:tc>
           <w:tcPr>
-            <w:tcW w:type="dxa" w:w="4953"/>
-            <w:tcBorders>
-              <w:top w:val="dashed" w:color="D9D0F0" w:sz="4"/>
-              <w:left w:val="dashed" w:color="D9D0F0" w:sz="4"/>
-              <w:bottom w:val="dashed" w:color="D9D0F0" w:sz="4"/>
-              <w:right w:val="dashed" w:color="D9D0F0" w:sz="4"/>
+            <w:tcW w:type="dxa" w:w="5103"/>
+            <w:tcBorders>
+              <w:top w:val="dashed" w:color="D9D0F0" w:sz="18"/>
+              <w:left w:val="dashed" w:color="D9D0F0" w:sz="18"/>
+              <w:bottom w:val="dashed" w:color="D9D0F0" w:sz="18"/>
+              <w:right w:val="dashed" w:color="D9D0F0" w:sz="18"/>
             </w:tcBorders>
             <w:tcMar>
               <w:top w:type="dxa" w:w="120"/>
@@ -4494,8 +4494,8 @@
                 <w:iCs w:val="false"/>
                 <w:caps w:val="false"/>
                 <w:color w:val="2D1B69"/>
-                <w:sz w:val="17"/>
-                <w:szCs w:val="17"/>
+                <w:sz w:val="24"/>
+                <w:szCs w:val="24"/>
               </w:rPr>
               <w:t xml:space="preserve">[Nazwa przedszkola / szkoły]</w:t>
             </w:r>
@@ -4514,8 +4514,8 @@
                 <w:iCs w:val="false"/>
                 <w:caps w:val="false"/>
                 <w:color w:val="6B6378"/>
-                <w:sz w:val="13"/>
-                <w:szCs w:val="13"/>
+                <w:sz w:val="18"/>
+                <w:szCs w:val="18"/>
               </w:rPr>
               <w:t xml:space="preserve">[Adres placówki, tel., e-mail]</w:t>
             </w:r>
@@ -4534,8 +4534,8 @@
                 <w:iCs w:val="false"/>
                 <w:caps w:val="false"/>
                 <w:color w:val="6B6378"/>
-                <w:sz w:val="11"/>
-                <w:szCs w:val="11"/>
+                <w:sz w:val="18"/>
+                <w:szCs w:val="18"/>
               </w:rPr>
               <w:t xml:space="preserve">(pieczęć placówki)</w:t>
             </w:r>
@@ -4543,7 +4543,7 @@
         </w:tc>
         <w:tc>
           <w:tcPr>
-            <w:tcW w:type="dxa" w:w="4953"/>
+            <w:tcW w:type="dxa" w:w="5103"/>
             <w:tcBorders>
               <w:top w:val="nil"/>
               <w:left w:val="nil"/>
@@ -4572,8 +4572,8 @@
                 <w:iCs w:val="false"/>
                 <w:caps w:val="false"/>
                 <w:color w:val="6B6378"/>
-                <w:sz w:val="14"/>
-                <w:szCs w:val="14"/>
+                <w:sz w:val="18"/>
+                <w:szCs w:val="18"/>
               </w:rPr>
               <w:t xml:space="preserve">[Miejscowość], dnia ………………………</w:t>
             </w:r>
@@ -4592,8 +4592,8 @@
                 <w:iCs w:val="false"/>
                 <w:caps w:val="false"/>
                 <w:color w:val="6B6378"/>
-                <w:sz w:val="14"/>
-                <w:szCs w:val="14"/>
+                <w:sz w:val="18"/>
+                <w:szCs w:val="18"/>
               </w:rPr>
               <w:t xml:space="preserve">Znak sprawy: ………………………</w:t>
             </w:r>
@@ -4612,8 +4612,8 @@
                 <w:iCs w:val="false"/>
                 <w:caps w:val="false"/>
                 <w:color w:val="6B6378"/>
-                <w:sz w:val="14"/>
-                <w:szCs w:val="14"/>
+                <w:sz w:val="18"/>
+                <w:szCs w:val="18"/>
               </w:rPr>
               <w:t xml:space="preserve">Zespół orzekający: [Nazwa Poradni Psychologiczno-Pedagogicznej]</w:t>
             </w:r>
@@ -4630,7 +4630,7 @@
       <w:pPr>
         <w:keepNext/>
         <w:pBdr>
-          <w:bottom w:val="single" w:color="D9D0F0" w:sz="4" w:space="4"/>
+          <w:bottom w:val="single" w:color="D9D0F0" w:sz="18" w:space="4"/>
         </w:pBdr>
         <w:spacing w:after="100" w:before="180"/>
       </w:pPr>
@@ -4643,8 +4643,8 @@
           <w:iCs w:val="false"/>
           <w:caps w:val="false"/>
           <w:color w:val="E74509"/>
-          <w:sz w:val="18"/>
-          <w:szCs w:val="18"/>
+          <w:sz w:val="24"/>
+          <w:szCs w:val="24"/>
         </w:rPr>
         <w:t xml:space="preserve">5.  </w:t>
       </w:r>
@@ -4658,8 +4658,8 @@
           <w:caps w:val="false"/>
           <w:color w:val="2D1B69"/>
           <w:spacing w:val="8"/>
-          <w:sz w:val="17"/>
-          <w:szCs w:val="17"/>
+          <w:sz w:val="24"/>
+          <w:szCs w:val="24"/>
         </w:rPr>
         <w:t xml:space="preserve">ZAŁĄCZNIKI EWALUACYJNE (§ 7 UST. 6 PKT 4–5)</w:t>
       </w:r>
@@ -4678,8 +4678,8 @@
           <w:iCs w:val="false"/>
           <w:caps w:val="false"/>
           <w:color w:val="E74509"/>
-          <w:sz w:val="20"/>
-          <w:szCs w:val="20"/>
+          <w:sz w:val="24"/>
+          <w:szCs w:val="24"/>
         </w:rPr>
         <w:t xml:space="preserve">☑  </w:t>
       </w:r>
@@ -4692,8 +4692,8 @@
           <w:iCs w:val="false"/>
           <w:caps w:val="false"/>
           <w:color w:val="1A1530"/>
-          <w:sz w:val="14"/>
-          <w:szCs w:val="14"/>
+          <w:sz w:val="18"/>
+          <w:szCs w:val="18"/>
         </w:rPr>
         <w:t xml:space="preserve">Aktualna wielospecjalistyczna ocena poziomu funkcjonowania dziecka / ucznia (WOPF) – dziecko / uczeń objęty kształceniem specjalnym (pkt 4)</w:t>
       </w:r>
@@ -4712,8 +4712,8 @@
           <w:iCs w:val="false"/>
           <w:caps w:val="false"/>
           <w:color w:val="B6A6DF"/>
-          <w:sz w:val="20"/>
-          <w:szCs w:val="20"/>
+          <w:sz w:val="24"/>
+          <w:szCs w:val="24"/>
         </w:rPr>
         <w:t xml:space="preserve">☐  </w:t>
       </w:r>
@@ -4726,8 +4726,8 @@
           <w:iCs w:val="false"/>
           <w:caps w:val="false"/>
           <w:color w:val="1A1530"/>
-          <w:sz w:val="14"/>
-          <w:szCs w:val="14"/>
+          <w:sz w:val="18"/>
+          <w:szCs w:val="18"/>
         </w:rPr>
         <w:t xml:space="preserve">Aktualna okresowa ocena funkcjonowania – dziecko / uczeń objęty zajęciami rewalidacyjno-wychowawczymi (pkt 5)</w:t>
       </w:r>
@@ -4746,8 +4746,8 @@
           <w:iCs w:val="false"/>
           <w:caps w:val="false"/>
           <w:color w:val="B6A6DF"/>
-          <w:sz w:val="20"/>
-          <w:szCs w:val="20"/>
+          <w:sz w:val="24"/>
+          <w:szCs w:val="24"/>
         </w:rPr>
         <w:t xml:space="preserve">☐  </w:t>
       </w:r>
@@ -4760,8 +4760,8 @@
           <w:iCs w:val="false"/>
           <w:caps w:val="false"/>
           <w:color w:val="1A1530"/>
-          <w:sz w:val="14"/>
-          <w:szCs w:val="14"/>
+          <w:sz w:val="18"/>
+          <w:szCs w:val="18"/>
         </w:rPr>
         <w:t xml:space="preserve">Nie dotyczy – dziecko / uczeń nieobjęty kształceniem specjalnym ani zajęciami rewalidacyjno-wychowawczymi</w:t>
       </w:r>
@@ -4770,7 +4770,7 @@
       <w:pPr>
         <w:keepNext/>
         <w:pBdr>
-          <w:bottom w:val="single" w:color="D9D0F0" w:sz="4" w:space="4"/>
+          <w:bottom w:val="single" w:color="D9D0F0" w:sz="18" w:space="4"/>
         </w:pBdr>
         <w:spacing w:after="100" w:before="180"/>
       </w:pPr>
@@ -4783,8 +4783,8 @@
           <w:iCs w:val="false"/>
           <w:caps w:val="false"/>
           <w:color w:val="E74509"/>
-          <w:sz w:val="18"/>
-          <w:szCs w:val="18"/>
+          <w:sz w:val="24"/>
+          <w:szCs w:val="24"/>
         </w:rPr>
         <w:t xml:space="preserve">6.  </w:t>
       </w:r>
@@ -4798,8 +4798,8 @@
           <w:caps w:val="false"/>
           <w:color w:val="2D1B69"/>
           <w:spacing w:val="8"/>
-          <w:sz w:val="17"/>
-          <w:szCs w:val="17"/>
+          <w:sz w:val="24"/>
+          <w:szCs w:val="24"/>
         </w:rPr>
         <w:t xml:space="preserve">DZIAŁANIA PODJĘTE PRZEZ NAUCZYCIELI, WYCHOWAWCÓW I SPECJALISTÓW W CELU POPRAWY FUNKCJONOWANIA; FORMY I ZAKRES POMOCY W RAMACH WCZESNEGO WSPOMAGANIA ROZWOJU LUB POMOCY PSYCHOLOGICZNO-PEDAGOGICZNEJ, OKRES ICH UDZIELANIA ORAZ EFEKTY (§ 7 UST. 6 PKT 6)</w:t>
       </w:r>
@@ -4859,8 +4859,8 @@
                 <w:caps/>
                 <w:color w:val="2D1B69"/>
                 <w:spacing w:val="10"/>
-                <w:sz w:val="13"/>
-                <w:szCs w:val="13"/>
+                <w:sz w:val="18"/>
+                <w:szCs w:val="18"/>
               </w:rPr>
               <w:t xml:space="preserve">Działanie / forma pomocy</w:t>
             </w:r>
@@ -4899,8 +4899,8 @@
                 <w:caps/>
                 <w:color w:val="2D1B69"/>
                 <w:spacing w:val="10"/>
-                <w:sz w:val="13"/>
-                <w:szCs w:val="13"/>
+                <w:sz w:val="18"/>
+                <w:szCs w:val="18"/>
               </w:rPr>
               <w:t xml:space="preserve">Zakres i wymiar</w:t>
             </w:r>
@@ -4939,8 +4939,8 @@
                 <w:caps/>
                 <w:color w:val="2D1B69"/>
                 <w:spacing w:val="10"/>
-                <w:sz w:val="13"/>
-                <w:szCs w:val="13"/>
+                <w:sz w:val="18"/>
+                <w:szCs w:val="18"/>
               </w:rPr>
               <w:t xml:space="preserve">Okres udzielania</w:t>
             </w:r>
@@ -4979,8 +4979,8 @@
                 <w:caps/>
                 <w:color w:val="2D1B69"/>
                 <w:spacing w:val="10"/>
-                <w:sz w:val="13"/>
-                <w:szCs w:val="13"/>
+                <w:sz w:val="18"/>
+                <w:szCs w:val="18"/>
               </w:rPr>
               <w:t xml:space="preserve">Efekty</w:t>
             </w:r>
@@ -5011,7 +5011,7 @@
           </w:tcPr>
           <w:p>
             <w:pPr>
-              <w:spacing w:after="0" w:before="0" w:line="230"/>
+              <w:spacing w:after="0" w:before="0" w:line="250"/>
               <w:jc w:val="left"/>
             </w:pPr>
             <w:r>
@@ -5023,8 +5023,8 @@
                 <w:iCs w:val="false"/>
                 <w:caps w:val="false"/>
                 <w:color w:val="2D1B69"/>
-                <w:sz w:val="13"/>
-                <w:szCs w:val="13"/>
+                <w:sz w:val="18"/>
+                <w:szCs w:val="18"/>
               </w:rPr>
               <w:t xml:space="preserve">Dostosowania środowiskowe i dydaktyczne</w:t>
             </w:r>
@@ -5049,7 +5049,7 @@
           </w:tcPr>
           <w:p>
             <w:pPr>
-              <w:spacing w:after="0" w:before="0" w:line="230"/>
+              <w:spacing w:after="0" w:before="0" w:line="250"/>
               <w:jc w:val="left"/>
             </w:pPr>
             <w:r>
@@ -5061,8 +5061,8 @@
                 <w:iCs w:val="false"/>
                 <w:caps w:val="false"/>
                 <w:color w:val="1A1530"/>
-                <w:sz w:val="13"/>
-                <w:szCs w:val="13"/>
+                <w:sz w:val="18"/>
+                <w:szCs w:val="18"/>
               </w:rPr>
               <w:t xml:space="preserve">strefa wyciszenia, redukcja bodźców, słuchawki wygłuszające, wizualny plan dnia, instrukcje krok po kroku</w:t>
             </w:r>
@@ -5087,7 +5087,7 @@
           </w:tcPr>
           <w:p>
             <w:pPr>
-              <w:spacing w:after="0" w:before="0" w:line="230"/>
+              <w:spacing w:after="0" w:before="0" w:line="250"/>
               <w:jc w:val="left"/>
             </w:pPr>
             <w:r>
@@ -5099,8 +5099,8 @@
                 <w:iCs w:val="false"/>
                 <w:caps w:val="false"/>
                 <w:color w:val="1A1530"/>
-                <w:sz w:val="13"/>
-                <w:szCs w:val="13"/>
+                <w:sz w:val="18"/>
+                <w:szCs w:val="18"/>
               </w:rPr>
               <w:t xml:space="preserve">od IX 2025 · codziennie · nadal</w:t>
             </w:r>
@@ -5125,7 +5125,7 @@
           </w:tcPr>
           <w:p>
             <w:pPr>
-              <w:spacing w:after="0" w:before="0" w:line="230"/>
+              <w:spacing w:after="0" w:before="0" w:line="250"/>
               <w:jc w:val="left"/>
             </w:pPr>
             <w:r>
@@ -5137,8 +5137,8 @@
                 <w:iCs w:val="false"/>
                 <w:caps w:val="false"/>
                 <w:color w:val="1A1530"/>
-                <w:sz w:val="13"/>
-                <w:szCs w:val="13"/>
+                <w:sz w:val="18"/>
+                <w:szCs w:val="18"/>
               </w:rPr>
               <w:t xml:space="preserve">spadek epizodów zachowań trudnych o ok. 40%; wydłużenie skupienia z 3 do 8 min</w:t>
             </w:r>
@@ -5169,7 +5169,7 @@
           </w:tcPr>
           <w:p>
             <w:pPr>
-              <w:spacing w:after="0" w:before="0" w:line="230"/>
+              <w:spacing w:after="0" w:before="0" w:line="250"/>
               <w:jc w:val="left"/>
             </w:pPr>
             <w:r>
@@ -5181,8 +5181,8 @@
                 <w:iCs w:val="false"/>
                 <w:caps w:val="false"/>
                 <w:color w:val="2D1B69"/>
-                <w:sz w:val="13"/>
-                <w:szCs w:val="13"/>
+                <w:sz w:val="18"/>
+                <w:szCs w:val="18"/>
               </w:rPr>
               <w:t xml:space="preserve">Pomoc psychologiczno-pedagogiczna</w:t>
             </w:r>
@@ -5207,7 +5207,7 @@
           </w:tcPr>
           <w:p>
             <w:pPr>
-              <w:spacing w:after="0" w:before="0" w:line="230"/>
+              <w:spacing w:after="0" w:before="0" w:line="250"/>
               <w:jc w:val="left"/>
             </w:pPr>
             <w:r>
@@ -5219,8 +5219,8 @@
                 <w:iCs w:val="false"/>
                 <w:caps w:val="false"/>
                 <w:color w:val="1A1530"/>
-                <w:sz w:val="13"/>
-                <w:szCs w:val="13"/>
+                <w:sz w:val="18"/>
+                <w:szCs w:val="18"/>
               </w:rPr>
               <w:t xml:space="preserve">zajęcia rozwijające kompetencje emocjonalno-społeczne 1 × 45 min; logopedyczne 1 × 45 min; korekcyjno-kompensacyjne 1 × 45 min; integracja sensoryczna 1 × 45 min; porady i konsultacje dla rodziców 1 × 30 min tygodniowo</w:t>
             </w:r>
@@ -5245,7 +5245,7 @@
           </w:tcPr>
           <w:p>
             <w:pPr>
-              <w:spacing w:after="0" w:before="0" w:line="230"/>
+              <w:spacing w:after="0" w:before="0" w:line="250"/>
               <w:jc w:val="left"/>
             </w:pPr>
             <w:r>
@@ -5257,8 +5257,8 @@
                 <w:iCs w:val="false"/>
                 <w:caps w:val="false"/>
                 <w:color w:val="1A1530"/>
-                <w:sz w:val="13"/>
-                <w:szCs w:val="13"/>
+                <w:sz w:val="18"/>
+                <w:szCs w:val="18"/>
               </w:rPr>
               <w:t xml:space="preserve">od X 2025 · 10 miesięcy · nadal</w:t>
             </w:r>
@@ -5283,7 +5283,7 @@
           </w:tcPr>
           <w:p>
             <w:pPr>
-              <w:spacing w:after="0" w:before="0" w:line="230"/>
+              <w:spacing w:after="0" w:before="0" w:line="250"/>
               <w:jc w:val="left"/>
             </w:pPr>
             <w:r>
@@ -5295,8 +5295,8 @@
                 <w:iCs w:val="false"/>
                 <w:caps w:val="false"/>
                 <w:color w:val="1A1530"/>
-                <w:sz w:val="13"/>
-                <w:szCs w:val="13"/>
+                <w:sz w:val="18"/>
+                <w:szCs w:val="18"/>
               </w:rPr>
               <w:t xml:space="preserve">lepsze tolerowanie obecności dzieci w zajęciach kierowanych; pierwsze prośby o przerwę gestem / piktogramem</w:t>
             </w:r>
@@ -5327,7 +5327,7 @@
           </w:tcPr>
           <w:p>
             <w:pPr>
-              <w:spacing w:after="0" w:before="0" w:line="230"/>
+              <w:spacing w:after="0" w:before="0" w:line="250"/>
               <w:jc w:val="left"/>
             </w:pPr>
             <w:r>
@@ -5339,8 +5339,8 @@
                 <w:iCs w:val="false"/>
                 <w:caps w:val="false"/>
                 <w:color w:val="2D1B69"/>
-                <w:sz w:val="13"/>
-                <w:szCs w:val="13"/>
+                <w:sz w:val="18"/>
+                <w:szCs w:val="18"/>
               </w:rPr>
               <w:t xml:space="preserve">Zajęcia rewalidacyjne (dziecko z orzeczeniem)</w:t>
             </w:r>
@@ -5365,7 +5365,7 @@
           </w:tcPr>
           <w:p>
             <w:pPr>
-              <w:spacing w:after="0" w:before="0" w:line="230"/>
+              <w:spacing w:after="0" w:before="0" w:line="250"/>
               <w:jc w:val="left"/>
             </w:pPr>
             <w:r>
@@ -5377,8 +5377,8 @@
                 <w:iCs w:val="false"/>
                 <w:caps w:val="false"/>
                 <w:color w:val="1A1530"/>
-                <w:sz w:val="13"/>
-                <w:szCs w:val="13"/>
+                <w:sz w:val="18"/>
+                <w:szCs w:val="18"/>
               </w:rPr>
               <w:t xml:space="preserve">2 godz. tygodniowo: komunikacja i AAC, umiejętności społeczne i ToM, motoryka mała</w:t>
             </w:r>
@@ -5403,7 +5403,7 @@
           </w:tcPr>
           <w:p>
             <w:pPr>
-              <w:spacing w:after="0" w:before="0" w:line="230"/>
+              <w:spacing w:after="0" w:before="0" w:line="250"/>
               <w:jc w:val="left"/>
             </w:pPr>
             <w:r>
@@ -5415,8 +5415,8 @@
                 <w:iCs w:val="false"/>
                 <w:caps w:val="false"/>
                 <w:color w:val="1A1530"/>
-                <w:sz w:val="13"/>
-                <w:szCs w:val="13"/>
+                <w:sz w:val="18"/>
+                <w:szCs w:val="18"/>
               </w:rPr>
               <w:t xml:space="preserve">od IX 2025 · 1 rok szkolny</w:t>
             </w:r>
@@ -5441,7 +5441,7 @@
           </w:tcPr>
           <w:p>
             <w:pPr>
-              <w:spacing w:after="0" w:before="0" w:line="230"/>
+              <w:spacing w:after="0" w:before="0" w:line="250"/>
               <w:jc w:val="left"/>
             </w:pPr>
             <w:r>
@@ -5453,8 +5453,8 @@
                 <w:iCs w:val="false"/>
                 <w:caps w:val="false"/>
                 <w:color w:val="1A1530"/>
-                <w:sz w:val="13"/>
-                <w:szCs w:val="13"/>
+                <w:sz w:val="18"/>
+                <w:szCs w:val="18"/>
               </w:rPr>
               <w:t xml:space="preserve">wzrost liczby komunikatów intencjonalnych; poprawa chwytu</w:t>
             </w:r>
@@ -5485,7 +5485,7 @@
           </w:tcPr>
           <w:p>
             <w:pPr>
-              <w:spacing w:after="0" w:before="0" w:line="230"/>
+              <w:spacing w:after="0" w:before="0" w:line="250"/>
               <w:jc w:val="left"/>
             </w:pPr>
             <w:r>
@@ -5497,8 +5497,8 @@
                 <w:iCs w:val="false"/>
                 <w:caps w:val="false"/>
                 <w:color w:val="2D1B69"/>
-                <w:sz w:val="13"/>
-                <w:szCs w:val="13"/>
+                <w:sz w:val="18"/>
+                <w:szCs w:val="18"/>
               </w:rPr>
               <w:t xml:space="preserve">Wczesne wspomaganie rozwoju (WWRD)</w:t>
             </w:r>
@@ -5523,7 +5523,7 @@
           </w:tcPr>
           <w:p>
             <w:pPr>
-              <w:spacing w:after="0" w:before="0" w:line="230"/>
+              <w:spacing w:after="0" w:before="0" w:line="250"/>
               <w:jc w:val="left"/>
             </w:pPr>
             <w:r>
@@ -5535,8 +5535,8 @@
                 <w:iCs w:val="false"/>
                 <w:caps w:val="false"/>
                 <w:color w:val="1A1530"/>
-                <w:sz w:val="13"/>
-                <w:szCs w:val="13"/>
+                <w:sz w:val="18"/>
+                <w:szCs w:val="18"/>
               </w:rPr>
               <w:t xml:space="preserve">☐ nie dotyczy  ☐ realizowane w: [placówka] – zakres: [zakres]</w:t>
             </w:r>
@@ -5561,7 +5561,7 @@
           </w:tcPr>
           <w:p>
             <w:pPr>
-              <w:spacing w:after="0" w:before="0" w:line="230"/>
+              <w:spacing w:after="0" w:before="0" w:line="250"/>
               <w:jc w:val="left"/>
             </w:pPr>
             <w:r>
@@ -5573,8 +5573,8 @@
                 <w:iCs w:val="false"/>
                 <w:caps w:val="false"/>
                 <w:color w:val="1A1530"/>
-                <w:sz w:val="13"/>
-                <w:szCs w:val="13"/>
+                <w:sz w:val="18"/>
+                <w:szCs w:val="18"/>
               </w:rPr>
               <w:t xml:space="preserve">[od – do]</w:t>
             </w:r>
@@ -5599,7 +5599,7 @@
           </w:tcPr>
           <w:p>
             <w:pPr>
-              <w:spacing w:after="0" w:before="0" w:line="230"/>
+              <w:spacing w:after="0" w:before="0" w:line="250"/>
               <w:jc w:val="left"/>
             </w:pPr>
             <w:r>
@@ -5611,8 +5611,8 @@
                 <w:iCs w:val="false"/>
                 <w:caps w:val="false"/>
                 <w:color w:val="1A1530"/>
-                <w:sz w:val="13"/>
-                <w:szCs w:val="13"/>
+                <w:sz w:val="18"/>
+                <w:szCs w:val="18"/>
               </w:rPr>
               <w:t xml:space="preserve">[efekty]</w:t>
             </w:r>
@@ -5643,7 +5643,7 @@
           </w:tcPr>
           <w:p>
             <w:pPr>
-              <w:spacing w:after="0" w:before="0" w:line="230"/>
+              <w:spacing w:after="0" w:before="0" w:line="250"/>
               <w:jc w:val="left"/>
             </w:pPr>
             <w:r>
@@ -5655,8 +5655,8 @@
                 <w:iCs w:val="false"/>
                 <w:caps w:val="false"/>
                 <w:color w:val="2D1B69"/>
-                <w:sz w:val="13"/>
-                <w:szCs w:val="13"/>
+                <w:sz w:val="18"/>
+                <w:szCs w:val="18"/>
               </w:rPr>
               <w:t xml:space="preserve">Współpraca z rodzicami</w:t>
             </w:r>
@@ -5681,7 +5681,7 @@
           </w:tcPr>
           <w:p>
             <w:pPr>
-              <w:spacing w:after="0" w:before="0" w:line="230"/>
+              <w:spacing w:after="0" w:before="0" w:line="250"/>
               <w:jc w:val="left"/>
             </w:pPr>
             <w:r>
@@ -5693,8 +5693,8 @@
                 <w:iCs w:val="false"/>
                 <w:caps w:val="false"/>
                 <w:color w:val="1A1530"/>
-                <w:sz w:val="13"/>
-                <w:szCs w:val="13"/>
+                <w:sz w:val="18"/>
+                <w:szCs w:val="18"/>
               </w:rPr>
               <w:t xml:space="preserve">konsultacje cotygodniowe, zeszyt korespondencji, wspólny system komunikatów i wzmocnień, instruktaż AAC w domu</w:t>
             </w:r>
@@ -5719,7 +5719,7 @@
           </w:tcPr>
           <w:p>
             <w:pPr>
-              <w:spacing w:after="0" w:before="0" w:line="230"/>
+              <w:spacing w:after="0" w:before="0" w:line="250"/>
               <w:jc w:val="left"/>
             </w:pPr>
             <w:r>
@@ -5731,8 +5731,8 @@
                 <w:iCs w:val="false"/>
                 <w:caps w:val="false"/>
                 <w:color w:val="1A1530"/>
-                <w:sz w:val="13"/>
-                <w:szCs w:val="13"/>
+                <w:sz w:val="18"/>
+                <w:szCs w:val="18"/>
               </w:rPr>
               <w:t xml:space="preserve">od IX 2025 · nadal</w:t>
             </w:r>
@@ -5757,7 +5757,7 @@
           </w:tcPr>
           <w:p>
             <w:pPr>
-              <w:spacing w:after="0" w:before="0" w:line="230"/>
+              <w:spacing w:after="0" w:before="0" w:line="250"/>
               <w:jc w:val="left"/>
             </w:pPr>
             <w:r>
@@ -5769,8 +5769,8 @@
                 <w:iCs w:val="false"/>
                 <w:caps w:val="false"/>
                 <w:color w:val="1A1530"/>
-                <w:sz w:val="13"/>
-                <w:szCs w:val="13"/>
+                <w:sz w:val="18"/>
+                <w:szCs w:val="18"/>
               </w:rPr>
               <w:t xml:space="preserve">spójne reakcje dorosłych; wzrost poczucia bezpieczeństwa dziecka</w:t>
             </w:r>
@@ -5782,7 +5782,7 @@
       <w:pPr>
         <w:keepNext/>
         <w:pBdr>
-          <w:bottom w:val="single" w:color="D9D0F0" w:sz="4" w:space="4"/>
+          <w:bottom w:val="single" w:color="D9D0F0" w:sz="18" w:space="4"/>
         </w:pBdr>
         <w:spacing w:after="100" w:before="180"/>
       </w:pPr>
@@ -5795,8 +5795,8 @@
           <w:iCs w:val="false"/>
           <w:caps w:val="false"/>
           <w:color w:val="E74509"/>
-          <w:sz w:val="18"/>
-          <w:szCs w:val="18"/>
+          <w:sz w:val="24"/>
+          <w:szCs w:val="24"/>
         </w:rPr>
         <w:t xml:space="preserve">7.  </w:t>
       </w:r>
@@ -5810,8 +5810,8 @@
           <w:caps w:val="false"/>
           <w:color w:val="2D1B69"/>
           <w:spacing w:val="8"/>
-          <w:sz w:val="17"/>
-          <w:szCs w:val="17"/>
+          <w:sz w:val="24"/>
+          <w:szCs w:val="24"/>
         </w:rPr>
         <w:t xml:space="preserve">WNIOSKI DOTYCZĄCE DALSZEJ PRACY Z DZIECKIEM / UCZNIEM MAJĄCE NA CELU POPRAWĘ FUNKCJONOWANIA (§ 7 UST. 6 PKT 7)</w:t>
       </w:r>
@@ -5830,8 +5830,8 @@
           <w:iCs w:val="false"/>
           <w:caps w:val="false"/>
           <w:color w:val="2E7D45"/>
-          <w:sz w:val="14"/>
-          <w:szCs w:val="14"/>
+          <w:sz w:val="18"/>
+          <w:szCs w:val="18"/>
         </w:rPr>
         <w:t xml:space="preserve">•  </w:t>
       </w:r>
@@ -5844,8 +5844,8 @@
           <w:iCs w:val="false"/>
           <w:caps w:val="false"/>
           <w:color w:val="1A1530"/>
-          <w:sz w:val="14"/>
-          <w:szCs w:val="14"/>
+          <w:sz w:val="18"/>
+          <w:szCs w:val="18"/>
         </w:rPr>
         <w:t xml:space="preserve">Utrzymanie struktury dnia, strefy wyciszenia i przygotowania do wydarzeń grupowych; stopniowe wydłużanie udziału.</w:t>
       </w:r>
@@ -5864,8 +5864,8 @@
           <w:iCs w:val="false"/>
           <w:caps w:val="false"/>
           <w:color w:val="2E7D45"/>
-          <w:sz w:val="14"/>
-          <w:szCs w:val="14"/>
+          <w:sz w:val="18"/>
+          <w:szCs w:val="18"/>
         </w:rPr>
         <w:t xml:space="preserve">•  </w:t>
       </w:r>
@@ -5878,8 +5878,8 @@
           <w:iCs w:val="false"/>
           <w:caps w:val="false"/>
           <w:color w:val="1A1530"/>
-          <w:sz w:val="14"/>
-          <w:szCs w:val="14"/>
+          <w:sz w:val="18"/>
+          <w:szCs w:val="18"/>
         </w:rPr>
         <w:t xml:space="preserve">Rozwijanie komunikacji funkcjonalnej z tablicą AAC w placówce i w domu; trening komunikatu zastępczego zamiast zachowania trudnego.</w:t>
       </w:r>
@@ -5898,8 +5898,8 @@
           <w:iCs w:val="false"/>
           <w:caps w:val="false"/>
           <w:color w:val="2E7D45"/>
-          <w:sz w:val="14"/>
-          <w:szCs w:val="14"/>
+          <w:sz w:val="18"/>
+          <w:szCs w:val="18"/>
         </w:rPr>
         <w:t xml:space="preserve">•  </w:t>
       </w:r>
@@ -5912,8 +5912,8 @@
           <w:iCs w:val="false"/>
           <w:caps w:val="false"/>
           <w:color w:val="1A1530"/>
-          <w:sz w:val="14"/>
-          <w:szCs w:val="14"/>
+          <w:sz w:val="18"/>
+          <w:szCs w:val="18"/>
         </w:rPr>
         <w:t xml:space="preserve">Trening umiejętności społecznych i teorii umysłu w małej grupie z przeniesieniem na zabawy swobodne (rówieśnik-mentor).</w:t>
       </w:r>
@@ -5932,8 +5932,8 @@
           <w:iCs w:val="false"/>
           <w:caps w:val="false"/>
           <w:color w:val="2E7D45"/>
-          <w:sz w:val="14"/>
-          <w:szCs w:val="14"/>
+          <w:sz w:val="18"/>
+          <w:szCs w:val="18"/>
         </w:rPr>
         <w:t xml:space="preserve">•  </w:t>
       </w:r>
@@ -5946,8 +5946,8 @@
           <w:iCs w:val="false"/>
           <w:caps w:val="false"/>
           <w:color w:val="1A1530"/>
-          <w:sz w:val="14"/>
-          <w:szCs w:val="14"/>
+          <w:sz w:val="18"/>
+          <w:szCs w:val="18"/>
         </w:rPr>
         <w:t xml:space="preserve">Usprawnianie motoryki małej i samoobsługi z dostosowanymi przyborami i paskiem wizualnym czynności.</w:t>
       </w:r>
@@ -5966,8 +5966,8 @@
           <w:iCs w:val="false"/>
           <w:caps w:val="false"/>
           <w:color w:val="2E7D45"/>
-          <w:sz w:val="14"/>
-          <w:szCs w:val="14"/>
+          <w:sz w:val="18"/>
+          <w:szCs w:val="18"/>
         </w:rPr>
         <w:t xml:space="preserve">•  </w:t>
       </w:r>
@@ -5980,8 +5980,8 @@
           <w:iCs w:val="false"/>
           <w:caps w:val="false"/>
           <w:color w:val="1A1530"/>
-          <w:sz w:val="14"/>
-          <w:szCs w:val="14"/>
+          <w:sz w:val="18"/>
+          <w:szCs w:val="18"/>
         </w:rPr>
         <w:t xml:space="preserve">Ocena efektów w styczniu i czerwcu; aktualizacja programu wspólnie z rodzicami.</w:t>
       </w:r>
@@ -6000,15 +6000,15 @@
           <w:iCs w:val="false"/>
           <w:caps w:val="false"/>
           <w:color w:val="1A1530"/>
-          <w:sz w:val="2"/>
-          <w:szCs w:val="2"/>
+          <w:sz w:val="18"/>
+          <w:szCs w:val="18"/>
         </w:rPr>
         <w:t xml:space="preserve"/>
       </w:r>
     </w:p>
     <w:tbl>
       <w:tblPr>
-        <w:tblW w:type="dxa" w:w="9906"/>
+        <w:tblW w:type="dxa" w:w="10206"/>
         <w:tblBorders>
           <w:top w:val="single" w:color="auto" w:sz="4"/>
           <w:left w:val="single" w:color="auto" w:sz="4"/>
@@ -6019,8 +6019,8 @@
         </w:tblBorders>
       </w:tblPr>
       <w:tblGrid>
-        <w:gridCol w:w="4953"/>
-        <w:gridCol w:w="4953"/>
+        <w:gridCol w:w="5103"/>
+        <w:gridCol w:w="5103"/>
       </w:tblGrid>
       <w:tr>
         <w:trPr>
@@ -6028,12 +6028,12 @@
         </w:trPr>
         <w:tc>
           <w:tcPr>
-            <w:tcW w:type="dxa" w:w="4953"/>
-            <w:tcBorders>
-              <w:top w:val="dashed" w:color="D9D0F0" w:sz="4"/>
-              <w:left w:val="dashed" w:color="D9D0F0" w:sz="4"/>
-              <w:bottom w:val="dashed" w:color="D9D0F0" w:sz="4"/>
-              <w:right w:val="dashed" w:color="D9D0F0" w:sz="4"/>
+            <w:tcW w:type="dxa" w:w="5103"/>
+            <w:tcBorders>
+              <w:top w:val="dashed" w:color="D9D0F0" w:sz="18"/>
+              <w:left w:val="dashed" w:color="D9D0F0" w:sz="18"/>
+              <w:bottom w:val="dashed" w:color="D9D0F0" w:sz="18"/>
+              <w:right w:val="dashed" w:color="D9D0F0" w:sz="18"/>
             </w:tcBorders>
             <w:tcMar>
               <w:top w:type="dxa" w:w="120"/>
@@ -6057,8 +6057,8 @@
                 <w:iCs w:val="false"/>
                 <w:caps w:val="false"/>
                 <w:color w:val="2D1B69"/>
-                <w:sz w:val="17"/>
-                <w:szCs w:val="17"/>
+                <w:sz w:val="24"/>
+                <w:szCs w:val="24"/>
               </w:rPr>
               <w:t xml:space="preserve">[Nazwa przedszkola / szkoły]</w:t>
             </w:r>
@@ -6077,8 +6077,8 @@
                 <w:iCs w:val="false"/>
                 <w:caps w:val="false"/>
                 <w:color w:val="6B6378"/>
-                <w:sz w:val="13"/>
-                <w:szCs w:val="13"/>
+                <w:sz w:val="18"/>
+                <w:szCs w:val="18"/>
               </w:rPr>
               <w:t xml:space="preserve">[Adres placówki, tel., e-mail]</w:t>
             </w:r>
@@ -6097,8 +6097,8 @@
                 <w:iCs w:val="false"/>
                 <w:caps w:val="false"/>
                 <w:color w:val="6B6378"/>
-                <w:sz w:val="11"/>
-                <w:szCs w:val="11"/>
+                <w:sz w:val="18"/>
+                <w:szCs w:val="18"/>
               </w:rPr>
               <w:t xml:space="preserve">(pieczęć placówki)</w:t>
             </w:r>
@@ -6106,7 +6106,7 @@
         </w:tc>
         <w:tc>
           <w:tcPr>
-            <w:tcW w:type="dxa" w:w="4953"/>
+            <w:tcW w:type="dxa" w:w="5103"/>
             <w:tcBorders>
               <w:top w:val="nil"/>
               <w:left w:val="nil"/>
@@ -6135,8 +6135,8 @@
                 <w:iCs w:val="false"/>
                 <w:caps w:val="false"/>
                 <w:color w:val="6B6378"/>
-                <w:sz w:val="14"/>
-                <w:szCs w:val="14"/>
+                <w:sz w:val="18"/>
+                <w:szCs w:val="18"/>
               </w:rPr>
               <w:t xml:space="preserve">[Miejscowość], dnia ………………………</w:t>
             </w:r>
@@ -6155,8 +6155,8 @@
                 <w:iCs w:val="false"/>
                 <w:caps w:val="false"/>
                 <w:color w:val="6B6378"/>
-                <w:sz w:val="14"/>
-                <w:szCs w:val="14"/>
+                <w:sz w:val="18"/>
+                <w:szCs w:val="18"/>
               </w:rPr>
               <w:t xml:space="preserve">Znak sprawy: ………………………</w:t>
             </w:r>
@@ -6175,8 +6175,8 @@
                 <w:iCs w:val="false"/>
                 <w:caps w:val="false"/>
                 <w:color w:val="6B6378"/>
-                <w:sz w:val="14"/>
-                <w:szCs w:val="14"/>
+                <w:sz w:val="18"/>
+                <w:szCs w:val="18"/>
               </w:rPr>
               <w:t xml:space="preserve">Zespół orzekający: [Nazwa Poradni Psychologiczno-Pedagogicznej]</w:t>
             </w:r>
@@ -6193,7 +6193,7 @@
       <w:pPr>
         <w:keepNext/>
         <w:pBdr>
-          <w:bottom w:val="single" w:color="D9D0F0" w:sz="4" w:space="4"/>
+          <w:bottom w:val="single" w:color="D9D0F0" w:sz="18" w:space="4"/>
         </w:pBdr>
         <w:spacing w:after="100" w:before="180"/>
       </w:pPr>
@@ -6206,8 +6206,8 @@
           <w:iCs w:val="false"/>
           <w:caps w:val="false"/>
           <w:color w:val="E74509"/>
-          <w:sz w:val="18"/>
-          <w:szCs w:val="18"/>
+          <w:sz w:val="24"/>
+          <w:szCs w:val="24"/>
         </w:rPr>
         <w:t xml:space="preserve">8.  </w:t>
       </w:r>
@@ -6221,8 +6221,8 @@
           <w:caps w:val="false"/>
           <w:color w:val="2D1B69"/>
           <w:spacing w:val="8"/>
-          <w:sz w:val="17"/>
-          <w:szCs w:val="17"/>
+          <w:sz w:val="24"/>
+          <w:szCs w:val="24"/>
         </w:rPr>
         <w:t xml:space="preserve">INFORMACJE UZUPEŁNIAJĄCE DLA ZESPOŁU ORZEKAJĄCEGO – FAKULTATYWNE, NA POTRZEBY OCENY FUNKCJONOWANIA (§ 8 UST. 2–3)</w:t>
       </w:r>
@@ -6241,8 +6241,8 @@
           <w:iCs w:val="false"/>
           <w:caps w:val="false"/>
           <w:color w:val="6B6378"/>
-          <w:sz w:val="16"/>
-          <w:szCs w:val="16"/>
+          <w:sz w:val="24"/>
+          <w:szCs w:val="24"/>
         </w:rPr>
         <w:t xml:space="preserve">Zespół orzekający dokonuje własnej oceny funkcjonowania (§ 8); poniższe informacje placówka przekazuje dodatkowo, aby ją ułatwić.</w:t>
       </w:r>
@@ -6261,15 +6261,15 @@
           <w:iCs w:val="false"/>
           <w:caps w:val="false"/>
           <w:color w:val="1A1530"/>
-          <w:sz w:val="13"/>
-          <w:szCs w:val="13"/>
+          <w:sz w:val="18"/>
+          <w:szCs w:val="18"/>
         </w:rPr>
         <w:t xml:space="preserve">Funkcje i struktury ciała (§ 8 ust. 2 pkt 2): zdrowie psychiczne – lęk przed zmianą, sztywność poznawcza, zaburzenia snu; percepcja – nadwrażliwość słuchowa i dotykowa, poszukiwanie stymulacji przedsionkowej; motoryka – obniżona precyzja motoryki małej, nieprawidłowy chwyt; mowa – echolalie, trudności pragmatyczne, korzysta z gestu i piktogramów; funkcje poznawcze – bardzo dobra pamięć wzrokowa, trudności z uwagą i uogólnianiem; funkcje emocjonalno-społeczne – teoria umysłu poniżej normy wiekowej, zachowania trudne o funkcji ucieczkowej; cechy indywidualne – głębokie zainteresowania, pozytywna reakcja na strukturę i stałych dorosłych.</w:t>
       </w:r>
     </w:p>
     <w:tbl>
       <w:tblPr>
-        <w:tblW w:type="dxa" w:w="9906"/>
+        <w:tblW w:type="dxa" w:w="10206"/>
         <w:tblBorders>
           <w:top w:val="single" w:color="auto" w:sz="4"/>
           <w:left w:val="single" w:color="auto" w:sz="4"/>
@@ -6280,8 +6280,8 @@
         </w:tblBorders>
       </w:tblPr>
       <w:tblGrid>
-        <w:gridCol w:w="4953"/>
-        <w:gridCol w:w="4953"/>
+        <w:gridCol w:w="5103"/>
+        <w:gridCol w:w="5103"/>
       </w:tblGrid>
       <w:tr>
         <w:trPr>
@@ -6289,7 +6289,7 @@
         </w:trPr>
         <w:tc>
           <w:tcPr>
-            <w:tcW w:type="dxa" w:w="4953"/>
+            <w:tcW w:type="dxa" w:w="5103"/>
             <w:tcBorders>
               <w:top w:val="single" w:color="D9D0F0" w:sz="4"/>
               <w:left w:val="single" w:color="D9D0F0" w:sz="4"/>
@@ -6320,8 +6320,8 @@
                 <w:caps/>
                 <w:color w:val="2E7D45"/>
                 <w:spacing w:val="10"/>
-                <w:sz w:val="13"/>
-                <w:szCs w:val="13"/>
+                <w:sz w:val="18"/>
+                <w:szCs w:val="18"/>
               </w:rPr>
               <w:t xml:space="preserve">Ułatwienia w środowisku placówki (co pomaga)</w:t>
             </w:r>
@@ -6329,7 +6329,7 @@
         </w:tc>
         <w:tc>
           <w:tcPr>
-            <w:tcW w:type="dxa" w:w="4953"/>
+            <w:tcW w:type="dxa" w:w="5103"/>
             <w:tcBorders>
               <w:top w:val="single" w:color="D9D0F0" w:sz="4"/>
               <w:left w:val="single" w:color="D9D0F0" w:sz="4"/>
@@ -6360,8 +6360,8 @@
                 <w:caps/>
                 <w:color w:val="BF382A"/>
                 <w:spacing w:val="10"/>
-                <w:sz w:val="13"/>
-                <w:szCs w:val="13"/>
+                <w:sz w:val="18"/>
+                <w:szCs w:val="18"/>
               </w:rPr>
               <w:t xml:space="preserve">Bariery (co utrudnia)</w:t>
             </w:r>
@@ -6374,7 +6374,7 @@
         </w:trPr>
         <w:tc>
           <w:tcPr>
-            <w:tcW w:type="dxa" w:w="4953"/>
+            <w:tcW w:type="dxa" w:w="5103"/>
             <w:tcBorders>
               <w:top w:val="single" w:color="E3E1EC" w:sz="4"/>
               <w:left w:val="single" w:color="E3E1EC" w:sz="4"/>
@@ -6403,8 +6403,8 @@
                 <w:iCs w:val="false"/>
                 <w:caps w:val="false"/>
                 <w:color w:val="2E7D45"/>
-                <w:sz w:val="14"/>
-                <w:szCs w:val="14"/>
+                <w:sz w:val="18"/>
+                <w:szCs w:val="18"/>
               </w:rPr>
               <w:t xml:space="preserve">•  </w:t>
             </w:r>
@@ -6417,8 +6417,8 @@
                 <w:iCs w:val="false"/>
                 <w:caps w:val="false"/>
                 <w:color w:val="1A1530"/>
-                <w:sz w:val="14"/>
-                <w:szCs w:val="14"/>
+                <w:sz w:val="18"/>
+                <w:szCs w:val="18"/>
               </w:rPr>
               <w:t xml:space="preserve">stały skład kadry i przewidywalny plan dnia (wizualny)</w:t>
             </w:r>
@@ -6437,8 +6437,8 @@
                 <w:iCs w:val="false"/>
                 <w:caps w:val="false"/>
                 <w:color w:val="2E7D45"/>
-                <w:sz w:val="14"/>
-                <w:szCs w:val="14"/>
+                <w:sz w:val="18"/>
+                <w:szCs w:val="18"/>
               </w:rPr>
               <w:t xml:space="preserve">•  </w:t>
             </w:r>
@@ -6451,8 +6451,8 @@
                 <w:iCs w:val="false"/>
                 <w:caps w:val="false"/>
                 <w:color w:val="1A1530"/>
-                <w:sz w:val="14"/>
-                <w:szCs w:val="14"/>
+                <w:sz w:val="18"/>
+                <w:szCs w:val="18"/>
               </w:rPr>
               <w:t xml:space="preserve">strefa wyciszenia w sali, słuchawki wygłuszające, przerwy sensoryczne</w:t>
             </w:r>
@@ -6471,8 +6471,8 @@
                 <w:iCs w:val="false"/>
                 <w:caps w:val="false"/>
                 <w:color w:val="2E7D45"/>
-                <w:sz w:val="14"/>
-                <w:szCs w:val="14"/>
+                <w:sz w:val="18"/>
+                <w:szCs w:val="18"/>
               </w:rPr>
               <w:t xml:space="preserve">•  </w:t>
             </w:r>
@@ -6485,8 +6485,8 @@
                 <w:iCs w:val="false"/>
                 <w:caps w:val="false"/>
                 <w:color w:val="1A1530"/>
-                <w:sz w:val="14"/>
-                <w:szCs w:val="14"/>
+                <w:sz w:val="18"/>
+                <w:szCs w:val="18"/>
               </w:rPr>
               <w:t xml:space="preserve">tablica wyboru AAC dostępna w sali i w domu</w:t>
             </w:r>
@@ -6505,8 +6505,8 @@
                 <w:iCs w:val="false"/>
                 <w:caps w:val="false"/>
                 <w:color w:val="2E7D45"/>
-                <w:sz w:val="14"/>
-                <w:szCs w:val="14"/>
+                <w:sz w:val="18"/>
+                <w:szCs w:val="18"/>
               </w:rPr>
               <w:t xml:space="preserve">•  </w:t>
             </w:r>
@@ -6519,8 +6519,8 @@
                 <w:iCs w:val="false"/>
                 <w:caps w:val="false"/>
                 <w:color w:val="1A1530"/>
-                <w:sz w:val="14"/>
-                <w:szCs w:val="14"/>
+                <w:sz w:val="18"/>
+                <w:szCs w:val="18"/>
               </w:rPr>
               <w:t xml:space="preserve">rówieśnik-mentor w zabawach; jasne zasady wizualne</w:t>
             </w:r>
@@ -6539,8 +6539,8 @@
                 <w:iCs w:val="false"/>
                 <w:caps w:val="false"/>
                 <w:color w:val="2E7D45"/>
-                <w:sz w:val="14"/>
-                <w:szCs w:val="14"/>
+                <w:sz w:val="18"/>
+                <w:szCs w:val="18"/>
               </w:rPr>
               <w:t xml:space="preserve">•  </w:t>
             </w:r>
@@ -6553,8 +6553,8 @@
                 <w:iCs w:val="false"/>
                 <w:caps w:val="false"/>
                 <w:color w:val="1A1530"/>
-                <w:sz w:val="14"/>
-                <w:szCs w:val="14"/>
+                <w:sz w:val="18"/>
+                <w:szCs w:val="18"/>
               </w:rPr>
               <w:t xml:space="preserve">zaangażowani rodzice, spójny system komunikatów dom–placówka</w:t>
             </w:r>
@@ -6562,7 +6562,7 @@
         </w:tc>
         <w:tc>
           <w:tcPr>
-            <w:tcW w:type="dxa" w:w="4953"/>
+            <w:tcW w:type="dxa" w:w="5103"/>
             <w:tcBorders>
               <w:top w:val="single" w:color="E3E1EC" w:sz="4"/>
               <w:left w:val="single" w:color="E3E1EC" w:sz="4"/>
@@ -6591,8 +6591,8 @@
                 <w:iCs w:val="false"/>
                 <w:caps w:val="false"/>
                 <w:color w:val="BF382A"/>
-                <w:sz w:val="14"/>
-                <w:szCs w:val="14"/>
+                <w:sz w:val="18"/>
+                <w:szCs w:val="18"/>
               </w:rPr>
               <w:t xml:space="preserve">•  </w:t>
             </w:r>
@@ -6605,8 +6605,8 @@
                 <w:iCs w:val="false"/>
                 <w:caps w:val="false"/>
                 <w:color w:val="1A1530"/>
-                <w:sz w:val="14"/>
-                <w:szCs w:val="14"/>
+                <w:sz w:val="18"/>
+                <w:szCs w:val="18"/>
               </w:rPr>
               <w:t xml:space="preserve">hałas korytarza, gwar w szatni i na stołówce</w:t>
             </w:r>
@@ -6625,8 +6625,8 @@
                 <w:iCs w:val="false"/>
                 <w:caps w:val="false"/>
                 <w:color w:val="BF382A"/>
-                <w:sz w:val="14"/>
-                <w:szCs w:val="14"/>
+                <w:sz w:val="18"/>
+                <w:szCs w:val="18"/>
               </w:rPr>
               <w:t xml:space="preserve">•  </w:t>
             </w:r>
@@ -6639,8 +6639,8 @@
                 <w:iCs w:val="false"/>
                 <w:caps w:val="false"/>
                 <w:color w:val="1A1530"/>
-                <w:sz w:val="14"/>
-                <w:szCs w:val="14"/>
+                <w:sz w:val="18"/>
+                <w:szCs w:val="18"/>
               </w:rPr>
               <w:t xml:space="preserve">apele, uroczystości i wyjścia zbiorowe bez przygotowania</w:t>
             </w:r>
@@ -6659,8 +6659,8 @@
                 <w:iCs w:val="false"/>
                 <w:caps w:val="false"/>
                 <w:color w:val="BF382A"/>
-                <w:sz w:val="14"/>
-                <w:szCs w:val="14"/>
+                <w:sz w:val="18"/>
+                <w:szCs w:val="18"/>
               </w:rPr>
               <w:t xml:space="preserve">•  </w:t>
             </w:r>
@@ -6673,8 +6673,8 @@
                 <w:iCs w:val="false"/>
                 <w:caps w:val="false"/>
                 <w:color w:val="1A1530"/>
-                <w:sz w:val="14"/>
-                <w:szCs w:val="14"/>
+                <w:sz w:val="18"/>
+                <w:szCs w:val="18"/>
               </w:rPr>
               <w:t xml:space="preserve">polecenia wieloetapowe podawane wyłącznie słownie</w:t>
             </w:r>
@@ -6693,8 +6693,8 @@
                 <w:iCs w:val="false"/>
                 <w:caps w:val="false"/>
                 <w:color w:val="BF382A"/>
-                <w:sz w:val="14"/>
-                <w:szCs w:val="14"/>
+                <w:sz w:val="18"/>
+                <w:szCs w:val="18"/>
               </w:rPr>
               <w:t xml:space="preserve">•  </w:t>
             </w:r>
@@ -6707,8 +6707,8 @@
                 <w:iCs w:val="false"/>
                 <w:caps w:val="false"/>
                 <w:color w:val="1A1530"/>
-                <w:sz w:val="14"/>
-                <w:szCs w:val="14"/>
+                <w:sz w:val="18"/>
+                <w:szCs w:val="18"/>
               </w:rPr>
               <w:t xml:space="preserve">nagłe zmiany planu, zastępstwa, zmiana sali</w:t>
             </w:r>
@@ -6727,8 +6727,8 @@
                 <w:iCs w:val="false"/>
                 <w:caps w:val="false"/>
                 <w:color w:val="BF382A"/>
-                <w:sz w:val="14"/>
-                <w:szCs w:val="14"/>
+                <w:sz w:val="18"/>
+                <w:szCs w:val="18"/>
               </w:rPr>
               <w:t xml:space="preserve">•  </w:t>
             </w:r>
@@ -6741,8 +6741,8 @@
                 <w:iCs w:val="false"/>
                 <w:caps w:val="false"/>
                 <w:color w:val="1A1530"/>
-                <w:sz w:val="14"/>
-                <w:szCs w:val="14"/>
+                <w:sz w:val="18"/>
+                <w:szCs w:val="18"/>
               </w:rPr>
               <w:t xml:space="preserve">faktury klejące i mokre podczas zajęć plastycznych</w:t>
             </w:r>
@@ -6764,8 +6764,8 @@
           <w:iCs w:val="false"/>
           <w:caps w:val="false"/>
           <w:color w:val="2D1B69"/>
-          <w:sz w:val="13"/>
-          <w:szCs w:val="13"/>
+          <w:sz w:val="18"/>
+          <w:szCs w:val="18"/>
         </w:rPr>
         <w:t xml:space="preserve">Informacje od dziecka i rodziców (§ 8 ust. 3 pkt 1 i 3): </w:t>
       </w:r>
@@ -6778,8 +6778,8 @@
           <w:iCs w:val="false"/>
           <w:caps w:val="false"/>
           <w:color w:val="1A1530"/>
-          <w:sz w:val="13"/>
-          <w:szCs w:val="13"/>
+          <w:sz w:val="18"/>
+          <w:szCs w:val="18"/>
         </w:rPr>
         <w:t xml:space="preserve">Informacje od dziecka (w formie dostosowanej do rozwoju) i od rodziców: lubi klocki, tablet z aplikacją o kosmosie i huśtanie; najtrudniejsze są hałas, zmiany planu i mokre ręce; pomagają cisza, plan dnia, słuchawki i wsparcie nauczyciela. Rodzice potwierdzają obraz funkcjonowania i wskazują potrzebę stałej kadry.</w:t>
       </w:r>
@@ -6798,8 +6798,8 @@
           <w:iCs w:val="false"/>
           <w:caps w:val="false"/>
           <w:color w:val="FFFFFF"/>
-          <w:sz w:val="16"/>
-          <w:szCs w:val="16"/>
+          <w:sz w:val="24"/>
+          <w:szCs w:val="24"/>
           <w:shd w:fill="2D6BB3" w:color="auto" w:val="clear"/>
         </w:rPr>
         <w:t xml:space="preserve"> ! </w:t>
@@ -6813,8 +6813,8 @@
           <w:iCs w:val="false"/>
           <w:caps w:val="false"/>
           <w:color w:val="2D1B69"/>
-          <w:sz w:val="18"/>
-          <w:szCs w:val="18"/>
+          <w:sz w:val="24"/>
+          <w:szCs w:val="24"/>
         </w:rPr>
         <w:t xml:space="preserve">   Stanowisko placówki w sprawie potrzeb dziecka / ucznia (dla zespołu orzekającego)</w:t>
       </w:r>
@@ -6827,15 +6827,15 @@
           <w:iCs w:val="false"/>
           <w:caps w:val="false"/>
           <w:color w:val="6B6378"/>
-          <w:sz w:val="14"/>
-          <w:szCs w:val="14"/>
+          <w:sz w:val="18"/>
+          <w:szCs w:val="18"/>
         </w:rPr>
         <w:t xml:space="preserve"/>
       </w:r>
     </w:p>
     <w:tbl>
       <w:tblPr>
-        <w:tblW w:type="dxa" w:w="9906"/>
+        <w:tblW w:type="dxa" w:w="10206"/>
         <w:tblBorders>
           <w:top w:val="single" w:color="auto" w:sz="4"/>
           <w:left w:val="single" w:color="auto" w:sz="4"/>
@@ -6846,8 +6846,8 @@
         </w:tblBorders>
       </w:tblPr>
       <w:tblGrid>
-        <w:gridCol w:w="4953"/>
-        <w:gridCol w:w="4953"/>
+        <w:gridCol w:w="5103"/>
+        <w:gridCol w:w="5103"/>
       </w:tblGrid>
       <w:tr>
         <w:trPr>
@@ -6855,7 +6855,7 @@
         </w:trPr>
         <w:tc>
           <w:tcPr>
-            <w:tcW w:type="dxa" w:w="4953"/>
+            <w:tcW w:type="dxa" w:w="5103"/>
             <w:tcBorders>
               <w:top w:val="nil"/>
               <w:left w:val="nil"/>
@@ -6884,8 +6884,8 @@
                 <w:iCs w:val="false"/>
                 <w:caps w:val="false"/>
                 <w:color w:val="E74509"/>
-                <w:sz w:val="20"/>
-                <w:szCs w:val="20"/>
+                <w:sz w:val="24"/>
+                <w:szCs w:val="24"/>
               </w:rPr>
               <w:t xml:space="preserve">☑  </w:t>
             </w:r>
@@ -6898,8 +6898,8 @@
                 <w:iCs w:val="false"/>
                 <w:caps w:val="false"/>
                 <w:color w:val="1A1530"/>
-                <w:sz w:val="15"/>
-                <w:szCs w:val="15"/>
+                <w:sz w:val="24"/>
+                <w:szCs w:val="24"/>
               </w:rPr>
               <w:t xml:space="preserve">Potrzeba kształcenia specjalnego (wydanie / aktualizacja orzeczenia) z uwagi na autyzm</w:t>
             </w:r>
@@ -6907,7 +6907,7 @@
         </w:tc>
         <w:tc>
           <w:tcPr>
-            <w:tcW w:type="dxa" w:w="4953"/>
+            <w:tcW w:type="dxa" w:w="5103"/>
             <w:tcBorders>
               <w:top w:val="nil"/>
               <w:left w:val="nil"/>
@@ -6936,8 +6936,8 @@
                 <w:iCs w:val="false"/>
                 <w:caps w:val="false"/>
                 <w:color w:val="E74509"/>
-                <w:sz w:val="20"/>
-                <w:szCs w:val="20"/>
+                <w:sz w:val="24"/>
+                <w:szCs w:val="24"/>
               </w:rPr>
               <w:t xml:space="preserve">☑  </w:t>
             </w:r>
@@ -6950,8 +6950,8 @@
                 <w:iCs w:val="false"/>
                 <w:caps w:val="false"/>
                 <w:color w:val="1A1530"/>
-                <w:sz w:val="15"/>
-                <w:szCs w:val="15"/>
+                <w:sz w:val="24"/>
+                <w:szCs w:val="24"/>
               </w:rPr>
               <w:t xml:space="preserve">Zajęcia rewalidacyjne – wnioskowany zakres: komunikacja i AAC, umiejętności społeczne, motoryka mała</w:t>
             </w:r>
@@ -6964,7 +6964,7 @@
         </w:trPr>
         <w:tc>
           <w:tcPr>
-            <w:tcW w:type="dxa" w:w="4953"/>
+            <w:tcW w:type="dxa" w:w="5103"/>
             <w:tcBorders>
               <w:top w:val="nil"/>
               <w:left w:val="nil"/>
@@ -6993,8 +6993,8 @@
                 <w:iCs w:val="false"/>
                 <w:caps w:val="false"/>
                 <w:color w:val="E74509"/>
-                <w:sz w:val="20"/>
-                <w:szCs w:val="20"/>
+                <w:sz w:val="24"/>
+                <w:szCs w:val="24"/>
               </w:rPr>
               <w:t xml:space="preserve">☑  </w:t>
             </w:r>
@@ -7007,8 +7007,8 @@
                 <w:iCs w:val="false"/>
                 <w:caps w:val="false"/>
                 <w:color w:val="1A1530"/>
-                <w:sz w:val="15"/>
-                <w:szCs w:val="15"/>
+                <w:sz w:val="24"/>
+                <w:szCs w:val="24"/>
               </w:rPr>
               <w:t xml:space="preserve">Wsparcie dodatkowej osoby – nauczyciel współorganizujący kształcenie (zajęcia kierowane, przejścia, wydarzenia grupowe)</w:t>
             </w:r>
@@ -7016,7 +7016,7 @@
         </w:tc>
         <w:tc>
           <w:tcPr>
-            <w:tcW w:type="dxa" w:w="4953"/>
+            <w:tcW w:type="dxa" w:w="5103"/>
             <w:tcBorders>
               <w:top w:val="nil"/>
               <w:left w:val="nil"/>
@@ -7045,8 +7045,8 @@
                 <w:iCs w:val="false"/>
                 <w:caps w:val="false"/>
                 <w:color w:val="E74509"/>
-                <w:sz w:val="20"/>
-                <w:szCs w:val="20"/>
+                <w:sz w:val="24"/>
+                <w:szCs w:val="24"/>
               </w:rPr>
               <w:t xml:space="preserve">☑  </w:t>
             </w:r>
@@ -7059,8 +7059,8 @@
                 <w:iCs w:val="false"/>
                 <w:caps w:val="false"/>
                 <w:color w:val="1A1530"/>
-                <w:sz w:val="15"/>
-                <w:szCs w:val="15"/>
+                <w:sz w:val="24"/>
+                <w:szCs w:val="24"/>
               </w:rPr>
               <w:t xml:space="preserve">Kontynuacja pomocy psychologiczno-pedagogicznej w dotychczasowych formach</w:t>
             </w:r>
@@ -7073,7 +7073,7 @@
         </w:trPr>
         <w:tc>
           <w:tcPr>
-            <w:tcW w:type="dxa" w:w="4953"/>
+            <w:tcW w:type="dxa" w:w="5103"/>
             <w:tcBorders>
               <w:top w:val="nil"/>
               <w:left w:val="nil"/>
@@ -7102,8 +7102,8 @@
                 <w:iCs w:val="false"/>
                 <w:caps w:val="false"/>
                 <w:color w:val="B6A6DF"/>
-                <w:sz w:val="20"/>
-                <w:szCs w:val="20"/>
+                <w:sz w:val="24"/>
+                <w:szCs w:val="24"/>
               </w:rPr>
               <w:t xml:space="preserve">☐  </w:t>
             </w:r>
@@ -7116,8 +7116,8 @@
                 <w:iCs w:val="false"/>
                 <w:caps w:val="false"/>
                 <w:color w:val="1A1530"/>
-                <w:sz w:val="15"/>
-                <w:szCs w:val="15"/>
+                <w:sz w:val="24"/>
+                <w:szCs w:val="24"/>
               </w:rPr>
               <w:t xml:space="preserve">Indywidualne nauczanie / zindywidualizowana ścieżka kształcenia</w:t>
             </w:r>
@@ -7125,7 +7125,7 @@
         </w:tc>
         <w:tc>
           <w:tcPr>
-            <w:tcW w:type="dxa" w:w="4953"/>
+            <w:tcW w:type="dxa" w:w="5103"/>
             <w:tcBorders>
               <w:top w:val="nil"/>
               <w:left w:val="nil"/>
@@ -7154,8 +7154,8 @@
                 <w:iCs w:val="false"/>
                 <w:caps w:val="false"/>
                 <w:color w:val="B6A6DF"/>
-                <w:sz w:val="20"/>
-                <w:szCs w:val="20"/>
+                <w:sz w:val="24"/>
+                <w:szCs w:val="24"/>
               </w:rPr>
               <w:t xml:space="preserve">☐  </w:t>
             </w:r>
@@ -7168,8 +7168,8 @@
                 <w:iCs w:val="false"/>
                 <w:caps w:val="false"/>
                 <w:color w:val="1A1530"/>
-                <w:sz w:val="15"/>
-                <w:szCs w:val="15"/>
+                <w:sz w:val="24"/>
+                <w:szCs w:val="24"/>
               </w:rPr>
               <w:t xml:space="preserve">Wczesne wspomaganie rozwoju</w:t>
             </w:r>
@@ -7182,7 +7182,7 @@
         </w:trPr>
         <w:tc>
           <w:tcPr>
-            <w:tcW w:type="dxa" w:w="4953"/>
+            <w:tcW w:type="dxa" w:w="5103"/>
             <w:tcBorders>
               <w:top w:val="nil"/>
               <w:left w:val="nil"/>
@@ -7211,8 +7211,8 @@
                 <w:iCs w:val="false"/>
                 <w:caps w:val="false"/>
                 <w:color w:val="B6A6DF"/>
-                <w:sz w:val="20"/>
-                <w:szCs w:val="20"/>
+                <w:sz w:val="24"/>
+                <w:szCs w:val="24"/>
               </w:rPr>
               <w:t xml:space="preserve">☐  </w:t>
             </w:r>
@@ -7225,8 +7225,8 @@
                 <w:iCs w:val="false"/>
                 <w:caps w:val="false"/>
                 <w:color w:val="1A1530"/>
-                <w:sz w:val="15"/>
-                <w:szCs w:val="15"/>
+                <w:sz w:val="24"/>
+                <w:szCs w:val="24"/>
               </w:rPr>
               <w:t xml:space="preserve">Inne: ……………………………………………</w:t>
             </w:r>
@@ -7234,7 +7234,7 @@
         </w:tc>
         <w:tc>
           <w:tcPr>
-            <w:tcW w:type="dxa" w:w="4953"/>
+            <w:tcW w:type="dxa" w:w="5103"/>
             <w:tcBorders>
               <w:top w:val="nil"/>
               <w:left w:val="nil"/>
@@ -7271,8 +7271,8 @@
           <w:iCs w:val="false"/>
           <w:caps w:val="false"/>
           <w:color w:val="2D1B69"/>
-          <w:sz w:val="13"/>
-          <w:szCs w:val="13"/>
+          <w:sz w:val="18"/>
+          <w:szCs w:val="18"/>
         </w:rPr>
         <w:t xml:space="preserve">Uzasadnienie: </w:t>
       </w:r>
@@ -7285,8 +7285,8 @@
           <w:iCs w:val="false"/>
           <w:caps w:val="false"/>
           <w:color w:val="1A1530"/>
-          <w:sz w:val="13"/>
-          <w:szCs w:val="13"/>
+          <w:sz w:val="18"/>
+          <w:szCs w:val="18"/>
         </w:rPr>
         <w:t xml:space="preserve">Wysoka potrzeba wsparcia w domenach d2, d7 i d9, potrzeba stałej komunikacji wspomagającej oraz ucieczkowa funkcja zachowań trudnych, którą kontroluje obecność przewidywalnego dorosłego. Dotychczasowe działania przyniosły mierzalną poprawę, co uzasadnia ich kontynuację i rozszerzenie w ramach kształcenia specjalnego.</w:t>
       </w:r>
@@ -7295,7 +7295,7 @@
       <w:pPr>
         <w:keepNext/>
         <w:pBdr>
-          <w:bottom w:val="single" w:color="D9D0F0" w:sz="4" w:space="4"/>
+          <w:bottom w:val="single" w:color="D9D0F0" w:sz="18" w:space="4"/>
         </w:pBdr>
         <w:spacing w:after="100" w:before="180"/>
       </w:pPr>
@@ -7308,8 +7308,8 @@
           <w:iCs w:val="false"/>
           <w:caps w:val="false"/>
           <w:color w:val="E74509"/>
-          <w:sz w:val="18"/>
-          <w:szCs w:val="18"/>
+          <w:sz w:val="24"/>
+          <w:szCs w:val="24"/>
         </w:rPr>
         <w:t xml:space="preserve">9.  </w:t>
       </w:r>
@@ -7323,15 +7323,15 @@
           <w:caps w:val="false"/>
           <w:color w:val="2D1B69"/>
           <w:spacing w:val="8"/>
-          <w:sz w:val="17"/>
-          <w:szCs w:val="17"/>
+          <w:sz w:val="24"/>
+          <w:szCs w:val="24"/>
         </w:rPr>
         <w:t xml:space="preserve">OSOBY, KTÓRE ROZPOZNAŁY TRUDNOŚCI, MOCNE STRONY I UZDOLNIENIA (NAUCZYCIELE, WYCHOWAWCY, SPECJALIŚCI PROWADZĄCY ZAJĘCIA)</w:t>
       </w:r>
     </w:p>
     <w:tbl>
       <w:tblPr>
-        <w:tblW w:type="dxa" w:w="9906"/>
+        <w:tblW w:type="dxa" w:w="10206"/>
         <w:tblBorders>
           <w:top w:val="single" w:color="auto" w:sz="4"/>
           <w:left w:val="single" w:color="auto" w:sz="4"/>
@@ -7342,8 +7342,8 @@
         </w:tblBorders>
       </w:tblPr>
       <w:tblGrid>
-        <w:gridCol w:w="4953"/>
-        <w:gridCol w:w="4953"/>
+        <w:gridCol w:w="5103"/>
+        <w:gridCol w:w="5103"/>
       </w:tblGrid>
       <w:tr>
         <w:trPr>
@@ -7351,7 +7351,7 @@
         </w:trPr>
         <w:tc>
           <w:tcPr>
-            <w:tcW w:type="dxa" w:w="4953"/>
+            <w:tcW w:type="dxa" w:w="5103"/>
             <w:tcBorders>
               <w:top w:val="nil"/>
               <w:left w:val="nil"/>
@@ -7380,8 +7380,8 @@
                 <w:iCs w:val="false"/>
                 <w:caps w:val="false"/>
                 <w:color w:val="2D1B69"/>
-                <w:sz w:val="13"/>
-                <w:szCs w:val="13"/>
+                <w:sz w:val="18"/>
+                <w:szCs w:val="18"/>
               </w:rPr>
               <w:t xml:space="preserve">Wychowawca / nauczyciel: </w:t>
             </w:r>
@@ -7394,8 +7394,8 @@
                 <w:iCs w:val="false"/>
                 <w:caps w:val="false"/>
                 <w:color w:val="1A1530"/>
-                <w:sz w:val="13"/>
-                <w:szCs w:val="13"/>
+                <w:sz w:val="18"/>
+                <w:szCs w:val="18"/>
               </w:rPr>
               <w:t xml:space="preserve">[Imię i nazwisko]</w:t>
             </w:r>
@@ -7414,8 +7414,8 @@
                 <w:iCs w:val="false"/>
                 <w:caps w:val="false"/>
                 <w:color w:val="6B6378"/>
-                <w:sz w:val="12"/>
-                <w:szCs w:val="12"/>
+                <w:sz w:val="18"/>
+                <w:szCs w:val="18"/>
               </w:rPr>
               <w:t xml:space="preserve">podpis: ………………………………………</w:t>
             </w:r>
@@ -7423,7 +7423,7 @@
         </w:tc>
         <w:tc>
           <w:tcPr>
-            <w:tcW w:type="dxa" w:w="4953"/>
+            <w:tcW w:type="dxa" w:w="5103"/>
             <w:tcBorders>
               <w:top w:val="nil"/>
               <w:left w:val="nil"/>
@@ -7452,8 +7452,8 @@
                 <w:iCs w:val="false"/>
                 <w:caps w:val="false"/>
                 <w:color w:val="2D1B69"/>
-                <w:sz w:val="13"/>
-                <w:szCs w:val="13"/>
+                <w:sz w:val="18"/>
+                <w:szCs w:val="18"/>
               </w:rPr>
               <w:t xml:space="preserve">Pedagog specjalny: </w:t>
             </w:r>
@@ -7466,8 +7466,8 @@
                 <w:iCs w:val="false"/>
                 <w:caps w:val="false"/>
                 <w:color w:val="1A1530"/>
-                <w:sz w:val="13"/>
-                <w:szCs w:val="13"/>
+                <w:sz w:val="18"/>
+                <w:szCs w:val="18"/>
               </w:rPr>
               <w:t xml:space="preserve">[Imię i nazwisko]</w:t>
             </w:r>
@@ -7486,8 +7486,8 @@
                 <w:iCs w:val="false"/>
                 <w:caps w:val="false"/>
                 <w:color w:val="6B6378"/>
-                <w:sz w:val="12"/>
-                <w:szCs w:val="12"/>
+                <w:sz w:val="18"/>
+                <w:szCs w:val="18"/>
               </w:rPr>
               <w:t xml:space="preserve">podpis: ………………………………………</w:t>
             </w:r>
@@ -7500,7 +7500,7 @@
         </w:trPr>
         <w:tc>
           <w:tcPr>
-            <w:tcW w:type="dxa" w:w="4953"/>
+            <w:tcW w:type="dxa" w:w="5103"/>
             <w:tcBorders>
               <w:top w:val="nil"/>
               <w:left w:val="nil"/>
@@ -7529,8 +7529,8 @@
                 <w:iCs w:val="false"/>
                 <w:caps w:val="false"/>
                 <w:color w:val="2D1B69"/>
-                <w:sz w:val="13"/>
-                <w:szCs w:val="13"/>
+                <w:sz w:val="18"/>
+                <w:szCs w:val="18"/>
               </w:rPr>
               <w:t xml:space="preserve">Psycholog: </w:t>
             </w:r>
@@ -7543,8 +7543,8 @@
                 <w:iCs w:val="false"/>
                 <w:caps w:val="false"/>
                 <w:color w:val="1A1530"/>
-                <w:sz w:val="13"/>
-                <w:szCs w:val="13"/>
+                <w:sz w:val="18"/>
+                <w:szCs w:val="18"/>
               </w:rPr>
               <w:t xml:space="preserve">[Imię i nazwisko]</w:t>
             </w:r>
@@ -7563,8 +7563,8 @@
                 <w:iCs w:val="false"/>
                 <w:caps w:val="false"/>
                 <w:color w:val="6B6378"/>
-                <w:sz w:val="12"/>
-                <w:szCs w:val="12"/>
+                <w:sz w:val="18"/>
+                <w:szCs w:val="18"/>
               </w:rPr>
               <w:t xml:space="preserve">podpis: ………………………………………</w:t>
             </w:r>
@@ -7572,7 +7572,7 @@
         </w:tc>
         <w:tc>
           <w:tcPr>
-            <w:tcW w:type="dxa" w:w="4953"/>
+            <w:tcW w:type="dxa" w:w="5103"/>
             <w:tcBorders>
               <w:top w:val="nil"/>
               <w:left w:val="nil"/>
@@ -7601,8 +7601,8 @@
                 <w:iCs w:val="false"/>
                 <w:caps w:val="false"/>
                 <w:color w:val="2D1B69"/>
-                <w:sz w:val="13"/>
-                <w:szCs w:val="13"/>
+                <w:sz w:val="18"/>
+                <w:szCs w:val="18"/>
               </w:rPr>
               <w:t xml:space="preserve">Logopeda: </w:t>
             </w:r>
@@ -7615,8 +7615,8 @@
                 <w:iCs w:val="false"/>
                 <w:caps w:val="false"/>
                 <w:color w:val="1A1530"/>
-                <w:sz w:val="13"/>
-                <w:szCs w:val="13"/>
+                <w:sz w:val="18"/>
+                <w:szCs w:val="18"/>
               </w:rPr>
               <w:t xml:space="preserve">[Imię i nazwisko]</w:t>
             </w:r>
@@ -7635,8 +7635,8 @@
                 <w:iCs w:val="false"/>
                 <w:caps w:val="false"/>
                 <w:color w:val="6B6378"/>
-                <w:sz w:val="12"/>
-                <w:szCs w:val="12"/>
+                <w:sz w:val="18"/>
+                <w:szCs w:val="18"/>
               </w:rPr>
               <w:t xml:space="preserve">podpis: ………………………………………</w:t>
             </w:r>
@@ -7646,7 +7646,7 @@
     </w:tbl>
     <w:tbl>
       <w:tblPr>
-        <w:tblW w:type="dxa" w:w="9906"/>
+        <w:tblW w:type="dxa" w:w="10206"/>
         <w:tblBorders>
           <w:top w:val="single" w:color="auto" w:sz="4"/>
           <w:left w:val="single" w:color="auto" w:sz="4"/>
@@ -7657,8 +7657,8 @@
         </w:tblBorders>
       </w:tblPr>
       <w:tblGrid>
-        <w:gridCol w:w="4953"/>
-        <w:gridCol w:w="4953"/>
+        <w:gridCol w:w="5103"/>
+        <w:gridCol w:w="5103"/>
       </w:tblGrid>
       <w:tr>
         <w:trPr>
@@ -7666,7 +7666,7 @@
         </w:trPr>
         <w:tc>
           <w:tcPr>
-            <w:tcW w:type="dxa" w:w="4953"/>
+            <w:tcW w:type="dxa" w:w="5103"/>
             <w:tcBorders>
               <w:top w:val="nil"/>
               <w:left w:val="nil"/>
@@ -7683,7 +7683,7 @@
           <w:p>
             <w:pPr>
               <w:pBdr>
-                <w:top w:val="single" w:color="2D1B69" w:sz="6" w:space="5"/>
+                <w:top w:val="single" w:color="2D1B69" w:sz="18" w:space="5"/>
               </w:pBdr>
               <w:spacing w:after="0" w:before="0"/>
               <w:jc w:val="center"/>
@@ -7697,8 +7697,8 @@
                 <w:iCs w:val="false"/>
                 <w:caps w:val="false"/>
                 <w:color w:val="2D1B69"/>
-                <w:sz w:val="16"/>
-                <w:szCs w:val="16"/>
+                <w:sz w:val="24"/>
+                <w:szCs w:val="24"/>
               </w:rPr>
               <w:t xml:space="preserve">Dyrektor przedszkola / szkoły · podpis i pieczęć · data</w:t>
             </w:r>
@@ -7717,8 +7717,8 @@
                 <w:iCs w:val="false"/>
                 <w:caps w:val="false"/>
                 <w:color w:val="6B6378"/>
-                <w:sz w:val="12"/>
-                <w:szCs w:val="12"/>
+                <w:sz w:val="18"/>
+                <w:szCs w:val="18"/>
               </w:rPr>
               <w:t xml:space="preserve">podpis i data</w:t>
             </w:r>
@@ -7726,7 +7726,7 @@
         </w:tc>
         <w:tc>
           <w:tcPr>
-            <w:tcW w:type="dxa" w:w="4953"/>
+            <w:tcW w:type="dxa" w:w="5103"/>
             <w:tcBorders>
               <w:top w:val="nil"/>
               <w:left w:val="nil"/>
@@ -7755,8 +7755,8 @@
                 <w:iCs w:val="false"/>
                 <w:caps w:val="false"/>
                 <w:color w:val="6B6378"/>
-                <w:sz w:val="12"/>
-                <w:szCs w:val="12"/>
+                <w:sz w:val="18"/>
+                <w:szCs w:val="18"/>
               </w:rPr>
               <w:t xml:space="preserve">Kopię opinii przekazano rodzicom / pełnoletniemu uczniowi (§ 7 ust. 5) dnia ……………… · podpis rodzica / ucznia: ………………………………</w:t>
             </w:r>
@@ -7778,8 +7778,8 @@
           <w:iCs w:val="false"/>
           <w:caps w:val="false"/>
           <w:color w:val="6B6378"/>
-          <w:sz w:val="12"/>
-          <w:szCs w:val="12"/>
+          <w:sz w:val="18"/>
+          <w:szCs w:val="18"/>
         </w:rPr>
         <w:t xml:space="preserve">Załączniki: ocena funkcjonalna (raport, część I–III), arkusze obserwacji, dokumentacja pomocy psychologiczno-pedagogicznej – do wglądu zespołu orzekającego za zgodą rodzica. Opinia zawiera dane dotyczące zdrowia (art. 9 RODO) – dokument poufny.</w:t>
       </w:r>
@@ -7787,7 +7787,7 @@
     <w:sectPr>
       <w:footerReference w:type="default" r:id="rId7"/>
       <w:pgSz w:w="11906" w:h="16838" w:orient="portrait"/>
-      <w:pgMar w:top="1100" w:right="1000" w:bottom="1250" w:left="1000" w:header="708" w:footer="708" w:gutter="0"/>
+      <w:pgMar w:top="1000" w:right="850" w:bottom="1100" w:left="850" w:header="708" w:footer="708" w:gutter="0"/>
       <w:pgNumType/>
       <w:docGrid w:linePitch="360"/>
     </w:sectPr>
@@ -7841,10 +7841,10 @@
   <w:p>
     <w:pPr>
       <w:pBdr>
-        <w:top w:val="single" w:color="E3E1EC" w:sz="4" w:space="4"/>
+        <w:top w:val="single" w:color="E3E1EC" w:sz="18" w:space="4"/>
       </w:pBdr>
       <w:tabs>
-        <w:tab w:val="right" w:pos="9906"/>
+        <w:tab w:val="right" w:pos="10206"/>
       </w:tabs>
       <w:spacing w:after="0" w:before="60"/>
     </w:pPr>
@@ -7857,8 +7857,8 @@
         <w:iCs w:val="false"/>
         <w:caps w:val="false"/>
         <w:color w:val="6B6378"/>
-        <w:sz w:val="12"/>
-        <w:szCs w:val="12"/>
+        <w:sz w:val="18"/>
+        <w:szCs w:val="18"/>
       </w:rPr>
       <w:t xml:space="preserve">Załącznik – opinia o funkcjonowaniu dziecka / ucznia · dokument poufny (RODO)</w:t>
     </w:r>
@@ -7885,8 +7885,8 @@
         <w:iCs w:val="false"/>
         <w:caps w:val="false"/>
         <w:color w:val="6B6378"/>
-        <w:sz w:val="12"/>
-        <w:szCs w:val="12"/>
+        <w:sz w:val="18"/>
+        <w:szCs w:val="18"/>
       </w:rPr>
       <w:t xml:space="preserve">Strona </w:t>
     </w:r>
@@ -7896,8 +7896,8 @@
         <w:b/>
         <w:bCs/>
         <w:color w:val="E74509"/>
-        <w:sz w:val="12"/>
-        <w:szCs w:val="12"/>
+        <w:sz w:val="18"/>
+        <w:szCs w:val="18"/>
       </w:rPr>
       <w:fldChar w:fldCharType="begin"/>
       <w:instrText xml:space="preserve">PAGE</w:instrText>
@@ -7913,8 +7913,8 @@
         <w:iCs w:val="false"/>
         <w:caps w:val="false"/>
         <w:color w:val="6B6378"/>
-        <w:sz w:val="12"/>
-        <w:szCs w:val="12"/>
+        <w:sz w:val="18"/>
+        <w:szCs w:val="18"/>
       </w:rPr>
       <w:t xml:space="preserve"> z </w:t>
     </w:r>
@@ -7924,8 +7924,8 @@
         <w:b/>
         <w:bCs/>
         <w:color w:val="2D1B69"/>
-        <w:sz w:val="12"/>
-        <w:szCs w:val="12"/>
+        <w:sz w:val="18"/>
+        <w:szCs w:val="18"/>
       </w:rPr>
       <w:fldChar w:fldCharType="begin"/>
       <w:instrText xml:space="preserve">NUMPAGES</w:instrText>
@@ -8075,8 +8075,8 @@
       <w:rPr>
         <w:rFonts w:ascii="Arial" w:cs="Arial" w:eastAsia="Arial" w:hAnsi="Arial"/>
         <w:color w:val="1A1530"/>
-        <w:sz w:val="20"/>
-        <w:szCs w:val="20"/>
+        <w:sz w:val="24"/>
+        <w:szCs w:val="24"/>
       </w:rPr>
     </w:rPrDefault>
     <w:pPrDefault/>

</xml_diff>

<commit_message>
Ocena Funkcjonalna: większe etykiety i noty, zasada druków bez reklam w CLAUDE.md
Co-Authored-By: Claude Fable 5.1 <noreply@anthropic.com>
Claude-Session: https://claude.ai/code/session_01FpF7vCSW7jSofte5z6wEKy
</commit_message>
<xml_diff>
--- a/eduplaner2026/raport_oceny_funkcjonalnej/Opinia_dla_poradni.docx
+++ b/eduplaner2026/raport_oceny_funkcjonalnej/Opinia_dla_poradni.docx
@@ -26,10 +26,10 @@
           <w:tcPr>
             <w:tcW w:type="dxa" w:w="5103"/>
             <w:tcBorders>
-              <w:top w:val="dashed" w:color="D9D0F0" w:sz="18"/>
-              <w:left w:val="dashed" w:color="D9D0F0" w:sz="18"/>
-              <w:bottom w:val="dashed" w:color="D9D0F0" w:sz="18"/>
-              <w:right w:val="dashed" w:color="D9D0F0" w:sz="18"/>
+              <w:top w:val="dashed" w:color="D9D0F0" w:sz="20"/>
+              <w:left w:val="dashed" w:color="D9D0F0" w:sz="20"/>
+              <w:bottom w:val="dashed" w:color="D9D0F0" w:sz="20"/>
+              <w:right w:val="dashed" w:color="D9D0F0" w:sz="20"/>
             </w:tcBorders>
             <w:tcMar>
               <w:top w:type="dxa" w:w="120"/>
@@ -73,8 +73,8 @@
                 <w:iCs w:val="false"/>
                 <w:caps w:val="false"/>
                 <w:color w:val="6B6378"/>
-                <w:sz w:val="18"/>
-                <w:szCs w:val="18"/>
+                <w:sz w:val="20"/>
+                <w:szCs w:val="20"/>
               </w:rPr>
               <w:t xml:space="preserve">[Adres placówki, tel., e-mail]</w:t>
             </w:r>
@@ -93,8 +93,8 @@
                 <w:iCs w:val="false"/>
                 <w:caps w:val="false"/>
                 <w:color w:val="6B6378"/>
-                <w:sz w:val="18"/>
-                <w:szCs w:val="18"/>
+                <w:sz w:val="20"/>
+                <w:szCs w:val="20"/>
               </w:rPr>
               <w:t xml:space="preserve">(pieczęć placówki)</w:t>
             </w:r>
@@ -131,8 +131,8 @@
                 <w:iCs w:val="false"/>
                 <w:caps w:val="false"/>
                 <w:color w:val="6B6378"/>
-                <w:sz w:val="18"/>
-                <w:szCs w:val="18"/>
+                <w:sz w:val="20"/>
+                <w:szCs w:val="20"/>
               </w:rPr>
               <w:t xml:space="preserve">[Miejscowość], dnia ………………………</w:t>
             </w:r>
@@ -151,8 +151,8 @@
                 <w:iCs w:val="false"/>
                 <w:caps w:val="false"/>
                 <w:color w:val="6B6378"/>
-                <w:sz w:val="18"/>
-                <w:szCs w:val="18"/>
+                <w:sz w:val="20"/>
+                <w:szCs w:val="20"/>
               </w:rPr>
               <w:t xml:space="preserve">Znak sprawy: ………………………</w:t>
             </w:r>
@@ -171,8 +171,8 @@
                 <w:iCs w:val="false"/>
                 <w:caps w:val="false"/>
                 <w:color w:val="6B6378"/>
-                <w:sz w:val="18"/>
-                <w:szCs w:val="18"/>
+                <w:sz w:val="20"/>
+                <w:szCs w:val="20"/>
               </w:rPr>
               <w:t xml:space="preserve">Zespół orzekający: [Nazwa Poradni Psychologiczno-Pedagogicznej]</w:t>
             </w:r>
@@ -220,8 +220,8 @@
           <w:caps w:val="false"/>
           <w:color w:val="E74509"/>
           <w:spacing w:val="30"/>
-          <w:sz w:val="18"/>
-          <w:szCs w:val="18"/>
+          <w:sz w:val="20"/>
+          <w:szCs w:val="20"/>
         </w:rPr>
         <w:t xml:space="preserve">W PRZEDSZKOLU / SZKOLE – DLA ZESPOŁU ORZEKAJĄCEGO PORADNI PSYCHOLOGICZNO-PEDAGOGICZNEJ</w:t>
       </w:r>
@@ -276,8 +276,8 @@
                 <w:iCs w:val="false"/>
                 <w:caps w:val="false"/>
                 <w:color w:val="2D1B69"/>
-                <w:sz w:val="18"/>
-                <w:szCs w:val="18"/>
+                <w:sz w:val="20"/>
+                <w:szCs w:val="20"/>
               </w:rPr>
               <w:t xml:space="preserve">Podstawa prawna: </w:t>
             </w:r>
@@ -290,8 +290,8 @@
                 <w:iCs w:val="false"/>
                 <w:caps w:val="false"/>
                 <w:color w:val="6B6378"/>
-                <w:sz w:val="18"/>
-                <w:szCs w:val="18"/>
+                <w:sz w:val="20"/>
+                <w:szCs w:val="20"/>
               </w:rPr>
               <w:t xml:space="preserve">§ 7 ust. 2–7 rozporządzenia Ministra Edukacji z dnia 2 marca 2026 r. w sprawie orzeczeń i opinii wydawanych przez zespoły orzekające działające w publicznych poradniach psychologiczno-pedagogicznych (Dz. U. z 2026 r. poz. 428).</w:t>
             </w:r>
@@ -310,8 +310,8 @@
                 <w:iCs w:val="false"/>
                 <w:caps w:val="false"/>
                 <w:color w:val="2D1B69"/>
-                <w:sz w:val="18"/>
-                <w:szCs w:val="18"/>
+                <w:sz w:val="20"/>
+                <w:szCs w:val="20"/>
               </w:rPr>
               <w:t xml:space="preserve">Tryb: </w:t>
             </w:r>
@@ -324,8 +324,8 @@
                 <w:iCs w:val="false"/>
                 <w:caps w:val="false"/>
                 <w:color w:val="6B6378"/>
-                <w:sz w:val="18"/>
-                <w:szCs w:val="18"/>
+                <w:sz w:val="20"/>
+                <w:szCs w:val="20"/>
               </w:rPr>
               <w:t xml:space="preserve">Opinię wydaje dyrektor na prośbę przewodniczącego zespołu orzekającego (§ 7 ust. 2) lub wnioskodawcy (ust. 4), w terminie 10 dni od dnia otrzymania prośby (ust. 3). Opinia uwzględnia wyniki obserwacji funkcjonowania dziecka/ucznia i działań diagnostycznych prowadzonych w placówce (ust. 6). Kopię opinii przekazuje się rodzicom dziecka lub ucznia albo pełnoletniemu uczniowi (ust. 5).</w:t>
             </w:r>
@@ -337,7 +337,7 @@
       <w:pPr>
         <w:keepNext/>
         <w:pBdr>
-          <w:bottom w:val="single" w:color="D9D0F0" w:sz="18" w:space="4"/>
+          <w:bottom w:val="single" w:color="D9D0F0" w:sz="20" w:space="4"/>
         </w:pBdr>
         <w:spacing w:after="100" w:before="180"/>
       </w:pPr>
@@ -411,7 +411,7 @@
           </w:tcPr>
           <w:p>
             <w:pPr>
-              <w:spacing w:after="0" w:before="0" w:line="250"/>
+              <w:spacing w:after="0" w:before="0" w:line="270"/>
               <w:jc w:val="left"/>
             </w:pPr>
             <w:r>
@@ -423,8 +423,8 @@
                 <w:iCs w:val="false"/>
                 <w:caps w:val="false"/>
                 <w:color w:val="2D1B69"/>
-                <w:sz w:val="18"/>
-                <w:szCs w:val="18"/>
+                <w:sz w:val="20"/>
+                <w:szCs w:val="20"/>
               </w:rPr>
               <w:t xml:space="preserve">Data wydania opinii (pkt 1)</w:t>
             </w:r>
@@ -449,7 +449,7 @@
           </w:tcPr>
           <w:p>
             <w:pPr>
-              <w:spacing w:after="0" w:before="0" w:line="250"/>
+              <w:spacing w:after="0" w:before="0" w:line="270"/>
               <w:jc w:val="left"/>
             </w:pPr>
             <w:r>
@@ -461,8 +461,8 @@
                 <w:iCs w:val="false"/>
                 <w:caps w:val="false"/>
                 <w:color w:val="1A1530"/>
-                <w:sz w:val="18"/>
-                <w:szCs w:val="18"/>
+                <w:sz w:val="20"/>
+                <w:szCs w:val="20"/>
               </w:rPr>
               <w:t xml:space="preserve">[Data wydania]</w:t>
             </w:r>
@@ -493,7 +493,7 @@
           </w:tcPr>
           <w:p>
             <w:pPr>
-              <w:spacing w:after="0" w:before="0" w:line="250"/>
+              <w:spacing w:after="0" w:before="0" w:line="270"/>
               <w:jc w:val="left"/>
             </w:pPr>
             <w:r>
@@ -505,8 +505,8 @@
                 <w:iCs w:val="false"/>
                 <w:caps w:val="false"/>
                 <w:color w:val="2D1B69"/>
-                <w:sz w:val="18"/>
-                <w:szCs w:val="18"/>
+                <w:sz w:val="20"/>
+                <w:szCs w:val="20"/>
               </w:rPr>
               <w:t xml:space="preserve">Imię i nazwisko dziecka / ucznia (pkt 2)</w:t>
             </w:r>
@@ -531,7 +531,7 @@
           </w:tcPr>
           <w:p>
             <w:pPr>
-              <w:spacing w:after="0" w:before="0" w:line="250"/>
+              <w:spacing w:after="0" w:before="0" w:line="270"/>
               <w:jc w:val="left"/>
             </w:pPr>
             <w:r>
@@ -543,8 +543,8 @@
                 <w:iCs w:val="false"/>
                 <w:caps w:val="false"/>
                 <w:color w:val="1A1530"/>
-                <w:sz w:val="18"/>
-                <w:szCs w:val="18"/>
+                <w:sz w:val="20"/>
+                <w:szCs w:val="20"/>
               </w:rPr>
               <w:t xml:space="preserve">[Imię i Nazwisko]</w:t>
             </w:r>
@@ -575,7 +575,7 @@
           </w:tcPr>
           <w:p>
             <w:pPr>
-              <w:spacing w:after="0" w:before="0" w:line="250"/>
+              <w:spacing w:after="0" w:before="0" w:line="270"/>
               <w:jc w:val="left"/>
             </w:pPr>
             <w:r>
@@ -587,8 +587,8 @@
                 <w:iCs w:val="false"/>
                 <w:caps w:val="false"/>
                 <w:color w:val="2D1B69"/>
-                <w:sz w:val="18"/>
-                <w:szCs w:val="18"/>
+                <w:sz w:val="20"/>
+                <w:szCs w:val="20"/>
               </w:rPr>
               <w:t xml:space="preserve">Data urodzenia · PESEL</w:t>
             </w:r>
@@ -613,7 +613,7 @@
           </w:tcPr>
           <w:p>
             <w:pPr>
-              <w:spacing w:after="0" w:before="0" w:line="250"/>
+              <w:spacing w:after="0" w:before="0" w:line="270"/>
               <w:jc w:val="left"/>
             </w:pPr>
             <w:r>
@@ -625,8 +625,8 @@
                 <w:iCs w:val="false"/>
                 <w:caps w:val="false"/>
                 <w:color w:val="1A1530"/>
-                <w:sz w:val="18"/>
-                <w:szCs w:val="18"/>
+                <w:sz w:val="20"/>
+                <w:szCs w:val="20"/>
               </w:rPr>
               <w:t xml:space="preserve">[Data urodzenia] · [PESEL]</w:t>
             </w:r>
@@ -657,7 +657,7 @@
           </w:tcPr>
           <w:p>
             <w:pPr>
-              <w:spacing w:after="0" w:before="0" w:line="250"/>
+              <w:spacing w:after="0" w:before="0" w:line="270"/>
               <w:jc w:val="left"/>
             </w:pPr>
             <w:r>
@@ -669,8 +669,8 @@
                 <w:iCs w:val="false"/>
                 <w:caps w:val="false"/>
                 <w:color w:val="2D1B69"/>
-                <w:sz w:val="18"/>
-                <w:szCs w:val="18"/>
+                <w:sz w:val="20"/>
+                <w:szCs w:val="20"/>
               </w:rPr>
               <w:t xml:space="preserve">Przedszkole / szkoła (nazwa, adres) · grupa / oddział</w:t>
             </w:r>
@@ -695,7 +695,7 @@
           </w:tcPr>
           <w:p>
             <w:pPr>
-              <w:spacing w:after="0" w:before="0" w:line="250"/>
+              <w:spacing w:after="0" w:before="0" w:line="270"/>
               <w:jc w:val="left"/>
             </w:pPr>
             <w:r>
@@ -707,8 +707,8 @@
                 <w:iCs w:val="false"/>
                 <w:caps w:val="false"/>
                 <w:color w:val="1A1530"/>
-                <w:sz w:val="18"/>
-                <w:szCs w:val="18"/>
+                <w:sz w:val="20"/>
+                <w:szCs w:val="20"/>
               </w:rPr>
               <w:t xml:space="preserve">[Nazwa i adres placówki] · [grupa / klasa] · ☐ dziecko do ukończenia wychowania przedszkolnego  ☐ uczeń</w:t>
             </w:r>
@@ -739,7 +739,7 @@
           </w:tcPr>
           <w:p>
             <w:pPr>
-              <w:spacing w:after="0" w:before="0" w:line="250"/>
+              <w:spacing w:after="0" w:before="0" w:line="270"/>
               <w:jc w:val="left"/>
             </w:pPr>
             <w:r>
@@ -751,8 +751,8 @@
                 <w:iCs w:val="false"/>
                 <w:caps w:val="false"/>
                 <w:color w:val="2D1B69"/>
-                <w:sz w:val="18"/>
-                <w:szCs w:val="18"/>
+                <w:sz w:val="20"/>
+                <w:szCs w:val="20"/>
               </w:rPr>
               <w:t xml:space="preserve">Rodzice / opiekunowie prawni (pełnoletni uczeń)</w:t>
             </w:r>
@@ -777,7 +777,7 @@
           </w:tcPr>
           <w:p>
             <w:pPr>
-              <w:spacing w:after="0" w:before="0" w:line="250"/>
+              <w:spacing w:after="0" w:before="0" w:line="270"/>
               <w:jc w:val="left"/>
             </w:pPr>
             <w:r>
@@ -789,8 +789,8 @@
                 <w:iCs w:val="false"/>
                 <w:caps w:val="false"/>
                 <w:color w:val="1A1530"/>
-                <w:sz w:val="18"/>
-                <w:szCs w:val="18"/>
+                <w:sz w:val="20"/>
+                <w:szCs w:val="20"/>
               </w:rPr>
               <w:t xml:space="preserve">[Imiona i nazwiska, adres do korespondencji]</w:t>
             </w:r>
@@ -821,7 +821,7 @@
           </w:tcPr>
           <w:p>
             <w:pPr>
-              <w:spacing w:after="0" w:before="0" w:line="250"/>
+              <w:spacing w:after="0" w:before="0" w:line="270"/>
               <w:jc w:val="left"/>
             </w:pPr>
             <w:r>
@@ -833,8 +833,8 @@
                 <w:iCs w:val="false"/>
                 <w:caps w:val="false"/>
                 <w:color w:val="2D1B69"/>
-                <w:sz w:val="18"/>
-                <w:szCs w:val="18"/>
+                <w:sz w:val="20"/>
+                <w:szCs w:val="20"/>
               </w:rPr>
               <w:t xml:space="preserve">Prośba o wydanie opinii</w:t>
             </w:r>
@@ -859,7 +859,7 @@
           </w:tcPr>
           <w:p>
             <w:pPr>
-              <w:spacing w:after="0" w:before="0" w:line="250"/>
+              <w:spacing w:after="0" w:before="0" w:line="270"/>
               <w:jc w:val="left"/>
             </w:pPr>
             <w:r>
@@ -871,8 +871,8 @@
                 <w:iCs w:val="false"/>
                 <w:caps w:val="false"/>
                 <w:color w:val="1A1530"/>
-                <w:sz w:val="18"/>
-                <w:szCs w:val="18"/>
+                <w:sz w:val="20"/>
+                <w:szCs w:val="20"/>
               </w:rPr>
               <w:t xml:space="preserve">☐ przewodniczący zespołu orzekającego (§ 7 ust. 2)  ☐ wnioskodawca (§ 7 ust. 4) · z dnia [Data otrzymania] · znak [Znak sprawy] · termin: 10 dni</w:t>
             </w:r>
@@ -903,7 +903,7 @@
           </w:tcPr>
           <w:p>
             <w:pPr>
-              <w:spacing w:after="0" w:before="0" w:line="250"/>
+              <w:spacing w:after="0" w:before="0" w:line="270"/>
               <w:jc w:val="left"/>
             </w:pPr>
             <w:r>
@@ -915,8 +915,8 @@
                 <w:iCs w:val="false"/>
                 <w:caps w:val="false"/>
                 <w:color w:val="2D1B69"/>
-                <w:sz w:val="18"/>
-                <w:szCs w:val="18"/>
+                <w:sz w:val="20"/>
+                <w:szCs w:val="20"/>
               </w:rPr>
               <w:t xml:space="preserve">Dotychczasowe orzeczenie / opinia poradni</w:t>
             </w:r>
@@ -941,7 +941,7 @@
           </w:tcPr>
           <w:p>
             <w:pPr>
-              <w:spacing w:after="0" w:before="0" w:line="250"/>
+              <w:spacing w:after="0" w:before="0" w:line="270"/>
               <w:jc w:val="left"/>
             </w:pPr>
             <w:r>
@@ -953,8 +953,8 @@
                 <w:iCs w:val="false"/>
                 <w:caps w:val="false"/>
                 <w:color w:val="1A1530"/>
-                <w:sz w:val="18"/>
-                <w:szCs w:val="18"/>
+                <w:sz w:val="20"/>
+                <w:szCs w:val="20"/>
               </w:rPr>
               <w:t xml:space="preserve">☐ brak  ☐ [Orzeczenie / Opinia] nr [Numer] z dnia [Data], wydane przez [Nazwa Poradni]</w:t>
             </w:r>
@@ -966,7 +966,7 @@
       <w:pPr>
         <w:keepNext/>
         <w:pBdr>
-          <w:bottom w:val="single" w:color="D9D0F0" w:sz="18" w:space="4"/>
+          <w:bottom w:val="single" w:color="D9D0F0" w:sz="20" w:space="4"/>
         </w:pBdr>
         <w:spacing w:after="100" w:before="180"/>
       </w:pPr>
@@ -1040,7 +1040,7 @@
           </w:tcPr>
           <w:p>
             <w:pPr>
-              <w:spacing w:after="0" w:before="0" w:line="250"/>
+              <w:spacing w:after="0" w:before="0" w:line="270"/>
               <w:jc w:val="left"/>
             </w:pPr>
             <w:r>
@@ -1052,8 +1052,8 @@
                 <w:iCs w:val="false"/>
                 <w:caps w:val="false"/>
                 <w:color w:val="2D1B69"/>
-                <w:sz w:val="18"/>
-                <w:szCs w:val="18"/>
+                <w:sz w:val="20"/>
+                <w:szCs w:val="20"/>
               </w:rPr>
               <w:t xml:space="preserve">Okres obserwacji</w:t>
             </w:r>
@@ -1078,7 +1078,7 @@
           </w:tcPr>
           <w:p>
             <w:pPr>
-              <w:spacing w:after="0" w:before="0" w:line="250"/>
+              <w:spacing w:after="0" w:before="0" w:line="270"/>
               <w:jc w:val="left"/>
             </w:pPr>
             <w:r>
@@ -1090,8 +1090,8 @@
                 <w:iCs w:val="false"/>
                 <w:caps w:val="false"/>
                 <w:color w:val="1A1530"/>
-                <w:sz w:val="18"/>
-                <w:szCs w:val="18"/>
+                <w:sz w:val="20"/>
+                <w:szCs w:val="20"/>
               </w:rPr>
               <w:t xml:space="preserve">wrzesień [rok] – [miesiąc rok]; obserwacja wstępna i pogłębiona w naturalnych sytuacjach (zajęcia kierowane, zabawa swobodna, posiłki, przejścia, wydarzenia grupowe)</w:t>
             </w:r>
@@ -1122,7 +1122,7 @@
           </w:tcPr>
           <w:p>
             <w:pPr>
-              <w:spacing w:after="0" w:before="0" w:line="250"/>
+              <w:spacing w:after="0" w:before="0" w:line="270"/>
               <w:jc w:val="left"/>
             </w:pPr>
             <w:r>
@@ -1134,8 +1134,8 @@
                 <w:iCs w:val="false"/>
                 <w:caps w:val="false"/>
                 <w:color w:val="2D1B69"/>
-                <w:sz w:val="18"/>
-                <w:szCs w:val="18"/>
+                <w:sz w:val="20"/>
+                <w:szCs w:val="20"/>
               </w:rPr>
               <w:t xml:space="preserve">Narzędzia i działania diagnostyczne</w:t>
             </w:r>
@@ -1160,7 +1160,7 @@
           </w:tcPr>
           <w:p>
             <w:pPr>
-              <w:spacing w:after="0" w:before="0" w:line="250"/>
+              <w:spacing w:after="0" w:before="0" w:line="270"/>
               <w:jc w:val="left"/>
             </w:pPr>
             <w:r>
@@ -1172,8 +1172,8 @@
                 <w:iCs w:val="false"/>
                 <w:caps w:val="false"/>
                 <w:color w:val="1A1530"/>
-                <w:sz w:val="18"/>
-                <w:szCs w:val="18"/>
+                <w:sz w:val="20"/>
+                <w:szCs w:val="20"/>
               </w:rPr>
               <w:t xml:space="preserve">Kwestionariusz Przedszkolnej / Szkolnej Oceny Funkcjonalnej (KPOF / KSzOF – 9 domen ICF); Profil Biopsychospołeczny; Arkusz Obserwacji Behawioralnej ABC; Profil Sensoryczny; Arkusz Oceny Rozwoju Mowy i Komunikacji; Arkusz Poziomu Rozwoju Teorii Umysłu (ToM); analiza dokumentacji pomocy psychologiczno-pedagogicznej</w:t>
             </w:r>
@@ -1204,7 +1204,7 @@
           </w:tcPr>
           <w:p>
             <w:pPr>
-              <w:spacing w:after="0" w:before="0" w:line="250"/>
+              <w:spacing w:after="0" w:before="0" w:line="270"/>
               <w:jc w:val="left"/>
             </w:pPr>
             <w:r>
@@ -1216,8 +1216,8 @@
                 <w:iCs w:val="false"/>
                 <w:caps w:val="false"/>
                 <w:color w:val="2D1B69"/>
-                <w:sz w:val="18"/>
-                <w:szCs w:val="18"/>
+                <w:sz w:val="20"/>
+                <w:szCs w:val="20"/>
               </w:rPr>
               <w:t xml:space="preserve">Osoby rozpoznające trudności, mocne strony i uzdolnienia</w:t>
             </w:r>
@@ -1242,7 +1242,7 @@
           </w:tcPr>
           <w:p>
             <w:pPr>
-              <w:spacing w:after="0" w:before="0" w:line="250"/>
+              <w:spacing w:after="0" w:before="0" w:line="270"/>
               <w:jc w:val="left"/>
             </w:pPr>
             <w:r>
@@ -1254,8 +1254,8 @@
                 <w:iCs w:val="false"/>
                 <w:caps w:val="false"/>
                 <w:color w:val="1A1530"/>
-                <w:sz w:val="18"/>
-                <w:szCs w:val="18"/>
+                <w:sz w:val="20"/>
+                <w:szCs w:val="20"/>
               </w:rPr>
               <w:t xml:space="preserve">wychowawca / nauczyciele oddziału, pedagog specjalny, psycholog, logopeda, terapeuta SI (imiona i nazwiska w części 9); informacje uzupełniające od rodziców i od dziecka w formie dostosowanej do jego rozwoju</w:t>
             </w:r>
@@ -1277,8 +1277,8 @@
           <w:iCs w:val="false"/>
           <w:caps w:val="false"/>
           <w:color w:val="1A1530"/>
-          <w:sz w:val="18"/>
-          <w:szCs w:val="18"/>
+          <w:sz w:val="20"/>
+          <w:szCs w:val="20"/>
         </w:rPr>
         <w:t xml:space="preserve"/>
       </w:r>
@@ -1307,10 +1307,10 @@
           <w:tcPr>
             <w:tcW w:type="dxa" w:w="5103"/>
             <w:tcBorders>
-              <w:top w:val="dashed" w:color="D9D0F0" w:sz="18"/>
-              <w:left w:val="dashed" w:color="D9D0F0" w:sz="18"/>
-              <w:bottom w:val="dashed" w:color="D9D0F0" w:sz="18"/>
-              <w:right w:val="dashed" w:color="D9D0F0" w:sz="18"/>
+              <w:top w:val="dashed" w:color="D9D0F0" w:sz="20"/>
+              <w:left w:val="dashed" w:color="D9D0F0" w:sz="20"/>
+              <w:bottom w:val="dashed" w:color="D9D0F0" w:sz="20"/>
+              <w:right w:val="dashed" w:color="D9D0F0" w:sz="20"/>
             </w:tcBorders>
             <w:tcMar>
               <w:top w:type="dxa" w:w="120"/>
@@ -1354,8 +1354,8 @@
                 <w:iCs w:val="false"/>
                 <w:caps w:val="false"/>
                 <w:color w:val="6B6378"/>
-                <w:sz w:val="18"/>
-                <w:szCs w:val="18"/>
+                <w:sz w:val="20"/>
+                <w:szCs w:val="20"/>
               </w:rPr>
               <w:t xml:space="preserve">[Adres placówki, tel., e-mail]</w:t>
             </w:r>
@@ -1374,8 +1374,8 @@
                 <w:iCs w:val="false"/>
                 <w:caps w:val="false"/>
                 <w:color w:val="6B6378"/>
-                <w:sz w:val="18"/>
-                <w:szCs w:val="18"/>
+                <w:sz w:val="20"/>
+                <w:szCs w:val="20"/>
               </w:rPr>
               <w:t xml:space="preserve">(pieczęć placówki)</w:t>
             </w:r>
@@ -1412,8 +1412,8 @@
                 <w:iCs w:val="false"/>
                 <w:caps w:val="false"/>
                 <w:color w:val="6B6378"/>
-                <w:sz w:val="18"/>
-                <w:szCs w:val="18"/>
+                <w:sz w:val="20"/>
+                <w:szCs w:val="20"/>
               </w:rPr>
               <w:t xml:space="preserve">[Miejscowość], dnia ………………………</w:t>
             </w:r>
@@ -1432,8 +1432,8 @@
                 <w:iCs w:val="false"/>
                 <w:caps w:val="false"/>
                 <w:color w:val="6B6378"/>
-                <w:sz w:val="18"/>
-                <w:szCs w:val="18"/>
+                <w:sz w:val="20"/>
+                <w:szCs w:val="20"/>
               </w:rPr>
               <w:t xml:space="preserve">Znak sprawy: ………………………</w:t>
             </w:r>
@@ -1452,8 +1452,8 @@
                 <w:iCs w:val="false"/>
                 <w:caps w:val="false"/>
                 <w:color w:val="6B6378"/>
-                <w:sz w:val="18"/>
-                <w:szCs w:val="18"/>
+                <w:sz w:val="20"/>
+                <w:szCs w:val="20"/>
               </w:rPr>
               <w:t xml:space="preserve">Zespół orzekający: [Nazwa Poradni Psychologiczno-Pedagogicznej]</w:t>
             </w:r>
@@ -1470,7 +1470,7 @@
       <w:pPr>
         <w:keepNext/>
         <w:pBdr>
-          <w:bottom w:val="single" w:color="D9D0F0" w:sz="18" w:space="4"/>
+          <w:bottom w:val="single" w:color="D9D0F0" w:sz="20" w:space="4"/>
         </w:pBdr>
         <w:spacing w:after="100" w:before="180"/>
       </w:pPr>
@@ -1567,8 +1567,8 @@
           <w:iCs w:val="false"/>
           <w:caps w:val="false"/>
           <w:color w:val="6B6378"/>
-          <w:sz w:val="18"/>
-          <w:szCs w:val="18"/>
+          <w:sz w:val="20"/>
+          <w:szCs w:val="20"/>
         </w:rPr>
         <w:t xml:space="preserve"/>
       </w:r>
@@ -1628,8 +1628,8 @@
                 <w:caps/>
                 <w:color w:val="2D1B69"/>
                 <w:spacing w:val="10"/>
-                <w:sz w:val="18"/>
-                <w:szCs w:val="18"/>
+                <w:sz w:val="20"/>
+                <w:szCs w:val="20"/>
               </w:rPr>
               <w:t xml:space="preserve">Obszar (ICF)</w:t>
             </w:r>
@@ -1668,8 +1668,8 @@
                 <w:caps/>
                 <w:color w:val="2E7D45"/>
                 <w:spacing w:val="10"/>
-                <w:sz w:val="18"/>
-                <w:szCs w:val="18"/>
+                <w:sz w:val="20"/>
+                <w:szCs w:val="20"/>
               </w:rPr>
               <w:t xml:space="preserve">Mocne strony i uzdolnienia</w:t>
             </w:r>
@@ -1708,8 +1708,8 @@
                 <w:caps/>
                 <w:color w:val="BF382A"/>
                 <w:spacing w:val="10"/>
-                <w:sz w:val="18"/>
-                <w:szCs w:val="18"/>
+                <w:sz w:val="20"/>
+                <w:szCs w:val="20"/>
               </w:rPr>
               <w:t xml:space="preserve">Trudności</w:t>
             </w:r>
@@ -1748,8 +1748,8 @@
                 <w:caps/>
                 <w:color w:val="2D1B69"/>
                 <w:spacing w:val="10"/>
-                <w:sz w:val="18"/>
-                <w:szCs w:val="18"/>
+                <w:sz w:val="20"/>
+                <w:szCs w:val="20"/>
               </w:rPr>
               <w:t xml:space="preserve">Poziom potrzeby wsparcia</w:t>
             </w:r>
@@ -1780,7 +1780,7 @@
           </w:tcPr>
           <w:p>
             <w:pPr>
-              <w:spacing w:after="0" w:before="0" w:line="250"/>
+              <w:spacing w:after="0" w:before="0" w:line="270"/>
               <w:jc w:val="left"/>
             </w:pPr>
             <w:r>
@@ -1792,8 +1792,8 @@
                 <w:iCs w:val="false"/>
                 <w:caps w:val="false"/>
                 <w:color w:val="2D1B69"/>
-                <w:sz w:val="18"/>
-                <w:szCs w:val="18"/>
+                <w:sz w:val="20"/>
+                <w:szCs w:val="20"/>
               </w:rPr>
               <w:t xml:space="preserve">1 · Uczenie się i stosowanie wiedzy</w:t>
             </w:r>
@@ -1818,7 +1818,7 @@
           </w:tcPr>
           <w:p>
             <w:pPr>
-              <w:spacing w:after="0" w:before="0" w:line="250"/>
+              <w:spacing w:after="0" w:before="0" w:line="270"/>
               <w:jc w:val="left"/>
             </w:pPr>
             <w:r>
@@ -1830,8 +1830,8 @@
                 <w:iCs w:val="false"/>
                 <w:caps w:val="false"/>
                 <w:color w:val="1A1530"/>
-                <w:sz w:val="18"/>
-                <w:szCs w:val="18"/>
+                <w:sz w:val="20"/>
+                <w:szCs w:val="20"/>
               </w:rPr>
               <w:t xml:space="preserve">pamięć wzrokowa, schematy graficzne, zainteresowania tematyczne, motywacja do pracy z ulubionymi pomocami</w:t>
             </w:r>
@@ -1856,7 +1856,7 @@
           </w:tcPr>
           <w:p>
             <w:pPr>
-              <w:spacing w:after="0" w:before="0" w:line="250"/>
+              <w:spacing w:after="0" w:before="0" w:line="270"/>
               <w:jc w:val="left"/>
             </w:pPr>
             <w:r>
@@ -1868,8 +1868,8 @@
                 <w:iCs w:val="false"/>
                 <w:caps w:val="false"/>
                 <w:color w:val="1A1530"/>
-                <w:sz w:val="18"/>
-                <w:szCs w:val="18"/>
+                <w:sz w:val="20"/>
+                <w:szCs w:val="20"/>
               </w:rPr>
               <w:t xml:space="preserve">przerzutność i podzielność uwagi, instrukcje wieloetapowe, uogólnianie wiedzy, stres przy zmianie planu, potrzeba nadzoru nauczyciela</w:t>
             </w:r>
@@ -1894,7 +1894,7 @@
           </w:tcPr>
           <w:p>
             <w:pPr>
-              <w:spacing w:after="0" w:before="0" w:line="250"/>
+              <w:spacing w:after="0" w:before="0" w:line="270"/>
               <w:jc w:val="left"/>
             </w:pPr>
             <w:r>
@@ -1906,8 +1906,8 @@
                 <w:iCs w:val="false"/>
                 <w:caps w:val="false"/>
                 <w:color w:val="2D1B69"/>
-                <w:sz w:val="18"/>
-                <w:szCs w:val="18"/>
+                <w:sz w:val="20"/>
+                <w:szCs w:val="20"/>
               </w:rPr>
               <w:t xml:space="preserve">d1 śr. 2,4 · d2 śr. 1,8 · d8 śr. 2,0 – poziom średni / wysoki</w:t>
             </w:r>
@@ -1938,7 +1938,7 @@
           </w:tcPr>
           <w:p>
             <w:pPr>
-              <w:spacing w:after="0" w:before="0" w:line="250"/>
+              <w:spacing w:after="0" w:before="0" w:line="270"/>
               <w:jc w:val="left"/>
             </w:pPr>
             <w:r>
@@ -1950,8 +1950,8 @@
                 <w:iCs w:val="false"/>
                 <w:caps w:val="false"/>
                 <w:color w:val="2D1B69"/>
-                <w:sz w:val="18"/>
-                <w:szCs w:val="18"/>
+                <w:sz w:val="20"/>
+                <w:szCs w:val="20"/>
               </w:rPr>
               <w:t xml:space="preserve">2 · Zachowania społeczne we wzajemnych kontaktach – przystosowanie społeczne i emocjonalne</w:t>
             </w:r>
@@ -1976,7 +1976,7 @@
           </w:tcPr>
           <w:p>
             <w:pPr>
-              <w:spacing w:after="0" w:before="0" w:line="250"/>
+              <w:spacing w:after="0" w:before="0" w:line="270"/>
               <w:jc w:val="left"/>
             </w:pPr>
             <w:r>
@@ -1988,8 +1988,8 @@
                 <w:iCs w:val="false"/>
                 <w:caps w:val="false"/>
                 <w:color w:val="1A1530"/>
-                <w:sz w:val="18"/>
-                <w:szCs w:val="18"/>
+                <w:sz w:val="20"/>
+                <w:szCs w:val="20"/>
               </w:rPr>
               <w:t xml:space="preserve">chęć przebywania blisko grupy, reakcja na stałych dorosłych, przestrzeganie zasad wizualnych</w:t>
             </w:r>
@@ -2014,7 +2014,7 @@
           </w:tcPr>
           <w:p>
             <w:pPr>
-              <w:spacing w:after="0" w:before="0" w:line="250"/>
+              <w:spacing w:after="0" w:before="0" w:line="270"/>
               <w:jc w:val="left"/>
             </w:pPr>
             <w:r>
@@ -2026,8 +2026,8 @@
                 <w:iCs w:val="false"/>
                 <w:caps w:val="false"/>
                 <w:color w:val="1A1530"/>
-                <w:sz w:val="18"/>
-                <w:szCs w:val="18"/>
+                <w:sz w:val="20"/>
+                <w:szCs w:val="20"/>
               </w:rPr>
               <w:t xml:space="preserve">odczytywanie emocji i intencji, tolerancja frustracji, wycofanie lub zachowania trudne w apelach i wyjściach</w:t>
             </w:r>
@@ -2052,7 +2052,7 @@
           </w:tcPr>
           <w:p>
             <w:pPr>
-              <w:spacing w:after="0" w:before="0" w:line="250"/>
+              <w:spacing w:after="0" w:before="0" w:line="270"/>
               <w:jc w:val="left"/>
             </w:pPr>
             <w:r>
@@ -2064,8 +2064,8 @@
                 <w:iCs w:val="false"/>
                 <w:caps w:val="false"/>
                 <w:color w:val="2D1B69"/>
-                <w:sz w:val="18"/>
-                <w:szCs w:val="18"/>
+                <w:sz w:val="20"/>
+                <w:szCs w:val="20"/>
               </w:rPr>
               <w:t xml:space="preserve">d7 śr. 1,6 · d9 śr. 1,8 – poziom wysoki</w:t>
             </w:r>
@@ -2096,7 +2096,7 @@
           </w:tcPr>
           <w:p>
             <w:pPr>
-              <w:spacing w:after="0" w:before="0" w:line="250"/>
+              <w:spacing w:after="0" w:before="0" w:line="270"/>
               <w:jc w:val="left"/>
             </w:pPr>
             <w:r>
@@ -2108,8 +2108,8 @@
                 <w:iCs w:val="false"/>
                 <w:caps w:val="false"/>
                 <w:color w:val="2D1B69"/>
-                <w:sz w:val="18"/>
-                <w:szCs w:val="18"/>
+                <w:sz w:val="20"/>
+                <w:szCs w:val="20"/>
               </w:rPr>
               <w:t xml:space="preserve">3 · Porozumiewanie się</w:t>
             </w:r>
@@ -2134,7 +2134,7 @@
           </w:tcPr>
           <w:p>
             <w:pPr>
-              <w:spacing w:after="0" w:before="0" w:line="250"/>
+              <w:spacing w:after="0" w:before="0" w:line="270"/>
               <w:jc w:val="left"/>
             </w:pPr>
             <w:r>
@@ -2146,8 +2146,8 @@
                 <w:iCs w:val="false"/>
                 <w:caps w:val="false"/>
                 <w:color w:val="1A1530"/>
-                <w:sz w:val="18"/>
-                <w:szCs w:val="18"/>
+                <w:sz w:val="20"/>
+                <w:szCs w:val="20"/>
               </w:rPr>
               <w:t xml:space="preserve">rozumienie prostych komunikatów wspartych gestem, sygnalizowanie potrzeb</w:t>
             </w:r>
@@ -2172,7 +2172,7 @@
           </w:tcPr>
           <w:p>
             <w:pPr>
-              <w:spacing w:after="0" w:before="0" w:line="250"/>
+              <w:spacing w:after="0" w:before="0" w:line="270"/>
               <w:jc w:val="left"/>
             </w:pPr>
             <w:r>
@@ -2184,8 +2184,8 @@
                 <w:iCs w:val="false"/>
                 <w:caps w:val="false"/>
                 <w:color w:val="1A1530"/>
-                <w:sz w:val="18"/>
-                <w:szCs w:val="18"/>
+                <w:sz w:val="20"/>
+                <w:szCs w:val="20"/>
               </w:rPr>
               <w:t xml:space="preserve">dosłowność, echolalie, inicjowanie i naprzemienność dialogu, potrzeba AAC</w:t>
             </w:r>
@@ -2210,7 +2210,7 @@
           </w:tcPr>
           <w:p>
             <w:pPr>
-              <w:spacing w:after="0" w:before="0" w:line="250"/>
+              <w:spacing w:after="0" w:before="0" w:line="270"/>
               <w:jc w:val="left"/>
             </w:pPr>
             <w:r>
@@ -2222,8 +2222,8 @@
                 <w:iCs w:val="false"/>
                 <w:caps w:val="false"/>
                 <w:color w:val="2D1B69"/>
-                <w:sz w:val="18"/>
-                <w:szCs w:val="18"/>
+                <w:sz w:val="20"/>
+                <w:szCs w:val="20"/>
               </w:rPr>
               <w:t xml:space="preserve">d3 śr. 2,0 – poziom średni</w:t>
             </w:r>
@@ -2254,7 +2254,7 @@
           </w:tcPr>
           <w:p>
             <w:pPr>
-              <w:spacing w:after="0" w:before="0" w:line="250"/>
+              <w:spacing w:after="0" w:before="0" w:line="270"/>
               <w:jc w:val="left"/>
             </w:pPr>
             <w:r>
@@ -2266,8 +2266,8 @@
                 <w:iCs w:val="false"/>
                 <w:caps w:val="false"/>
                 <w:color w:val="2D1B69"/>
-                <w:sz w:val="18"/>
-                <w:szCs w:val="18"/>
+                <w:sz w:val="20"/>
+                <w:szCs w:val="20"/>
               </w:rPr>
               <w:t xml:space="preserve">4 · Aktywność ruchowa – poruszanie się</w:t>
             </w:r>
@@ -2292,7 +2292,7 @@
           </w:tcPr>
           <w:p>
             <w:pPr>
-              <w:spacing w:after="0" w:before="0" w:line="250"/>
+              <w:spacing w:after="0" w:before="0" w:line="270"/>
               <w:jc w:val="left"/>
             </w:pPr>
             <w:r>
@@ -2304,8 +2304,8 @@
                 <w:iCs w:val="false"/>
                 <w:caps w:val="false"/>
                 <w:color w:val="1A1530"/>
-                <w:sz w:val="18"/>
-                <w:szCs w:val="18"/>
+                <w:sz w:val="20"/>
+                <w:szCs w:val="20"/>
               </w:rPr>
               <w:t xml:space="preserve">motoryka duża, chętny udział w zabawach ruchowych</w:t>
             </w:r>
@@ -2330,7 +2330,7 @@
           </w:tcPr>
           <w:p>
             <w:pPr>
-              <w:spacing w:after="0" w:before="0" w:line="250"/>
+              <w:spacing w:after="0" w:before="0" w:line="270"/>
               <w:jc w:val="left"/>
             </w:pPr>
             <w:r>
@@ -2342,8 +2342,8 @@
                 <w:iCs w:val="false"/>
                 <w:caps w:val="false"/>
                 <w:color w:val="1A1530"/>
-                <w:sz w:val="18"/>
-                <w:szCs w:val="18"/>
+                <w:sz w:val="20"/>
+                <w:szCs w:val="20"/>
               </w:rPr>
               <w:t xml:space="preserve">motoryka mała, koordynacja wzrokowo-ruchowa, chwyt, napięcie posturalne</w:t>
             </w:r>
@@ -2368,7 +2368,7 @@
           </w:tcPr>
           <w:p>
             <w:pPr>
-              <w:spacing w:after="0" w:before="0" w:line="250"/>
+              <w:spacing w:after="0" w:before="0" w:line="270"/>
               <w:jc w:val="left"/>
             </w:pPr>
             <w:r>
@@ -2380,8 +2380,8 @@
                 <w:iCs w:val="false"/>
                 <w:caps w:val="false"/>
                 <w:color w:val="2D1B69"/>
-                <w:sz w:val="18"/>
-                <w:szCs w:val="18"/>
+                <w:sz w:val="20"/>
+                <w:szCs w:val="20"/>
               </w:rPr>
               <w:t xml:space="preserve">d4 śr. 3,2 – poziom niski</w:t>
             </w:r>
@@ -2412,7 +2412,7 @@
           </w:tcPr>
           <w:p>
             <w:pPr>
-              <w:spacing w:after="0" w:before="0" w:line="250"/>
+              <w:spacing w:after="0" w:before="0" w:line="270"/>
               <w:jc w:val="left"/>
             </w:pPr>
             <w:r>
@@ -2424,8 +2424,8 @@
                 <w:iCs w:val="false"/>
                 <w:caps w:val="false"/>
                 <w:color w:val="2D1B69"/>
-                <w:sz w:val="18"/>
-                <w:szCs w:val="18"/>
+                <w:sz w:val="20"/>
+                <w:szCs w:val="20"/>
               </w:rPr>
               <w:t xml:space="preserve">5 · Dbanie o siebie</w:t>
             </w:r>
@@ -2450,7 +2450,7 @@
           </w:tcPr>
           <w:p>
             <w:pPr>
-              <w:spacing w:after="0" w:before="0" w:line="250"/>
+              <w:spacing w:after="0" w:before="0" w:line="270"/>
               <w:jc w:val="left"/>
             </w:pPr>
             <w:r>
@@ -2462,8 +2462,8 @@
                 <w:iCs w:val="false"/>
                 <w:caps w:val="false"/>
                 <w:color w:val="1A1530"/>
-                <w:sz w:val="18"/>
-                <w:szCs w:val="18"/>
+                <w:sz w:val="20"/>
+                <w:szCs w:val="20"/>
               </w:rPr>
               <w:t xml:space="preserve">podstawowe nawyki higieniczne i toaletowe, znajomość swoich rzeczy, obowiązki po przypomnieniu</w:t>
             </w:r>
@@ -2488,7 +2488,7 @@
           </w:tcPr>
           <w:p>
             <w:pPr>
-              <w:spacing w:after="0" w:before="0" w:line="250"/>
+              <w:spacing w:after="0" w:before="0" w:line="270"/>
               <w:jc w:val="left"/>
             </w:pPr>
             <w:r>
@@ -2500,8 +2500,8 @@
                 <w:iCs w:val="false"/>
                 <w:caps w:val="false"/>
                 <w:color w:val="1A1530"/>
-                <w:sz w:val="18"/>
-                <w:szCs w:val="18"/>
+                <w:sz w:val="20"/>
+                <w:szCs w:val="20"/>
               </w:rPr>
               <w:t xml:space="preserve">opór sensoryczny przy myciu rąk, wybiórczość pokarmowa, trudne zapięcia, brak inicjowania obowiązków</w:t>
             </w:r>
@@ -2526,7 +2526,7 @@
           </w:tcPr>
           <w:p>
             <w:pPr>
-              <w:spacing w:after="0" w:before="0" w:line="250"/>
+              <w:spacing w:after="0" w:before="0" w:line="270"/>
               <w:jc w:val="left"/>
             </w:pPr>
             <w:r>
@@ -2538,8 +2538,8 @@
                 <w:iCs w:val="false"/>
                 <w:caps w:val="false"/>
                 <w:color w:val="2D1B69"/>
-                <w:sz w:val="18"/>
-                <w:szCs w:val="18"/>
+                <w:sz w:val="20"/>
+                <w:szCs w:val="20"/>
               </w:rPr>
               <w:t xml:space="preserve">d5 śr. 2,2 · d6 śr. 2,8 – poziom średni / niski</w:t>
             </w:r>
@@ -2561,8 +2561,8 @@
           <w:iCs w:val="false"/>
           <w:caps w:val="false"/>
           <w:color w:val="1A1530"/>
-          <w:sz w:val="18"/>
-          <w:szCs w:val="18"/>
+          <w:sz w:val="20"/>
+          <w:szCs w:val="20"/>
         </w:rPr>
         <w:t xml:space="preserve"/>
       </w:r>
@@ -2591,10 +2591,10 @@
           <w:tcPr>
             <w:tcW w:type="dxa" w:w="5103"/>
             <w:tcBorders>
-              <w:top w:val="dashed" w:color="D9D0F0" w:sz="18"/>
-              <w:left w:val="dashed" w:color="D9D0F0" w:sz="18"/>
-              <w:bottom w:val="dashed" w:color="D9D0F0" w:sz="18"/>
-              <w:right w:val="dashed" w:color="D9D0F0" w:sz="18"/>
+              <w:top w:val="dashed" w:color="D9D0F0" w:sz="20"/>
+              <w:left w:val="dashed" w:color="D9D0F0" w:sz="20"/>
+              <w:bottom w:val="dashed" w:color="D9D0F0" w:sz="20"/>
+              <w:right w:val="dashed" w:color="D9D0F0" w:sz="20"/>
             </w:tcBorders>
             <w:tcMar>
               <w:top w:type="dxa" w:w="120"/>
@@ -2638,8 +2638,8 @@
                 <w:iCs w:val="false"/>
                 <w:caps w:val="false"/>
                 <w:color w:val="6B6378"/>
-                <w:sz w:val="18"/>
-                <w:szCs w:val="18"/>
+                <w:sz w:val="20"/>
+                <w:szCs w:val="20"/>
               </w:rPr>
               <w:t xml:space="preserve">[Adres placówki, tel., e-mail]</w:t>
             </w:r>
@@ -2658,8 +2658,8 @@
                 <w:iCs w:val="false"/>
                 <w:caps w:val="false"/>
                 <w:color w:val="6B6378"/>
-                <w:sz w:val="18"/>
-                <w:szCs w:val="18"/>
+                <w:sz w:val="20"/>
+                <w:szCs w:val="20"/>
               </w:rPr>
               <w:t xml:space="preserve">(pieczęć placówki)</w:t>
             </w:r>
@@ -2696,8 +2696,8 @@
                 <w:iCs w:val="false"/>
                 <w:caps w:val="false"/>
                 <w:color w:val="6B6378"/>
-                <w:sz w:val="18"/>
-                <w:szCs w:val="18"/>
+                <w:sz w:val="20"/>
+                <w:szCs w:val="20"/>
               </w:rPr>
               <w:t xml:space="preserve">[Miejscowość], dnia ………………………</w:t>
             </w:r>
@@ -2716,8 +2716,8 @@
                 <w:iCs w:val="false"/>
                 <w:caps w:val="false"/>
                 <w:color w:val="6B6378"/>
-                <w:sz w:val="18"/>
-                <w:szCs w:val="18"/>
+                <w:sz w:val="20"/>
+                <w:szCs w:val="20"/>
               </w:rPr>
               <w:t xml:space="preserve">Znak sprawy: ………………………</w:t>
             </w:r>
@@ -2736,8 +2736,8 @@
                 <w:iCs w:val="false"/>
                 <w:caps w:val="false"/>
                 <w:color w:val="6B6378"/>
-                <w:sz w:val="18"/>
-                <w:szCs w:val="18"/>
+                <w:sz w:val="20"/>
+                <w:szCs w:val="20"/>
               </w:rPr>
               <w:t xml:space="preserve">Zespół orzekający: [Nazwa Poradni Psychologiczno-Pedagogicznej]</w:t>
             </w:r>
@@ -2754,7 +2754,7 @@
       <w:pPr>
         <w:keepNext/>
         <w:pBdr>
-          <w:bottom w:val="single" w:color="D9D0F0" w:sz="18" w:space="4"/>
+          <w:bottom w:val="single" w:color="D9D0F0" w:sz="20" w:space="4"/>
         </w:pBdr>
         <w:spacing w:after="100" w:before="180"/>
       </w:pPr>
@@ -2831,8 +2831,8 @@
           <w:iCs w:val="false"/>
           <w:caps w:val="false"/>
           <w:color w:val="6B6378"/>
-          <w:sz w:val="18"/>
-          <w:szCs w:val="18"/>
+          <w:sz w:val="20"/>
+          <w:szCs w:val="20"/>
         </w:rPr>
         <w:t xml:space="preserve"/>
       </w:r>
@@ -2892,8 +2892,8 @@
                 <w:caps/>
                 <w:color w:val="2D1B69"/>
                 <w:spacing w:val="10"/>
-                <w:sz w:val="18"/>
-                <w:szCs w:val="18"/>
+                <w:sz w:val="20"/>
+                <w:szCs w:val="20"/>
               </w:rPr>
               <w:t xml:space="preserve">Obszar (ICF)</w:t>
             </w:r>
@@ -2932,8 +2932,8 @@
                 <w:caps/>
                 <w:color w:val="2E7D45"/>
                 <w:spacing w:val="10"/>
-                <w:sz w:val="18"/>
-                <w:szCs w:val="18"/>
+                <w:sz w:val="20"/>
+                <w:szCs w:val="20"/>
               </w:rPr>
               <w:t xml:space="preserve">Mocne strony i uzdolnienia</w:t>
             </w:r>
@@ -2972,8 +2972,8 @@
                 <w:caps/>
                 <w:color w:val="BF382A"/>
                 <w:spacing w:val="10"/>
-                <w:sz w:val="18"/>
-                <w:szCs w:val="18"/>
+                <w:sz w:val="20"/>
+                <w:szCs w:val="20"/>
               </w:rPr>
               <w:t xml:space="preserve">Trudności</w:t>
             </w:r>
@@ -3012,8 +3012,8 @@
                 <w:caps/>
                 <w:color w:val="2D1B69"/>
                 <w:spacing w:val="10"/>
-                <w:sz w:val="18"/>
-                <w:szCs w:val="18"/>
+                <w:sz w:val="20"/>
+                <w:szCs w:val="20"/>
               </w:rPr>
               <w:t xml:space="preserve">Poziom potrzeby wsparcia</w:t>
             </w:r>
@@ -3044,7 +3044,7 @@
           </w:tcPr>
           <w:p>
             <w:pPr>
-              <w:spacing w:after="0" w:before="0" w:line="250"/>
+              <w:spacing w:after="0" w:before="0" w:line="270"/>
               <w:jc w:val="left"/>
             </w:pPr>
             <w:r>
@@ -3056,8 +3056,8 @@
                 <w:iCs w:val="false"/>
                 <w:caps w:val="false"/>
                 <w:color w:val="2D1B69"/>
-                <w:sz w:val="18"/>
-                <w:szCs w:val="18"/>
+                <w:sz w:val="20"/>
+                <w:szCs w:val="20"/>
               </w:rPr>
               <w:t xml:space="preserve">1 · Uczenie się i stosowanie wiedzy</w:t>
             </w:r>
@@ -3082,7 +3082,7 @@
           </w:tcPr>
           <w:p>
             <w:pPr>
-              <w:spacing w:after="0" w:before="0" w:line="250"/>
+              <w:spacing w:after="0" w:before="0" w:line="270"/>
               <w:jc w:val="left"/>
             </w:pPr>
             <w:r>
@@ -3094,8 +3094,8 @@
                 <w:iCs w:val="false"/>
                 <w:caps w:val="false"/>
                 <w:color w:val="1A1530"/>
-                <w:sz w:val="18"/>
-                <w:szCs w:val="18"/>
+                <w:sz w:val="20"/>
+                <w:szCs w:val="20"/>
               </w:rPr>
               <w:t xml:space="preserve">pamięć wzrokowa, schematy graficzne, zainteresowania, zaangażowanie przy zadaniach z obrazem</w:t>
             </w:r>
@@ -3120,7 +3120,7 @@
           </w:tcPr>
           <w:p>
             <w:pPr>
-              <w:spacing w:after="0" w:before="0" w:line="250"/>
+              <w:spacing w:after="0" w:before="0" w:line="270"/>
               <w:jc w:val="left"/>
             </w:pPr>
             <w:r>
@@ -3132,8 +3132,8 @@
                 <w:iCs w:val="false"/>
                 <w:caps w:val="false"/>
                 <w:color w:val="1A1530"/>
-                <w:sz w:val="18"/>
-                <w:szCs w:val="18"/>
+                <w:sz w:val="20"/>
+                <w:szCs w:val="20"/>
               </w:rPr>
               <w:t xml:space="preserve">uwaga, instrukcje wieloetapowe, uogólnianie, męczliwość przy pisaniu, potrzeba nadzoru</w:t>
             </w:r>
@@ -3158,7 +3158,7 @@
           </w:tcPr>
           <w:p>
             <w:pPr>
-              <w:spacing w:after="0" w:before="0" w:line="250"/>
+              <w:spacing w:after="0" w:before="0" w:line="270"/>
               <w:jc w:val="left"/>
             </w:pPr>
             <w:r>
@@ -3170,8 +3170,8 @@
                 <w:iCs w:val="false"/>
                 <w:caps w:val="false"/>
                 <w:color w:val="2D1B69"/>
-                <w:sz w:val="18"/>
-                <w:szCs w:val="18"/>
+                <w:sz w:val="20"/>
+                <w:szCs w:val="20"/>
               </w:rPr>
               <w:t xml:space="preserve">d1 śr. 2,4 · d8 śr. 2,0 – średni</w:t>
             </w:r>
@@ -3202,7 +3202,7 @@
           </w:tcPr>
           <w:p>
             <w:pPr>
-              <w:spacing w:after="0" w:before="0" w:line="250"/>
+              <w:spacing w:after="0" w:before="0" w:line="270"/>
               <w:jc w:val="left"/>
             </w:pPr>
             <w:r>
@@ -3214,8 +3214,8 @@
                 <w:iCs w:val="false"/>
                 <w:caps w:val="false"/>
                 <w:color w:val="2D1B69"/>
-                <w:sz w:val="18"/>
-                <w:szCs w:val="18"/>
+                <w:sz w:val="20"/>
+                <w:szCs w:val="20"/>
               </w:rPr>
               <w:t xml:space="preserve">2 · Ogólne zadania i obowiązki</w:t>
             </w:r>
@@ -3240,7 +3240,7 @@
           </w:tcPr>
           <w:p>
             <w:pPr>
-              <w:spacing w:after="0" w:before="0" w:line="250"/>
+              <w:spacing w:after="0" w:before="0" w:line="270"/>
               <w:jc w:val="left"/>
             </w:pPr>
             <w:r>
@@ -3252,8 +3252,8 @@
                 <w:iCs w:val="false"/>
                 <w:caps w:val="false"/>
                 <w:color w:val="1A1530"/>
-                <w:sz w:val="18"/>
-                <w:szCs w:val="18"/>
+                <w:sz w:val="20"/>
+                <w:szCs w:val="20"/>
               </w:rPr>
               <w:t xml:space="preserve">zadania o stałej strukturze, zasady wizualne</w:t>
             </w:r>
@@ -3278,7 +3278,7 @@
           </w:tcPr>
           <w:p>
             <w:pPr>
-              <w:spacing w:after="0" w:before="0" w:line="250"/>
+              <w:spacing w:after="0" w:before="0" w:line="270"/>
               <w:jc w:val="left"/>
             </w:pPr>
             <w:r>
@@ -3290,8 +3290,8 @@
                 <w:iCs w:val="false"/>
                 <w:caps w:val="false"/>
                 <w:color w:val="1A1530"/>
-                <w:sz w:val="18"/>
-                <w:szCs w:val="18"/>
+                <w:sz w:val="20"/>
+                <w:szCs w:val="20"/>
               </w:rPr>
               <w:t xml:space="preserve">organizacja pracy, zadania wieloetapowe, stres przy zmianach</w:t>
             </w:r>
@@ -3316,7 +3316,7 @@
           </w:tcPr>
           <w:p>
             <w:pPr>
-              <w:spacing w:after="0" w:before="0" w:line="250"/>
+              <w:spacing w:after="0" w:before="0" w:line="270"/>
               <w:jc w:val="left"/>
             </w:pPr>
             <w:r>
@@ -3328,8 +3328,8 @@
                 <w:iCs w:val="false"/>
                 <w:caps w:val="false"/>
                 <w:color w:val="2D1B69"/>
-                <w:sz w:val="18"/>
-                <w:szCs w:val="18"/>
+                <w:sz w:val="20"/>
+                <w:szCs w:val="20"/>
               </w:rPr>
               <w:t xml:space="preserve">d2 śr. 1,8 – wysoki</w:t>
             </w:r>
@@ -3360,7 +3360,7 @@
           </w:tcPr>
           <w:p>
             <w:pPr>
-              <w:spacing w:after="0" w:before="0" w:line="250"/>
+              <w:spacing w:after="0" w:before="0" w:line="270"/>
               <w:jc w:val="left"/>
             </w:pPr>
             <w:r>
@@ -3372,8 +3372,8 @@
                 <w:iCs w:val="false"/>
                 <w:caps w:val="false"/>
                 <w:color w:val="2D1B69"/>
-                <w:sz w:val="18"/>
-                <w:szCs w:val="18"/>
+                <w:sz w:val="20"/>
+                <w:szCs w:val="20"/>
               </w:rPr>
               <w:t xml:space="preserve">3 · Porozumiewanie się</w:t>
             </w:r>
@@ -3398,7 +3398,7 @@
           </w:tcPr>
           <w:p>
             <w:pPr>
-              <w:spacing w:after="0" w:before="0" w:line="250"/>
+              <w:spacing w:after="0" w:before="0" w:line="270"/>
               <w:jc w:val="left"/>
             </w:pPr>
             <w:r>
@@ -3410,8 +3410,8 @@
                 <w:iCs w:val="false"/>
                 <w:caps w:val="false"/>
                 <w:color w:val="1A1530"/>
-                <w:sz w:val="18"/>
-                <w:szCs w:val="18"/>
+                <w:sz w:val="20"/>
+                <w:szCs w:val="20"/>
               </w:rPr>
               <w:t xml:space="preserve">rozumienie prostych komunikatów z gestem, sygnalizowanie potrzeb</w:t>
             </w:r>
@@ -3436,7 +3436,7 @@
           </w:tcPr>
           <w:p>
             <w:pPr>
-              <w:spacing w:after="0" w:before="0" w:line="250"/>
+              <w:spacing w:after="0" w:before="0" w:line="270"/>
               <w:jc w:val="left"/>
             </w:pPr>
             <w:r>
@@ -3448,8 +3448,8 @@
                 <w:iCs w:val="false"/>
                 <w:caps w:val="false"/>
                 <w:color w:val="1A1530"/>
-                <w:sz w:val="18"/>
-                <w:szCs w:val="18"/>
+                <w:sz w:val="20"/>
+                <w:szCs w:val="20"/>
               </w:rPr>
               <w:t xml:space="preserve">dosłowność, echolalie, inicjowanie dialogu, potrzeba AAC</w:t>
             </w:r>
@@ -3474,7 +3474,7 @@
           </w:tcPr>
           <w:p>
             <w:pPr>
-              <w:spacing w:after="0" w:before="0" w:line="250"/>
+              <w:spacing w:after="0" w:before="0" w:line="270"/>
               <w:jc w:val="left"/>
             </w:pPr>
             <w:r>
@@ -3486,8 +3486,8 @@
                 <w:iCs w:val="false"/>
                 <w:caps w:val="false"/>
                 <w:color w:val="2D1B69"/>
-                <w:sz w:val="18"/>
-                <w:szCs w:val="18"/>
+                <w:sz w:val="20"/>
+                <w:szCs w:val="20"/>
               </w:rPr>
               <w:t xml:space="preserve">d3 śr. 2,0 – średni</w:t>
             </w:r>
@@ -3518,7 +3518,7 @@
           </w:tcPr>
           <w:p>
             <w:pPr>
-              <w:spacing w:after="0" w:before="0" w:line="250"/>
+              <w:spacing w:after="0" w:before="0" w:line="270"/>
               <w:jc w:val="left"/>
             </w:pPr>
             <w:r>
@@ -3530,8 +3530,8 @@
                 <w:iCs w:val="false"/>
                 <w:caps w:val="false"/>
                 <w:color w:val="2D1B69"/>
-                <w:sz w:val="18"/>
-                <w:szCs w:val="18"/>
+                <w:sz w:val="20"/>
+                <w:szCs w:val="20"/>
               </w:rPr>
               <w:t xml:space="preserve">4 · Motoryka, poruszanie się, w tym mobilność i aktywność manualna</w:t>
             </w:r>
@@ -3556,7 +3556,7 @@
           </w:tcPr>
           <w:p>
             <w:pPr>
-              <w:spacing w:after="0" w:before="0" w:line="250"/>
+              <w:spacing w:after="0" w:before="0" w:line="270"/>
               <w:jc w:val="left"/>
             </w:pPr>
             <w:r>
@@ -3568,8 +3568,8 @@
                 <w:iCs w:val="false"/>
                 <w:caps w:val="false"/>
                 <w:color w:val="1A1530"/>
-                <w:sz w:val="18"/>
-                <w:szCs w:val="18"/>
+                <w:sz w:val="20"/>
+                <w:szCs w:val="20"/>
               </w:rPr>
               <w:t xml:space="preserve">motoryka duża, zabawy ruchowe</w:t>
             </w:r>
@@ -3594,7 +3594,7 @@
           </w:tcPr>
           <w:p>
             <w:pPr>
-              <w:spacing w:after="0" w:before="0" w:line="250"/>
+              <w:spacing w:after="0" w:before="0" w:line="270"/>
               <w:jc w:val="left"/>
             </w:pPr>
             <w:r>
@@ -3606,8 +3606,8 @@
                 <w:iCs w:val="false"/>
                 <w:caps w:val="false"/>
                 <w:color w:val="1A1530"/>
-                <w:sz w:val="18"/>
-                <w:szCs w:val="18"/>
+                <w:sz w:val="20"/>
+                <w:szCs w:val="20"/>
               </w:rPr>
               <w:t xml:space="preserve">motoryka mała, koordynacja, chwyt</w:t>
             </w:r>
@@ -3632,7 +3632,7 @@
           </w:tcPr>
           <w:p>
             <w:pPr>
-              <w:spacing w:after="0" w:before="0" w:line="250"/>
+              <w:spacing w:after="0" w:before="0" w:line="270"/>
               <w:jc w:val="left"/>
             </w:pPr>
             <w:r>
@@ -3644,8 +3644,8 @@
                 <w:iCs w:val="false"/>
                 <w:caps w:val="false"/>
                 <w:color w:val="2D1B69"/>
-                <w:sz w:val="18"/>
-                <w:szCs w:val="18"/>
+                <w:sz w:val="20"/>
+                <w:szCs w:val="20"/>
               </w:rPr>
               <w:t xml:space="preserve">d4 śr. 3,2 – niski</w:t>
             </w:r>
@@ -3676,7 +3676,7 @@
           </w:tcPr>
           <w:p>
             <w:pPr>
-              <w:spacing w:after="0" w:before="0" w:line="250"/>
+              <w:spacing w:after="0" w:before="0" w:line="270"/>
               <w:jc w:val="left"/>
             </w:pPr>
             <w:r>
@@ -3688,8 +3688,8 @@
                 <w:iCs w:val="false"/>
                 <w:caps w:val="false"/>
                 <w:color w:val="2D1B69"/>
-                <w:sz w:val="18"/>
-                <w:szCs w:val="18"/>
+                <w:sz w:val="20"/>
+                <w:szCs w:val="20"/>
               </w:rPr>
               <w:t xml:space="preserve">5 · Dbanie o siebie, samoobsługa i samodzielność</w:t>
             </w:r>
@@ -3714,7 +3714,7 @@
           </w:tcPr>
           <w:p>
             <w:pPr>
-              <w:spacing w:after="0" w:before="0" w:line="250"/>
+              <w:spacing w:after="0" w:before="0" w:line="270"/>
               <w:jc w:val="left"/>
             </w:pPr>
             <w:r>
@@ -3726,8 +3726,8 @@
                 <w:iCs w:val="false"/>
                 <w:caps w:val="false"/>
                 <w:color w:val="1A1530"/>
-                <w:sz w:val="18"/>
-                <w:szCs w:val="18"/>
+                <w:sz w:val="20"/>
+                <w:szCs w:val="20"/>
               </w:rPr>
               <w:t xml:space="preserve">higiena i toaleta, znajomość swoich rzeczy</w:t>
             </w:r>
@@ -3752,7 +3752,7 @@
           </w:tcPr>
           <w:p>
             <w:pPr>
-              <w:spacing w:after="0" w:before="0" w:line="250"/>
+              <w:spacing w:after="0" w:before="0" w:line="270"/>
               <w:jc w:val="left"/>
             </w:pPr>
             <w:r>
@@ -3764,8 +3764,8 @@
                 <w:iCs w:val="false"/>
                 <w:caps w:val="false"/>
                 <w:color w:val="1A1530"/>
-                <w:sz w:val="18"/>
-                <w:szCs w:val="18"/>
+                <w:sz w:val="20"/>
+                <w:szCs w:val="20"/>
               </w:rPr>
               <w:t xml:space="preserve">opór sensoryczny przy myciu rąk, wybiórczość pokarmowa, zapięcia</w:t>
             </w:r>
@@ -3790,7 +3790,7 @@
           </w:tcPr>
           <w:p>
             <w:pPr>
-              <w:spacing w:after="0" w:before="0" w:line="250"/>
+              <w:spacing w:after="0" w:before="0" w:line="270"/>
               <w:jc w:val="left"/>
             </w:pPr>
             <w:r>
@@ -3802,8 +3802,8 @@
                 <w:iCs w:val="false"/>
                 <w:caps w:val="false"/>
                 <w:color w:val="2D1B69"/>
-                <w:sz w:val="18"/>
-                <w:szCs w:val="18"/>
+                <w:sz w:val="20"/>
+                <w:szCs w:val="20"/>
               </w:rPr>
               <w:t xml:space="preserve">d5 śr. 2,2 – średni</w:t>
             </w:r>
@@ -3834,7 +3834,7 @@
           </w:tcPr>
           <w:p>
             <w:pPr>
-              <w:spacing w:after="0" w:before="0" w:line="250"/>
+              <w:spacing w:after="0" w:before="0" w:line="270"/>
               <w:jc w:val="left"/>
             </w:pPr>
             <w:r>
@@ -3846,8 +3846,8 @@
                 <w:iCs w:val="false"/>
                 <w:caps w:val="false"/>
                 <w:color w:val="2D1B69"/>
-                <w:sz w:val="18"/>
-                <w:szCs w:val="18"/>
+                <w:sz w:val="20"/>
+                <w:szCs w:val="20"/>
               </w:rPr>
               <w:t xml:space="preserve">6 · Życie domowe</w:t>
             </w:r>
@@ -3872,7 +3872,7 @@
           </w:tcPr>
           <w:p>
             <w:pPr>
-              <w:spacing w:after="0" w:before="0" w:line="250"/>
+              <w:spacing w:after="0" w:before="0" w:line="270"/>
               <w:jc w:val="left"/>
             </w:pPr>
             <w:r>
@@ -3884,8 +3884,8 @@
                 <w:iCs w:val="false"/>
                 <w:caps w:val="false"/>
                 <w:color w:val="1A1530"/>
-                <w:sz w:val="18"/>
-                <w:szCs w:val="18"/>
+                <w:sz w:val="20"/>
+                <w:szCs w:val="20"/>
               </w:rPr>
               <w:t xml:space="preserve">dyżur i sprzątanie po przypomnieniu</w:t>
             </w:r>
@@ -3910,7 +3910,7 @@
           </w:tcPr>
           <w:p>
             <w:pPr>
-              <w:spacing w:after="0" w:before="0" w:line="250"/>
+              <w:spacing w:after="0" w:before="0" w:line="270"/>
               <w:jc w:val="left"/>
             </w:pPr>
             <w:r>
@@ -3922,8 +3922,8 @@
                 <w:iCs w:val="false"/>
                 <w:caps w:val="false"/>
                 <w:color w:val="1A1530"/>
-                <w:sz w:val="18"/>
-                <w:szCs w:val="18"/>
+                <w:sz w:val="20"/>
+                <w:szCs w:val="20"/>
               </w:rPr>
               <w:t xml:space="preserve">brak inicjowania, niedoprowadzanie do końca</w:t>
             </w:r>
@@ -3948,7 +3948,7 @@
           </w:tcPr>
           <w:p>
             <w:pPr>
-              <w:spacing w:after="0" w:before="0" w:line="250"/>
+              <w:spacing w:after="0" w:before="0" w:line="270"/>
               <w:jc w:val="left"/>
             </w:pPr>
             <w:r>
@@ -3960,8 +3960,8 @@
                 <w:iCs w:val="false"/>
                 <w:caps w:val="false"/>
                 <w:color w:val="2D1B69"/>
-                <w:sz w:val="18"/>
-                <w:szCs w:val="18"/>
+                <w:sz w:val="20"/>
+                <w:szCs w:val="20"/>
               </w:rPr>
               <w:t xml:space="preserve">d6 śr. 2,8 – niski</w:t>
             </w:r>
@@ -3992,7 +3992,7 @@
           </w:tcPr>
           <w:p>
             <w:pPr>
-              <w:spacing w:after="0" w:before="0" w:line="250"/>
+              <w:spacing w:after="0" w:before="0" w:line="270"/>
               <w:jc w:val="left"/>
             </w:pPr>
             <w:r>
@@ -4004,8 +4004,8 @@
                 <w:iCs w:val="false"/>
                 <w:caps w:val="false"/>
                 <w:color w:val="2D1B69"/>
-                <w:sz w:val="18"/>
-                <w:szCs w:val="18"/>
+                <w:sz w:val="20"/>
+                <w:szCs w:val="20"/>
               </w:rPr>
               <w:t xml:space="preserve">7 · Wzajemne kontakty i związki międzyludzkie, życie w społeczności szkolnej i lokalnej</w:t>
             </w:r>
@@ -4030,7 +4030,7 @@
           </w:tcPr>
           <w:p>
             <w:pPr>
-              <w:spacing w:after="0" w:before="0" w:line="250"/>
+              <w:spacing w:after="0" w:before="0" w:line="270"/>
               <w:jc w:val="left"/>
             </w:pPr>
             <w:r>
@@ -4042,8 +4042,8 @@
                 <w:iCs w:val="false"/>
                 <w:caps w:val="false"/>
                 <w:color w:val="1A1530"/>
-                <w:sz w:val="18"/>
-                <w:szCs w:val="18"/>
+                <w:sz w:val="20"/>
+                <w:szCs w:val="20"/>
               </w:rPr>
               <w:t xml:space="preserve">bliskość grupy, reakcja na stałych dorosłych; udział w wydarzeniach po przygotowaniu</w:t>
             </w:r>
@@ -4068,7 +4068,7 @@
           </w:tcPr>
           <w:p>
             <w:pPr>
-              <w:spacing w:after="0" w:before="0" w:line="250"/>
+              <w:spacing w:after="0" w:before="0" w:line="270"/>
               <w:jc w:val="left"/>
             </w:pPr>
             <w:r>
@@ -4080,8 +4080,8 @@
                 <w:iCs w:val="false"/>
                 <w:caps w:val="false"/>
                 <w:color w:val="1A1530"/>
-                <w:sz w:val="18"/>
-                <w:szCs w:val="18"/>
+                <w:sz w:val="20"/>
+                <w:szCs w:val="20"/>
               </w:rPr>
               <w:t xml:space="preserve">odczytywanie emocji i intencji, tolerancja frustracji, konflikty; przeciążenie w apelach i wyjściach – wycofanie lub zachowania trudne</w:t>
             </w:r>
@@ -4106,7 +4106,7 @@
           </w:tcPr>
           <w:p>
             <w:pPr>
-              <w:spacing w:after="0" w:before="0" w:line="250"/>
+              <w:spacing w:after="0" w:before="0" w:line="270"/>
               <w:jc w:val="left"/>
             </w:pPr>
             <w:r>
@@ -4118,8 +4118,8 @@
                 <w:iCs w:val="false"/>
                 <w:caps w:val="false"/>
                 <w:color w:val="2D1B69"/>
-                <w:sz w:val="18"/>
-                <w:szCs w:val="18"/>
+                <w:sz w:val="20"/>
+                <w:szCs w:val="20"/>
               </w:rPr>
               <w:t xml:space="preserve">d7 śr. 1,6 · d9 śr. 1,8 – wysoki</w:t>
             </w:r>
@@ -4141,8 +4141,8 @@
           <w:iCs w:val="false"/>
           <w:caps w:val="false"/>
           <w:color w:val="2D1B69"/>
-          <w:sz w:val="18"/>
-          <w:szCs w:val="18"/>
+          <w:sz w:val="20"/>
+          <w:szCs w:val="20"/>
         </w:rPr>
         <w:t xml:space="preserve">Wynik ogólny: 68 / 180 pkt, średnia 2,1 (skala 0–5) – umiarkowana potrzeba wsparcia; trzy domeny na poziomie wysokim (d2, d7, d9).</w:t>
       </w:r>
@@ -4151,7 +4151,7 @@
       <w:pPr>
         <w:keepNext/>
         <w:pBdr>
-          <w:bottom w:val="single" w:color="D9D0F0" w:sz="18" w:space="4"/>
+          <w:bottom w:val="single" w:color="D9D0F0" w:sz="20" w:space="4"/>
         </w:pBdr>
         <w:spacing w:after="100" w:before="180"/>
       </w:pPr>
@@ -4199,8 +4199,8 @@
           <w:iCs w:val="false"/>
           <w:caps w:val="false"/>
           <w:color w:val="E74509"/>
-          <w:sz w:val="18"/>
-          <w:szCs w:val="18"/>
+          <w:sz w:val="20"/>
+          <w:szCs w:val="20"/>
         </w:rPr>
         <w:t xml:space="preserve">•  </w:t>
       </w:r>
@@ -4213,8 +4213,8 @@
           <w:iCs w:val="false"/>
           <w:caps w:val="false"/>
           <w:color w:val="1A1530"/>
-          <w:sz w:val="18"/>
-          <w:szCs w:val="18"/>
+          <w:sz w:val="20"/>
+          <w:szCs w:val="20"/>
         </w:rPr>
         <w:t xml:space="preserve">Program wychowania przedszkolnego / programy nauczania: [nazwa programu, oddział].</w:t>
       </w:r>
@@ -4233,8 +4233,8 @@
           <w:iCs w:val="false"/>
           <w:caps w:val="false"/>
           <w:color w:val="E74509"/>
-          <w:sz w:val="18"/>
-          <w:szCs w:val="18"/>
+          <w:sz w:val="20"/>
+          <w:szCs w:val="20"/>
         </w:rPr>
         <w:t xml:space="preserve">•  </w:t>
       </w:r>
@@ -4247,8 +4247,8 @@
           <w:iCs w:val="false"/>
           <w:caps w:val="false"/>
           <w:color w:val="1A1530"/>
-          <w:sz w:val="18"/>
-          <w:szCs w:val="18"/>
+          <w:sz w:val="20"/>
+          <w:szCs w:val="20"/>
         </w:rPr>
         <w:t xml:space="preserve">Rozumienie poleceń złożonych i samodzielna organizacja pracy – wymaga instrukcji krok po kroku wspartych obrazem; bez dostosowania rezygnuje z zadania.</w:t>
       </w:r>
@@ -4267,8 +4267,8 @@
           <w:iCs w:val="false"/>
           <w:caps w:val="false"/>
           <w:color w:val="E74509"/>
-          <w:sz w:val="18"/>
-          <w:szCs w:val="18"/>
+          <w:sz w:val="20"/>
+          <w:szCs w:val="20"/>
         </w:rPr>
         <w:t xml:space="preserve">•  </w:t>
       </w:r>
@@ -4281,8 +4281,8 @@
           <w:iCs w:val="false"/>
           <w:caps w:val="false"/>
           <w:color w:val="1A1530"/>
-          <w:sz w:val="18"/>
-          <w:szCs w:val="18"/>
+          <w:sz w:val="20"/>
+          <w:szCs w:val="20"/>
         </w:rPr>
         <w:t xml:space="preserve">Utrzymanie uwagi na zadaniu (obecnie do 8 min po dostosowaniu środowiska) i szybka męczliwość przy zadaniach pisemnych i wykonawczych.</w:t>
       </w:r>
@@ -4301,8 +4301,8 @@
           <w:iCs w:val="false"/>
           <w:caps w:val="false"/>
           <w:color w:val="E74509"/>
-          <w:sz w:val="18"/>
-          <w:szCs w:val="18"/>
+          <w:sz w:val="20"/>
+          <w:szCs w:val="20"/>
         </w:rPr>
         <w:t xml:space="preserve">•  </w:t>
       </w:r>
@@ -4315,8 +4315,8 @@
           <w:iCs w:val="false"/>
           <w:caps w:val="false"/>
           <w:color w:val="1A1530"/>
-          <w:sz w:val="18"/>
-          <w:szCs w:val="18"/>
+          <w:sz w:val="20"/>
+          <w:szCs w:val="20"/>
         </w:rPr>
         <w:t xml:space="preserve">Uczestnictwo w zajęciach grupowych, apelach i wyjściach – przeciążenie sensoryczne prowadzi do wycofania lub zachowań trudnych.</w:t>
       </w:r>
@@ -4335,8 +4335,8 @@
           <w:iCs w:val="false"/>
           <w:caps w:val="false"/>
           <w:color w:val="E74509"/>
-          <w:sz w:val="18"/>
-          <w:szCs w:val="18"/>
+          <w:sz w:val="20"/>
+          <w:szCs w:val="20"/>
         </w:rPr>
         <w:t xml:space="preserve">•  </w:t>
       </w:r>
@@ -4349,8 +4349,8 @@
           <w:iCs w:val="false"/>
           <w:caps w:val="false"/>
           <w:color w:val="1A1530"/>
-          <w:sz w:val="18"/>
-          <w:szCs w:val="18"/>
+          <w:sz w:val="20"/>
+          <w:szCs w:val="20"/>
         </w:rPr>
         <w:t xml:space="preserve">Komunikacja z rówieśnikami i nauczycielem w sytuacjach swobodnych – potrzeba wsparcia AAC i skryptów dialogowych.</w:t>
       </w:r>
@@ -4369,8 +4369,8 @@
           <w:iCs w:val="false"/>
           <w:caps w:val="false"/>
           <w:color w:val="E74509"/>
-          <w:sz w:val="18"/>
-          <w:szCs w:val="18"/>
+          <w:sz w:val="20"/>
+          <w:szCs w:val="20"/>
         </w:rPr>
         <w:t xml:space="preserve">•  </w:t>
       </w:r>
@@ -4383,8 +4383,8 @@
           <w:iCs w:val="false"/>
           <w:caps w:val="false"/>
           <w:color w:val="1A1530"/>
-          <w:sz w:val="18"/>
-          <w:szCs w:val="18"/>
+          <w:sz w:val="20"/>
+          <w:szCs w:val="20"/>
         </w:rPr>
         <w:t xml:space="preserve">Grafomotoryka, czynności manualne (chwyt, wycinanie) oraz samoobsługa przy posiłkach i toalecie – realizowane w wydłużonym czasie z dostosowanymi przyborami.</w:t>
       </w:r>
@@ -4403,8 +4403,8 @@
           <w:iCs w:val="false"/>
           <w:caps w:val="false"/>
           <w:color w:val="E74509"/>
-          <w:sz w:val="18"/>
-          <w:szCs w:val="18"/>
+          <w:sz w:val="20"/>
+          <w:szCs w:val="20"/>
         </w:rPr>
         <w:t xml:space="preserve">•  </w:t>
       </w:r>
@@ -4417,8 +4417,8 @@
           <w:iCs w:val="false"/>
           <w:caps w:val="false"/>
           <w:color w:val="1A1530"/>
-          <w:sz w:val="18"/>
-          <w:szCs w:val="18"/>
+          <w:sz w:val="20"/>
+          <w:szCs w:val="20"/>
         </w:rPr>
         <w:t xml:space="preserve">Wprowadzone dostosowania w toku realizacji programu: plany aktywności, instrukcje jednoetapowe, wydłużony czas, przerwy sensoryczne, ocena postępu względem samego siebie.</w:t>
       </w:r>
@@ -4437,8 +4437,8 @@
           <w:iCs w:val="false"/>
           <w:caps w:val="false"/>
           <w:color w:val="1A1530"/>
-          <w:sz w:val="18"/>
-          <w:szCs w:val="18"/>
+          <w:sz w:val="20"/>
+          <w:szCs w:val="20"/>
         </w:rPr>
         <w:t xml:space="preserve"/>
       </w:r>
@@ -4467,10 +4467,10 @@
           <w:tcPr>
             <w:tcW w:type="dxa" w:w="5103"/>
             <w:tcBorders>
-              <w:top w:val="dashed" w:color="D9D0F0" w:sz="18"/>
-              <w:left w:val="dashed" w:color="D9D0F0" w:sz="18"/>
-              <w:bottom w:val="dashed" w:color="D9D0F0" w:sz="18"/>
-              <w:right w:val="dashed" w:color="D9D0F0" w:sz="18"/>
+              <w:top w:val="dashed" w:color="D9D0F0" w:sz="20"/>
+              <w:left w:val="dashed" w:color="D9D0F0" w:sz="20"/>
+              <w:bottom w:val="dashed" w:color="D9D0F0" w:sz="20"/>
+              <w:right w:val="dashed" w:color="D9D0F0" w:sz="20"/>
             </w:tcBorders>
             <w:tcMar>
               <w:top w:type="dxa" w:w="120"/>
@@ -4514,8 +4514,8 @@
                 <w:iCs w:val="false"/>
                 <w:caps w:val="false"/>
                 <w:color w:val="6B6378"/>
-                <w:sz w:val="18"/>
-                <w:szCs w:val="18"/>
+                <w:sz w:val="20"/>
+                <w:szCs w:val="20"/>
               </w:rPr>
               <w:t xml:space="preserve">[Adres placówki, tel., e-mail]</w:t>
             </w:r>
@@ -4534,8 +4534,8 @@
                 <w:iCs w:val="false"/>
                 <w:caps w:val="false"/>
                 <w:color w:val="6B6378"/>
-                <w:sz w:val="18"/>
-                <w:szCs w:val="18"/>
+                <w:sz w:val="20"/>
+                <w:szCs w:val="20"/>
               </w:rPr>
               <w:t xml:space="preserve">(pieczęć placówki)</w:t>
             </w:r>
@@ -4572,8 +4572,8 @@
                 <w:iCs w:val="false"/>
                 <w:caps w:val="false"/>
                 <w:color w:val="6B6378"/>
-                <w:sz w:val="18"/>
-                <w:szCs w:val="18"/>
+                <w:sz w:val="20"/>
+                <w:szCs w:val="20"/>
               </w:rPr>
               <w:t xml:space="preserve">[Miejscowość], dnia ………………………</w:t>
             </w:r>
@@ -4592,8 +4592,8 @@
                 <w:iCs w:val="false"/>
                 <w:caps w:val="false"/>
                 <w:color w:val="6B6378"/>
-                <w:sz w:val="18"/>
-                <w:szCs w:val="18"/>
+                <w:sz w:val="20"/>
+                <w:szCs w:val="20"/>
               </w:rPr>
               <w:t xml:space="preserve">Znak sprawy: ………………………</w:t>
             </w:r>
@@ -4612,8 +4612,8 @@
                 <w:iCs w:val="false"/>
                 <w:caps w:val="false"/>
                 <w:color w:val="6B6378"/>
-                <w:sz w:val="18"/>
-                <w:szCs w:val="18"/>
+                <w:sz w:val="20"/>
+                <w:szCs w:val="20"/>
               </w:rPr>
               <w:t xml:space="preserve">Zespół orzekający: [Nazwa Poradni Psychologiczno-Pedagogicznej]</w:t>
             </w:r>
@@ -4630,7 +4630,7 @@
       <w:pPr>
         <w:keepNext/>
         <w:pBdr>
-          <w:bottom w:val="single" w:color="D9D0F0" w:sz="18" w:space="4"/>
+          <w:bottom w:val="single" w:color="D9D0F0" w:sz="20" w:space="4"/>
         </w:pBdr>
         <w:spacing w:after="100" w:before="180"/>
       </w:pPr>
@@ -4692,8 +4692,8 @@
           <w:iCs w:val="false"/>
           <w:caps w:val="false"/>
           <w:color w:val="1A1530"/>
-          <w:sz w:val="18"/>
-          <w:szCs w:val="18"/>
+          <w:sz w:val="20"/>
+          <w:szCs w:val="20"/>
         </w:rPr>
         <w:t xml:space="preserve">Aktualna wielospecjalistyczna ocena poziomu funkcjonowania dziecka / ucznia (WOPF) – dziecko / uczeń objęty kształceniem specjalnym (pkt 4)</w:t>
       </w:r>
@@ -4726,8 +4726,8 @@
           <w:iCs w:val="false"/>
           <w:caps w:val="false"/>
           <w:color w:val="1A1530"/>
-          <w:sz w:val="18"/>
-          <w:szCs w:val="18"/>
+          <w:sz w:val="20"/>
+          <w:szCs w:val="20"/>
         </w:rPr>
         <w:t xml:space="preserve">Aktualna okresowa ocena funkcjonowania – dziecko / uczeń objęty zajęciami rewalidacyjno-wychowawczymi (pkt 5)</w:t>
       </w:r>
@@ -4760,8 +4760,8 @@
           <w:iCs w:val="false"/>
           <w:caps w:val="false"/>
           <w:color w:val="1A1530"/>
-          <w:sz w:val="18"/>
-          <w:szCs w:val="18"/>
+          <w:sz w:val="20"/>
+          <w:szCs w:val="20"/>
         </w:rPr>
         <w:t xml:space="preserve">Nie dotyczy – dziecko / uczeń nieobjęty kształceniem specjalnym ani zajęciami rewalidacyjno-wychowawczymi</w:t>
       </w:r>
@@ -4770,7 +4770,7 @@
       <w:pPr>
         <w:keepNext/>
         <w:pBdr>
-          <w:bottom w:val="single" w:color="D9D0F0" w:sz="18" w:space="4"/>
+          <w:bottom w:val="single" w:color="D9D0F0" w:sz="20" w:space="4"/>
         </w:pBdr>
         <w:spacing w:after="100" w:before="180"/>
       </w:pPr>
@@ -4859,8 +4859,8 @@
                 <w:caps/>
                 <w:color w:val="2D1B69"/>
                 <w:spacing w:val="10"/>
-                <w:sz w:val="18"/>
-                <w:szCs w:val="18"/>
+                <w:sz w:val="20"/>
+                <w:szCs w:val="20"/>
               </w:rPr>
               <w:t xml:space="preserve">Działanie / forma pomocy</w:t>
             </w:r>
@@ -4899,8 +4899,8 @@
                 <w:caps/>
                 <w:color w:val="2D1B69"/>
                 <w:spacing w:val="10"/>
-                <w:sz w:val="18"/>
-                <w:szCs w:val="18"/>
+                <w:sz w:val="20"/>
+                <w:szCs w:val="20"/>
               </w:rPr>
               <w:t xml:space="preserve">Zakres i wymiar</w:t>
             </w:r>
@@ -4939,8 +4939,8 @@
                 <w:caps/>
                 <w:color w:val="2D1B69"/>
                 <w:spacing w:val="10"/>
-                <w:sz w:val="18"/>
-                <w:szCs w:val="18"/>
+                <w:sz w:val="20"/>
+                <w:szCs w:val="20"/>
               </w:rPr>
               <w:t xml:space="preserve">Okres udzielania</w:t>
             </w:r>
@@ -4979,8 +4979,8 @@
                 <w:caps/>
                 <w:color w:val="2D1B69"/>
                 <w:spacing w:val="10"/>
-                <w:sz w:val="18"/>
-                <w:szCs w:val="18"/>
+                <w:sz w:val="20"/>
+                <w:szCs w:val="20"/>
               </w:rPr>
               <w:t xml:space="preserve">Efekty</w:t>
             </w:r>
@@ -5011,7 +5011,7 @@
           </w:tcPr>
           <w:p>
             <w:pPr>
-              <w:spacing w:after="0" w:before="0" w:line="250"/>
+              <w:spacing w:after="0" w:before="0" w:line="270"/>
               <w:jc w:val="left"/>
             </w:pPr>
             <w:r>
@@ -5023,8 +5023,8 @@
                 <w:iCs w:val="false"/>
                 <w:caps w:val="false"/>
                 <w:color w:val="2D1B69"/>
-                <w:sz w:val="18"/>
-                <w:szCs w:val="18"/>
+                <w:sz w:val="20"/>
+                <w:szCs w:val="20"/>
               </w:rPr>
               <w:t xml:space="preserve">Dostosowania środowiskowe i dydaktyczne</w:t>
             </w:r>
@@ -5049,7 +5049,7 @@
           </w:tcPr>
           <w:p>
             <w:pPr>
-              <w:spacing w:after="0" w:before="0" w:line="250"/>
+              <w:spacing w:after="0" w:before="0" w:line="270"/>
               <w:jc w:val="left"/>
             </w:pPr>
             <w:r>
@@ -5061,8 +5061,8 @@
                 <w:iCs w:val="false"/>
                 <w:caps w:val="false"/>
                 <w:color w:val="1A1530"/>
-                <w:sz w:val="18"/>
-                <w:szCs w:val="18"/>
+                <w:sz w:val="20"/>
+                <w:szCs w:val="20"/>
               </w:rPr>
               <w:t xml:space="preserve">strefa wyciszenia, redukcja bodźców, słuchawki wygłuszające, wizualny plan dnia, instrukcje krok po kroku</w:t>
             </w:r>
@@ -5087,7 +5087,7 @@
           </w:tcPr>
           <w:p>
             <w:pPr>
-              <w:spacing w:after="0" w:before="0" w:line="250"/>
+              <w:spacing w:after="0" w:before="0" w:line="270"/>
               <w:jc w:val="left"/>
             </w:pPr>
             <w:r>
@@ -5099,8 +5099,8 @@
                 <w:iCs w:val="false"/>
                 <w:caps w:val="false"/>
                 <w:color w:val="1A1530"/>
-                <w:sz w:val="18"/>
-                <w:szCs w:val="18"/>
+                <w:sz w:val="20"/>
+                <w:szCs w:val="20"/>
               </w:rPr>
               <w:t xml:space="preserve">od IX 2025 · codziennie · nadal</w:t>
             </w:r>
@@ -5125,7 +5125,7 @@
           </w:tcPr>
           <w:p>
             <w:pPr>
-              <w:spacing w:after="0" w:before="0" w:line="250"/>
+              <w:spacing w:after="0" w:before="0" w:line="270"/>
               <w:jc w:val="left"/>
             </w:pPr>
             <w:r>
@@ -5137,8 +5137,8 @@
                 <w:iCs w:val="false"/>
                 <w:caps w:val="false"/>
                 <w:color w:val="1A1530"/>
-                <w:sz w:val="18"/>
-                <w:szCs w:val="18"/>
+                <w:sz w:val="20"/>
+                <w:szCs w:val="20"/>
               </w:rPr>
               <w:t xml:space="preserve">spadek epizodów zachowań trudnych o ok. 40%; wydłużenie skupienia z 3 do 8 min</w:t>
             </w:r>
@@ -5169,7 +5169,7 @@
           </w:tcPr>
           <w:p>
             <w:pPr>
-              <w:spacing w:after="0" w:before="0" w:line="250"/>
+              <w:spacing w:after="0" w:before="0" w:line="270"/>
               <w:jc w:val="left"/>
             </w:pPr>
             <w:r>
@@ -5181,8 +5181,8 @@
                 <w:iCs w:val="false"/>
                 <w:caps w:val="false"/>
                 <w:color w:val="2D1B69"/>
-                <w:sz w:val="18"/>
-                <w:szCs w:val="18"/>
+                <w:sz w:val="20"/>
+                <w:szCs w:val="20"/>
               </w:rPr>
               <w:t xml:space="preserve">Pomoc psychologiczno-pedagogiczna</w:t>
             </w:r>
@@ -5207,7 +5207,7 @@
           </w:tcPr>
           <w:p>
             <w:pPr>
-              <w:spacing w:after="0" w:before="0" w:line="250"/>
+              <w:spacing w:after="0" w:before="0" w:line="270"/>
               <w:jc w:val="left"/>
             </w:pPr>
             <w:r>
@@ -5219,8 +5219,8 @@
                 <w:iCs w:val="false"/>
                 <w:caps w:val="false"/>
                 <w:color w:val="1A1530"/>
-                <w:sz w:val="18"/>
-                <w:szCs w:val="18"/>
+                <w:sz w:val="20"/>
+                <w:szCs w:val="20"/>
               </w:rPr>
               <w:t xml:space="preserve">zajęcia rozwijające kompetencje emocjonalno-społeczne 1 × 45 min; logopedyczne 1 × 45 min; korekcyjno-kompensacyjne 1 × 45 min; integracja sensoryczna 1 × 45 min; porady i konsultacje dla rodziców 1 × 30 min tygodniowo</w:t>
             </w:r>
@@ -5245,7 +5245,7 @@
           </w:tcPr>
           <w:p>
             <w:pPr>
-              <w:spacing w:after="0" w:before="0" w:line="250"/>
+              <w:spacing w:after="0" w:before="0" w:line="270"/>
               <w:jc w:val="left"/>
             </w:pPr>
             <w:r>
@@ -5257,8 +5257,8 @@
                 <w:iCs w:val="false"/>
                 <w:caps w:val="false"/>
                 <w:color w:val="1A1530"/>
-                <w:sz w:val="18"/>
-                <w:szCs w:val="18"/>
+                <w:sz w:val="20"/>
+                <w:szCs w:val="20"/>
               </w:rPr>
               <w:t xml:space="preserve">od X 2025 · 10 miesięcy · nadal</w:t>
             </w:r>
@@ -5283,7 +5283,7 @@
           </w:tcPr>
           <w:p>
             <w:pPr>
-              <w:spacing w:after="0" w:before="0" w:line="250"/>
+              <w:spacing w:after="0" w:before="0" w:line="270"/>
               <w:jc w:val="left"/>
             </w:pPr>
             <w:r>
@@ -5295,8 +5295,8 @@
                 <w:iCs w:val="false"/>
                 <w:caps w:val="false"/>
                 <w:color w:val="1A1530"/>
-                <w:sz w:val="18"/>
-                <w:szCs w:val="18"/>
+                <w:sz w:val="20"/>
+                <w:szCs w:val="20"/>
               </w:rPr>
               <w:t xml:space="preserve">lepsze tolerowanie obecności dzieci w zajęciach kierowanych; pierwsze prośby o przerwę gestem / piktogramem</w:t>
             </w:r>
@@ -5327,7 +5327,7 @@
           </w:tcPr>
           <w:p>
             <w:pPr>
-              <w:spacing w:after="0" w:before="0" w:line="250"/>
+              <w:spacing w:after="0" w:before="0" w:line="270"/>
               <w:jc w:val="left"/>
             </w:pPr>
             <w:r>
@@ -5339,8 +5339,8 @@
                 <w:iCs w:val="false"/>
                 <w:caps w:val="false"/>
                 <w:color w:val="2D1B69"/>
-                <w:sz w:val="18"/>
-                <w:szCs w:val="18"/>
+                <w:sz w:val="20"/>
+                <w:szCs w:val="20"/>
               </w:rPr>
               <w:t xml:space="preserve">Zajęcia rewalidacyjne (dziecko z orzeczeniem)</w:t>
             </w:r>
@@ -5365,7 +5365,7 @@
           </w:tcPr>
           <w:p>
             <w:pPr>
-              <w:spacing w:after="0" w:before="0" w:line="250"/>
+              <w:spacing w:after="0" w:before="0" w:line="270"/>
               <w:jc w:val="left"/>
             </w:pPr>
             <w:r>
@@ -5377,8 +5377,8 @@
                 <w:iCs w:val="false"/>
                 <w:caps w:val="false"/>
                 <w:color w:val="1A1530"/>
-                <w:sz w:val="18"/>
-                <w:szCs w:val="18"/>
+                <w:sz w:val="20"/>
+                <w:szCs w:val="20"/>
               </w:rPr>
               <w:t xml:space="preserve">2 godz. tygodniowo: komunikacja i AAC, umiejętności społeczne i ToM, motoryka mała</w:t>
             </w:r>
@@ -5403,7 +5403,7 @@
           </w:tcPr>
           <w:p>
             <w:pPr>
-              <w:spacing w:after="0" w:before="0" w:line="250"/>
+              <w:spacing w:after="0" w:before="0" w:line="270"/>
               <w:jc w:val="left"/>
             </w:pPr>
             <w:r>
@@ -5415,8 +5415,8 @@
                 <w:iCs w:val="false"/>
                 <w:caps w:val="false"/>
                 <w:color w:val="1A1530"/>
-                <w:sz w:val="18"/>
-                <w:szCs w:val="18"/>
+                <w:sz w:val="20"/>
+                <w:szCs w:val="20"/>
               </w:rPr>
               <w:t xml:space="preserve">od IX 2025 · 1 rok szkolny</w:t>
             </w:r>
@@ -5441,7 +5441,7 @@
           </w:tcPr>
           <w:p>
             <w:pPr>
-              <w:spacing w:after="0" w:before="0" w:line="250"/>
+              <w:spacing w:after="0" w:before="0" w:line="270"/>
               <w:jc w:val="left"/>
             </w:pPr>
             <w:r>
@@ -5453,8 +5453,8 @@
                 <w:iCs w:val="false"/>
                 <w:caps w:val="false"/>
                 <w:color w:val="1A1530"/>
-                <w:sz w:val="18"/>
-                <w:szCs w:val="18"/>
+                <w:sz w:val="20"/>
+                <w:szCs w:val="20"/>
               </w:rPr>
               <w:t xml:space="preserve">wzrost liczby komunikatów intencjonalnych; poprawa chwytu</w:t>
             </w:r>
@@ -5485,7 +5485,7 @@
           </w:tcPr>
           <w:p>
             <w:pPr>
-              <w:spacing w:after="0" w:before="0" w:line="250"/>
+              <w:spacing w:after="0" w:before="0" w:line="270"/>
               <w:jc w:val="left"/>
             </w:pPr>
             <w:r>
@@ -5497,8 +5497,8 @@
                 <w:iCs w:val="false"/>
                 <w:caps w:val="false"/>
                 <w:color w:val="2D1B69"/>
-                <w:sz w:val="18"/>
-                <w:szCs w:val="18"/>
+                <w:sz w:val="20"/>
+                <w:szCs w:val="20"/>
               </w:rPr>
               <w:t xml:space="preserve">Wczesne wspomaganie rozwoju (WWRD)</w:t>
             </w:r>
@@ -5523,7 +5523,7 @@
           </w:tcPr>
           <w:p>
             <w:pPr>
-              <w:spacing w:after="0" w:before="0" w:line="250"/>
+              <w:spacing w:after="0" w:before="0" w:line="270"/>
               <w:jc w:val="left"/>
             </w:pPr>
             <w:r>
@@ -5535,8 +5535,8 @@
                 <w:iCs w:val="false"/>
                 <w:caps w:val="false"/>
                 <w:color w:val="1A1530"/>
-                <w:sz w:val="18"/>
-                <w:szCs w:val="18"/>
+                <w:sz w:val="20"/>
+                <w:szCs w:val="20"/>
               </w:rPr>
               <w:t xml:space="preserve">☐ nie dotyczy  ☐ realizowane w: [placówka] – zakres: [zakres]</w:t>
             </w:r>
@@ -5561,7 +5561,7 @@
           </w:tcPr>
           <w:p>
             <w:pPr>
-              <w:spacing w:after="0" w:before="0" w:line="250"/>
+              <w:spacing w:after="0" w:before="0" w:line="270"/>
               <w:jc w:val="left"/>
             </w:pPr>
             <w:r>
@@ -5573,8 +5573,8 @@
                 <w:iCs w:val="false"/>
                 <w:caps w:val="false"/>
                 <w:color w:val="1A1530"/>
-                <w:sz w:val="18"/>
-                <w:szCs w:val="18"/>
+                <w:sz w:val="20"/>
+                <w:szCs w:val="20"/>
               </w:rPr>
               <w:t xml:space="preserve">[od – do]</w:t>
             </w:r>
@@ -5599,7 +5599,7 @@
           </w:tcPr>
           <w:p>
             <w:pPr>
-              <w:spacing w:after="0" w:before="0" w:line="250"/>
+              <w:spacing w:after="0" w:before="0" w:line="270"/>
               <w:jc w:val="left"/>
             </w:pPr>
             <w:r>
@@ -5611,8 +5611,8 @@
                 <w:iCs w:val="false"/>
                 <w:caps w:val="false"/>
                 <w:color w:val="1A1530"/>
-                <w:sz w:val="18"/>
-                <w:szCs w:val="18"/>
+                <w:sz w:val="20"/>
+                <w:szCs w:val="20"/>
               </w:rPr>
               <w:t xml:space="preserve">[efekty]</w:t>
             </w:r>
@@ -5643,7 +5643,7 @@
           </w:tcPr>
           <w:p>
             <w:pPr>
-              <w:spacing w:after="0" w:before="0" w:line="250"/>
+              <w:spacing w:after="0" w:before="0" w:line="270"/>
               <w:jc w:val="left"/>
             </w:pPr>
             <w:r>
@@ -5655,8 +5655,8 @@
                 <w:iCs w:val="false"/>
                 <w:caps w:val="false"/>
                 <w:color w:val="2D1B69"/>
-                <w:sz w:val="18"/>
-                <w:szCs w:val="18"/>
+                <w:sz w:val="20"/>
+                <w:szCs w:val="20"/>
               </w:rPr>
               <w:t xml:space="preserve">Współpraca z rodzicami</w:t>
             </w:r>
@@ -5681,7 +5681,7 @@
           </w:tcPr>
           <w:p>
             <w:pPr>
-              <w:spacing w:after="0" w:before="0" w:line="250"/>
+              <w:spacing w:after="0" w:before="0" w:line="270"/>
               <w:jc w:val="left"/>
             </w:pPr>
             <w:r>
@@ -5693,8 +5693,8 @@
                 <w:iCs w:val="false"/>
                 <w:caps w:val="false"/>
                 <w:color w:val="1A1530"/>
-                <w:sz w:val="18"/>
-                <w:szCs w:val="18"/>
+                <w:sz w:val="20"/>
+                <w:szCs w:val="20"/>
               </w:rPr>
               <w:t xml:space="preserve">konsultacje cotygodniowe, zeszyt korespondencji, wspólny system komunikatów i wzmocnień, instruktaż AAC w domu</w:t>
             </w:r>
@@ -5719,7 +5719,7 @@
           </w:tcPr>
           <w:p>
             <w:pPr>
-              <w:spacing w:after="0" w:before="0" w:line="250"/>
+              <w:spacing w:after="0" w:before="0" w:line="270"/>
               <w:jc w:val="left"/>
             </w:pPr>
             <w:r>
@@ -5731,8 +5731,8 @@
                 <w:iCs w:val="false"/>
                 <w:caps w:val="false"/>
                 <w:color w:val="1A1530"/>
-                <w:sz w:val="18"/>
-                <w:szCs w:val="18"/>
+                <w:sz w:val="20"/>
+                <w:szCs w:val="20"/>
               </w:rPr>
               <w:t xml:space="preserve">od IX 2025 · nadal</w:t>
             </w:r>
@@ -5757,7 +5757,7 @@
           </w:tcPr>
           <w:p>
             <w:pPr>
-              <w:spacing w:after="0" w:before="0" w:line="250"/>
+              <w:spacing w:after="0" w:before="0" w:line="270"/>
               <w:jc w:val="left"/>
             </w:pPr>
             <w:r>
@@ -5769,8 +5769,8 @@
                 <w:iCs w:val="false"/>
                 <w:caps w:val="false"/>
                 <w:color w:val="1A1530"/>
-                <w:sz w:val="18"/>
-                <w:szCs w:val="18"/>
+                <w:sz w:val="20"/>
+                <w:szCs w:val="20"/>
               </w:rPr>
               <w:t xml:space="preserve">spójne reakcje dorosłych; wzrost poczucia bezpieczeństwa dziecka</w:t>
             </w:r>
@@ -5782,7 +5782,7 @@
       <w:pPr>
         <w:keepNext/>
         <w:pBdr>
-          <w:bottom w:val="single" w:color="D9D0F0" w:sz="18" w:space="4"/>
+          <w:bottom w:val="single" w:color="D9D0F0" w:sz="20" w:space="4"/>
         </w:pBdr>
         <w:spacing w:after="100" w:before="180"/>
       </w:pPr>
@@ -5830,8 +5830,8 @@
           <w:iCs w:val="false"/>
           <w:caps w:val="false"/>
           <w:color w:val="2E7D45"/>
-          <w:sz w:val="18"/>
-          <w:szCs w:val="18"/>
+          <w:sz w:val="20"/>
+          <w:szCs w:val="20"/>
         </w:rPr>
         <w:t xml:space="preserve">•  </w:t>
       </w:r>
@@ -5844,8 +5844,8 @@
           <w:iCs w:val="false"/>
           <w:caps w:val="false"/>
           <w:color w:val="1A1530"/>
-          <w:sz w:val="18"/>
-          <w:szCs w:val="18"/>
+          <w:sz w:val="20"/>
+          <w:szCs w:val="20"/>
         </w:rPr>
         <w:t xml:space="preserve">Utrzymanie struktury dnia, strefy wyciszenia i przygotowania do wydarzeń grupowych; stopniowe wydłużanie udziału.</w:t>
       </w:r>
@@ -5864,8 +5864,8 @@
           <w:iCs w:val="false"/>
           <w:caps w:val="false"/>
           <w:color w:val="2E7D45"/>
-          <w:sz w:val="18"/>
-          <w:szCs w:val="18"/>
+          <w:sz w:val="20"/>
+          <w:szCs w:val="20"/>
         </w:rPr>
         <w:t xml:space="preserve">•  </w:t>
       </w:r>
@@ -5878,8 +5878,8 @@
           <w:iCs w:val="false"/>
           <w:caps w:val="false"/>
           <w:color w:val="1A1530"/>
-          <w:sz w:val="18"/>
-          <w:szCs w:val="18"/>
+          <w:sz w:val="20"/>
+          <w:szCs w:val="20"/>
         </w:rPr>
         <w:t xml:space="preserve">Rozwijanie komunikacji funkcjonalnej z tablicą AAC w placówce i w domu; trening komunikatu zastępczego zamiast zachowania trudnego.</w:t>
       </w:r>
@@ -5898,8 +5898,8 @@
           <w:iCs w:val="false"/>
           <w:caps w:val="false"/>
           <w:color w:val="2E7D45"/>
-          <w:sz w:val="18"/>
-          <w:szCs w:val="18"/>
+          <w:sz w:val="20"/>
+          <w:szCs w:val="20"/>
         </w:rPr>
         <w:t xml:space="preserve">•  </w:t>
       </w:r>
@@ -5912,8 +5912,8 @@
           <w:iCs w:val="false"/>
           <w:caps w:val="false"/>
           <w:color w:val="1A1530"/>
-          <w:sz w:val="18"/>
-          <w:szCs w:val="18"/>
+          <w:sz w:val="20"/>
+          <w:szCs w:val="20"/>
         </w:rPr>
         <w:t xml:space="preserve">Trening umiejętności społecznych i teorii umysłu w małej grupie z przeniesieniem na zabawy swobodne (rówieśnik-mentor).</w:t>
       </w:r>
@@ -5932,8 +5932,8 @@
           <w:iCs w:val="false"/>
           <w:caps w:val="false"/>
           <w:color w:val="2E7D45"/>
-          <w:sz w:val="18"/>
-          <w:szCs w:val="18"/>
+          <w:sz w:val="20"/>
+          <w:szCs w:val="20"/>
         </w:rPr>
         <w:t xml:space="preserve">•  </w:t>
       </w:r>
@@ -5946,8 +5946,8 @@
           <w:iCs w:val="false"/>
           <w:caps w:val="false"/>
           <w:color w:val="1A1530"/>
-          <w:sz w:val="18"/>
-          <w:szCs w:val="18"/>
+          <w:sz w:val="20"/>
+          <w:szCs w:val="20"/>
         </w:rPr>
         <w:t xml:space="preserve">Usprawnianie motoryki małej i samoobsługi z dostosowanymi przyborami i paskiem wizualnym czynności.</w:t>
       </w:r>
@@ -5966,8 +5966,8 @@
           <w:iCs w:val="false"/>
           <w:caps w:val="false"/>
           <w:color w:val="2E7D45"/>
-          <w:sz w:val="18"/>
-          <w:szCs w:val="18"/>
+          <w:sz w:val="20"/>
+          <w:szCs w:val="20"/>
         </w:rPr>
         <w:t xml:space="preserve">•  </w:t>
       </w:r>
@@ -5980,8 +5980,8 @@
           <w:iCs w:val="false"/>
           <w:caps w:val="false"/>
           <w:color w:val="1A1530"/>
-          <w:sz w:val="18"/>
-          <w:szCs w:val="18"/>
+          <w:sz w:val="20"/>
+          <w:szCs w:val="20"/>
         </w:rPr>
         <w:t xml:space="preserve">Ocena efektów w styczniu i czerwcu; aktualizacja programu wspólnie z rodzicami.</w:t>
       </w:r>
@@ -6000,8 +6000,8 @@
           <w:iCs w:val="false"/>
           <w:caps w:val="false"/>
           <w:color w:val="1A1530"/>
-          <w:sz w:val="18"/>
-          <w:szCs w:val="18"/>
+          <w:sz w:val="20"/>
+          <w:szCs w:val="20"/>
         </w:rPr>
         <w:t xml:space="preserve"/>
       </w:r>
@@ -6030,10 +6030,10 @@
           <w:tcPr>
             <w:tcW w:type="dxa" w:w="5103"/>
             <w:tcBorders>
-              <w:top w:val="dashed" w:color="D9D0F0" w:sz="18"/>
-              <w:left w:val="dashed" w:color="D9D0F0" w:sz="18"/>
-              <w:bottom w:val="dashed" w:color="D9D0F0" w:sz="18"/>
-              <w:right w:val="dashed" w:color="D9D0F0" w:sz="18"/>
+              <w:top w:val="dashed" w:color="D9D0F0" w:sz="20"/>
+              <w:left w:val="dashed" w:color="D9D0F0" w:sz="20"/>
+              <w:bottom w:val="dashed" w:color="D9D0F0" w:sz="20"/>
+              <w:right w:val="dashed" w:color="D9D0F0" w:sz="20"/>
             </w:tcBorders>
             <w:tcMar>
               <w:top w:type="dxa" w:w="120"/>
@@ -6077,8 +6077,8 @@
                 <w:iCs w:val="false"/>
                 <w:caps w:val="false"/>
                 <w:color w:val="6B6378"/>
-                <w:sz w:val="18"/>
-                <w:szCs w:val="18"/>
+                <w:sz w:val="20"/>
+                <w:szCs w:val="20"/>
               </w:rPr>
               <w:t xml:space="preserve">[Adres placówki, tel., e-mail]</w:t>
             </w:r>
@@ -6097,8 +6097,8 @@
                 <w:iCs w:val="false"/>
                 <w:caps w:val="false"/>
                 <w:color w:val="6B6378"/>
-                <w:sz w:val="18"/>
-                <w:szCs w:val="18"/>
+                <w:sz w:val="20"/>
+                <w:szCs w:val="20"/>
               </w:rPr>
               <w:t xml:space="preserve">(pieczęć placówki)</w:t>
             </w:r>
@@ -6135,8 +6135,8 @@
                 <w:iCs w:val="false"/>
                 <w:caps w:val="false"/>
                 <w:color w:val="6B6378"/>
-                <w:sz w:val="18"/>
-                <w:szCs w:val="18"/>
+                <w:sz w:val="20"/>
+                <w:szCs w:val="20"/>
               </w:rPr>
               <w:t xml:space="preserve">[Miejscowość], dnia ………………………</w:t>
             </w:r>
@@ -6155,8 +6155,8 @@
                 <w:iCs w:val="false"/>
                 <w:caps w:val="false"/>
                 <w:color w:val="6B6378"/>
-                <w:sz w:val="18"/>
-                <w:szCs w:val="18"/>
+                <w:sz w:val="20"/>
+                <w:szCs w:val="20"/>
               </w:rPr>
               <w:t xml:space="preserve">Znak sprawy: ………………………</w:t>
             </w:r>
@@ -6175,8 +6175,8 @@
                 <w:iCs w:val="false"/>
                 <w:caps w:val="false"/>
                 <w:color w:val="6B6378"/>
-                <w:sz w:val="18"/>
-                <w:szCs w:val="18"/>
+                <w:sz w:val="20"/>
+                <w:szCs w:val="20"/>
               </w:rPr>
               <w:t xml:space="preserve">Zespół orzekający: [Nazwa Poradni Psychologiczno-Pedagogicznej]</w:t>
             </w:r>
@@ -6193,7 +6193,7 @@
       <w:pPr>
         <w:keepNext/>
         <w:pBdr>
-          <w:bottom w:val="single" w:color="D9D0F0" w:sz="18" w:space="4"/>
+          <w:bottom w:val="single" w:color="D9D0F0" w:sz="20" w:space="4"/>
         </w:pBdr>
         <w:spacing w:after="100" w:before="180"/>
       </w:pPr>
@@ -6261,8 +6261,8 @@
           <w:iCs w:val="false"/>
           <w:caps w:val="false"/>
           <w:color w:val="1A1530"/>
-          <w:sz w:val="18"/>
-          <w:szCs w:val="18"/>
+          <w:sz w:val="20"/>
+          <w:szCs w:val="20"/>
         </w:rPr>
         <w:t xml:space="preserve">Funkcje i struktury ciała (§ 8 ust. 2 pkt 2): zdrowie psychiczne – lęk przed zmianą, sztywność poznawcza, zaburzenia snu; percepcja – nadwrażliwość słuchowa i dotykowa, poszukiwanie stymulacji przedsionkowej; motoryka – obniżona precyzja motoryki małej, nieprawidłowy chwyt; mowa – echolalie, trudności pragmatyczne, korzysta z gestu i piktogramów; funkcje poznawcze – bardzo dobra pamięć wzrokowa, trudności z uwagą i uogólnianiem; funkcje emocjonalno-społeczne – teoria umysłu poniżej normy wiekowej, zachowania trudne o funkcji ucieczkowej; cechy indywidualne – głębokie zainteresowania, pozytywna reakcja na strukturę i stałych dorosłych.</w:t>
       </w:r>
@@ -6320,8 +6320,8 @@
                 <w:caps/>
                 <w:color w:val="2E7D45"/>
                 <w:spacing w:val="10"/>
-                <w:sz w:val="18"/>
-                <w:szCs w:val="18"/>
+                <w:sz w:val="20"/>
+                <w:szCs w:val="20"/>
               </w:rPr>
               <w:t xml:space="preserve">Ułatwienia w środowisku placówki (co pomaga)</w:t>
             </w:r>
@@ -6360,8 +6360,8 @@
                 <w:caps/>
                 <w:color w:val="BF382A"/>
                 <w:spacing w:val="10"/>
-                <w:sz w:val="18"/>
-                <w:szCs w:val="18"/>
+                <w:sz w:val="20"/>
+                <w:szCs w:val="20"/>
               </w:rPr>
               <w:t xml:space="preserve">Bariery (co utrudnia)</w:t>
             </w:r>
@@ -6403,8 +6403,8 @@
                 <w:iCs w:val="false"/>
                 <w:caps w:val="false"/>
                 <w:color w:val="2E7D45"/>
-                <w:sz w:val="18"/>
-                <w:szCs w:val="18"/>
+                <w:sz w:val="20"/>
+                <w:szCs w:val="20"/>
               </w:rPr>
               <w:t xml:space="preserve">•  </w:t>
             </w:r>
@@ -6417,8 +6417,8 @@
                 <w:iCs w:val="false"/>
                 <w:caps w:val="false"/>
                 <w:color w:val="1A1530"/>
-                <w:sz w:val="18"/>
-                <w:szCs w:val="18"/>
+                <w:sz w:val="20"/>
+                <w:szCs w:val="20"/>
               </w:rPr>
               <w:t xml:space="preserve">stały skład kadry i przewidywalny plan dnia (wizualny)</w:t>
             </w:r>
@@ -6437,8 +6437,8 @@
                 <w:iCs w:val="false"/>
                 <w:caps w:val="false"/>
                 <w:color w:val="2E7D45"/>
-                <w:sz w:val="18"/>
-                <w:szCs w:val="18"/>
+                <w:sz w:val="20"/>
+                <w:szCs w:val="20"/>
               </w:rPr>
               <w:t xml:space="preserve">•  </w:t>
             </w:r>
@@ -6451,8 +6451,8 @@
                 <w:iCs w:val="false"/>
                 <w:caps w:val="false"/>
                 <w:color w:val="1A1530"/>
-                <w:sz w:val="18"/>
-                <w:szCs w:val="18"/>
+                <w:sz w:val="20"/>
+                <w:szCs w:val="20"/>
               </w:rPr>
               <w:t xml:space="preserve">strefa wyciszenia w sali, słuchawki wygłuszające, przerwy sensoryczne</w:t>
             </w:r>
@@ -6471,8 +6471,8 @@
                 <w:iCs w:val="false"/>
                 <w:caps w:val="false"/>
                 <w:color w:val="2E7D45"/>
-                <w:sz w:val="18"/>
-                <w:szCs w:val="18"/>
+                <w:sz w:val="20"/>
+                <w:szCs w:val="20"/>
               </w:rPr>
               <w:t xml:space="preserve">•  </w:t>
             </w:r>
@@ -6485,8 +6485,8 @@
                 <w:iCs w:val="false"/>
                 <w:caps w:val="false"/>
                 <w:color w:val="1A1530"/>
-                <w:sz w:val="18"/>
-                <w:szCs w:val="18"/>
+                <w:sz w:val="20"/>
+                <w:szCs w:val="20"/>
               </w:rPr>
               <w:t xml:space="preserve">tablica wyboru AAC dostępna w sali i w domu</w:t>
             </w:r>
@@ -6505,8 +6505,8 @@
                 <w:iCs w:val="false"/>
                 <w:caps w:val="false"/>
                 <w:color w:val="2E7D45"/>
-                <w:sz w:val="18"/>
-                <w:szCs w:val="18"/>
+                <w:sz w:val="20"/>
+                <w:szCs w:val="20"/>
               </w:rPr>
               <w:t xml:space="preserve">•  </w:t>
             </w:r>
@@ -6519,8 +6519,8 @@
                 <w:iCs w:val="false"/>
                 <w:caps w:val="false"/>
                 <w:color w:val="1A1530"/>
-                <w:sz w:val="18"/>
-                <w:szCs w:val="18"/>
+                <w:sz w:val="20"/>
+                <w:szCs w:val="20"/>
               </w:rPr>
               <w:t xml:space="preserve">rówieśnik-mentor w zabawach; jasne zasady wizualne</w:t>
             </w:r>
@@ -6539,8 +6539,8 @@
                 <w:iCs w:val="false"/>
                 <w:caps w:val="false"/>
                 <w:color w:val="2E7D45"/>
-                <w:sz w:val="18"/>
-                <w:szCs w:val="18"/>
+                <w:sz w:val="20"/>
+                <w:szCs w:val="20"/>
               </w:rPr>
               <w:t xml:space="preserve">•  </w:t>
             </w:r>
@@ -6553,8 +6553,8 @@
                 <w:iCs w:val="false"/>
                 <w:caps w:val="false"/>
                 <w:color w:val="1A1530"/>
-                <w:sz w:val="18"/>
-                <w:szCs w:val="18"/>
+                <w:sz w:val="20"/>
+                <w:szCs w:val="20"/>
               </w:rPr>
               <w:t xml:space="preserve">zaangażowani rodzice, spójny system komunikatów dom–placówka</w:t>
             </w:r>
@@ -6591,8 +6591,8 @@
                 <w:iCs w:val="false"/>
                 <w:caps w:val="false"/>
                 <w:color w:val="BF382A"/>
-                <w:sz w:val="18"/>
-                <w:szCs w:val="18"/>
+                <w:sz w:val="20"/>
+                <w:szCs w:val="20"/>
               </w:rPr>
               <w:t xml:space="preserve">•  </w:t>
             </w:r>
@@ -6605,8 +6605,8 @@
                 <w:iCs w:val="false"/>
                 <w:caps w:val="false"/>
                 <w:color w:val="1A1530"/>
-                <w:sz w:val="18"/>
-                <w:szCs w:val="18"/>
+                <w:sz w:val="20"/>
+                <w:szCs w:val="20"/>
               </w:rPr>
               <w:t xml:space="preserve">hałas korytarza, gwar w szatni i na stołówce</w:t>
             </w:r>
@@ -6625,8 +6625,8 @@
                 <w:iCs w:val="false"/>
                 <w:caps w:val="false"/>
                 <w:color w:val="BF382A"/>
-                <w:sz w:val="18"/>
-                <w:szCs w:val="18"/>
+                <w:sz w:val="20"/>
+                <w:szCs w:val="20"/>
               </w:rPr>
               <w:t xml:space="preserve">•  </w:t>
             </w:r>
@@ -6639,8 +6639,8 @@
                 <w:iCs w:val="false"/>
                 <w:caps w:val="false"/>
                 <w:color w:val="1A1530"/>
-                <w:sz w:val="18"/>
-                <w:szCs w:val="18"/>
+                <w:sz w:val="20"/>
+                <w:szCs w:val="20"/>
               </w:rPr>
               <w:t xml:space="preserve">apele, uroczystości i wyjścia zbiorowe bez przygotowania</w:t>
             </w:r>
@@ -6659,8 +6659,8 @@
                 <w:iCs w:val="false"/>
                 <w:caps w:val="false"/>
                 <w:color w:val="BF382A"/>
-                <w:sz w:val="18"/>
-                <w:szCs w:val="18"/>
+                <w:sz w:val="20"/>
+                <w:szCs w:val="20"/>
               </w:rPr>
               <w:t xml:space="preserve">•  </w:t>
             </w:r>
@@ -6673,8 +6673,8 @@
                 <w:iCs w:val="false"/>
                 <w:caps w:val="false"/>
                 <w:color w:val="1A1530"/>
-                <w:sz w:val="18"/>
-                <w:szCs w:val="18"/>
+                <w:sz w:val="20"/>
+                <w:szCs w:val="20"/>
               </w:rPr>
               <w:t xml:space="preserve">polecenia wieloetapowe podawane wyłącznie słownie</w:t>
             </w:r>
@@ -6693,8 +6693,8 @@
                 <w:iCs w:val="false"/>
                 <w:caps w:val="false"/>
                 <w:color w:val="BF382A"/>
-                <w:sz w:val="18"/>
-                <w:szCs w:val="18"/>
+                <w:sz w:val="20"/>
+                <w:szCs w:val="20"/>
               </w:rPr>
               <w:t xml:space="preserve">•  </w:t>
             </w:r>
@@ -6707,8 +6707,8 @@
                 <w:iCs w:val="false"/>
                 <w:caps w:val="false"/>
                 <w:color w:val="1A1530"/>
-                <w:sz w:val="18"/>
-                <w:szCs w:val="18"/>
+                <w:sz w:val="20"/>
+                <w:szCs w:val="20"/>
               </w:rPr>
               <w:t xml:space="preserve">nagłe zmiany planu, zastępstwa, zmiana sali</w:t>
             </w:r>
@@ -6727,8 +6727,8 @@
                 <w:iCs w:val="false"/>
                 <w:caps w:val="false"/>
                 <w:color w:val="BF382A"/>
-                <w:sz w:val="18"/>
-                <w:szCs w:val="18"/>
+                <w:sz w:val="20"/>
+                <w:szCs w:val="20"/>
               </w:rPr>
               <w:t xml:space="preserve">•  </w:t>
             </w:r>
@@ -6741,8 +6741,8 @@
                 <w:iCs w:val="false"/>
                 <w:caps w:val="false"/>
                 <w:color w:val="1A1530"/>
-                <w:sz w:val="18"/>
-                <w:szCs w:val="18"/>
+                <w:sz w:val="20"/>
+                <w:szCs w:val="20"/>
               </w:rPr>
               <w:t xml:space="preserve">faktury klejące i mokre podczas zajęć plastycznych</w:t>
             </w:r>
@@ -6764,8 +6764,8 @@
           <w:iCs w:val="false"/>
           <w:caps w:val="false"/>
           <w:color w:val="2D1B69"/>
-          <w:sz w:val="18"/>
-          <w:szCs w:val="18"/>
+          <w:sz w:val="20"/>
+          <w:szCs w:val="20"/>
         </w:rPr>
         <w:t xml:space="preserve">Informacje od dziecka i rodziców (§ 8 ust. 3 pkt 1 i 3): </w:t>
       </w:r>
@@ -6778,8 +6778,8 @@
           <w:iCs w:val="false"/>
           <w:caps w:val="false"/>
           <w:color w:val="1A1530"/>
-          <w:sz w:val="18"/>
-          <w:szCs w:val="18"/>
+          <w:sz w:val="20"/>
+          <w:szCs w:val="20"/>
         </w:rPr>
         <w:t xml:space="preserve">Informacje od dziecka (w formie dostosowanej do rozwoju) i od rodziców: lubi klocki, tablet z aplikacją o kosmosie i huśtanie; najtrudniejsze są hałas, zmiany planu i mokre ręce; pomagają cisza, plan dnia, słuchawki i wsparcie nauczyciela. Rodzice potwierdzają obraz funkcjonowania i wskazują potrzebę stałej kadry.</w:t>
       </w:r>
@@ -6827,8 +6827,8 @@
           <w:iCs w:val="false"/>
           <w:caps w:val="false"/>
           <w:color w:val="6B6378"/>
-          <w:sz w:val="18"/>
-          <w:szCs w:val="18"/>
+          <w:sz w:val="20"/>
+          <w:szCs w:val="20"/>
         </w:rPr>
         <w:t xml:space="preserve"/>
       </w:r>
@@ -7271,8 +7271,8 @@
           <w:iCs w:val="false"/>
           <w:caps w:val="false"/>
           <w:color w:val="2D1B69"/>
-          <w:sz w:val="18"/>
-          <w:szCs w:val="18"/>
+          <w:sz w:val="20"/>
+          <w:szCs w:val="20"/>
         </w:rPr>
         <w:t xml:space="preserve">Uzasadnienie: </w:t>
       </w:r>
@@ -7285,8 +7285,8 @@
           <w:iCs w:val="false"/>
           <w:caps w:val="false"/>
           <w:color w:val="1A1530"/>
-          <w:sz w:val="18"/>
-          <w:szCs w:val="18"/>
+          <w:sz w:val="20"/>
+          <w:szCs w:val="20"/>
         </w:rPr>
         <w:t xml:space="preserve">Wysoka potrzeba wsparcia w domenach d2, d7 i d9, potrzeba stałej komunikacji wspomagającej oraz ucieczkowa funkcja zachowań trudnych, którą kontroluje obecność przewidywalnego dorosłego. Dotychczasowe działania przyniosły mierzalną poprawę, co uzasadnia ich kontynuację i rozszerzenie w ramach kształcenia specjalnego.</w:t>
       </w:r>
@@ -7295,7 +7295,7 @@
       <w:pPr>
         <w:keepNext/>
         <w:pBdr>
-          <w:bottom w:val="single" w:color="D9D0F0" w:sz="18" w:space="4"/>
+          <w:bottom w:val="single" w:color="D9D0F0" w:sz="20" w:space="4"/>
         </w:pBdr>
         <w:spacing w:after="100" w:before="180"/>
       </w:pPr>
@@ -7380,8 +7380,8 @@
                 <w:iCs w:val="false"/>
                 <w:caps w:val="false"/>
                 <w:color w:val="2D1B69"/>
-                <w:sz w:val="18"/>
-                <w:szCs w:val="18"/>
+                <w:sz w:val="20"/>
+                <w:szCs w:val="20"/>
               </w:rPr>
               <w:t xml:space="preserve">Wychowawca / nauczyciel: </w:t>
             </w:r>
@@ -7394,8 +7394,8 @@
                 <w:iCs w:val="false"/>
                 <w:caps w:val="false"/>
                 <w:color w:val="1A1530"/>
-                <w:sz w:val="18"/>
-                <w:szCs w:val="18"/>
+                <w:sz w:val="20"/>
+                <w:szCs w:val="20"/>
               </w:rPr>
               <w:t xml:space="preserve">[Imię i nazwisko]</w:t>
             </w:r>
@@ -7414,8 +7414,8 @@
                 <w:iCs w:val="false"/>
                 <w:caps w:val="false"/>
                 <w:color w:val="6B6378"/>
-                <w:sz w:val="18"/>
-                <w:szCs w:val="18"/>
+                <w:sz w:val="20"/>
+                <w:szCs w:val="20"/>
               </w:rPr>
               <w:t xml:space="preserve">podpis: ………………………………………</w:t>
             </w:r>
@@ -7452,8 +7452,8 @@
                 <w:iCs w:val="false"/>
                 <w:caps w:val="false"/>
                 <w:color w:val="2D1B69"/>
-                <w:sz w:val="18"/>
-                <w:szCs w:val="18"/>
+                <w:sz w:val="20"/>
+                <w:szCs w:val="20"/>
               </w:rPr>
               <w:t xml:space="preserve">Pedagog specjalny: </w:t>
             </w:r>
@@ -7466,8 +7466,8 @@
                 <w:iCs w:val="false"/>
                 <w:caps w:val="false"/>
                 <w:color w:val="1A1530"/>
-                <w:sz w:val="18"/>
-                <w:szCs w:val="18"/>
+                <w:sz w:val="20"/>
+                <w:szCs w:val="20"/>
               </w:rPr>
               <w:t xml:space="preserve">[Imię i nazwisko]</w:t>
             </w:r>
@@ -7486,8 +7486,8 @@
                 <w:iCs w:val="false"/>
                 <w:caps w:val="false"/>
                 <w:color w:val="6B6378"/>
-                <w:sz w:val="18"/>
-                <w:szCs w:val="18"/>
+                <w:sz w:val="20"/>
+                <w:szCs w:val="20"/>
               </w:rPr>
               <w:t xml:space="preserve">podpis: ………………………………………</w:t>
             </w:r>
@@ -7529,8 +7529,8 @@
                 <w:iCs w:val="false"/>
                 <w:caps w:val="false"/>
                 <w:color w:val="2D1B69"/>
-                <w:sz w:val="18"/>
-                <w:szCs w:val="18"/>
+                <w:sz w:val="20"/>
+                <w:szCs w:val="20"/>
               </w:rPr>
               <w:t xml:space="preserve">Psycholog: </w:t>
             </w:r>
@@ -7543,8 +7543,8 @@
                 <w:iCs w:val="false"/>
                 <w:caps w:val="false"/>
                 <w:color w:val="1A1530"/>
-                <w:sz w:val="18"/>
-                <w:szCs w:val="18"/>
+                <w:sz w:val="20"/>
+                <w:szCs w:val="20"/>
               </w:rPr>
               <w:t xml:space="preserve">[Imię i nazwisko]</w:t>
             </w:r>
@@ -7563,8 +7563,8 @@
                 <w:iCs w:val="false"/>
                 <w:caps w:val="false"/>
                 <w:color w:val="6B6378"/>
-                <w:sz w:val="18"/>
-                <w:szCs w:val="18"/>
+                <w:sz w:val="20"/>
+                <w:szCs w:val="20"/>
               </w:rPr>
               <w:t xml:space="preserve">podpis: ………………………………………</w:t>
             </w:r>
@@ -7601,8 +7601,8 @@
                 <w:iCs w:val="false"/>
                 <w:caps w:val="false"/>
                 <w:color w:val="2D1B69"/>
-                <w:sz w:val="18"/>
-                <w:szCs w:val="18"/>
+                <w:sz w:val="20"/>
+                <w:szCs w:val="20"/>
               </w:rPr>
               <w:t xml:space="preserve">Logopeda: </w:t>
             </w:r>
@@ -7615,8 +7615,8 @@
                 <w:iCs w:val="false"/>
                 <w:caps w:val="false"/>
                 <w:color w:val="1A1530"/>
-                <w:sz w:val="18"/>
-                <w:szCs w:val="18"/>
+                <w:sz w:val="20"/>
+                <w:szCs w:val="20"/>
               </w:rPr>
               <w:t xml:space="preserve">[Imię i nazwisko]</w:t>
             </w:r>
@@ -7635,8 +7635,8 @@
                 <w:iCs w:val="false"/>
                 <w:caps w:val="false"/>
                 <w:color w:val="6B6378"/>
-                <w:sz w:val="18"/>
-                <w:szCs w:val="18"/>
+                <w:sz w:val="20"/>
+                <w:szCs w:val="20"/>
               </w:rPr>
               <w:t xml:space="preserve">podpis: ………………………………………</w:t>
             </w:r>
@@ -7683,7 +7683,7 @@
           <w:p>
             <w:pPr>
               <w:pBdr>
-                <w:top w:val="single" w:color="2D1B69" w:sz="18" w:space="5"/>
+                <w:top w:val="single" w:color="2D1B69" w:sz="20" w:space="5"/>
               </w:pBdr>
               <w:spacing w:after="0" w:before="0"/>
               <w:jc w:val="center"/>
@@ -7717,8 +7717,8 @@
                 <w:iCs w:val="false"/>
                 <w:caps w:val="false"/>
                 <w:color w:val="6B6378"/>
-                <w:sz w:val="18"/>
-                <w:szCs w:val="18"/>
+                <w:sz w:val="20"/>
+                <w:szCs w:val="20"/>
               </w:rPr>
               <w:t xml:space="preserve">podpis i data</w:t>
             </w:r>
@@ -7755,8 +7755,8 @@
                 <w:iCs w:val="false"/>
                 <w:caps w:val="false"/>
                 <w:color w:val="6B6378"/>
-                <w:sz w:val="18"/>
-                <w:szCs w:val="18"/>
+                <w:sz w:val="20"/>
+                <w:szCs w:val="20"/>
               </w:rPr>
               <w:t xml:space="preserve">Kopię opinii przekazano rodzicom / pełnoletniemu uczniowi (§ 7 ust. 5) dnia ……………… · podpis rodzica / ucznia: ………………………………</w:t>
             </w:r>
@@ -7778,8 +7778,8 @@
           <w:iCs w:val="false"/>
           <w:caps w:val="false"/>
           <w:color w:val="6B6378"/>
-          <w:sz w:val="18"/>
-          <w:szCs w:val="18"/>
+          <w:sz w:val="20"/>
+          <w:szCs w:val="20"/>
         </w:rPr>
         <w:t xml:space="preserve">Załączniki: ocena funkcjonalna (raport, część I–III), arkusze obserwacji, dokumentacja pomocy psychologiczno-pedagogicznej – do wglądu zespołu orzekającego za zgodą rodzica. Opinia zawiera dane dotyczące zdrowia (art. 9 RODO) – dokument poufny.</w:t>
       </w:r>
@@ -7841,7 +7841,7 @@
   <w:p>
     <w:pPr>
       <w:pBdr>
-        <w:top w:val="single" w:color="E3E1EC" w:sz="18" w:space="4"/>
+        <w:top w:val="single" w:color="E3E1EC" w:sz="20" w:space="4"/>
       </w:pBdr>
       <w:tabs>
         <w:tab w:val="right" w:pos="10206"/>
@@ -7857,8 +7857,8 @@
         <w:iCs w:val="false"/>
         <w:caps w:val="false"/>
         <w:color w:val="6B6378"/>
-        <w:sz w:val="18"/>
-        <w:szCs w:val="18"/>
+        <w:sz w:val="20"/>
+        <w:szCs w:val="20"/>
       </w:rPr>
       <w:t xml:space="preserve">Załącznik – opinia o funkcjonowaniu dziecka / ucznia · dokument poufny (RODO)</w:t>
     </w:r>
@@ -7885,8 +7885,8 @@
         <w:iCs w:val="false"/>
         <w:caps w:val="false"/>
         <w:color w:val="6B6378"/>
-        <w:sz w:val="18"/>
-        <w:szCs w:val="18"/>
+        <w:sz w:val="20"/>
+        <w:szCs w:val="20"/>
       </w:rPr>
       <w:t xml:space="preserve">Strona </w:t>
     </w:r>
@@ -7896,8 +7896,8 @@
         <w:b/>
         <w:bCs/>
         <w:color w:val="E74509"/>
-        <w:sz w:val="18"/>
-        <w:szCs w:val="18"/>
+        <w:sz w:val="20"/>
+        <w:szCs w:val="20"/>
       </w:rPr>
       <w:fldChar w:fldCharType="begin"/>
       <w:instrText xml:space="preserve">PAGE</w:instrText>
@@ -7913,8 +7913,8 @@
         <w:iCs w:val="false"/>
         <w:caps w:val="false"/>
         <w:color w:val="6B6378"/>
-        <w:sz w:val="18"/>
-        <w:szCs w:val="18"/>
+        <w:sz w:val="20"/>
+        <w:szCs w:val="20"/>
       </w:rPr>
       <w:t xml:space="preserve"> z </w:t>
     </w:r>
@@ -7924,8 +7924,8 @@
         <w:b/>
         <w:bCs/>
         <w:color w:val="2D1B69"/>
-        <w:sz w:val="18"/>
-        <w:szCs w:val="18"/>
+        <w:sz w:val="20"/>
+        <w:szCs w:val="20"/>
       </w:rPr>
       <w:fldChar w:fldCharType="begin"/>
       <w:instrText xml:space="preserve">NUMPAGES</w:instrText>

</xml_diff>

<commit_message>
Ocena Funkcjonalna: jednolita czcionka 12 pt w tabelach, druk ciągły bez pustych stron
- HTML/PDF: wszystkie tabele 16 px, nagłówek i numeracja w marginesie
  strony (@page), sekcje płyną; nowa strona tylko po okładce, na
  początku części i przed załącznikiem.
- Word: jeden schemat rozmiarów (24/20/28), nagłówek sekcji Worda z nazwą
  placówki i polem dziecka, brak podziałów stron między sekcjami,
  spis treści przeniesiony na stronę „Jak czytać”.
- PDF 25 stron, Word 33 strony, opinia 6 stron.

Co-Authored-By: Claude Fable 5.1 <noreply@anthropic.com>
Claude-Session: https://claude.ai/code/session_01FpF7vCSW7jSofte5z6wEKy
</commit_message>
<xml_diff>
--- a/eduplaner2026/raport_oceny_funkcjonalnej/Opinia_dla_poradni.docx
+++ b/eduplaner2026/raport_oceny_funkcjonalnej/Opinia_dla_poradni.docx
@@ -26,10 +26,10 @@
           <w:tcPr>
             <w:tcW w:type="dxa" w:w="5103"/>
             <w:tcBorders>
-              <w:top w:val="dashed" w:color="D9D0F0" w:sz="20"/>
-              <w:left w:val="dashed" w:color="D9D0F0" w:sz="20"/>
-              <w:bottom w:val="dashed" w:color="D9D0F0" w:sz="20"/>
-              <w:right w:val="dashed" w:color="D9D0F0" w:sz="20"/>
+              <w:top w:val="dashed" w:color="D9D0F0" w:sz="24"/>
+              <w:left w:val="dashed" w:color="D9D0F0" w:sz="24"/>
+              <w:bottom w:val="dashed" w:color="D9D0F0" w:sz="24"/>
+              <w:right w:val="dashed" w:color="D9D0F0" w:sz="24"/>
             </w:tcBorders>
             <w:tcMar>
               <w:top w:type="dxa" w:w="120"/>
@@ -73,8 +73,8 @@
                 <w:iCs w:val="false"/>
                 <w:caps w:val="false"/>
                 <w:color w:val="6B6378"/>
-                <w:sz w:val="20"/>
-                <w:szCs w:val="20"/>
+                <w:sz w:val="24"/>
+                <w:szCs w:val="24"/>
               </w:rPr>
               <w:t xml:space="preserve">[Adres placówki, tel., e-mail]</w:t>
             </w:r>
@@ -93,8 +93,8 @@
                 <w:iCs w:val="false"/>
                 <w:caps w:val="false"/>
                 <w:color w:val="6B6378"/>
-                <w:sz w:val="20"/>
-                <w:szCs w:val="20"/>
+                <w:sz w:val="24"/>
+                <w:szCs w:val="24"/>
               </w:rPr>
               <w:t xml:space="preserve">(pieczęć placówki)</w:t>
             </w:r>
@@ -131,8 +131,8 @@
                 <w:iCs w:val="false"/>
                 <w:caps w:val="false"/>
                 <w:color w:val="6B6378"/>
-                <w:sz w:val="20"/>
-                <w:szCs w:val="20"/>
+                <w:sz w:val="24"/>
+                <w:szCs w:val="24"/>
               </w:rPr>
               <w:t xml:space="preserve">[Miejscowość], dnia ………………………</w:t>
             </w:r>
@@ -151,8 +151,8 @@
                 <w:iCs w:val="false"/>
                 <w:caps w:val="false"/>
                 <w:color w:val="6B6378"/>
-                <w:sz w:val="20"/>
-                <w:szCs w:val="20"/>
+                <w:sz w:val="24"/>
+                <w:szCs w:val="24"/>
               </w:rPr>
               <w:t xml:space="preserve">Znak sprawy: ………………………</w:t>
             </w:r>
@@ -171,8 +171,8 @@
                 <w:iCs w:val="false"/>
                 <w:caps w:val="false"/>
                 <w:color w:val="6B6378"/>
-                <w:sz w:val="20"/>
-                <w:szCs w:val="20"/>
+                <w:sz w:val="24"/>
+                <w:szCs w:val="24"/>
               </w:rPr>
               <w:t xml:space="preserve">Zespół orzekający: [Nazwa Poradni Psychologiczno-Pedagogicznej]</w:t>
             </w:r>
@@ -220,8 +220,8 @@
           <w:caps w:val="false"/>
           <w:color w:val="E74509"/>
           <w:spacing w:val="30"/>
-          <w:sz w:val="20"/>
-          <w:szCs w:val="20"/>
+          <w:sz w:val="24"/>
+          <w:szCs w:val="24"/>
         </w:rPr>
         <w:t xml:space="preserve">W PRZEDSZKOLU / SZKOLE – DLA ZESPOŁU ORZEKAJĄCEGO PORADNI PSYCHOLOGICZNO-PEDAGOGICZNEJ</w:t>
       </w:r>
@@ -276,8 +276,8 @@
                 <w:iCs w:val="false"/>
                 <w:caps w:val="false"/>
                 <w:color w:val="2D1B69"/>
-                <w:sz w:val="20"/>
-                <w:szCs w:val="20"/>
+                <w:sz w:val="24"/>
+                <w:szCs w:val="24"/>
               </w:rPr>
               <w:t xml:space="preserve">Podstawa prawna: </w:t>
             </w:r>
@@ -290,8 +290,8 @@
                 <w:iCs w:val="false"/>
                 <w:caps w:val="false"/>
                 <w:color w:val="6B6378"/>
-                <w:sz w:val="20"/>
-                <w:szCs w:val="20"/>
+                <w:sz w:val="24"/>
+                <w:szCs w:val="24"/>
               </w:rPr>
               <w:t xml:space="preserve">§ 7 ust. 2–7 rozporządzenia Ministra Edukacji z dnia 2 marca 2026 r. w sprawie orzeczeń i opinii wydawanych przez zespoły orzekające działające w publicznych poradniach psychologiczno-pedagogicznych (Dz. U. z 2026 r. poz. 428).</w:t>
             </w:r>
@@ -310,8 +310,8 @@
                 <w:iCs w:val="false"/>
                 <w:caps w:val="false"/>
                 <w:color w:val="2D1B69"/>
-                <w:sz w:val="20"/>
-                <w:szCs w:val="20"/>
+                <w:sz w:val="24"/>
+                <w:szCs w:val="24"/>
               </w:rPr>
               <w:t xml:space="preserve">Tryb: </w:t>
             </w:r>
@@ -324,8 +324,8 @@
                 <w:iCs w:val="false"/>
                 <w:caps w:val="false"/>
                 <w:color w:val="6B6378"/>
-                <w:sz w:val="20"/>
-                <w:szCs w:val="20"/>
+                <w:sz w:val="24"/>
+                <w:szCs w:val="24"/>
               </w:rPr>
               <w:t xml:space="preserve">Opinię wydaje dyrektor na prośbę przewodniczącego zespołu orzekającego (§ 7 ust. 2) lub wnioskodawcy (ust. 4), w terminie 10 dni od dnia otrzymania prośby (ust. 3). Opinia uwzględnia wyniki obserwacji funkcjonowania dziecka/ucznia i działań diagnostycznych prowadzonych w placówce (ust. 6). Kopię opinii przekazuje się rodzicom dziecka lub ucznia albo pełnoletniemu uczniowi (ust. 5).</w:t>
             </w:r>
@@ -337,7 +337,7 @@
       <w:pPr>
         <w:keepNext/>
         <w:pBdr>
-          <w:bottom w:val="single" w:color="D9D0F0" w:sz="20" w:space="4"/>
+          <w:bottom w:val="single" w:color="D9D0F0" w:sz="24" w:space="4"/>
         </w:pBdr>
         <w:spacing w:after="100" w:before="180"/>
       </w:pPr>
@@ -423,8 +423,8 @@
                 <w:iCs w:val="false"/>
                 <w:caps w:val="false"/>
                 <w:color w:val="2D1B69"/>
-                <w:sz w:val="20"/>
-                <w:szCs w:val="20"/>
+                <w:sz w:val="24"/>
+                <w:szCs w:val="24"/>
               </w:rPr>
               <w:t xml:space="preserve">Data wydania opinii (pkt 1)</w:t>
             </w:r>
@@ -461,8 +461,8 @@
                 <w:iCs w:val="false"/>
                 <w:caps w:val="false"/>
                 <w:color w:val="1A1530"/>
-                <w:sz w:val="20"/>
-                <w:szCs w:val="20"/>
+                <w:sz w:val="24"/>
+                <w:szCs w:val="24"/>
               </w:rPr>
               <w:t xml:space="preserve">[Data wydania]</w:t>
             </w:r>
@@ -505,8 +505,8 @@
                 <w:iCs w:val="false"/>
                 <w:caps w:val="false"/>
                 <w:color w:val="2D1B69"/>
-                <w:sz w:val="20"/>
-                <w:szCs w:val="20"/>
+                <w:sz w:val="24"/>
+                <w:szCs w:val="24"/>
               </w:rPr>
               <w:t xml:space="preserve">Imię i nazwisko dziecka / ucznia (pkt 2)</w:t>
             </w:r>
@@ -543,8 +543,8 @@
                 <w:iCs w:val="false"/>
                 <w:caps w:val="false"/>
                 <w:color w:val="1A1530"/>
-                <w:sz w:val="20"/>
-                <w:szCs w:val="20"/>
+                <w:sz w:val="24"/>
+                <w:szCs w:val="24"/>
               </w:rPr>
               <w:t xml:space="preserve">[Imię i Nazwisko]</w:t>
             </w:r>
@@ -587,8 +587,8 @@
                 <w:iCs w:val="false"/>
                 <w:caps w:val="false"/>
                 <w:color w:val="2D1B69"/>
-                <w:sz w:val="20"/>
-                <w:szCs w:val="20"/>
+                <w:sz w:val="24"/>
+                <w:szCs w:val="24"/>
               </w:rPr>
               <w:t xml:space="preserve">Data urodzenia · PESEL</w:t>
             </w:r>
@@ -625,8 +625,8 @@
                 <w:iCs w:val="false"/>
                 <w:caps w:val="false"/>
                 <w:color w:val="1A1530"/>
-                <w:sz w:val="20"/>
-                <w:szCs w:val="20"/>
+                <w:sz w:val="24"/>
+                <w:szCs w:val="24"/>
               </w:rPr>
               <w:t xml:space="preserve">[Data urodzenia] · [PESEL]</w:t>
             </w:r>
@@ -669,8 +669,8 @@
                 <w:iCs w:val="false"/>
                 <w:caps w:val="false"/>
                 <w:color w:val="2D1B69"/>
-                <w:sz w:val="20"/>
-                <w:szCs w:val="20"/>
+                <w:sz w:val="24"/>
+                <w:szCs w:val="24"/>
               </w:rPr>
               <w:t xml:space="preserve">Przedszkole / szkoła (nazwa, adres) · grupa / oddział</w:t>
             </w:r>
@@ -707,8 +707,8 @@
                 <w:iCs w:val="false"/>
                 <w:caps w:val="false"/>
                 <w:color w:val="1A1530"/>
-                <w:sz w:val="20"/>
-                <w:szCs w:val="20"/>
+                <w:sz w:val="24"/>
+                <w:szCs w:val="24"/>
               </w:rPr>
               <w:t xml:space="preserve">[Nazwa i adres placówki] · [grupa / klasa] · ☐ dziecko do ukończenia wychowania przedszkolnego  ☐ uczeń</w:t>
             </w:r>
@@ -751,8 +751,8 @@
                 <w:iCs w:val="false"/>
                 <w:caps w:val="false"/>
                 <w:color w:val="2D1B69"/>
-                <w:sz w:val="20"/>
-                <w:szCs w:val="20"/>
+                <w:sz w:val="24"/>
+                <w:szCs w:val="24"/>
               </w:rPr>
               <w:t xml:space="preserve">Rodzice / opiekunowie prawni (pełnoletni uczeń)</w:t>
             </w:r>
@@ -789,8 +789,8 @@
                 <w:iCs w:val="false"/>
                 <w:caps w:val="false"/>
                 <w:color w:val="1A1530"/>
-                <w:sz w:val="20"/>
-                <w:szCs w:val="20"/>
+                <w:sz w:val="24"/>
+                <w:szCs w:val="24"/>
               </w:rPr>
               <w:t xml:space="preserve">[Imiona i nazwiska, adres do korespondencji]</w:t>
             </w:r>
@@ -833,8 +833,8 @@
                 <w:iCs w:val="false"/>
                 <w:caps w:val="false"/>
                 <w:color w:val="2D1B69"/>
-                <w:sz w:val="20"/>
-                <w:szCs w:val="20"/>
+                <w:sz w:val="24"/>
+                <w:szCs w:val="24"/>
               </w:rPr>
               <w:t xml:space="preserve">Prośba o wydanie opinii</w:t>
             </w:r>
@@ -871,8 +871,8 @@
                 <w:iCs w:val="false"/>
                 <w:caps w:val="false"/>
                 <w:color w:val="1A1530"/>
-                <w:sz w:val="20"/>
-                <w:szCs w:val="20"/>
+                <w:sz w:val="24"/>
+                <w:szCs w:val="24"/>
               </w:rPr>
               <w:t xml:space="preserve">☐ przewodniczący zespołu orzekającego (§ 7 ust. 2)  ☐ wnioskodawca (§ 7 ust. 4) · z dnia [Data otrzymania] · znak [Znak sprawy] · termin: 10 dni</w:t>
             </w:r>
@@ -915,8 +915,8 @@
                 <w:iCs w:val="false"/>
                 <w:caps w:val="false"/>
                 <w:color w:val="2D1B69"/>
-                <w:sz w:val="20"/>
-                <w:szCs w:val="20"/>
+                <w:sz w:val="24"/>
+                <w:szCs w:val="24"/>
               </w:rPr>
               <w:t xml:space="preserve">Dotychczasowe orzeczenie / opinia poradni</w:t>
             </w:r>
@@ -953,8 +953,8 @@
                 <w:iCs w:val="false"/>
                 <w:caps w:val="false"/>
                 <w:color w:val="1A1530"/>
-                <w:sz w:val="20"/>
-                <w:szCs w:val="20"/>
+                <w:sz w:val="24"/>
+                <w:szCs w:val="24"/>
               </w:rPr>
               <w:t xml:space="preserve">☐ brak  ☐ [Orzeczenie / Opinia] nr [Numer] z dnia [Data], wydane przez [Nazwa Poradni]</w:t>
             </w:r>
@@ -966,7 +966,7 @@
       <w:pPr>
         <w:keepNext/>
         <w:pBdr>
-          <w:bottom w:val="single" w:color="D9D0F0" w:sz="20" w:space="4"/>
+          <w:bottom w:val="single" w:color="D9D0F0" w:sz="24" w:space="4"/>
         </w:pBdr>
         <w:spacing w:after="100" w:before="180"/>
       </w:pPr>
@@ -1052,8 +1052,8 @@
                 <w:iCs w:val="false"/>
                 <w:caps w:val="false"/>
                 <w:color w:val="2D1B69"/>
-                <w:sz w:val="20"/>
-                <w:szCs w:val="20"/>
+                <w:sz w:val="24"/>
+                <w:szCs w:val="24"/>
               </w:rPr>
               <w:t xml:space="preserve">Okres obserwacji</w:t>
             </w:r>
@@ -1090,8 +1090,8 @@
                 <w:iCs w:val="false"/>
                 <w:caps w:val="false"/>
                 <w:color w:val="1A1530"/>
-                <w:sz w:val="20"/>
-                <w:szCs w:val="20"/>
+                <w:sz w:val="24"/>
+                <w:szCs w:val="24"/>
               </w:rPr>
               <w:t xml:space="preserve">wrzesień [rok] – [miesiąc rok]; obserwacja wstępna i pogłębiona w naturalnych sytuacjach (zajęcia kierowane, zabawa swobodna, posiłki, przejścia, wydarzenia grupowe)</w:t>
             </w:r>
@@ -1134,8 +1134,8 @@
                 <w:iCs w:val="false"/>
                 <w:caps w:val="false"/>
                 <w:color w:val="2D1B69"/>
-                <w:sz w:val="20"/>
-                <w:szCs w:val="20"/>
+                <w:sz w:val="24"/>
+                <w:szCs w:val="24"/>
               </w:rPr>
               <w:t xml:space="preserve">Narzędzia i działania diagnostyczne</w:t>
             </w:r>
@@ -1172,8 +1172,8 @@
                 <w:iCs w:val="false"/>
                 <w:caps w:val="false"/>
                 <w:color w:val="1A1530"/>
-                <w:sz w:val="20"/>
-                <w:szCs w:val="20"/>
+                <w:sz w:val="24"/>
+                <w:szCs w:val="24"/>
               </w:rPr>
               <w:t xml:space="preserve">Kwestionariusz Przedszkolnej / Szkolnej Oceny Funkcjonalnej (KPOF / KSzOF – 9 domen ICF); Profil Biopsychospołeczny; Arkusz Obserwacji Behawioralnej ABC; Profil Sensoryczny; Arkusz Oceny Rozwoju Mowy i Komunikacji; Arkusz Poziomu Rozwoju Teorii Umysłu (ToM); analiza dokumentacji pomocy psychologiczno-pedagogicznej</w:t>
             </w:r>
@@ -1216,8 +1216,8 @@
                 <w:iCs w:val="false"/>
                 <w:caps w:val="false"/>
                 <w:color w:val="2D1B69"/>
-                <w:sz w:val="20"/>
-                <w:szCs w:val="20"/>
+                <w:sz w:val="24"/>
+                <w:szCs w:val="24"/>
               </w:rPr>
               <w:t xml:space="preserve">Osoby rozpoznające trudności, mocne strony i uzdolnienia</w:t>
             </w:r>
@@ -1254,8 +1254,8 @@
                 <w:iCs w:val="false"/>
                 <w:caps w:val="false"/>
                 <w:color w:val="1A1530"/>
-                <w:sz w:val="20"/>
-                <w:szCs w:val="20"/>
+                <w:sz w:val="24"/>
+                <w:szCs w:val="24"/>
               </w:rPr>
               <w:t xml:space="preserve">wychowawca / nauczyciele oddziału, pedagog specjalny, psycholog, logopeda, terapeuta SI (imiona i nazwiska w części 9); informacje uzupełniające od rodziców i od dziecka w formie dostosowanej do jego rozwoju</w:t>
             </w:r>
@@ -1265,212 +1265,14 @@
     </w:tbl>
     <w:p>
       <w:pPr>
-        <w:pageBreakBefore/>
-        <w:spacing w:after="0" w:before="0" w:line="20" w:lineRule="exact"/>
-      </w:pPr>
-      <w:r>
-        <w:rPr>
-          <w:rFonts w:ascii="Arial" w:cs="Arial" w:eastAsia="Arial" w:hAnsi="Arial"/>
-          <w:b w:val="false"/>
-          <w:bCs w:val="false"/>
-          <w:i w:val="false"/>
-          <w:iCs w:val="false"/>
-          <w:caps w:val="false"/>
-          <w:color w:val="1A1530"/>
-          <w:sz w:val="20"/>
-          <w:szCs w:val="20"/>
-        </w:rPr>
-        <w:t xml:space="preserve"/>
-      </w:r>
-    </w:p>
-    <w:tbl>
-      <w:tblPr>
-        <w:tblW w:type="dxa" w:w="10206"/>
-        <w:tblBorders>
-          <w:top w:val="single" w:color="auto" w:sz="4"/>
-          <w:left w:val="single" w:color="auto" w:sz="4"/>
-          <w:bottom w:val="single" w:color="auto" w:sz="4"/>
-          <w:right w:val="single" w:color="auto" w:sz="4"/>
-          <w:insideH w:val="single" w:color="auto" w:sz="4"/>
-          <w:insideV w:val="single" w:color="auto" w:sz="4"/>
-        </w:tblBorders>
-      </w:tblPr>
-      <w:tblGrid>
-        <w:gridCol w:w="5103"/>
-        <w:gridCol w:w="5103"/>
-      </w:tblGrid>
-      <w:tr>
-        <w:trPr>
-          <w:cantSplit/>
-        </w:trPr>
-        <w:tc>
-          <w:tcPr>
-            <w:tcW w:type="dxa" w:w="5103"/>
-            <w:tcBorders>
-              <w:top w:val="dashed" w:color="D9D0F0" w:sz="20"/>
-              <w:left w:val="dashed" w:color="D9D0F0" w:sz="20"/>
-              <w:bottom w:val="dashed" w:color="D9D0F0" w:sz="20"/>
-              <w:right w:val="dashed" w:color="D9D0F0" w:sz="20"/>
-            </w:tcBorders>
-            <w:tcMar>
-              <w:top w:type="dxa" w:w="120"/>
-              <w:left w:type="dxa" w:w="180"/>
-              <w:bottom w:type="dxa" w:w="120"/>
-              <w:right w:type="dxa" w:w="180"/>
-            </w:tcMar>
-            <w:vAlign w:val="top"/>
-          </w:tcPr>
-          <w:p>
-            <w:pPr>
-              <w:spacing w:after="20" w:before="0" w:line="276"/>
-              <w:jc w:val="left"/>
-            </w:pPr>
-            <w:r>
-              <w:rPr>
-                <w:rFonts w:ascii="Arial" w:cs="Arial" w:eastAsia="Arial" w:hAnsi="Arial"/>
-                <w:b/>
-                <w:bCs/>
-                <w:i w:val="false"/>
-                <w:iCs w:val="false"/>
-                <w:caps w:val="false"/>
-                <w:color w:val="2D1B69"/>
-                <w:sz w:val="24"/>
-                <w:szCs w:val="24"/>
-              </w:rPr>
-              <w:t xml:space="preserve">[Nazwa przedszkola / szkoły]</w:t>
-            </w:r>
-          </w:p>
-          <w:p>
-            <w:pPr>
-              <w:spacing w:after="20" w:before="0" w:line="276"/>
-              <w:jc w:val="left"/>
-            </w:pPr>
-            <w:r>
-              <w:rPr>
-                <w:rFonts w:ascii="Arial" w:cs="Arial" w:eastAsia="Arial" w:hAnsi="Arial"/>
-                <w:b w:val="false"/>
-                <w:bCs w:val="false"/>
-                <w:i w:val="false"/>
-                <w:iCs w:val="false"/>
-                <w:caps w:val="false"/>
-                <w:color w:val="6B6378"/>
-                <w:sz w:val="20"/>
-                <w:szCs w:val="20"/>
-              </w:rPr>
-              <w:t xml:space="preserve">[Adres placówki, tel., e-mail]</w:t>
-            </w:r>
-          </w:p>
-          <w:p>
-            <w:pPr>
-              <w:spacing w:after="0" w:before="0" w:line="276"/>
-              <w:jc w:val="left"/>
-            </w:pPr>
-            <w:r>
-              <w:rPr>
-                <w:rFonts w:ascii="Arial" w:cs="Arial" w:eastAsia="Arial" w:hAnsi="Arial"/>
-                <w:b w:val="false"/>
-                <w:bCs w:val="false"/>
-                <w:i w:val="false"/>
-                <w:iCs w:val="false"/>
-                <w:caps w:val="false"/>
-                <w:color w:val="6B6378"/>
-                <w:sz w:val="20"/>
-                <w:szCs w:val="20"/>
-              </w:rPr>
-              <w:t xml:space="preserve">(pieczęć placówki)</w:t>
-            </w:r>
-          </w:p>
-        </w:tc>
-        <w:tc>
-          <w:tcPr>
-            <w:tcW w:type="dxa" w:w="5103"/>
-            <w:tcBorders>
-              <w:top w:val="nil"/>
-              <w:left w:val="nil"/>
-              <w:bottom w:val="nil"/>
-              <w:right w:val="nil"/>
-            </w:tcBorders>
-            <w:tcMar>
-              <w:top w:type="dxa" w:w="60"/>
-              <w:left w:type="dxa" w:w="200"/>
-              <w:bottom w:type="dxa" w:w="60"/>
-              <w:right w:type="dxa" w:w="0"/>
-            </w:tcMar>
-            <w:vAlign w:val="top"/>
-          </w:tcPr>
-          <w:p>
-            <w:pPr>
-              <w:spacing w:after="40" w:before="0" w:line="276"/>
-              <w:jc w:val="right"/>
-            </w:pPr>
-            <w:r>
-              <w:rPr>
-                <w:rFonts w:ascii="Arial" w:cs="Arial" w:eastAsia="Arial" w:hAnsi="Arial"/>
-                <w:b w:val="false"/>
-                <w:bCs w:val="false"/>
-                <w:i w:val="false"/>
-                <w:iCs w:val="false"/>
-                <w:caps w:val="false"/>
-                <w:color w:val="6B6378"/>
-                <w:sz w:val="20"/>
-                <w:szCs w:val="20"/>
-              </w:rPr>
-              <w:t xml:space="preserve">[Miejscowość], dnia ………………………</w:t>
-            </w:r>
-          </w:p>
-          <w:p>
-            <w:pPr>
-              <w:spacing w:after="40" w:before="0" w:line="276"/>
-              <w:jc w:val="right"/>
-            </w:pPr>
-            <w:r>
-              <w:rPr>
-                <w:rFonts w:ascii="Arial" w:cs="Arial" w:eastAsia="Arial" w:hAnsi="Arial"/>
-                <w:b w:val="false"/>
-                <w:bCs w:val="false"/>
-                <w:i w:val="false"/>
-                <w:iCs w:val="false"/>
-                <w:caps w:val="false"/>
-                <w:color w:val="6B6378"/>
-                <w:sz w:val="20"/>
-                <w:szCs w:val="20"/>
-              </w:rPr>
-              <w:t xml:space="preserve">Znak sprawy: ………………………</w:t>
-            </w:r>
-          </w:p>
-          <w:p>
-            <w:pPr>
-              <w:spacing w:after="0" w:before="0" w:line="276"/>
-              <w:jc w:val="right"/>
-            </w:pPr>
-            <w:r>
-              <w:rPr>
-                <w:rFonts w:ascii="Arial" w:cs="Arial" w:eastAsia="Arial" w:hAnsi="Arial"/>
-                <w:b w:val="false"/>
-                <w:bCs w:val="false"/>
-                <w:i w:val="false"/>
-                <w:iCs w:val="false"/>
-                <w:caps w:val="false"/>
-                <w:color w:val="6B6378"/>
-                <w:sz w:val="20"/>
-                <w:szCs w:val="20"/>
-              </w:rPr>
-              <w:t xml:space="preserve">Zespół orzekający: [Nazwa Poradni Psychologiczno-Pedagogicznej]</w:t>
-            </w:r>
-          </w:p>
-        </w:tc>
-      </w:tr>
-    </w:tbl>
-    <w:p>
-      <w:pPr>
-        <w:spacing w:after="160" w:before="0"/>
+        <w:spacing w:after="360" w:before="0"/>
       </w:pPr>
     </w:p>
     <w:p>
       <w:pPr>
         <w:keepNext/>
         <w:pBdr>
-          <w:bottom w:val="single" w:color="D9D0F0" w:sz="20" w:space="4"/>
+          <w:bottom w:val="single" w:color="D9D0F0" w:sz="24" w:space="4"/>
         </w:pBdr>
         <w:spacing w:after="100" w:before="180"/>
       </w:pPr>
@@ -1567,8 +1369,8 @@
           <w:iCs w:val="false"/>
           <w:caps w:val="false"/>
           <w:color w:val="6B6378"/>
-          <w:sz w:val="20"/>
-          <w:szCs w:val="20"/>
+          <w:sz w:val="24"/>
+          <w:szCs w:val="24"/>
         </w:rPr>
         <w:t xml:space="preserve"/>
       </w:r>
@@ -1628,8 +1430,8 @@
                 <w:caps/>
                 <w:color w:val="2D1B69"/>
                 <w:spacing w:val="10"/>
-                <w:sz w:val="20"/>
-                <w:szCs w:val="20"/>
+                <w:sz w:val="24"/>
+                <w:szCs w:val="24"/>
               </w:rPr>
               <w:t xml:space="preserve">Obszar (ICF)</w:t>
             </w:r>
@@ -1668,8 +1470,8 @@
                 <w:caps/>
                 <w:color w:val="2E7D45"/>
                 <w:spacing w:val="10"/>
-                <w:sz w:val="20"/>
-                <w:szCs w:val="20"/>
+                <w:sz w:val="24"/>
+                <w:szCs w:val="24"/>
               </w:rPr>
               <w:t xml:space="preserve">Mocne strony i uzdolnienia</w:t>
             </w:r>
@@ -1708,8 +1510,8 @@
                 <w:caps/>
                 <w:color w:val="BF382A"/>
                 <w:spacing w:val="10"/>
-                <w:sz w:val="20"/>
-                <w:szCs w:val="20"/>
+                <w:sz w:val="24"/>
+                <w:szCs w:val="24"/>
               </w:rPr>
               <w:t xml:space="preserve">Trudności</w:t>
             </w:r>
@@ -1748,8 +1550,8 @@
                 <w:caps/>
                 <w:color w:val="2D1B69"/>
                 <w:spacing w:val="10"/>
-                <w:sz w:val="20"/>
-                <w:szCs w:val="20"/>
+                <w:sz w:val="24"/>
+                <w:szCs w:val="24"/>
               </w:rPr>
               <w:t xml:space="preserve">Poziom potrzeby wsparcia</w:t>
             </w:r>
@@ -1792,8 +1594,8 @@
                 <w:iCs w:val="false"/>
                 <w:caps w:val="false"/>
                 <w:color w:val="2D1B69"/>
-                <w:sz w:val="20"/>
-                <w:szCs w:val="20"/>
+                <w:sz w:val="24"/>
+                <w:szCs w:val="24"/>
               </w:rPr>
               <w:t xml:space="preserve">1 · Uczenie się i stosowanie wiedzy</w:t>
             </w:r>
@@ -1830,8 +1632,8 @@
                 <w:iCs w:val="false"/>
                 <w:caps w:val="false"/>
                 <w:color w:val="1A1530"/>
-                <w:sz w:val="20"/>
-                <w:szCs w:val="20"/>
+                <w:sz w:val="24"/>
+                <w:szCs w:val="24"/>
               </w:rPr>
               <w:t xml:space="preserve">pamięć wzrokowa, schematy graficzne, zainteresowania tematyczne, motywacja do pracy z ulubionymi pomocami</w:t>
             </w:r>
@@ -1868,8 +1670,8 @@
                 <w:iCs w:val="false"/>
                 <w:caps w:val="false"/>
                 <w:color w:val="1A1530"/>
-                <w:sz w:val="20"/>
-                <w:szCs w:val="20"/>
+                <w:sz w:val="24"/>
+                <w:szCs w:val="24"/>
               </w:rPr>
               <w:t xml:space="preserve">przerzutność i podzielność uwagi, instrukcje wieloetapowe, uogólnianie wiedzy, stres przy zmianie planu, potrzeba nadzoru nauczyciela</w:t>
             </w:r>
@@ -1906,8 +1708,8 @@
                 <w:iCs w:val="false"/>
                 <w:caps w:val="false"/>
                 <w:color w:val="2D1B69"/>
-                <w:sz w:val="20"/>
-                <w:szCs w:val="20"/>
+                <w:sz w:val="24"/>
+                <w:szCs w:val="24"/>
               </w:rPr>
               <w:t xml:space="preserve">d1 śr. 2,4 · d2 śr. 1,8 · d8 śr. 2,0 – poziom średni / wysoki</w:t>
             </w:r>
@@ -1950,8 +1752,8 @@
                 <w:iCs w:val="false"/>
                 <w:caps w:val="false"/>
                 <w:color w:val="2D1B69"/>
-                <w:sz w:val="20"/>
-                <w:szCs w:val="20"/>
+                <w:sz w:val="24"/>
+                <w:szCs w:val="24"/>
               </w:rPr>
               <w:t xml:space="preserve">2 · Zachowania społeczne we wzajemnych kontaktach – przystosowanie społeczne i emocjonalne</w:t>
             </w:r>
@@ -1988,8 +1790,8 @@
                 <w:iCs w:val="false"/>
                 <w:caps w:val="false"/>
                 <w:color w:val="1A1530"/>
-                <w:sz w:val="20"/>
-                <w:szCs w:val="20"/>
+                <w:sz w:val="24"/>
+                <w:szCs w:val="24"/>
               </w:rPr>
               <w:t xml:space="preserve">chęć przebywania blisko grupy, reakcja na stałych dorosłych, przestrzeganie zasad wizualnych</w:t>
             </w:r>
@@ -2026,8 +1828,8 @@
                 <w:iCs w:val="false"/>
                 <w:caps w:val="false"/>
                 <w:color w:val="1A1530"/>
-                <w:sz w:val="20"/>
-                <w:szCs w:val="20"/>
+                <w:sz w:val="24"/>
+                <w:szCs w:val="24"/>
               </w:rPr>
               <w:t xml:space="preserve">odczytywanie emocji i intencji, tolerancja frustracji, wycofanie lub zachowania trudne w apelach i wyjściach</w:t>
             </w:r>
@@ -2064,8 +1866,8 @@
                 <w:iCs w:val="false"/>
                 <w:caps w:val="false"/>
                 <w:color w:val="2D1B69"/>
-                <w:sz w:val="20"/>
-                <w:szCs w:val="20"/>
+                <w:sz w:val="24"/>
+                <w:szCs w:val="24"/>
               </w:rPr>
               <w:t xml:space="preserve">d7 śr. 1,6 · d9 śr. 1,8 – poziom wysoki</w:t>
             </w:r>
@@ -2108,8 +1910,8 @@
                 <w:iCs w:val="false"/>
                 <w:caps w:val="false"/>
                 <w:color w:val="2D1B69"/>
-                <w:sz w:val="20"/>
-                <w:szCs w:val="20"/>
+                <w:sz w:val="24"/>
+                <w:szCs w:val="24"/>
               </w:rPr>
               <w:t xml:space="preserve">3 · Porozumiewanie się</w:t>
             </w:r>
@@ -2146,8 +1948,8 @@
                 <w:iCs w:val="false"/>
                 <w:caps w:val="false"/>
                 <w:color w:val="1A1530"/>
-                <w:sz w:val="20"/>
-                <w:szCs w:val="20"/>
+                <w:sz w:val="24"/>
+                <w:szCs w:val="24"/>
               </w:rPr>
               <w:t xml:space="preserve">rozumienie prostych komunikatów wspartych gestem, sygnalizowanie potrzeb</w:t>
             </w:r>
@@ -2184,8 +1986,8 @@
                 <w:iCs w:val="false"/>
                 <w:caps w:val="false"/>
                 <w:color w:val="1A1530"/>
-                <w:sz w:val="20"/>
-                <w:szCs w:val="20"/>
+                <w:sz w:val="24"/>
+                <w:szCs w:val="24"/>
               </w:rPr>
               <w:t xml:space="preserve">dosłowność, echolalie, inicjowanie i naprzemienność dialogu, potrzeba AAC</w:t>
             </w:r>
@@ -2222,8 +2024,8 @@
                 <w:iCs w:val="false"/>
                 <w:caps w:val="false"/>
                 <w:color w:val="2D1B69"/>
-                <w:sz w:val="20"/>
-                <w:szCs w:val="20"/>
+                <w:sz w:val="24"/>
+                <w:szCs w:val="24"/>
               </w:rPr>
               <w:t xml:space="preserve">d3 śr. 2,0 – poziom średni</w:t>
             </w:r>
@@ -2266,8 +2068,8 @@
                 <w:iCs w:val="false"/>
                 <w:caps w:val="false"/>
                 <w:color w:val="2D1B69"/>
-                <w:sz w:val="20"/>
-                <w:szCs w:val="20"/>
+                <w:sz w:val="24"/>
+                <w:szCs w:val="24"/>
               </w:rPr>
               <w:t xml:space="preserve">4 · Aktywność ruchowa – poruszanie się</w:t>
             </w:r>
@@ -2304,8 +2106,8 @@
                 <w:iCs w:val="false"/>
                 <w:caps w:val="false"/>
                 <w:color w:val="1A1530"/>
-                <w:sz w:val="20"/>
-                <w:szCs w:val="20"/>
+                <w:sz w:val="24"/>
+                <w:szCs w:val="24"/>
               </w:rPr>
               <w:t xml:space="preserve">motoryka duża, chętny udział w zabawach ruchowych</w:t>
             </w:r>
@@ -2342,8 +2144,8 @@
                 <w:iCs w:val="false"/>
                 <w:caps w:val="false"/>
                 <w:color w:val="1A1530"/>
-                <w:sz w:val="20"/>
-                <w:szCs w:val="20"/>
+                <w:sz w:val="24"/>
+                <w:szCs w:val="24"/>
               </w:rPr>
               <w:t xml:space="preserve">motoryka mała, koordynacja wzrokowo-ruchowa, chwyt, napięcie posturalne</w:t>
             </w:r>
@@ -2380,8 +2182,8 @@
                 <w:iCs w:val="false"/>
                 <w:caps w:val="false"/>
                 <w:color w:val="2D1B69"/>
-                <w:sz w:val="20"/>
-                <w:szCs w:val="20"/>
+                <w:sz w:val="24"/>
+                <w:szCs w:val="24"/>
               </w:rPr>
               <w:t xml:space="preserve">d4 śr. 3,2 – poziom niski</w:t>
             </w:r>
@@ -2424,8 +2226,8 @@
                 <w:iCs w:val="false"/>
                 <w:caps w:val="false"/>
                 <w:color w:val="2D1B69"/>
-                <w:sz w:val="20"/>
-                <w:szCs w:val="20"/>
+                <w:sz w:val="24"/>
+                <w:szCs w:val="24"/>
               </w:rPr>
               <w:t xml:space="preserve">5 · Dbanie o siebie</w:t>
             </w:r>
@@ -2462,8 +2264,8 @@
                 <w:iCs w:val="false"/>
                 <w:caps w:val="false"/>
                 <w:color w:val="1A1530"/>
-                <w:sz w:val="20"/>
-                <w:szCs w:val="20"/>
+                <w:sz w:val="24"/>
+                <w:szCs w:val="24"/>
               </w:rPr>
               <w:t xml:space="preserve">podstawowe nawyki higieniczne i toaletowe, znajomość swoich rzeczy, obowiązki po przypomnieniu</w:t>
             </w:r>
@@ -2500,8 +2302,8 @@
                 <w:iCs w:val="false"/>
                 <w:caps w:val="false"/>
                 <w:color w:val="1A1530"/>
-                <w:sz w:val="20"/>
-                <w:szCs w:val="20"/>
+                <w:sz w:val="24"/>
+                <w:szCs w:val="24"/>
               </w:rPr>
               <w:t xml:space="preserve">opór sensoryczny przy myciu rąk, wybiórczość pokarmowa, trudne zapięcia, brak inicjowania obowiązków</w:t>
             </w:r>
@@ -2538,8 +2340,8 @@
                 <w:iCs w:val="false"/>
                 <w:caps w:val="false"/>
                 <w:color w:val="2D1B69"/>
-                <w:sz w:val="20"/>
-                <w:szCs w:val="20"/>
+                <w:sz w:val="24"/>
+                <w:szCs w:val="24"/>
               </w:rPr>
               <w:t xml:space="preserve">d5 śr. 2,2 · d6 śr. 2,8 – poziom średni / niski</w:t>
             </w:r>
@@ -2549,212 +2351,14 @@
     </w:tbl>
     <w:p>
       <w:pPr>
-        <w:pageBreakBefore/>
-        <w:spacing w:after="0" w:before="0" w:line="20" w:lineRule="exact"/>
-      </w:pPr>
-      <w:r>
-        <w:rPr>
-          <w:rFonts w:ascii="Arial" w:cs="Arial" w:eastAsia="Arial" w:hAnsi="Arial"/>
-          <w:b w:val="false"/>
-          <w:bCs w:val="false"/>
-          <w:i w:val="false"/>
-          <w:iCs w:val="false"/>
-          <w:caps w:val="false"/>
-          <w:color w:val="1A1530"/>
-          <w:sz w:val="20"/>
-          <w:szCs w:val="20"/>
-        </w:rPr>
-        <w:t xml:space="preserve"/>
-      </w:r>
-    </w:p>
-    <w:tbl>
-      <w:tblPr>
-        <w:tblW w:type="dxa" w:w="10206"/>
-        <w:tblBorders>
-          <w:top w:val="single" w:color="auto" w:sz="4"/>
-          <w:left w:val="single" w:color="auto" w:sz="4"/>
-          <w:bottom w:val="single" w:color="auto" w:sz="4"/>
-          <w:right w:val="single" w:color="auto" w:sz="4"/>
-          <w:insideH w:val="single" w:color="auto" w:sz="4"/>
-          <w:insideV w:val="single" w:color="auto" w:sz="4"/>
-        </w:tblBorders>
-      </w:tblPr>
-      <w:tblGrid>
-        <w:gridCol w:w="5103"/>
-        <w:gridCol w:w="5103"/>
-      </w:tblGrid>
-      <w:tr>
-        <w:trPr>
-          <w:cantSplit/>
-        </w:trPr>
-        <w:tc>
-          <w:tcPr>
-            <w:tcW w:type="dxa" w:w="5103"/>
-            <w:tcBorders>
-              <w:top w:val="dashed" w:color="D9D0F0" w:sz="20"/>
-              <w:left w:val="dashed" w:color="D9D0F0" w:sz="20"/>
-              <w:bottom w:val="dashed" w:color="D9D0F0" w:sz="20"/>
-              <w:right w:val="dashed" w:color="D9D0F0" w:sz="20"/>
-            </w:tcBorders>
-            <w:tcMar>
-              <w:top w:type="dxa" w:w="120"/>
-              <w:left w:type="dxa" w:w="180"/>
-              <w:bottom w:type="dxa" w:w="120"/>
-              <w:right w:type="dxa" w:w="180"/>
-            </w:tcMar>
-            <w:vAlign w:val="top"/>
-          </w:tcPr>
-          <w:p>
-            <w:pPr>
-              <w:spacing w:after="20" w:before="0" w:line="276"/>
-              <w:jc w:val="left"/>
-            </w:pPr>
-            <w:r>
-              <w:rPr>
-                <w:rFonts w:ascii="Arial" w:cs="Arial" w:eastAsia="Arial" w:hAnsi="Arial"/>
-                <w:b/>
-                <w:bCs/>
-                <w:i w:val="false"/>
-                <w:iCs w:val="false"/>
-                <w:caps w:val="false"/>
-                <w:color w:val="2D1B69"/>
-                <w:sz w:val="24"/>
-                <w:szCs w:val="24"/>
-              </w:rPr>
-              <w:t xml:space="preserve">[Nazwa przedszkola / szkoły]</w:t>
-            </w:r>
-          </w:p>
-          <w:p>
-            <w:pPr>
-              <w:spacing w:after="20" w:before="0" w:line="276"/>
-              <w:jc w:val="left"/>
-            </w:pPr>
-            <w:r>
-              <w:rPr>
-                <w:rFonts w:ascii="Arial" w:cs="Arial" w:eastAsia="Arial" w:hAnsi="Arial"/>
-                <w:b w:val="false"/>
-                <w:bCs w:val="false"/>
-                <w:i w:val="false"/>
-                <w:iCs w:val="false"/>
-                <w:caps w:val="false"/>
-                <w:color w:val="6B6378"/>
-                <w:sz w:val="20"/>
-                <w:szCs w:val="20"/>
-              </w:rPr>
-              <w:t xml:space="preserve">[Adres placówki, tel., e-mail]</w:t>
-            </w:r>
-          </w:p>
-          <w:p>
-            <w:pPr>
-              <w:spacing w:after="0" w:before="0" w:line="276"/>
-              <w:jc w:val="left"/>
-            </w:pPr>
-            <w:r>
-              <w:rPr>
-                <w:rFonts w:ascii="Arial" w:cs="Arial" w:eastAsia="Arial" w:hAnsi="Arial"/>
-                <w:b w:val="false"/>
-                <w:bCs w:val="false"/>
-                <w:i w:val="false"/>
-                <w:iCs w:val="false"/>
-                <w:caps w:val="false"/>
-                <w:color w:val="6B6378"/>
-                <w:sz w:val="20"/>
-                <w:szCs w:val="20"/>
-              </w:rPr>
-              <w:t xml:space="preserve">(pieczęć placówki)</w:t>
-            </w:r>
-          </w:p>
-        </w:tc>
-        <w:tc>
-          <w:tcPr>
-            <w:tcW w:type="dxa" w:w="5103"/>
-            <w:tcBorders>
-              <w:top w:val="nil"/>
-              <w:left w:val="nil"/>
-              <w:bottom w:val="nil"/>
-              <w:right w:val="nil"/>
-            </w:tcBorders>
-            <w:tcMar>
-              <w:top w:type="dxa" w:w="60"/>
-              <w:left w:type="dxa" w:w="200"/>
-              <w:bottom w:type="dxa" w:w="60"/>
-              <w:right w:type="dxa" w:w="0"/>
-            </w:tcMar>
-            <w:vAlign w:val="top"/>
-          </w:tcPr>
-          <w:p>
-            <w:pPr>
-              <w:spacing w:after="40" w:before="0" w:line="276"/>
-              <w:jc w:val="right"/>
-            </w:pPr>
-            <w:r>
-              <w:rPr>
-                <w:rFonts w:ascii="Arial" w:cs="Arial" w:eastAsia="Arial" w:hAnsi="Arial"/>
-                <w:b w:val="false"/>
-                <w:bCs w:val="false"/>
-                <w:i w:val="false"/>
-                <w:iCs w:val="false"/>
-                <w:caps w:val="false"/>
-                <w:color w:val="6B6378"/>
-                <w:sz w:val="20"/>
-                <w:szCs w:val="20"/>
-              </w:rPr>
-              <w:t xml:space="preserve">[Miejscowość], dnia ………………………</w:t>
-            </w:r>
-          </w:p>
-          <w:p>
-            <w:pPr>
-              <w:spacing w:after="40" w:before="0" w:line="276"/>
-              <w:jc w:val="right"/>
-            </w:pPr>
-            <w:r>
-              <w:rPr>
-                <w:rFonts w:ascii="Arial" w:cs="Arial" w:eastAsia="Arial" w:hAnsi="Arial"/>
-                <w:b w:val="false"/>
-                <w:bCs w:val="false"/>
-                <w:i w:val="false"/>
-                <w:iCs w:val="false"/>
-                <w:caps w:val="false"/>
-                <w:color w:val="6B6378"/>
-                <w:sz w:val="20"/>
-                <w:szCs w:val="20"/>
-              </w:rPr>
-              <w:t xml:space="preserve">Znak sprawy: ………………………</w:t>
-            </w:r>
-          </w:p>
-          <w:p>
-            <w:pPr>
-              <w:spacing w:after="0" w:before="0" w:line="276"/>
-              <w:jc w:val="right"/>
-            </w:pPr>
-            <w:r>
-              <w:rPr>
-                <w:rFonts w:ascii="Arial" w:cs="Arial" w:eastAsia="Arial" w:hAnsi="Arial"/>
-                <w:b w:val="false"/>
-                <w:bCs w:val="false"/>
-                <w:i w:val="false"/>
-                <w:iCs w:val="false"/>
-                <w:caps w:val="false"/>
-                <w:color w:val="6B6378"/>
-                <w:sz w:val="20"/>
-                <w:szCs w:val="20"/>
-              </w:rPr>
-              <w:t xml:space="preserve">Zespół orzekający: [Nazwa Poradni Psychologiczno-Pedagogicznej]</w:t>
-            </w:r>
-          </w:p>
-        </w:tc>
-      </w:tr>
-    </w:tbl>
-    <w:p>
-      <w:pPr>
-        <w:spacing w:after="160" w:before="0"/>
+        <w:spacing w:after="360" w:before="0"/>
       </w:pPr>
     </w:p>
     <w:p>
       <w:pPr>
         <w:keepNext/>
         <w:pBdr>
-          <w:bottom w:val="single" w:color="D9D0F0" w:sz="20" w:space="4"/>
+          <w:bottom w:val="single" w:color="D9D0F0" w:sz="24" w:space="4"/>
         </w:pBdr>
         <w:spacing w:after="100" w:before="180"/>
       </w:pPr>
@@ -2831,8 +2435,8 @@
           <w:iCs w:val="false"/>
           <w:caps w:val="false"/>
           <w:color w:val="6B6378"/>
-          <w:sz w:val="20"/>
-          <w:szCs w:val="20"/>
+          <w:sz w:val="24"/>
+          <w:szCs w:val="24"/>
         </w:rPr>
         <w:t xml:space="preserve"/>
       </w:r>
@@ -2892,8 +2496,8 @@
                 <w:caps/>
                 <w:color w:val="2D1B69"/>
                 <w:spacing w:val="10"/>
-                <w:sz w:val="20"/>
-                <w:szCs w:val="20"/>
+                <w:sz w:val="24"/>
+                <w:szCs w:val="24"/>
               </w:rPr>
               <w:t xml:space="preserve">Obszar (ICF)</w:t>
             </w:r>
@@ -2932,8 +2536,8 @@
                 <w:caps/>
                 <w:color w:val="2E7D45"/>
                 <w:spacing w:val="10"/>
-                <w:sz w:val="20"/>
-                <w:szCs w:val="20"/>
+                <w:sz w:val="24"/>
+                <w:szCs w:val="24"/>
               </w:rPr>
               <w:t xml:space="preserve">Mocne strony i uzdolnienia</w:t>
             </w:r>
@@ -2972,8 +2576,8 @@
                 <w:caps/>
                 <w:color w:val="BF382A"/>
                 <w:spacing w:val="10"/>
-                <w:sz w:val="20"/>
-                <w:szCs w:val="20"/>
+                <w:sz w:val="24"/>
+                <w:szCs w:val="24"/>
               </w:rPr>
               <w:t xml:space="preserve">Trudności</w:t>
             </w:r>
@@ -3012,8 +2616,8 @@
                 <w:caps/>
                 <w:color w:val="2D1B69"/>
                 <w:spacing w:val="10"/>
-                <w:sz w:val="20"/>
-                <w:szCs w:val="20"/>
+                <w:sz w:val="24"/>
+                <w:szCs w:val="24"/>
               </w:rPr>
               <w:t xml:space="preserve">Poziom potrzeby wsparcia</w:t>
             </w:r>
@@ -3056,8 +2660,8 @@
                 <w:iCs w:val="false"/>
                 <w:caps w:val="false"/>
                 <w:color w:val="2D1B69"/>
-                <w:sz w:val="20"/>
-                <w:szCs w:val="20"/>
+                <w:sz w:val="24"/>
+                <w:szCs w:val="24"/>
               </w:rPr>
               <w:t xml:space="preserve">1 · Uczenie się i stosowanie wiedzy</w:t>
             </w:r>
@@ -3094,8 +2698,8 @@
                 <w:iCs w:val="false"/>
                 <w:caps w:val="false"/>
                 <w:color w:val="1A1530"/>
-                <w:sz w:val="20"/>
-                <w:szCs w:val="20"/>
+                <w:sz w:val="24"/>
+                <w:szCs w:val="24"/>
               </w:rPr>
               <w:t xml:space="preserve">pamięć wzrokowa, schematy graficzne, zainteresowania, zaangażowanie przy zadaniach z obrazem</w:t>
             </w:r>
@@ -3132,8 +2736,8 @@
                 <w:iCs w:val="false"/>
                 <w:caps w:val="false"/>
                 <w:color w:val="1A1530"/>
-                <w:sz w:val="20"/>
-                <w:szCs w:val="20"/>
+                <w:sz w:val="24"/>
+                <w:szCs w:val="24"/>
               </w:rPr>
               <w:t xml:space="preserve">uwaga, instrukcje wieloetapowe, uogólnianie, męczliwość przy pisaniu, potrzeba nadzoru</w:t>
             </w:r>
@@ -3170,8 +2774,8 @@
                 <w:iCs w:val="false"/>
                 <w:caps w:val="false"/>
                 <w:color w:val="2D1B69"/>
-                <w:sz w:val="20"/>
-                <w:szCs w:val="20"/>
+                <w:sz w:val="24"/>
+                <w:szCs w:val="24"/>
               </w:rPr>
               <w:t xml:space="preserve">d1 śr. 2,4 · d8 śr. 2,0 – średni</w:t>
             </w:r>
@@ -3214,8 +2818,8 @@
                 <w:iCs w:val="false"/>
                 <w:caps w:val="false"/>
                 <w:color w:val="2D1B69"/>
-                <w:sz w:val="20"/>
-                <w:szCs w:val="20"/>
+                <w:sz w:val="24"/>
+                <w:szCs w:val="24"/>
               </w:rPr>
               <w:t xml:space="preserve">2 · Ogólne zadania i obowiązki</w:t>
             </w:r>
@@ -3252,8 +2856,8 @@
                 <w:iCs w:val="false"/>
                 <w:caps w:val="false"/>
                 <w:color w:val="1A1530"/>
-                <w:sz w:val="20"/>
-                <w:szCs w:val="20"/>
+                <w:sz w:val="24"/>
+                <w:szCs w:val="24"/>
               </w:rPr>
               <w:t xml:space="preserve">zadania o stałej strukturze, zasady wizualne</w:t>
             </w:r>
@@ -3290,8 +2894,8 @@
                 <w:iCs w:val="false"/>
                 <w:caps w:val="false"/>
                 <w:color w:val="1A1530"/>
-                <w:sz w:val="20"/>
-                <w:szCs w:val="20"/>
+                <w:sz w:val="24"/>
+                <w:szCs w:val="24"/>
               </w:rPr>
               <w:t xml:space="preserve">organizacja pracy, zadania wieloetapowe, stres przy zmianach</w:t>
             </w:r>
@@ -3328,8 +2932,8 @@
                 <w:iCs w:val="false"/>
                 <w:caps w:val="false"/>
                 <w:color w:val="2D1B69"/>
-                <w:sz w:val="20"/>
-                <w:szCs w:val="20"/>
+                <w:sz w:val="24"/>
+                <w:szCs w:val="24"/>
               </w:rPr>
               <w:t xml:space="preserve">d2 śr. 1,8 – wysoki</w:t>
             </w:r>
@@ -3372,8 +2976,8 @@
                 <w:iCs w:val="false"/>
                 <w:caps w:val="false"/>
                 <w:color w:val="2D1B69"/>
-                <w:sz w:val="20"/>
-                <w:szCs w:val="20"/>
+                <w:sz w:val="24"/>
+                <w:szCs w:val="24"/>
               </w:rPr>
               <w:t xml:space="preserve">3 · Porozumiewanie się</w:t>
             </w:r>
@@ -3410,8 +3014,8 @@
                 <w:iCs w:val="false"/>
                 <w:caps w:val="false"/>
                 <w:color w:val="1A1530"/>
-                <w:sz w:val="20"/>
-                <w:szCs w:val="20"/>
+                <w:sz w:val="24"/>
+                <w:szCs w:val="24"/>
               </w:rPr>
               <w:t xml:space="preserve">rozumienie prostych komunikatów z gestem, sygnalizowanie potrzeb</w:t>
             </w:r>
@@ -3448,8 +3052,8 @@
                 <w:iCs w:val="false"/>
                 <w:caps w:val="false"/>
                 <w:color w:val="1A1530"/>
-                <w:sz w:val="20"/>
-                <w:szCs w:val="20"/>
+                <w:sz w:val="24"/>
+                <w:szCs w:val="24"/>
               </w:rPr>
               <w:t xml:space="preserve">dosłowność, echolalie, inicjowanie dialogu, potrzeba AAC</w:t>
             </w:r>
@@ -3486,8 +3090,8 @@
                 <w:iCs w:val="false"/>
                 <w:caps w:val="false"/>
                 <w:color w:val="2D1B69"/>
-                <w:sz w:val="20"/>
-                <w:szCs w:val="20"/>
+                <w:sz w:val="24"/>
+                <w:szCs w:val="24"/>
               </w:rPr>
               <w:t xml:space="preserve">d3 śr. 2,0 – średni</w:t>
             </w:r>
@@ -3530,8 +3134,8 @@
                 <w:iCs w:val="false"/>
                 <w:caps w:val="false"/>
                 <w:color w:val="2D1B69"/>
-                <w:sz w:val="20"/>
-                <w:szCs w:val="20"/>
+                <w:sz w:val="24"/>
+                <w:szCs w:val="24"/>
               </w:rPr>
               <w:t xml:space="preserve">4 · Motoryka, poruszanie się, w tym mobilność i aktywność manualna</w:t>
             </w:r>
@@ -3568,8 +3172,8 @@
                 <w:iCs w:val="false"/>
                 <w:caps w:val="false"/>
                 <w:color w:val="1A1530"/>
-                <w:sz w:val="20"/>
-                <w:szCs w:val="20"/>
+                <w:sz w:val="24"/>
+                <w:szCs w:val="24"/>
               </w:rPr>
               <w:t xml:space="preserve">motoryka duża, zabawy ruchowe</w:t>
             </w:r>
@@ -3606,8 +3210,8 @@
                 <w:iCs w:val="false"/>
                 <w:caps w:val="false"/>
                 <w:color w:val="1A1530"/>
-                <w:sz w:val="20"/>
-                <w:szCs w:val="20"/>
+                <w:sz w:val="24"/>
+                <w:szCs w:val="24"/>
               </w:rPr>
               <w:t xml:space="preserve">motoryka mała, koordynacja, chwyt</w:t>
             </w:r>
@@ -3644,8 +3248,8 @@
                 <w:iCs w:val="false"/>
                 <w:caps w:val="false"/>
                 <w:color w:val="2D1B69"/>
-                <w:sz w:val="20"/>
-                <w:szCs w:val="20"/>
+                <w:sz w:val="24"/>
+                <w:szCs w:val="24"/>
               </w:rPr>
               <w:t xml:space="preserve">d4 śr. 3,2 – niski</w:t>
             </w:r>
@@ -3688,8 +3292,8 @@
                 <w:iCs w:val="false"/>
                 <w:caps w:val="false"/>
                 <w:color w:val="2D1B69"/>
-                <w:sz w:val="20"/>
-                <w:szCs w:val="20"/>
+                <w:sz w:val="24"/>
+                <w:szCs w:val="24"/>
               </w:rPr>
               <w:t xml:space="preserve">5 · Dbanie o siebie, samoobsługa i samodzielność</w:t>
             </w:r>
@@ -3726,8 +3330,8 @@
                 <w:iCs w:val="false"/>
                 <w:caps w:val="false"/>
                 <w:color w:val="1A1530"/>
-                <w:sz w:val="20"/>
-                <w:szCs w:val="20"/>
+                <w:sz w:val="24"/>
+                <w:szCs w:val="24"/>
               </w:rPr>
               <w:t xml:space="preserve">higiena i toaleta, znajomość swoich rzeczy</w:t>
             </w:r>
@@ -3764,8 +3368,8 @@
                 <w:iCs w:val="false"/>
                 <w:caps w:val="false"/>
                 <w:color w:val="1A1530"/>
-                <w:sz w:val="20"/>
-                <w:szCs w:val="20"/>
+                <w:sz w:val="24"/>
+                <w:szCs w:val="24"/>
               </w:rPr>
               <w:t xml:space="preserve">opór sensoryczny przy myciu rąk, wybiórczość pokarmowa, zapięcia</w:t>
             </w:r>
@@ -3802,8 +3406,8 @@
                 <w:iCs w:val="false"/>
                 <w:caps w:val="false"/>
                 <w:color w:val="2D1B69"/>
-                <w:sz w:val="20"/>
-                <w:szCs w:val="20"/>
+                <w:sz w:val="24"/>
+                <w:szCs w:val="24"/>
               </w:rPr>
               <w:t xml:space="preserve">d5 śr. 2,2 – średni</w:t>
             </w:r>
@@ -3846,8 +3450,8 @@
                 <w:iCs w:val="false"/>
                 <w:caps w:val="false"/>
                 <w:color w:val="2D1B69"/>
-                <w:sz w:val="20"/>
-                <w:szCs w:val="20"/>
+                <w:sz w:val="24"/>
+                <w:szCs w:val="24"/>
               </w:rPr>
               <w:t xml:space="preserve">6 · Życie domowe</w:t>
             </w:r>
@@ -3884,8 +3488,8 @@
                 <w:iCs w:val="false"/>
                 <w:caps w:val="false"/>
                 <w:color w:val="1A1530"/>
-                <w:sz w:val="20"/>
-                <w:szCs w:val="20"/>
+                <w:sz w:val="24"/>
+                <w:szCs w:val="24"/>
               </w:rPr>
               <w:t xml:space="preserve">dyżur i sprzątanie po przypomnieniu</w:t>
             </w:r>
@@ -3922,8 +3526,8 @@
                 <w:iCs w:val="false"/>
                 <w:caps w:val="false"/>
                 <w:color w:val="1A1530"/>
-                <w:sz w:val="20"/>
-                <w:szCs w:val="20"/>
+                <w:sz w:val="24"/>
+                <w:szCs w:val="24"/>
               </w:rPr>
               <w:t xml:space="preserve">brak inicjowania, niedoprowadzanie do końca</w:t>
             </w:r>
@@ -3960,8 +3564,8 @@
                 <w:iCs w:val="false"/>
                 <w:caps w:val="false"/>
                 <w:color w:val="2D1B69"/>
-                <w:sz w:val="20"/>
-                <w:szCs w:val="20"/>
+                <w:sz w:val="24"/>
+                <w:szCs w:val="24"/>
               </w:rPr>
               <w:t xml:space="preserve">d6 śr. 2,8 – niski</w:t>
             </w:r>
@@ -4004,8 +3608,8 @@
                 <w:iCs w:val="false"/>
                 <w:caps w:val="false"/>
                 <w:color w:val="2D1B69"/>
-                <w:sz w:val="20"/>
-                <w:szCs w:val="20"/>
+                <w:sz w:val="24"/>
+                <w:szCs w:val="24"/>
               </w:rPr>
               <w:t xml:space="preserve">7 · Wzajemne kontakty i związki międzyludzkie, życie w społeczności szkolnej i lokalnej</w:t>
             </w:r>
@@ -4042,8 +3646,8 @@
                 <w:iCs w:val="false"/>
                 <w:caps w:val="false"/>
                 <w:color w:val="1A1530"/>
-                <w:sz w:val="20"/>
-                <w:szCs w:val="20"/>
+                <w:sz w:val="24"/>
+                <w:szCs w:val="24"/>
               </w:rPr>
               <w:t xml:space="preserve">bliskość grupy, reakcja na stałych dorosłych; udział w wydarzeniach po przygotowaniu</w:t>
             </w:r>
@@ -4080,8 +3684,8 @@
                 <w:iCs w:val="false"/>
                 <w:caps w:val="false"/>
                 <w:color w:val="1A1530"/>
-                <w:sz w:val="20"/>
-                <w:szCs w:val="20"/>
+                <w:sz w:val="24"/>
+                <w:szCs w:val="24"/>
               </w:rPr>
               <w:t xml:space="preserve">odczytywanie emocji i intencji, tolerancja frustracji, konflikty; przeciążenie w apelach i wyjściach – wycofanie lub zachowania trudne</w:t>
             </w:r>
@@ -4118,8 +3722,8 @@
                 <w:iCs w:val="false"/>
                 <w:caps w:val="false"/>
                 <w:color w:val="2D1B69"/>
-                <w:sz w:val="20"/>
-                <w:szCs w:val="20"/>
+                <w:sz w:val="24"/>
+                <w:szCs w:val="24"/>
               </w:rPr>
               <w:t xml:space="preserve">d7 śr. 1,6 · d9 śr. 1,8 – wysoki</w:t>
             </w:r>
@@ -4141,8 +3745,8 @@
           <w:iCs w:val="false"/>
           <w:caps w:val="false"/>
           <w:color w:val="2D1B69"/>
-          <w:sz w:val="20"/>
-          <w:szCs w:val="20"/>
+          <w:sz w:val="24"/>
+          <w:szCs w:val="24"/>
         </w:rPr>
         <w:t xml:space="preserve">Wynik ogólny: 68 / 180 pkt, średnia 2,1 (skala 0–5) – umiarkowana potrzeba wsparcia; trzy domeny na poziomie wysokim (d2, d7, d9).</w:t>
       </w:r>
@@ -4151,7 +3755,7 @@
       <w:pPr>
         <w:keepNext/>
         <w:pBdr>
-          <w:bottom w:val="single" w:color="D9D0F0" w:sz="20" w:space="4"/>
+          <w:bottom w:val="single" w:color="D9D0F0" w:sz="24" w:space="4"/>
         </w:pBdr>
         <w:spacing w:after="100" w:before="180"/>
       </w:pPr>
@@ -4199,8 +3803,8 @@
           <w:iCs w:val="false"/>
           <w:caps w:val="false"/>
           <w:color w:val="E74509"/>
-          <w:sz w:val="20"/>
-          <w:szCs w:val="20"/>
+          <w:sz w:val="24"/>
+          <w:szCs w:val="24"/>
         </w:rPr>
         <w:t xml:space="preserve">•  </w:t>
       </w:r>
@@ -4213,8 +3817,8 @@
           <w:iCs w:val="false"/>
           <w:caps w:val="false"/>
           <w:color w:val="1A1530"/>
-          <w:sz w:val="20"/>
-          <w:szCs w:val="20"/>
+          <w:sz w:val="24"/>
+          <w:szCs w:val="24"/>
         </w:rPr>
         <w:t xml:space="preserve">Program wychowania przedszkolnego / programy nauczania: [nazwa programu, oddział].</w:t>
       </w:r>
@@ -4233,8 +3837,8 @@
           <w:iCs w:val="false"/>
           <w:caps w:val="false"/>
           <w:color w:val="E74509"/>
-          <w:sz w:val="20"/>
-          <w:szCs w:val="20"/>
+          <w:sz w:val="24"/>
+          <w:szCs w:val="24"/>
         </w:rPr>
         <w:t xml:space="preserve">•  </w:t>
       </w:r>
@@ -4247,8 +3851,8 @@
           <w:iCs w:val="false"/>
           <w:caps w:val="false"/>
           <w:color w:val="1A1530"/>
-          <w:sz w:val="20"/>
-          <w:szCs w:val="20"/>
+          <w:sz w:val="24"/>
+          <w:szCs w:val="24"/>
         </w:rPr>
         <w:t xml:space="preserve">Rozumienie poleceń złożonych i samodzielna organizacja pracy – wymaga instrukcji krok po kroku wspartych obrazem; bez dostosowania rezygnuje z zadania.</w:t>
       </w:r>
@@ -4267,8 +3871,8 @@
           <w:iCs w:val="false"/>
           <w:caps w:val="false"/>
           <w:color w:val="E74509"/>
-          <w:sz w:val="20"/>
-          <w:szCs w:val="20"/>
+          <w:sz w:val="24"/>
+          <w:szCs w:val="24"/>
         </w:rPr>
         <w:t xml:space="preserve">•  </w:t>
       </w:r>
@@ -4281,8 +3885,8 @@
           <w:iCs w:val="false"/>
           <w:caps w:val="false"/>
           <w:color w:val="1A1530"/>
-          <w:sz w:val="20"/>
-          <w:szCs w:val="20"/>
+          <w:sz w:val="24"/>
+          <w:szCs w:val="24"/>
         </w:rPr>
         <w:t xml:space="preserve">Utrzymanie uwagi na zadaniu (obecnie do 8 min po dostosowaniu środowiska) i szybka męczliwość przy zadaniach pisemnych i wykonawczych.</w:t>
       </w:r>
@@ -4301,8 +3905,8 @@
           <w:iCs w:val="false"/>
           <w:caps w:val="false"/>
           <w:color w:val="E74509"/>
-          <w:sz w:val="20"/>
-          <w:szCs w:val="20"/>
+          <w:sz w:val="24"/>
+          <w:szCs w:val="24"/>
         </w:rPr>
         <w:t xml:space="preserve">•  </w:t>
       </w:r>
@@ -4315,8 +3919,8 @@
           <w:iCs w:val="false"/>
           <w:caps w:val="false"/>
           <w:color w:val="1A1530"/>
-          <w:sz w:val="20"/>
-          <w:szCs w:val="20"/>
+          <w:sz w:val="24"/>
+          <w:szCs w:val="24"/>
         </w:rPr>
         <w:t xml:space="preserve">Uczestnictwo w zajęciach grupowych, apelach i wyjściach – przeciążenie sensoryczne prowadzi do wycofania lub zachowań trudnych.</w:t>
       </w:r>
@@ -4335,8 +3939,8 @@
           <w:iCs w:val="false"/>
           <w:caps w:val="false"/>
           <w:color w:val="E74509"/>
-          <w:sz w:val="20"/>
-          <w:szCs w:val="20"/>
+          <w:sz w:val="24"/>
+          <w:szCs w:val="24"/>
         </w:rPr>
         <w:t xml:space="preserve">•  </w:t>
       </w:r>
@@ -4349,8 +3953,8 @@
           <w:iCs w:val="false"/>
           <w:caps w:val="false"/>
           <w:color w:val="1A1530"/>
-          <w:sz w:val="20"/>
-          <w:szCs w:val="20"/>
+          <w:sz w:val="24"/>
+          <w:szCs w:val="24"/>
         </w:rPr>
         <w:t xml:space="preserve">Komunikacja z rówieśnikami i nauczycielem w sytuacjach swobodnych – potrzeba wsparcia AAC i skryptów dialogowych.</w:t>
       </w:r>
@@ -4369,8 +3973,8 @@
           <w:iCs w:val="false"/>
           <w:caps w:val="false"/>
           <w:color w:val="E74509"/>
-          <w:sz w:val="20"/>
-          <w:szCs w:val="20"/>
+          <w:sz w:val="24"/>
+          <w:szCs w:val="24"/>
         </w:rPr>
         <w:t xml:space="preserve">•  </w:t>
       </w:r>
@@ -4383,8 +3987,8 @@
           <w:iCs w:val="false"/>
           <w:caps w:val="false"/>
           <w:color w:val="1A1530"/>
-          <w:sz w:val="20"/>
-          <w:szCs w:val="20"/>
+          <w:sz w:val="24"/>
+          <w:szCs w:val="24"/>
         </w:rPr>
         <w:t xml:space="preserve">Grafomotoryka, czynności manualne (chwyt, wycinanie) oraz samoobsługa przy posiłkach i toalecie – realizowane w wydłużonym czasie z dostosowanymi przyborami.</w:t>
       </w:r>
@@ -4403,8 +4007,8 @@
           <w:iCs w:val="false"/>
           <w:caps w:val="false"/>
           <w:color w:val="E74509"/>
-          <w:sz w:val="20"/>
-          <w:szCs w:val="20"/>
+          <w:sz w:val="24"/>
+          <w:szCs w:val="24"/>
         </w:rPr>
         <w:t xml:space="preserve">•  </w:t>
       </w:r>
@@ -4417,220 +4021,22 @@
           <w:iCs w:val="false"/>
           <w:caps w:val="false"/>
           <w:color w:val="1A1530"/>
-          <w:sz w:val="20"/>
-          <w:szCs w:val="20"/>
+          <w:sz w:val="24"/>
+          <w:szCs w:val="24"/>
         </w:rPr>
         <w:t xml:space="preserve">Wprowadzone dostosowania w toku realizacji programu: plany aktywności, instrukcje jednoetapowe, wydłużony czas, przerwy sensoryczne, ocena postępu względem samego siebie.</w:t>
       </w:r>
     </w:p>
     <w:p>
       <w:pPr>
-        <w:pageBreakBefore/>
-        <w:spacing w:after="0" w:before="0" w:line="20" w:lineRule="exact"/>
-      </w:pPr>
-      <w:r>
-        <w:rPr>
-          <w:rFonts w:ascii="Arial" w:cs="Arial" w:eastAsia="Arial" w:hAnsi="Arial"/>
-          <w:b w:val="false"/>
-          <w:bCs w:val="false"/>
-          <w:i w:val="false"/>
-          <w:iCs w:val="false"/>
-          <w:caps w:val="false"/>
-          <w:color w:val="1A1530"/>
-          <w:sz w:val="20"/>
-          <w:szCs w:val="20"/>
-        </w:rPr>
-        <w:t xml:space="preserve"/>
-      </w:r>
-    </w:p>
-    <w:tbl>
-      <w:tblPr>
-        <w:tblW w:type="dxa" w:w="10206"/>
-        <w:tblBorders>
-          <w:top w:val="single" w:color="auto" w:sz="4"/>
-          <w:left w:val="single" w:color="auto" w:sz="4"/>
-          <w:bottom w:val="single" w:color="auto" w:sz="4"/>
-          <w:right w:val="single" w:color="auto" w:sz="4"/>
-          <w:insideH w:val="single" w:color="auto" w:sz="4"/>
-          <w:insideV w:val="single" w:color="auto" w:sz="4"/>
-        </w:tblBorders>
-      </w:tblPr>
-      <w:tblGrid>
-        <w:gridCol w:w="5103"/>
-        <w:gridCol w:w="5103"/>
-      </w:tblGrid>
-      <w:tr>
-        <w:trPr>
-          <w:cantSplit/>
-        </w:trPr>
-        <w:tc>
-          <w:tcPr>
-            <w:tcW w:type="dxa" w:w="5103"/>
-            <w:tcBorders>
-              <w:top w:val="dashed" w:color="D9D0F0" w:sz="20"/>
-              <w:left w:val="dashed" w:color="D9D0F0" w:sz="20"/>
-              <w:bottom w:val="dashed" w:color="D9D0F0" w:sz="20"/>
-              <w:right w:val="dashed" w:color="D9D0F0" w:sz="20"/>
-            </w:tcBorders>
-            <w:tcMar>
-              <w:top w:type="dxa" w:w="120"/>
-              <w:left w:type="dxa" w:w="180"/>
-              <w:bottom w:type="dxa" w:w="120"/>
-              <w:right w:type="dxa" w:w="180"/>
-            </w:tcMar>
-            <w:vAlign w:val="top"/>
-          </w:tcPr>
-          <w:p>
-            <w:pPr>
-              <w:spacing w:after="20" w:before="0" w:line="276"/>
-              <w:jc w:val="left"/>
-            </w:pPr>
-            <w:r>
-              <w:rPr>
-                <w:rFonts w:ascii="Arial" w:cs="Arial" w:eastAsia="Arial" w:hAnsi="Arial"/>
-                <w:b/>
-                <w:bCs/>
-                <w:i w:val="false"/>
-                <w:iCs w:val="false"/>
-                <w:caps w:val="false"/>
-                <w:color w:val="2D1B69"/>
-                <w:sz w:val="24"/>
-                <w:szCs w:val="24"/>
-              </w:rPr>
-              <w:t xml:space="preserve">[Nazwa przedszkola / szkoły]</w:t>
-            </w:r>
-          </w:p>
-          <w:p>
-            <w:pPr>
-              <w:spacing w:after="20" w:before="0" w:line="276"/>
-              <w:jc w:val="left"/>
-            </w:pPr>
-            <w:r>
-              <w:rPr>
-                <w:rFonts w:ascii="Arial" w:cs="Arial" w:eastAsia="Arial" w:hAnsi="Arial"/>
-                <w:b w:val="false"/>
-                <w:bCs w:val="false"/>
-                <w:i w:val="false"/>
-                <w:iCs w:val="false"/>
-                <w:caps w:val="false"/>
-                <w:color w:val="6B6378"/>
-                <w:sz w:val="20"/>
-                <w:szCs w:val="20"/>
-              </w:rPr>
-              <w:t xml:space="preserve">[Adres placówki, tel., e-mail]</w:t>
-            </w:r>
-          </w:p>
-          <w:p>
-            <w:pPr>
-              <w:spacing w:after="0" w:before="0" w:line="276"/>
-              <w:jc w:val="left"/>
-            </w:pPr>
-            <w:r>
-              <w:rPr>
-                <w:rFonts w:ascii="Arial" w:cs="Arial" w:eastAsia="Arial" w:hAnsi="Arial"/>
-                <w:b w:val="false"/>
-                <w:bCs w:val="false"/>
-                <w:i w:val="false"/>
-                <w:iCs w:val="false"/>
-                <w:caps w:val="false"/>
-                <w:color w:val="6B6378"/>
-                <w:sz w:val="20"/>
-                <w:szCs w:val="20"/>
-              </w:rPr>
-              <w:t xml:space="preserve">(pieczęć placówki)</w:t>
-            </w:r>
-          </w:p>
-        </w:tc>
-        <w:tc>
-          <w:tcPr>
-            <w:tcW w:type="dxa" w:w="5103"/>
-            <w:tcBorders>
-              <w:top w:val="nil"/>
-              <w:left w:val="nil"/>
-              <w:bottom w:val="nil"/>
-              <w:right w:val="nil"/>
-            </w:tcBorders>
-            <w:tcMar>
-              <w:top w:type="dxa" w:w="60"/>
-              <w:left w:type="dxa" w:w="200"/>
-              <w:bottom w:type="dxa" w:w="60"/>
-              <w:right w:type="dxa" w:w="0"/>
-            </w:tcMar>
-            <w:vAlign w:val="top"/>
-          </w:tcPr>
-          <w:p>
-            <w:pPr>
-              <w:spacing w:after="40" w:before="0" w:line="276"/>
-              <w:jc w:val="right"/>
-            </w:pPr>
-            <w:r>
-              <w:rPr>
-                <w:rFonts w:ascii="Arial" w:cs="Arial" w:eastAsia="Arial" w:hAnsi="Arial"/>
-                <w:b w:val="false"/>
-                <w:bCs w:val="false"/>
-                <w:i w:val="false"/>
-                <w:iCs w:val="false"/>
-                <w:caps w:val="false"/>
-                <w:color w:val="6B6378"/>
-                <w:sz w:val="20"/>
-                <w:szCs w:val="20"/>
-              </w:rPr>
-              <w:t xml:space="preserve">[Miejscowość], dnia ………………………</w:t>
-            </w:r>
-          </w:p>
-          <w:p>
-            <w:pPr>
-              <w:spacing w:after="40" w:before="0" w:line="276"/>
-              <w:jc w:val="right"/>
-            </w:pPr>
-            <w:r>
-              <w:rPr>
-                <w:rFonts w:ascii="Arial" w:cs="Arial" w:eastAsia="Arial" w:hAnsi="Arial"/>
-                <w:b w:val="false"/>
-                <w:bCs w:val="false"/>
-                <w:i w:val="false"/>
-                <w:iCs w:val="false"/>
-                <w:caps w:val="false"/>
-                <w:color w:val="6B6378"/>
-                <w:sz w:val="20"/>
-                <w:szCs w:val="20"/>
-              </w:rPr>
-              <w:t xml:space="preserve">Znak sprawy: ………………………</w:t>
-            </w:r>
-          </w:p>
-          <w:p>
-            <w:pPr>
-              <w:spacing w:after="0" w:before="0" w:line="276"/>
-              <w:jc w:val="right"/>
-            </w:pPr>
-            <w:r>
-              <w:rPr>
-                <w:rFonts w:ascii="Arial" w:cs="Arial" w:eastAsia="Arial" w:hAnsi="Arial"/>
-                <w:b w:val="false"/>
-                <w:bCs w:val="false"/>
-                <w:i w:val="false"/>
-                <w:iCs w:val="false"/>
-                <w:caps w:val="false"/>
-                <w:color w:val="6B6378"/>
-                <w:sz w:val="20"/>
-                <w:szCs w:val="20"/>
-              </w:rPr>
-              <w:t xml:space="preserve">Zespół orzekający: [Nazwa Poradni Psychologiczno-Pedagogicznej]</w:t>
-            </w:r>
-          </w:p>
-        </w:tc>
-      </w:tr>
-    </w:tbl>
-    <w:p>
-      <w:pPr>
-        <w:spacing w:after="160" w:before="0"/>
+        <w:spacing w:after="360" w:before="0"/>
       </w:pPr>
     </w:p>
     <w:p>
       <w:pPr>
         <w:keepNext/>
         <w:pBdr>
-          <w:bottom w:val="single" w:color="D9D0F0" w:sz="20" w:space="4"/>
+          <w:bottom w:val="single" w:color="D9D0F0" w:sz="24" w:space="4"/>
         </w:pBdr>
         <w:spacing w:after="100" w:before="180"/>
       </w:pPr>
@@ -4692,8 +4098,8 @@
           <w:iCs w:val="false"/>
           <w:caps w:val="false"/>
           <w:color w:val="1A1530"/>
-          <w:sz w:val="20"/>
-          <w:szCs w:val="20"/>
+          <w:sz w:val="24"/>
+          <w:szCs w:val="24"/>
         </w:rPr>
         <w:t xml:space="preserve">Aktualna wielospecjalistyczna ocena poziomu funkcjonowania dziecka / ucznia (WOPF) – dziecko / uczeń objęty kształceniem specjalnym (pkt 4)</w:t>
       </w:r>
@@ -4726,8 +4132,8 @@
           <w:iCs w:val="false"/>
           <w:caps w:val="false"/>
           <w:color w:val="1A1530"/>
-          <w:sz w:val="20"/>
-          <w:szCs w:val="20"/>
+          <w:sz w:val="24"/>
+          <w:szCs w:val="24"/>
         </w:rPr>
         <w:t xml:space="preserve">Aktualna okresowa ocena funkcjonowania – dziecko / uczeń objęty zajęciami rewalidacyjno-wychowawczymi (pkt 5)</w:t>
       </w:r>
@@ -4760,8 +4166,8 @@
           <w:iCs w:val="false"/>
           <w:caps w:val="false"/>
           <w:color w:val="1A1530"/>
-          <w:sz w:val="20"/>
-          <w:szCs w:val="20"/>
+          <w:sz w:val="24"/>
+          <w:szCs w:val="24"/>
         </w:rPr>
         <w:t xml:space="preserve">Nie dotyczy – dziecko / uczeń nieobjęty kształceniem specjalnym ani zajęciami rewalidacyjno-wychowawczymi</w:t>
       </w:r>
@@ -4770,7 +4176,7 @@
       <w:pPr>
         <w:keepNext/>
         <w:pBdr>
-          <w:bottom w:val="single" w:color="D9D0F0" w:sz="20" w:space="4"/>
+          <w:bottom w:val="single" w:color="D9D0F0" w:sz="24" w:space="4"/>
         </w:pBdr>
         <w:spacing w:after="100" w:before="180"/>
       </w:pPr>
@@ -4859,8 +4265,8 @@
                 <w:caps/>
                 <w:color w:val="2D1B69"/>
                 <w:spacing w:val="10"/>
-                <w:sz w:val="20"/>
-                <w:szCs w:val="20"/>
+                <w:sz w:val="24"/>
+                <w:szCs w:val="24"/>
               </w:rPr>
               <w:t xml:space="preserve">Działanie / forma pomocy</w:t>
             </w:r>
@@ -4899,8 +4305,8 @@
                 <w:caps/>
                 <w:color w:val="2D1B69"/>
                 <w:spacing w:val="10"/>
-                <w:sz w:val="20"/>
-                <w:szCs w:val="20"/>
+                <w:sz w:val="24"/>
+                <w:szCs w:val="24"/>
               </w:rPr>
               <w:t xml:space="preserve">Zakres i wymiar</w:t>
             </w:r>
@@ -4939,8 +4345,8 @@
                 <w:caps/>
                 <w:color w:val="2D1B69"/>
                 <w:spacing w:val="10"/>
-                <w:sz w:val="20"/>
-                <w:szCs w:val="20"/>
+                <w:sz w:val="24"/>
+                <w:szCs w:val="24"/>
               </w:rPr>
               <w:t xml:space="preserve">Okres udzielania</w:t>
             </w:r>
@@ -4979,8 +4385,8 @@
                 <w:caps/>
                 <w:color w:val="2D1B69"/>
                 <w:spacing w:val="10"/>
-                <w:sz w:val="20"/>
-                <w:szCs w:val="20"/>
+                <w:sz w:val="24"/>
+                <w:szCs w:val="24"/>
               </w:rPr>
               <w:t xml:space="preserve">Efekty</w:t>
             </w:r>
@@ -5023,8 +4429,8 @@
                 <w:iCs w:val="false"/>
                 <w:caps w:val="false"/>
                 <w:color w:val="2D1B69"/>
-                <w:sz w:val="20"/>
-                <w:szCs w:val="20"/>
+                <w:sz w:val="24"/>
+                <w:szCs w:val="24"/>
               </w:rPr>
               <w:t xml:space="preserve">Dostosowania środowiskowe i dydaktyczne</w:t>
             </w:r>
@@ -5061,8 +4467,8 @@
                 <w:iCs w:val="false"/>
                 <w:caps w:val="false"/>
                 <w:color w:val="1A1530"/>
-                <w:sz w:val="20"/>
-                <w:szCs w:val="20"/>
+                <w:sz w:val="24"/>
+                <w:szCs w:val="24"/>
               </w:rPr>
               <w:t xml:space="preserve">strefa wyciszenia, redukcja bodźców, słuchawki wygłuszające, wizualny plan dnia, instrukcje krok po kroku</w:t>
             </w:r>
@@ -5099,8 +4505,8 @@
                 <w:iCs w:val="false"/>
                 <w:caps w:val="false"/>
                 <w:color w:val="1A1530"/>
-                <w:sz w:val="20"/>
-                <w:szCs w:val="20"/>
+                <w:sz w:val="24"/>
+                <w:szCs w:val="24"/>
               </w:rPr>
               <w:t xml:space="preserve">od IX 2025 · codziennie · nadal</w:t>
             </w:r>
@@ -5137,8 +4543,8 @@
                 <w:iCs w:val="false"/>
                 <w:caps w:val="false"/>
                 <w:color w:val="1A1530"/>
-                <w:sz w:val="20"/>
-                <w:szCs w:val="20"/>
+                <w:sz w:val="24"/>
+                <w:szCs w:val="24"/>
               </w:rPr>
               <w:t xml:space="preserve">spadek epizodów zachowań trudnych o ok. 40%; wydłużenie skupienia z 3 do 8 min</w:t>
             </w:r>
@@ -5181,8 +4587,8 @@
                 <w:iCs w:val="false"/>
                 <w:caps w:val="false"/>
                 <w:color w:val="2D1B69"/>
-                <w:sz w:val="20"/>
-                <w:szCs w:val="20"/>
+                <w:sz w:val="24"/>
+                <w:szCs w:val="24"/>
               </w:rPr>
               <w:t xml:space="preserve">Pomoc psychologiczno-pedagogiczna</w:t>
             </w:r>
@@ -5219,8 +4625,8 @@
                 <w:iCs w:val="false"/>
                 <w:caps w:val="false"/>
                 <w:color w:val="1A1530"/>
-                <w:sz w:val="20"/>
-                <w:szCs w:val="20"/>
+                <w:sz w:val="24"/>
+                <w:szCs w:val="24"/>
               </w:rPr>
               <w:t xml:space="preserve">zajęcia rozwijające kompetencje emocjonalno-społeczne 1 × 45 min; logopedyczne 1 × 45 min; korekcyjno-kompensacyjne 1 × 45 min; integracja sensoryczna 1 × 45 min; porady i konsultacje dla rodziców 1 × 30 min tygodniowo</w:t>
             </w:r>
@@ -5257,8 +4663,8 @@
                 <w:iCs w:val="false"/>
                 <w:caps w:val="false"/>
                 <w:color w:val="1A1530"/>
-                <w:sz w:val="20"/>
-                <w:szCs w:val="20"/>
+                <w:sz w:val="24"/>
+                <w:szCs w:val="24"/>
               </w:rPr>
               <w:t xml:space="preserve">od X 2025 · 10 miesięcy · nadal</w:t>
             </w:r>
@@ -5295,8 +4701,8 @@
                 <w:iCs w:val="false"/>
                 <w:caps w:val="false"/>
                 <w:color w:val="1A1530"/>
-                <w:sz w:val="20"/>
-                <w:szCs w:val="20"/>
+                <w:sz w:val="24"/>
+                <w:szCs w:val="24"/>
               </w:rPr>
               <w:t xml:space="preserve">lepsze tolerowanie obecności dzieci w zajęciach kierowanych; pierwsze prośby o przerwę gestem / piktogramem</w:t>
             </w:r>
@@ -5339,8 +4745,8 @@
                 <w:iCs w:val="false"/>
                 <w:caps w:val="false"/>
                 <w:color w:val="2D1B69"/>
-                <w:sz w:val="20"/>
-                <w:szCs w:val="20"/>
+                <w:sz w:val="24"/>
+                <w:szCs w:val="24"/>
               </w:rPr>
               <w:t xml:space="preserve">Zajęcia rewalidacyjne (dziecko z orzeczeniem)</w:t>
             </w:r>
@@ -5377,8 +4783,8 @@
                 <w:iCs w:val="false"/>
                 <w:caps w:val="false"/>
                 <w:color w:val="1A1530"/>
-                <w:sz w:val="20"/>
-                <w:szCs w:val="20"/>
+                <w:sz w:val="24"/>
+                <w:szCs w:val="24"/>
               </w:rPr>
               <w:t xml:space="preserve">2 godz. tygodniowo: komunikacja i AAC, umiejętności społeczne i ToM, motoryka mała</w:t>
             </w:r>
@@ -5415,8 +4821,8 @@
                 <w:iCs w:val="false"/>
                 <w:caps w:val="false"/>
                 <w:color w:val="1A1530"/>
-                <w:sz w:val="20"/>
-                <w:szCs w:val="20"/>
+                <w:sz w:val="24"/>
+                <w:szCs w:val="24"/>
               </w:rPr>
               <w:t xml:space="preserve">od IX 2025 · 1 rok szkolny</w:t>
             </w:r>
@@ -5453,8 +4859,8 @@
                 <w:iCs w:val="false"/>
                 <w:caps w:val="false"/>
                 <w:color w:val="1A1530"/>
-                <w:sz w:val="20"/>
-                <w:szCs w:val="20"/>
+                <w:sz w:val="24"/>
+                <w:szCs w:val="24"/>
               </w:rPr>
               <w:t xml:space="preserve">wzrost liczby komunikatów intencjonalnych; poprawa chwytu</w:t>
             </w:r>
@@ -5497,8 +4903,8 @@
                 <w:iCs w:val="false"/>
                 <w:caps w:val="false"/>
                 <w:color w:val="2D1B69"/>
-                <w:sz w:val="20"/>
-                <w:szCs w:val="20"/>
+                <w:sz w:val="24"/>
+                <w:szCs w:val="24"/>
               </w:rPr>
               <w:t xml:space="preserve">Wczesne wspomaganie rozwoju (WWRD)</w:t>
             </w:r>
@@ -5535,8 +4941,8 @@
                 <w:iCs w:val="false"/>
                 <w:caps w:val="false"/>
                 <w:color w:val="1A1530"/>
-                <w:sz w:val="20"/>
-                <w:szCs w:val="20"/>
+                <w:sz w:val="24"/>
+                <w:szCs w:val="24"/>
               </w:rPr>
               <w:t xml:space="preserve">☐ nie dotyczy  ☐ realizowane w: [placówka] – zakres: [zakres]</w:t>
             </w:r>
@@ -5573,8 +4979,8 @@
                 <w:iCs w:val="false"/>
                 <w:caps w:val="false"/>
                 <w:color w:val="1A1530"/>
-                <w:sz w:val="20"/>
-                <w:szCs w:val="20"/>
+                <w:sz w:val="24"/>
+                <w:szCs w:val="24"/>
               </w:rPr>
               <w:t xml:space="preserve">[od – do]</w:t>
             </w:r>
@@ -5611,8 +5017,8 @@
                 <w:iCs w:val="false"/>
                 <w:caps w:val="false"/>
                 <w:color w:val="1A1530"/>
-                <w:sz w:val="20"/>
-                <w:szCs w:val="20"/>
+                <w:sz w:val="24"/>
+                <w:szCs w:val="24"/>
               </w:rPr>
               <w:t xml:space="preserve">[efekty]</w:t>
             </w:r>
@@ -5655,8 +5061,8 @@
                 <w:iCs w:val="false"/>
                 <w:caps w:val="false"/>
                 <w:color w:val="2D1B69"/>
-                <w:sz w:val="20"/>
-                <w:szCs w:val="20"/>
+                <w:sz w:val="24"/>
+                <w:szCs w:val="24"/>
               </w:rPr>
               <w:t xml:space="preserve">Współpraca z rodzicami</w:t>
             </w:r>
@@ -5693,8 +5099,8 @@
                 <w:iCs w:val="false"/>
                 <w:caps w:val="false"/>
                 <w:color w:val="1A1530"/>
-                <w:sz w:val="20"/>
-                <w:szCs w:val="20"/>
+                <w:sz w:val="24"/>
+                <w:szCs w:val="24"/>
               </w:rPr>
               <w:t xml:space="preserve">konsultacje cotygodniowe, zeszyt korespondencji, wspólny system komunikatów i wzmocnień, instruktaż AAC w domu</w:t>
             </w:r>
@@ -5731,8 +5137,8 @@
                 <w:iCs w:val="false"/>
                 <w:caps w:val="false"/>
                 <w:color w:val="1A1530"/>
-                <w:sz w:val="20"/>
-                <w:szCs w:val="20"/>
+                <w:sz w:val="24"/>
+                <w:szCs w:val="24"/>
               </w:rPr>
               <w:t xml:space="preserve">od IX 2025 · nadal</w:t>
             </w:r>
@@ -5769,8 +5175,8 @@
                 <w:iCs w:val="false"/>
                 <w:caps w:val="false"/>
                 <w:color w:val="1A1530"/>
-                <w:sz w:val="20"/>
-                <w:szCs w:val="20"/>
+                <w:sz w:val="24"/>
+                <w:szCs w:val="24"/>
               </w:rPr>
               <w:t xml:space="preserve">spójne reakcje dorosłych; wzrost poczucia bezpieczeństwa dziecka</w:t>
             </w:r>
@@ -5782,7 +5188,7 @@
       <w:pPr>
         <w:keepNext/>
         <w:pBdr>
-          <w:bottom w:val="single" w:color="D9D0F0" w:sz="20" w:space="4"/>
+          <w:bottom w:val="single" w:color="D9D0F0" w:sz="24" w:space="4"/>
         </w:pBdr>
         <w:spacing w:after="100" w:before="180"/>
       </w:pPr>
@@ -5830,8 +5236,8 @@
           <w:iCs w:val="false"/>
           <w:caps w:val="false"/>
           <w:color w:val="2E7D45"/>
-          <w:sz w:val="20"/>
-          <w:szCs w:val="20"/>
+          <w:sz w:val="24"/>
+          <w:szCs w:val="24"/>
         </w:rPr>
         <w:t xml:space="preserve">•  </w:t>
       </w:r>
@@ -5844,8 +5250,8 @@
           <w:iCs w:val="false"/>
           <w:caps w:val="false"/>
           <w:color w:val="1A1530"/>
-          <w:sz w:val="20"/>
-          <w:szCs w:val="20"/>
+          <w:sz w:val="24"/>
+          <w:szCs w:val="24"/>
         </w:rPr>
         <w:t xml:space="preserve">Utrzymanie struktury dnia, strefy wyciszenia i przygotowania do wydarzeń grupowych; stopniowe wydłużanie udziału.</w:t>
       </w:r>
@@ -5864,8 +5270,8 @@
           <w:iCs w:val="false"/>
           <w:caps w:val="false"/>
           <w:color w:val="2E7D45"/>
-          <w:sz w:val="20"/>
-          <w:szCs w:val="20"/>
+          <w:sz w:val="24"/>
+          <w:szCs w:val="24"/>
         </w:rPr>
         <w:t xml:space="preserve">•  </w:t>
       </w:r>
@@ -5878,8 +5284,8 @@
           <w:iCs w:val="false"/>
           <w:caps w:val="false"/>
           <w:color w:val="1A1530"/>
-          <w:sz w:val="20"/>
-          <w:szCs w:val="20"/>
+          <w:sz w:val="24"/>
+          <w:szCs w:val="24"/>
         </w:rPr>
         <w:t xml:space="preserve">Rozwijanie komunikacji funkcjonalnej z tablicą AAC w placówce i w domu; trening komunikatu zastępczego zamiast zachowania trudnego.</w:t>
       </w:r>
@@ -5898,8 +5304,8 @@
           <w:iCs w:val="false"/>
           <w:caps w:val="false"/>
           <w:color w:val="2E7D45"/>
-          <w:sz w:val="20"/>
-          <w:szCs w:val="20"/>
+          <w:sz w:val="24"/>
+          <w:szCs w:val="24"/>
         </w:rPr>
         <w:t xml:space="preserve">•  </w:t>
       </w:r>
@@ -5912,8 +5318,8 @@
           <w:iCs w:val="false"/>
           <w:caps w:val="false"/>
           <w:color w:val="1A1530"/>
-          <w:sz w:val="20"/>
-          <w:szCs w:val="20"/>
+          <w:sz w:val="24"/>
+          <w:szCs w:val="24"/>
         </w:rPr>
         <w:t xml:space="preserve">Trening umiejętności społecznych i teorii umysłu w małej grupie z przeniesieniem na zabawy swobodne (rówieśnik-mentor).</w:t>
       </w:r>
@@ -5932,8 +5338,8 @@
           <w:iCs w:val="false"/>
           <w:caps w:val="false"/>
           <w:color w:val="2E7D45"/>
-          <w:sz w:val="20"/>
-          <w:szCs w:val="20"/>
+          <w:sz w:val="24"/>
+          <w:szCs w:val="24"/>
         </w:rPr>
         <w:t xml:space="preserve">•  </w:t>
       </w:r>
@@ -5946,8 +5352,8 @@
           <w:iCs w:val="false"/>
           <w:caps w:val="false"/>
           <w:color w:val="1A1530"/>
-          <w:sz w:val="20"/>
-          <w:szCs w:val="20"/>
+          <w:sz w:val="24"/>
+          <w:szCs w:val="24"/>
         </w:rPr>
         <w:t xml:space="preserve">Usprawnianie motoryki małej i samoobsługi z dostosowanymi przyborami i paskiem wizualnym czynności.</w:t>
       </w:r>
@@ -5966,8 +5372,8 @@
           <w:iCs w:val="false"/>
           <w:caps w:val="false"/>
           <w:color w:val="2E7D45"/>
-          <w:sz w:val="20"/>
-          <w:szCs w:val="20"/>
+          <w:sz w:val="24"/>
+          <w:szCs w:val="24"/>
         </w:rPr>
         <w:t xml:space="preserve">•  </w:t>
       </w:r>
@@ -5980,16 +5386,79 @@
           <w:iCs w:val="false"/>
           <w:caps w:val="false"/>
           <w:color w:val="1A1530"/>
-          <w:sz w:val="20"/>
-          <w:szCs w:val="20"/>
+          <w:sz w:val="24"/>
+          <w:szCs w:val="24"/>
         </w:rPr>
         <w:t xml:space="preserve">Ocena efektów w styczniu i czerwcu; aktualizacja programu wspólnie z rodzicami.</w:t>
       </w:r>
     </w:p>
     <w:p>
       <w:pPr>
-        <w:pageBreakBefore/>
-        <w:spacing w:after="0" w:before="0" w:line="20" w:lineRule="exact"/>
+        <w:spacing w:after="360" w:before="0"/>
+      </w:pPr>
+    </w:p>
+    <w:p>
+      <w:pPr>
+        <w:keepNext/>
+        <w:pBdr>
+          <w:bottom w:val="single" w:color="D9D0F0" w:sz="24" w:space="4"/>
+        </w:pBdr>
+        <w:spacing w:after="100" w:before="180"/>
+      </w:pPr>
+      <w:r>
+        <w:rPr>
+          <w:rFonts w:ascii="Arial" w:cs="Arial" w:eastAsia="Arial" w:hAnsi="Arial"/>
+          <w:b/>
+          <w:bCs/>
+          <w:i w:val="false"/>
+          <w:iCs w:val="false"/>
+          <w:caps w:val="false"/>
+          <w:color w:val="E74509"/>
+          <w:sz w:val="24"/>
+          <w:szCs w:val="24"/>
+        </w:rPr>
+        <w:t xml:space="preserve">8.  </w:t>
+      </w:r>
+      <w:r>
+        <w:rPr>
+          <w:rFonts w:ascii="Arial" w:cs="Arial" w:eastAsia="Arial" w:hAnsi="Arial"/>
+          <w:b/>
+          <w:bCs/>
+          <w:i w:val="false"/>
+          <w:iCs w:val="false"/>
+          <w:caps w:val="false"/>
+          <w:color w:val="2D1B69"/>
+          <w:spacing w:val="8"/>
+          <w:sz w:val="24"/>
+          <w:szCs w:val="24"/>
+        </w:rPr>
+        <w:t xml:space="preserve">INFORMACJE UZUPEŁNIAJĄCE DLA ZESPOŁU ORZEKAJĄCEGO – FAKULTATYWNE, NA POTRZEBY OCENY FUNKCJONOWANIA (§ 8 UST. 2–3)</w:t>
+      </w:r>
+    </w:p>
+    <w:p>
+      <w:pPr>
+        <w:spacing w:after="140" w:before="0" w:line="260"/>
+        <w:jc w:val="both"/>
+      </w:pPr>
+      <w:r>
+        <w:rPr>
+          <w:rFonts w:ascii="Arial" w:cs="Arial" w:eastAsia="Arial" w:hAnsi="Arial"/>
+          <w:b w:val="false"/>
+          <w:bCs w:val="false"/>
+          <w:i w:val="false"/>
+          <w:iCs w:val="false"/>
+          <w:caps w:val="false"/>
+          <w:color w:val="6B6378"/>
+          <w:sz w:val="24"/>
+          <w:szCs w:val="24"/>
+        </w:rPr>
+        <w:t xml:space="preserve">Zespół orzekający dokonuje własnej oceny funkcjonowania (§ 8); poniższe informacje placówka przekazuje dodatkowo, aby ją ułatwić.</w:t>
+      </w:r>
+    </w:p>
+    <w:p>
+      <w:pPr>
+        <w:spacing w:after="100" w:before="0" w:line="240"/>
+        <w:jc w:val="both"/>
       </w:pPr>
       <w:r>
         <w:rPr>
@@ -6000,10 +5469,10 @@
           <w:iCs w:val="false"/>
           <w:caps w:val="false"/>
           <w:color w:val="1A1530"/>
-          <w:sz w:val="20"/>
-          <w:szCs w:val="20"/>
+          <w:sz w:val="24"/>
+          <w:szCs w:val="24"/>
         </w:rPr>
-        <w:t xml:space="preserve"/>
+        <w:t xml:space="preserve">Funkcje i struktury ciała (§ 8 ust. 2 pkt 2): zdrowie psychiczne – lęk przed zmianą, sztywność poznawcza, zaburzenia snu; percepcja – nadwrażliwość słuchowa i dotykowa, poszukiwanie stymulacji przedsionkowej; motoryka – obniżona precyzja motoryki małej, nieprawidłowy chwyt; mowa – echolalie, trudności pragmatyczne, korzysta z gestu i piktogramów; funkcje poznawcze – bardzo dobra pamięć wzrokowa, trudności z uwagą i uogólnianiem; funkcje emocjonalno-społeczne – teoria umysłu poniżej normy wiekowej, zachowania trudne o funkcji ucieczkowej; cechy indywidualne – głębokie zainteresowania, pozytywna reakcja na strukturę i stałych dorosłych.</w:t>
       </w:r>
     </w:p>
     <w:tbl>
@@ -6030,22 +5499,23 @@
           <w:tcPr>
             <w:tcW w:type="dxa" w:w="5103"/>
             <w:tcBorders>
-              <w:top w:val="dashed" w:color="D9D0F0" w:sz="20"/>
-              <w:left w:val="dashed" w:color="D9D0F0" w:sz="20"/>
-              <w:bottom w:val="dashed" w:color="D9D0F0" w:sz="20"/>
-              <w:right w:val="dashed" w:color="D9D0F0" w:sz="20"/>
-            </w:tcBorders>
-            <w:tcMar>
-              <w:top w:type="dxa" w:w="120"/>
-              <w:left w:type="dxa" w:w="180"/>
-              <w:bottom w:type="dxa" w:w="120"/>
-              <w:right w:type="dxa" w:w="180"/>
-            </w:tcMar>
-            <w:vAlign w:val="top"/>
-          </w:tcPr>
-          <w:p>
-            <w:pPr>
-              <w:spacing w:after="20" w:before="0" w:line="276"/>
+              <w:top w:val="single" w:color="D9D0F0" w:sz="4"/>
+              <w:left w:val="single" w:color="D9D0F0" w:sz="4"/>
+              <w:bottom w:val="single" w:color="D9D0F0" w:sz="4"/>
+              <w:right w:val="single" w:color="D9D0F0" w:sz="4"/>
+            </w:tcBorders>
+            <w:shd w:fill="EFE9F9" w:color="auto" w:val="clear"/>
+            <w:tcMar>
+              <w:top w:type="dxa" w:w="100"/>
+              <w:left w:type="dxa" w:w="140"/>
+              <w:bottom w:type="dxa" w:w="100"/>
+              <w:right w:type="dxa" w:w="120"/>
+            </w:tcMar>
+            <w:vAlign w:val="top"/>
+          </w:tcPr>
+          <w:p>
+            <w:pPr>
+              <w:spacing w:after="0" w:before="0" w:line="276"/>
               <w:jc w:val="left"/>
             </w:pPr>
             <w:r>
@@ -6055,34 +5525,34 @@
                 <w:bCs/>
                 <w:i w:val="false"/>
                 <w:iCs w:val="false"/>
-                <w:caps w:val="false"/>
-                <w:color w:val="2D1B69"/>
-                <w:sz w:val="24"/>
-                <w:szCs w:val="24"/>
-              </w:rPr>
-              <w:t xml:space="preserve">[Nazwa przedszkola / szkoły]</w:t>
-            </w:r>
-          </w:p>
-          <w:p>
-            <w:pPr>
-              <w:spacing w:after="20" w:before="0" w:line="276"/>
-              <w:jc w:val="left"/>
-            </w:pPr>
-            <w:r>
-              <w:rPr>
-                <w:rFonts w:ascii="Arial" w:cs="Arial" w:eastAsia="Arial" w:hAnsi="Arial"/>
-                <w:b w:val="false"/>
-                <w:bCs w:val="false"/>
-                <w:i w:val="false"/>
-                <w:iCs w:val="false"/>
-                <w:caps w:val="false"/>
-                <w:color w:val="6B6378"/>
-                <w:sz w:val="20"/>
-                <w:szCs w:val="20"/>
-              </w:rPr>
-              <w:t xml:space="preserve">[Adres placówki, tel., e-mail]</w:t>
-            </w:r>
-          </w:p>
+                <w:caps/>
+                <w:color w:val="2E7D45"/>
+                <w:spacing w:val="10"/>
+                <w:sz w:val="24"/>
+                <w:szCs w:val="24"/>
+              </w:rPr>
+              <w:t xml:space="preserve">Ułatwienia w środowisku placówki (co pomaga)</w:t>
+            </w:r>
+          </w:p>
+        </w:tc>
+        <w:tc>
+          <w:tcPr>
+            <w:tcW w:type="dxa" w:w="5103"/>
+            <w:tcBorders>
+              <w:top w:val="single" w:color="D9D0F0" w:sz="4"/>
+              <w:left w:val="single" w:color="D9D0F0" w:sz="4"/>
+              <w:bottom w:val="single" w:color="D9D0F0" w:sz="4"/>
+              <w:right w:val="single" w:color="D9D0F0" w:sz="4"/>
+            </w:tcBorders>
+            <w:shd w:fill="EFE9F9" w:color="auto" w:val="clear"/>
+            <w:tcMar>
+              <w:top w:type="dxa" w:w="100"/>
+              <w:left w:type="dxa" w:w="140"/>
+              <w:bottom w:type="dxa" w:w="100"/>
+              <w:right w:type="dxa" w:w="120"/>
+            </w:tcMar>
+            <w:vAlign w:val="top"/>
+          </w:tcPr>
           <w:p>
             <w:pPr>
               <w:spacing w:after="0" w:before="0" w:line="276"/>
@@ -6091,94 +5561,398 @@
             <w:r>
               <w:rPr>
                 <w:rFonts w:ascii="Arial" w:cs="Arial" w:eastAsia="Arial" w:hAnsi="Arial"/>
-                <w:b w:val="false"/>
-                <w:bCs w:val="false"/>
-                <w:i w:val="false"/>
-                <w:iCs w:val="false"/>
-                <w:caps w:val="false"/>
-                <w:color w:val="6B6378"/>
-                <w:sz w:val="20"/>
-                <w:szCs w:val="20"/>
-              </w:rPr>
-              <w:t xml:space="preserve">(pieczęć placówki)</w:t>
-            </w:r>
-          </w:p>
-        </w:tc>
+                <w:b/>
+                <w:bCs/>
+                <w:i w:val="false"/>
+                <w:iCs w:val="false"/>
+                <w:caps/>
+                <w:color w:val="BF382A"/>
+                <w:spacing w:val="10"/>
+                <w:sz w:val="24"/>
+                <w:szCs w:val="24"/>
+              </w:rPr>
+              <w:t xml:space="preserve">Bariery (co utrudnia)</w:t>
+            </w:r>
+          </w:p>
+        </w:tc>
+      </w:tr>
+      <w:tr>
+        <w:trPr>
+          <w:cantSplit/>
+        </w:trPr>
         <w:tc>
           <w:tcPr>
             <w:tcW w:type="dxa" w:w="5103"/>
             <w:tcBorders>
-              <w:top w:val="nil"/>
-              <w:left w:val="nil"/>
-              <w:bottom w:val="nil"/>
-              <w:right w:val="nil"/>
+              <w:top w:val="single" w:color="E3E1EC" w:sz="4"/>
+              <w:left w:val="single" w:color="E3E1EC" w:sz="4"/>
+              <w:bottom w:val="single" w:color="E3E1EC" w:sz="4"/>
+              <w:right w:val="single" w:color="E3E1EC" w:sz="4"/>
             </w:tcBorders>
             <w:tcMar>
               <w:top w:type="dxa" w:w="60"/>
-              <w:left w:type="dxa" w:w="200"/>
+              <w:left w:type="dxa" w:w="140"/>
               <w:bottom w:type="dxa" w:w="60"/>
-              <w:right w:type="dxa" w:w="0"/>
-            </w:tcMar>
-            <w:vAlign w:val="top"/>
-          </w:tcPr>
-          <w:p>
-            <w:pPr>
-              <w:spacing w:after="40" w:before="0" w:line="276"/>
-              <w:jc w:val="right"/>
-            </w:pPr>
-            <w:r>
-              <w:rPr>
-                <w:rFonts w:ascii="Arial" w:cs="Arial" w:eastAsia="Arial" w:hAnsi="Arial"/>
-                <w:b w:val="false"/>
-                <w:bCs w:val="false"/>
-                <w:i w:val="false"/>
-                <w:iCs w:val="false"/>
-                <w:caps w:val="false"/>
-                <w:color w:val="6B6378"/>
-                <w:sz w:val="20"/>
-                <w:szCs w:val="20"/>
-              </w:rPr>
-              <w:t xml:space="preserve">[Miejscowość], dnia ………………………</w:t>
-            </w:r>
-          </w:p>
-          <w:p>
-            <w:pPr>
-              <w:spacing w:after="40" w:before="0" w:line="276"/>
-              <w:jc w:val="right"/>
-            </w:pPr>
-            <w:r>
-              <w:rPr>
-                <w:rFonts w:ascii="Arial" w:cs="Arial" w:eastAsia="Arial" w:hAnsi="Arial"/>
-                <w:b w:val="false"/>
-                <w:bCs w:val="false"/>
-                <w:i w:val="false"/>
-                <w:iCs w:val="false"/>
-                <w:caps w:val="false"/>
-                <w:color w:val="6B6378"/>
-                <w:sz w:val="20"/>
-                <w:szCs w:val="20"/>
-              </w:rPr>
-              <w:t xml:space="preserve">Znak sprawy: ………………………</w:t>
-            </w:r>
-          </w:p>
-          <w:p>
-            <w:pPr>
-              <w:spacing w:after="0" w:before="0" w:line="276"/>
-              <w:jc w:val="right"/>
-            </w:pPr>
-            <w:r>
-              <w:rPr>
-                <w:rFonts w:ascii="Arial" w:cs="Arial" w:eastAsia="Arial" w:hAnsi="Arial"/>
-                <w:b w:val="false"/>
-                <w:bCs w:val="false"/>
-                <w:i w:val="false"/>
-                <w:iCs w:val="false"/>
-                <w:caps w:val="false"/>
-                <w:color w:val="6B6378"/>
-                <w:sz w:val="20"/>
-                <w:szCs w:val="20"/>
-              </w:rPr>
-              <w:t xml:space="preserve">Zespół orzekający: [Nazwa Poradni Psychologiczno-Pedagogicznej]</w:t>
+              <w:right w:type="dxa" w:w="120"/>
+            </w:tcMar>
+            <w:vAlign w:val="top"/>
+          </w:tcPr>
+          <w:p>
+            <w:pPr>
+              <w:spacing w:after="40" w:before="0" w:line="245"/>
+              <w:ind w:left="220" w:hanging="220"/>
+            </w:pPr>
+            <w:r>
+              <w:rPr>
+                <w:rFonts w:ascii="Arial" w:cs="Arial" w:eastAsia="Arial" w:hAnsi="Arial"/>
+                <w:b/>
+                <w:bCs/>
+                <w:i w:val="false"/>
+                <w:iCs w:val="false"/>
+                <w:caps w:val="false"/>
+                <w:color w:val="2E7D45"/>
+                <w:sz w:val="24"/>
+                <w:szCs w:val="24"/>
+              </w:rPr>
+              <w:t xml:space="preserve">•  </w:t>
+            </w:r>
+            <w:r>
+              <w:rPr>
+                <w:rFonts w:ascii="Arial" w:cs="Arial" w:eastAsia="Arial" w:hAnsi="Arial"/>
+                <w:b w:val="false"/>
+                <w:bCs w:val="false"/>
+                <w:i w:val="false"/>
+                <w:iCs w:val="false"/>
+                <w:caps w:val="false"/>
+                <w:color w:val="1A1530"/>
+                <w:sz w:val="24"/>
+                <w:szCs w:val="24"/>
+              </w:rPr>
+              <w:t xml:space="preserve">stały skład kadry i przewidywalny plan dnia (wizualny)</w:t>
+            </w:r>
+          </w:p>
+          <w:p>
+            <w:pPr>
+              <w:spacing w:after="40" w:before="0" w:line="245"/>
+              <w:ind w:left="220" w:hanging="220"/>
+            </w:pPr>
+            <w:r>
+              <w:rPr>
+                <w:rFonts w:ascii="Arial" w:cs="Arial" w:eastAsia="Arial" w:hAnsi="Arial"/>
+                <w:b/>
+                <w:bCs/>
+                <w:i w:val="false"/>
+                <w:iCs w:val="false"/>
+                <w:caps w:val="false"/>
+                <w:color w:val="2E7D45"/>
+                <w:sz w:val="24"/>
+                <w:szCs w:val="24"/>
+              </w:rPr>
+              <w:t xml:space="preserve">•  </w:t>
+            </w:r>
+            <w:r>
+              <w:rPr>
+                <w:rFonts w:ascii="Arial" w:cs="Arial" w:eastAsia="Arial" w:hAnsi="Arial"/>
+                <w:b w:val="false"/>
+                <w:bCs w:val="false"/>
+                <w:i w:val="false"/>
+                <w:iCs w:val="false"/>
+                <w:caps w:val="false"/>
+                <w:color w:val="1A1530"/>
+                <w:sz w:val="24"/>
+                <w:szCs w:val="24"/>
+              </w:rPr>
+              <w:t xml:space="preserve">strefa wyciszenia w sali, słuchawki wygłuszające, przerwy sensoryczne</w:t>
+            </w:r>
+          </w:p>
+          <w:p>
+            <w:pPr>
+              <w:spacing w:after="40" w:before="0" w:line="245"/>
+              <w:ind w:left="220" w:hanging="220"/>
+            </w:pPr>
+            <w:r>
+              <w:rPr>
+                <w:rFonts w:ascii="Arial" w:cs="Arial" w:eastAsia="Arial" w:hAnsi="Arial"/>
+                <w:b/>
+                <w:bCs/>
+                <w:i w:val="false"/>
+                <w:iCs w:val="false"/>
+                <w:caps w:val="false"/>
+                <w:color w:val="2E7D45"/>
+                <w:sz w:val="24"/>
+                <w:szCs w:val="24"/>
+              </w:rPr>
+              <w:t xml:space="preserve">•  </w:t>
+            </w:r>
+            <w:r>
+              <w:rPr>
+                <w:rFonts w:ascii="Arial" w:cs="Arial" w:eastAsia="Arial" w:hAnsi="Arial"/>
+                <w:b w:val="false"/>
+                <w:bCs w:val="false"/>
+                <w:i w:val="false"/>
+                <w:iCs w:val="false"/>
+                <w:caps w:val="false"/>
+                <w:color w:val="1A1530"/>
+                <w:sz w:val="24"/>
+                <w:szCs w:val="24"/>
+              </w:rPr>
+              <w:t xml:space="preserve">tablica wyboru AAC dostępna w sali i w domu</w:t>
+            </w:r>
+          </w:p>
+          <w:p>
+            <w:pPr>
+              <w:spacing w:after="40" w:before="0" w:line="245"/>
+              <w:ind w:left="220" w:hanging="220"/>
+            </w:pPr>
+            <w:r>
+              <w:rPr>
+                <w:rFonts w:ascii="Arial" w:cs="Arial" w:eastAsia="Arial" w:hAnsi="Arial"/>
+                <w:b/>
+                <w:bCs/>
+                <w:i w:val="false"/>
+                <w:iCs w:val="false"/>
+                <w:caps w:val="false"/>
+                <w:color w:val="2E7D45"/>
+                <w:sz w:val="24"/>
+                <w:szCs w:val="24"/>
+              </w:rPr>
+              <w:t xml:space="preserve">•  </w:t>
+            </w:r>
+            <w:r>
+              <w:rPr>
+                <w:rFonts w:ascii="Arial" w:cs="Arial" w:eastAsia="Arial" w:hAnsi="Arial"/>
+                <w:b w:val="false"/>
+                <w:bCs w:val="false"/>
+                <w:i w:val="false"/>
+                <w:iCs w:val="false"/>
+                <w:caps w:val="false"/>
+                <w:color w:val="1A1530"/>
+                <w:sz w:val="24"/>
+                <w:szCs w:val="24"/>
+              </w:rPr>
+              <w:t xml:space="preserve">rówieśnik-mentor w zabawach; jasne zasady wizualne</w:t>
+            </w:r>
+          </w:p>
+          <w:p>
+            <w:pPr>
+              <w:spacing w:after="40" w:before="0" w:line="245"/>
+              <w:ind w:left="220" w:hanging="220"/>
+            </w:pPr>
+            <w:r>
+              <w:rPr>
+                <w:rFonts w:ascii="Arial" w:cs="Arial" w:eastAsia="Arial" w:hAnsi="Arial"/>
+                <w:b/>
+                <w:bCs/>
+                <w:i w:val="false"/>
+                <w:iCs w:val="false"/>
+                <w:caps w:val="false"/>
+                <w:color w:val="2E7D45"/>
+                <w:sz w:val="24"/>
+                <w:szCs w:val="24"/>
+              </w:rPr>
+              <w:t xml:space="preserve">•  </w:t>
+            </w:r>
+            <w:r>
+              <w:rPr>
+                <w:rFonts w:ascii="Arial" w:cs="Arial" w:eastAsia="Arial" w:hAnsi="Arial"/>
+                <w:b w:val="false"/>
+                <w:bCs w:val="false"/>
+                <w:i w:val="false"/>
+                <w:iCs w:val="false"/>
+                <w:caps w:val="false"/>
+                <w:color w:val="1A1530"/>
+                <w:sz w:val="24"/>
+                <w:szCs w:val="24"/>
+              </w:rPr>
+              <w:t xml:space="preserve">zaangażowani rodzice, spójny system komunikatów dom–placówka</w:t>
+            </w:r>
+          </w:p>
+        </w:tc>
+        <w:tc>
+          <w:tcPr>
+            <w:tcW w:type="dxa" w:w="5103"/>
+            <w:tcBorders>
+              <w:top w:val="single" w:color="E3E1EC" w:sz="4"/>
+              <w:left w:val="single" w:color="E3E1EC" w:sz="4"/>
+              <w:bottom w:val="single" w:color="E3E1EC" w:sz="4"/>
+              <w:right w:val="single" w:color="E3E1EC" w:sz="4"/>
+            </w:tcBorders>
+            <w:tcMar>
+              <w:top w:type="dxa" w:w="60"/>
+              <w:left w:type="dxa" w:w="140"/>
+              <w:bottom w:type="dxa" w:w="60"/>
+              <w:right w:type="dxa" w:w="120"/>
+            </w:tcMar>
+            <w:vAlign w:val="top"/>
+          </w:tcPr>
+          <w:p>
+            <w:pPr>
+              <w:spacing w:after="40" w:before="0" w:line="245"/>
+              <w:ind w:left="220" w:hanging="220"/>
+            </w:pPr>
+            <w:r>
+              <w:rPr>
+                <w:rFonts w:ascii="Arial" w:cs="Arial" w:eastAsia="Arial" w:hAnsi="Arial"/>
+                <w:b/>
+                <w:bCs/>
+                <w:i w:val="false"/>
+                <w:iCs w:val="false"/>
+                <w:caps w:val="false"/>
+                <w:color w:val="BF382A"/>
+                <w:sz w:val="24"/>
+                <w:szCs w:val="24"/>
+              </w:rPr>
+              <w:t xml:space="preserve">•  </w:t>
+            </w:r>
+            <w:r>
+              <w:rPr>
+                <w:rFonts w:ascii="Arial" w:cs="Arial" w:eastAsia="Arial" w:hAnsi="Arial"/>
+                <w:b w:val="false"/>
+                <w:bCs w:val="false"/>
+                <w:i w:val="false"/>
+                <w:iCs w:val="false"/>
+                <w:caps w:val="false"/>
+                <w:color w:val="1A1530"/>
+                <w:sz w:val="24"/>
+                <w:szCs w:val="24"/>
+              </w:rPr>
+              <w:t xml:space="preserve">hałas korytarza, gwar w szatni i na stołówce</w:t>
+            </w:r>
+          </w:p>
+          <w:p>
+            <w:pPr>
+              <w:spacing w:after="40" w:before="0" w:line="245"/>
+              <w:ind w:left="220" w:hanging="220"/>
+            </w:pPr>
+            <w:r>
+              <w:rPr>
+                <w:rFonts w:ascii="Arial" w:cs="Arial" w:eastAsia="Arial" w:hAnsi="Arial"/>
+                <w:b/>
+                <w:bCs/>
+                <w:i w:val="false"/>
+                <w:iCs w:val="false"/>
+                <w:caps w:val="false"/>
+                <w:color w:val="BF382A"/>
+                <w:sz w:val="24"/>
+                <w:szCs w:val="24"/>
+              </w:rPr>
+              <w:t xml:space="preserve">•  </w:t>
+            </w:r>
+            <w:r>
+              <w:rPr>
+                <w:rFonts w:ascii="Arial" w:cs="Arial" w:eastAsia="Arial" w:hAnsi="Arial"/>
+                <w:b w:val="false"/>
+                <w:bCs w:val="false"/>
+                <w:i w:val="false"/>
+                <w:iCs w:val="false"/>
+                <w:caps w:val="false"/>
+                <w:color w:val="1A1530"/>
+                <w:sz w:val="24"/>
+                <w:szCs w:val="24"/>
+              </w:rPr>
+              <w:t xml:space="preserve">apele, uroczystości i wyjścia zbiorowe bez przygotowania</w:t>
+            </w:r>
+          </w:p>
+          <w:p>
+            <w:pPr>
+              <w:spacing w:after="40" w:before="0" w:line="245"/>
+              <w:ind w:left="220" w:hanging="220"/>
+            </w:pPr>
+            <w:r>
+              <w:rPr>
+                <w:rFonts w:ascii="Arial" w:cs="Arial" w:eastAsia="Arial" w:hAnsi="Arial"/>
+                <w:b/>
+                <w:bCs/>
+                <w:i w:val="false"/>
+                <w:iCs w:val="false"/>
+                <w:caps w:val="false"/>
+                <w:color w:val="BF382A"/>
+                <w:sz w:val="24"/>
+                <w:szCs w:val="24"/>
+              </w:rPr>
+              <w:t xml:space="preserve">•  </w:t>
+            </w:r>
+            <w:r>
+              <w:rPr>
+                <w:rFonts w:ascii="Arial" w:cs="Arial" w:eastAsia="Arial" w:hAnsi="Arial"/>
+                <w:b w:val="false"/>
+                <w:bCs w:val="false"/>
+                <w:i w:val="false"/>
+                <w:iCs w:val="false"/>
+                <w:caps w:val="false"/>
+                <w:color w:val="1A1530"/>
+                <w:sz w:val="24"/>
+                <w:szCs w:val="24"/>
+              </w:rPr>
+              <w:t xml:space="preserve">polecenia wieloetapowe podawane wyłącznie słownie</w:t>
+            </w:r>
+          </w:p>
+          <w:p>
+            <w:pPr>
+              <w:spacing w:after="40" w:before="0" w:line="245"/>
+              <w:ind w:left="220" w:hanging="220"/>
+            </w:pPr>
+            <w:r>
+              <w:rPr>
+                <w:rFonts w:ascii="Arial" w:cs="Arial" w:eastAsia="Arial" w:hAnsi="Arial"/>
+                <w:b/>
+                <w:bCs/>
+                <w:i w:val="false"/>
+                <w:iCs w:val="false"/>
+                <w:caps w:val="false"/>
+                <w:color w:val="BF382A"/>
+                <w:sz w:val="24"/>
+                <w:szCs w:val="24"/>
+              </w:rPr>
+              <w:t xml:space="preserve">•  </w:t>
+            </w:r>
+            <w:r>
+              <w:rPr>
+                <w:rFonts w:ascii="Arial" w:cs="Arial" w:eastAsia="Arial" w:hAnsi="Arial"/>
+                <w:b w:val="false"/>
+                <w:bCs w:val="false"/>
+                <w:i w:val="false"/>
+                <w:iCs w:val="false"/>
+                <w:caps w:val="false"/>
+                <w:color w:val="1A1530"/>
+                <w:sz w:val="24"/>
+                <w:szCs w:val="24"/>
+              </w:rPr>
+              <w:t xml:space="preserve">nagłe zmiany planu, zastępstwa, zmiana sali</w:t>
+            </w:r>
+          </w:p>
+          <w:p>
+            <w:pPr>
+              <w:spacing w:after="40" w:before="0" w:line="245"/>
+              <w:ind w:left="220" w:hanging="220"/>
+            </w:pPr>
+            <w:r>
+              <w:rPr>
+                <w:rFonts w:ascii="Arial" w:cs="Arial" w:eastAsia="Arial" w:hAnsi="Arial"/>
+                <w:b/>
+                <w:bCs/>
+                <w:i w:val="false"/>
+                <w:iCs w:val="false"/>
+                <w:caps w:val="false"/>
+                <w:color w:val="BF382A"/>
+                <w:sz w:val="24"/>
+                <w:szCs w:val="24"/>
+              </w:rPr>
+              <w:t xml:space="preserve">•  </w:t>
+            </w:r>
+            <w:r>
+              <w:rPr>
+                <w:rFonts w:ascii="Arial" w:cs="Arial" w:eastAsia="Arial" w:hAnsi="Arial"/>
+                <w:b w:val="false"/>
+                <w:bCs w:val="false"/>
+                <w:i w:val="false"/>
+                <w:iCs w:val="false"/>
+                <w:caps w:val="false"/>
+                <w:color w:val="1A1530"/>
+                <w:sz w:val="24"/>
+                <w:szCs w:val="24"/>
+              </w:rPr>
+              <w:t xml:space="preserve">faktury klejące i mokre podczas zajęć plastycznych</w:t>
             </w:r>
           </w:p>
         </w:tc>
@@ -6186,31 +5960,9 @@
     </w:tbl>
     <w:p>
       <w:pPr>
-        <w:spacing w:after="160" w:before="0"/>
+        <w:spacing w:after="60" w:before="80" w:line="240"/>
+        <w:jc w:val="both"/>
       </w:pPr>
-    </w:p>
-    <w:p>
-      <w:pPr>
-        <w:keepNext/>
-        <w:pBdr>
-          <w:bottom w:val="single" w:color="D9D0F0" w:sz="20" w:space="4"/>
-        </w:pBdr>
-        <w:spacing w:after="100" w:before="180"/>
-      </w:pPr>
-      <w:r>
-        <w:rPr>
-          <w:rFonts w:ascii="Arial" w:cs="Arial" w:eastAsia="Arial" w:hAnsi="Arial"/>
-          <w:b/>
-          <w:bCs/>
-          <w:i w:val="false"/>
-          <w:iCs w:val="false"/>
-          <w:caps w:val="false"/>
-          <w:color w:val="E74509"/>
-          <w:sz w:val="24"/>
-          <w:szCs w:val="24"/>
-        </w:rPr>
-        <w:t xml:space="preserve">8.  </w:t>
-      </w:r>
       <w:r>
         <w:rPr>
           <w:rFonts w:ascii="Arial" w:cs="Arial" w:eastAsia="Arial" w:hAnsi="Arial"/>
@@ -6220,18 +5972,60 @@
           <w:iCs w:val="false"/>
           <w:caps w:val="false"/>
           <w:color w:val="2D1B69"/>
-          <w:spacing w:val="8"/>
           <w:sz w:val="24"/>
           <w:szCs w:val="24"/>
         </w:rPr>
-        <w:t xml:space="preserve">INFORMACJE UZUPEŁNIAJĄCE DLA ZESPOŁU ORZEKAJĄCEGO – FAKULTATYWNE, NA POTRZEBY OCENY FUNKCJONOWANIA (§ 8 UST. 2–3)</w:t>
+        <w:t xml:space="preserve">Informacje od dziecka i rodziców (§ 8 ust. 3 pkt 1 i 3): </w:t>
+      </w:r>
+      <w:r>
+        <w:rPr>
+          <w:rFonts w:ascii="Arial" w:cs="Arial" w:eastAsia="Arial" w:hAnsi="Arial"/>
+          <w:b w:val="false"/>
+          <w:bCs w:val="false"/>
+          <w:i w:val="false"/>
+          <w:iCs w:val="false"/>
+          <w:caps w:val="false"/>
+          <w:color w:val="1A1530"/>
+          <w:sz w:val="24"/>
+          <w:szCs w:val="24"/>
+        </w:rPr>
+        <w:t xml:space="preserve">Informacje od dziecka (w formie dostosowanej do rozwoju) i od rodziców: lubi klocki, tablet z aplikacją o kosmosie i huśtanie; najtrudniejsze są hałas, zmiany planu i mokre ręce; pomagają cisza, plan dnia, słuchawki i wsparcie nauczyciela. Rodzice potwierdzają obraz funkcjonowania i wskazują potrzebę stałej kadry.</w:t>
       </w:r>
     </w:p>
     <w:p>
       <w:pPr>
-        <w:spacing w:after="140" w:before="0" w:line="260"/>
-        <w:jc w:val="both"/>
+        <w:keepNext/>
+        <w:spacing w:after="90" w:before="140"/>
       </w:pPr>
+      <w:r>
+        <w:rPr>
+          <w:rFonts w:ascii="Arial" w:cs="Arial" w:eastAsia="Arial" w:hAnsi="Arial"/>
+          <w:b/>
+          <w:bCs/>
+          <w:i w:val="false"/>
+          <w:iCs w:val="false"/>
+          <w:caps w:val="false"/>
+          <w:color w:val="FFFFFF"/>
+          <w:sz w:val="24"/>
+          <w:szCs w:val="24"/>
+          <w:shd w:fill="2D6BB3" w:color="auto" w:val="clear"/>
+        </w:rPr>
+        <w:t xml:space="preserve"> ! </w:t>
+      </w:r>
+      <w:r>
+        <w:rPr>
+          <w:rFonts w:ascii="Arial" w:cs="Arial" w:eastAsia="Arial" w:hAnsi="Arial"/>
+          <w:b/>
+          <w:bCs/>
+          <w:i w:val="false"/>
+          <w:iCs w:val="false"/>
+          <w:caps w:val="false"/>
+          <w:color w:val="2D1B69"/>
+          <w:sz w:val="24"/>
+          <w:szCs w:val="24"/>
+        </w:rPr>
+        <w:t xml:space="preserve">   Stanowisko placówki w sprawie potrzeb dziecka / ucznia (dla zespołu orzekającego)</w:t>
+      </w:r>
       <w:r>
         <w:rPr>
           <w:rFonts w:ascii="Arial" w:cs="Arial" w:eastAsia="Arial" w:hAnsi="Arial"/>
@@ -6244,27 +6038,7 @@
           <w:sz w:val="24"/>
           <w:szCs w:val="24"/>
         </w:rPr>
-        <w:t xml:space="preserve">Zespół orzekający dokonuje własnej oceny funkcjonowania (§ 8); poniższe informacje placówka przekazuje dodatkowo, aby ją ułatwić.</w:t>
-      </w:r>
-    </w:p>
-    <w:p>
-      <w:pPr>
-        <w:spacing w:after="100" w:before="0" w:line="240"/>
-        <w:jc w:val="both"/>
-      </w:pPr>
-      <w:r>
-        <w:rPr>
-          <w:rFonts w:ascii="Arial" w:cs="Arial" w:eastAsia="Arial" w:hAnsi="Arial"/>
-          <w:b w:val="false"/>
-          <w:bCs w:val="false"/>
-          <w:i w:val="false"/>
-          <w:iCs w:val="false"/>
-          <w:caps w:val="false"/>
-          <w:color w:val="1A1530"/>
-          <w:sz w:val="20"/>
-          <w:szCs w:val="20"/>
-        </w:rPr>
-        <w:t xml:space="preserve">Funkcje i struktury ciała (§ 8 ust. 2 pkt 2): zdrowie psychiczne – lęk przed zmianą, sztywność poznawcza, zaburzenia snu; percepcja – nadwrażliwość słuchowa i dotykowa, poszukiwanie stymulacji przedsionkowej; motoryka – obniżona precyzja motoryki małej, nieprawidłowy chwyt; mowa – echolalie, trudności pragmatyczne, korzysta z gestu i piktogramów; funkcje poznawcze – bardzo dobra pamięć wzrokowa, trudności z uwagą i uogólnianiem; funkcje emocjonalno-społeczne – teoria umysłu poniżej normy wiekowej, zachowania trudne o funkcji ucieczkowej; cechy indywidualne – głębokie zainteresowania, pozytywna reakcja na strukturę i stałych dorosłych.</w:t>
+        <w:t xml:space="preserve"/>
       </w:r>
     </w:p>
     <w:tbl>
@@ -6291,17 +6065,16 @@
           <w:tcPr>
             <w:tcW w:type="dxa" w:w="5103"/>
             <w:tcBorders>
-              <w:top w:val="single" w:color="D9D0F0" w:sz="4"/>
-              <w:left w:val="single" w:color="D9D0F0" w:sz="4"/>
-              <w:bottom w:val="single" w:color="D9D0F0" w:sz="4"/>
-              <w:right w:val="single" w:color="D9D0F0" w:sz="4"/>
-            </w:tcBorders>
-            <w:shd w:fill="EFE9F9" w:color="auto" w:val="clear"/>
-            <w:tcMar>
-              <w:top w:type="dxa" w:w="100"/>
-              <w:left w:type="dxa" w:w="140"/>
-              <w:bottom w:type="dxa" w:w="100"/>
-              <w:right w:type="dxa" w:w="120"/>
+              <w:top w:val="nil"/>
+              <w:left w:val="nil"/>
+              <w:bottom w:val="nil"/>
+              <w:right w:val="nil"/>
+            </w:tcBorders>
+            <w:tcMar>
+              <w:top w:type="dxa" w:w="15"/>
+              <w:left w:type="dxa" w:w="0"/>
+              <w:bottom w:type="dxa" w:w="15"/>
+              <w:right w:type="dxa" w:w="100"/>
             </w:tcMar>
             <w:vAlign w:val="top"/>
           </w:tcPr>
@@ -6313,17 +6086,30 @@
             <w:r>
               <w:rPr>
                 <w:rFonts w:ascii="Arial" w:cs="Arial" w:eastAsia="Arial" w:hAnsi="Arial"/>
-                <w:b/>
-                <w:bCs/>
-                <w:i w:val="false"/>
-                <w:iCs w:val="false"/>
-                <w:caps/>
-                <w:color w:val="2E7D45"/>
-                <w:spacing w:val="10"/>
-                <w:sz w:val="20"/>
-                <w:szCs w:val="20"/>
-              </w:rPr>
-              <w:t xml:space="preserve">Ułatwienia w środowisku placówki (co pomaga)</w:t>
+                <w:b w:val="false"/>
+                <w:bCs w:val="false"/>
+                <w:i w:val="false"/>
+                <w:iCs w:val="false"/>
+                <w:caps w:val="false"/>
+                <w:color w:val="E74509"/>
+                <w:sz w:val="24"/>
+                <w:szCs w:val="24"/>
+              </w:rPr>
+              <w:t xml:space="preserve">☑  </w:t>
+            </w:r>
+            <w:r>
+              <w:rPr>
+                <w:rFonts w:ascii="Arial" w:cs="Arial" w:eastAsia="Arial" w:hAnsi="Arial"/>
+                <w:b w:val="false"/>
+                <w:bCs w:val="false"/>
+                <w:i w:val="false"/>
+                <w:iCs w:val="false"/>
+                <w:caps w:val="false"/>
+                <w:color w:val="1A1530"/>
+                <w:sz w:val="24"/>
+                <w:szCs w:val="24"/>
+              </w:rPr>
+              <w:t xml:space="preserve">Potrzeba kształcenia specjalnego (wydanie / aktualizacja orzeczenia) z uwagi na autyzm</w:t>
             </w:r>
           </w:p>
         </w:tc>
@@ -6331,17 +6117,16 @@
           <w:tcPr>
             <w:tcW w:type="dxa" w:w="5103"/>
             <w:tcBorders>
-              <w:top w:val="single" w:color="D9D0F0" w:sz="4"/>
-              <w:left w:val="single" w:color="D9D0F0" w:sz="4"/>
-              <w:bottom w:val="single" w:color="D9D0F0" w:sz="4"/>
-              <w:right w:val="single" w:color="D9D0F0" w:sz="4"/>
-            </w:tcBorders>
-            <w:shd w:fill="EFE9F9" w:color="auto" w:val="clear"/>
-            <w:tcMar>
-              <w:top w:type="dxa" w:w="100"/>
-              <w:left w:type="dxa" w:w="140"/>
-              <w:bottom w:type="dxa" w:w="100"/>
-              <w:right w:type="dxa" w:w="120"/>
+              <w:top w:val="nil"/>
+              <w:left w:val="nil"/>
+              <w:bottom w:val="nil"/>
+              <w:right w:val="nil"/>
+            </w:tcBorders>
+            <w:tcMar>
+              <w:top w:type="dxa" w:w="15"/>
+              <w:left w:type="dxa" w:w="0"/>
+              <w:bottom w:type="dxa" w:w="15"/>
+              <w:right w:type="dxa" w:w="100"/>
             </w:tcMar>
             <w:vAlign w:val="top"/>
           </w:tcPr>
@@ -6353,17 +6138,30 @@
             <w:r>
               <w:rPr>
                 <w:rFonts w:ascii="Arial" w:cs="Arial" w:eastAsia="Arial" w:hAnsi="Arial"/>
-                <w:b/>
-                <w:bCs/>
-                <w:i w:val="false"/>
-                <w:iCs w:val="false"/>
-                <w:caps/>
-                <w:color w:val="BF382A"/>
-                <w:spacing w:val="10"/>
-                <w:sz w:val="20"/>
-                <w:szCs w:val="20"/>
-              </w:rPr>
-              <w:t xml:space="preserve">Bariery (co utrudnia)</w:t>
+                <w:b w:val="false"/>
+                <w:bCs w:val="false"/>
+                <w:i w:val="false"/>
+                <w:iCs w:val="false"/>
+                <w:caps w:val="false"/>
+                <w:color w:val="E74509"/>
+                <w:sz w:val="24"/>
+                <w:szCs w:val="24"/>
+              </w:rPr>
+              <w:t xml:space="preserve">☑  </w:t>
+            </w:r>
+            <w:r>
+              <w:rPr>
+                <w:rFonts w:ascii="Arial" w:cs="Arial" w:eastAsia="Arial" w:hAnsi="Arial"/>
+                <w:b w:val="false"/>
+                <w:bCs w:val="false"/>
+                <w:i w:val="false"/>
+                <w:iCs w:val="false"/>
+                <w:caps w:val="false"/>
+                <w:color w:val="1A1530"/>
+                <w:sz w:val="24"/>
+                <w:szCs w:val="24"/>
+              </w:rPr>
+              <w:t xml:space="preserve">Zajęcia rewalidacyjne – wnioskowany zakres: komunikacja i AAC, umiejętności społeczne, motoryka mała</w:t>
             </w:r>
           </w:p>
         </w:tc>
@@ -6376,37 +6174,37 @@
           <w:tcPr>
             <w:tcW w:type="dxa" w:w="5103"/>
             <w:tcBorders>
-              <w:top w:val="single" w:color="E3E1EC" w:sz="4"/>
-              <w:left w:val="single" w:color="E3E1EC" w:sz="4"/>
-              <w:bottom w:val="single" w:color="E3E1EC" w:sz="4"/>
-              <w:right w:val="single" w:color="E3E1EC" w:sz="4"/>
-            </w:tcBorders>
-            <w:tcMar>
-              <w:top w:type="dxa" w:w="60"/>
-              <w:left w:type="dxa" w:w="140"/>
-              <w:bottom w:type="dxa" w:w="60"/>
-              <w:right w:type="dxa" w:w="120"/>
-            </w:tcMar>
-            <w:vAlign w:val="top"/>
-          </w:tcPr>
-          <w:p>
-            <w:pPr>
-              <w:spacing w:after="40" w:before="0" w:line="245"/>
-              <w:ind w:left="220" w:hanging="220"/>
-            </w:pPr>
-            <w:r>
-              <w:rPr>
-                <w:rFonts w:ascii="Arial" w:cs="Arial" w:eastAsia="Arial" w:hAnsi="Arial"/>
-                <w:b/>
-                <w:bCs/>
-                <w:i w:val="false"/>
-                <w:iCs w:val="false"/>
-                <w:caps w:val="false"/>
-                <w:color w:val="2E7D45"/>
-                <w:sz w:val="20"/>
-                <w:szCs w:val="20"/>
-              </w:rPr>
-              <w:t xml:space="preserve">•  </w:t>
+              <w:top w:val="nil"/>
+              <w:left w:val="nil"/>
+              <w:bottom w:val="nil"/>
+              <w:right w:val="nil"/>
+            </w:tcBorders>
+            <w:tcMar>
+              <w:top w:type="dxa" w:w="15"/>
+              <w:left w:type="dxa" w:w="0"/>
+              <w:bottom w:type="dxa" w:w="15"/>
+              <w:right w:type="dxa" w:w="100"/>
+            </w:tcMar>
+            <w:vAlign w:val="top"/>
+          </w:tcPr>
+          <w:p>
+            <w:pPr>
+              <w:spacing w:after="0" w:before="0" w:line="276"/>
+              <w:jc w:val="left"/>
+            </w:pPr>
+            <w:r>
+              <w:rPr>
+                <w:rFonts w:ascii="Arial" w:cs="Arial" w:eastAsia="Arial" w:hAnsi="Arial"/>
+                <w:b w:val="false"/>
+                <w:bCs w:val="false"/>
+                <w:i w:val="false"/>
+                <w:iCs w:val="false"/>
+                <w:caps w:val="false"/>
+                <w:color w:val="E74509"/>
+                <w:sz w:val="24"/>
+                <w:szCs w:val="24"/>
+              </w:rPr>
+              <w:t xml:space="preserve">☑  </w:t>
             </w:r>
             <w:r>
               <w:rPr>
@@ -6417,30 +6215,48 @@
                 <w:iCs w:val="false"/>
                 <w:caps w:val="false"/>
                 <w:color w:val="1A1530"/>
-                <w:sz w:val="20"/>
-                <w:szCs w:val="20"/>
-              </w:rPr>
-              <w:t xml:space="preserve">stały skład kadry i przewidywalny plan dnia (wizualny)</w:t>
-            </w:r>
-          </w:p>
-          <w:p>
-            <w:pPr>
-              <w:spacing w:after="40" w:before="0" w:line="245"/>
-              <w:ind w:left="220" w:hanging="220"/>
-            </w:pPr>
-            <w:r>
-              <w:rPr>
-                <w:rFonts w:ascii="Arial" w:cs="Arial" w:eastAsia="Arial" w:hAnsi="Arial"/>
-                <w:b/>
-                <w:bCs/>
-                <w:i w:val="false"/>
-                <w:iCs w:val="false"/>
-                <w:caps w:val="false"/>
-                <w:color w:val="2E7D45"/>
-                <w:sz w:val="20"/>
-                <w:szCs w:val="20"/>
-              </w:rPr>
-              <w:t xml:space="preserve">•  </w:t>
+                <w:sz w:val="24"/>
+                <w:szCs w:val="24"/>
+              </w:rPr>
+              <w:t xml:space="preserve">Wsparcie dodatkowej osoby – nauczyciel współorganizujący kształcenie (zajęcia kierowane, przejścia, wydarzenia grupowe)</w:t>
+            </w:r>
+          </w:p>
+        </w:tc>
+        <w:tc>
+          <w:tcPr>
+            <w:tcW w:type="dxa" w:w="5103"/>
+            <w:tcBorders>
+              <w:top w:val="nil"/>
+              <w:left w:val="nil"/>
+              <w:bottom w:val="nil"/>
+              <w:right w:val="nil"/>
+            </w:tcBorders>
+            <w:tcMar>
+              <w:top w:type="dxa" w:w="15"/>
+              <w:left w:type="dxa" w:w="0"/>
+              <w:bottom w:type="dxa" w:w="15"/>
+              <w:right w:type="dxa" w:w="100"/>
+            </w:tcMar>
+            <w:vAlign w:val="top"/>
+          </w:tcPr>
+          <w:p>
+            <w:pPr>
+              <w:spacing w:after="0" w:before="0" w:line="276"/>
+              <w:jc w:val="left"/>
+            </w:pPr>
+            <w:r>
+              <w:rPr>
+                <w:rFonts w:ascii="Arial" w:cs="Arial" w:eastAsia="Arial" w:hAnsi="Arial"/>
+                <w:b w:val="false"/>
+                <w:bCs w:val="false"/>
+                <w:i w:val="false"/>
+                <w:iCs w:val="false"/>
+                <w:caps w:val="false"/>
+                <w:color w:val="E74509"/>
+                <w:sz w:val="24"/>
+                <w:szCs w:val="24"/>
+              </w:rPr>
+              <w:t xml:space="preserve">☑  </w:t>
             </w:r>
             <w:r>
               <w:rPr>
@@ -6451,30 +6267,53 @@
                 <w:iCs w:val="false"/>
                 <w:caps w:val="false"/>
                 <w:color w:val="1A1530"/>
-                <w:sz w:val="20"/>
-                <w:szCs w:val="20"/>
-              </w:rPr>
-              <w:t xml:space="preserve">strefa wyciszenia w sali, słuchawki wygłuszające, przerwy sensoryczne</w:t>
-            </w:r>
-          </w:p>
-          <w:p>
-            <w:pPr>
-              <w:spacing w:after="40" w:before="0" w:line="245"/>
-              <w:ind w:left="220" w:hanging="220"/>
-            </w:pPr>
-            <w:r>
-              <w:rPr>
-                <w:rFonts w:ascii="Arial" w:cs="Arial" w:eastAsia="Arial" w:hAnsi="Arial"/>
-                <w:b/>
-                <w:bCs/>
-                <w:i w:val="false"/>
-                <w:iCs w:val="false"/>
-                <w:caps w:val="false"/>
-                <w:color w:val="2E7D45"/>
-                <w:sz w:val="20"/>
-                <w:szCs w:val="20"/>
-              </w:rPr>
-              <w:t xml:space="preserve">•  </w:t>
+                <w:sz w:val="24"/>
+                <w:szCs w:val="24"/>
+              </w:rPr>
+              <w:t xml:space="preserve">Kontynuacja pomocy psychologiczno-pedagogicznej w dotychczasowych formach</w:t>
+            </w:r>
+          </w:p>
+        </w:tc>
+      </w:tr>
+      <w:tr>
+        <w:trPr>
+          <w:cantSplit/>
+        </w:trPr>
+        <w:tc>
+          <w:tcPr>
+            <w:tcW w:type="dxa" w:w="5103"/>
+            <w:tcBorders>
+              <w:top w:val="nil"/>
+              <w:left w:val="nil"/>
+              <w:bottom w:val="nil"/>
+              <w:right w:val="nil"/>
+            </w:tcBorders>
+            <w:tcMar>
+              <w:top w:type="dxa" w:w="15"/>
+              <w:left w:type="dxa" w:w="0"/>
+              <w:bottom w:type="dxa" w:w="15"/>
+              <w:right w:type="dxa" w:w="100"/>
+            </w:tcMar>
+            <w:vAlign w:val="top"/>
+          </w:tcPr>
+          <w:p>
+            <w:pPr>
+              <w:spacing w:after="0" w:before="0" w:line="276"/>
+              <w:jc w:val="left"/>
+            </w:pPr>
+            <w:r>
+              <w:rPr>
+                <w:rFonts w:ascii="Arial" w:cs="Arial" w:eastAsia="Arial" w:hAnsi="Arial"/>
+                <w:b w:val="false"/>
+                <w:bCs w:val="false"/>
+                <w:i w:val="false"/>
+                <w:iCs w:val="false"/>
+                <w:caps w:val="false"/>
+                <w:color w:val="B6A6DF"/>
+                <w:sz w:val="24"/>
+                <w:szCs w:val="24"/>
+              </w:rPr>
+              <w:t xml:space="preserve">☐  </w:t>
             </w:r>
             <w:r>
               <w:rPr>
@@ -6485,30 +6324,48 @@
                 <w:iCs w:val="false"/>
                 <w:caps w:val="false"/>
                 <w:color w:val="1A1530"/>
-                <w:sz w:val="20"/>
-                <w:szCs w:val="20"/>
-              </w:rPr>
-              <w:t xml:space="preserve">tablica wyboru AAC dostępna w sali i w domu</w:t>
-            </w:r>
-          </w:p>
-          <w:p>
-            <w:pPr>
-              <w:spacing w:after="40" w:before="0" w:line="245"/>
-              <w:ind w:left="220" w:hanging="220"/>
-            </w:pPr>
-            <w:r>
-              <w:rPr>
-                <w:rFonts w:ascii="Arial" w:cs="Arial" w:eastAsia="Arial" w:hAnsi="Arial"/>
-                <w:b/>
-                <w:bCs/>
-                <w:i w:val="false"/>
-                <w:iCs w:val="false"/>
-                <w:caps w:val="false"/>
-                <w:color w:val="2E7D45"/>
-                <w:sz w:val="20"/>
-                <w:szCs w:val="20"/>
-              </w:rPr>
-              <w:t xml:space="preserve">•  </w:t>
+                <w:sz w:val="24"/>
+                <w:szCs w:val="24"/>
+              </w:rPr>
+              <w:t xml:space="preserve">Indywidualne nauczanie / zindywidualizowana ścieżka kształcenia</w:t>
+            </w:r>
+          </w:p>
+        </w:tc>
+        <w:tc>
+          <w:tcPr>
+            <w:tcW w:type="dxa" w:w="5103"/>
+            <w:tcBorders>
+              <w:top w:val="nil"/>
+              <w:left w:val="nil"/>
+              <w:bottom w:val="nil"/>
+              <w:right w:val="nil"/>
+            </w:tcBorders>
+            <w:tcMar>
+              <w:top w:type="dxa" w:w="15"/>
+              <w:left w:type="dxa" w:w="0"/>
+              <w:bottom w:type="dxa" w:w="15"/>
+              <w:right w:type="dxa" w:w="100"/>
+            </w:tcMar>
+            <w:vAlign w:val="top"/>
+          </w:tcPr>
+          <w:p>
+            <w:pPr>
+              <w:spacing w:after="0" w:before="0" w:line="276"/>
+              <w:jc w:val="left"/>
+            </w:pPr>
+            <w:r>
+              <w:rPr>
+                <w:rFonts w:ascii="Arial" w:cs="Arial" w:eastAsia="Arial" w:hAnsi="Arial"/>
+                <w:b w:val="false"/>
+                <w:bCs w:val="false"/>
+                <w:i w:val="false"/>
+                <w:iCs w:val="false"/>
+                <w:caps w:val="false"/>
+                <w:color w:val="B6A6DF"/>
+                <w:sz w:val="24"/>
+                <w:szCs w:val="24"/>
+              </w:rPr>
+              <w:t xml:space="preserve">☐  </w:t>
             </w:r>
             <w:r>
               <w:rPr>
@@ -6519,30 +6376,53 @@
                 <w:iCs w:val="false"/>
                 <w:caps w:val="false"/>
                 <w:color w:val="1A1530"/>
-                <w:sz w:val="20"/>
-                <w:szCs w:val="20"/>
-              </w:rPr>
-              <w:t xml:space="preserve">rówieśnik-mentor w zabawach; jasne zasady wizualne</w:t>
-            </w:r>
-          </w:p>
-          <w:p>
-            <w:pPr>
-              <w:spacing w:after="40" w:before="0" w:line="245"/>
-              <w:ind w:left="220" w:hanging="220"/>
-            </w:pPr>
-            <w:r>
-              <w:rPr>
-                <w:rFonts w:ascii="Arial" w:cs="Arial" w:eastAsia="Arial" w:hAnsi="Arial"/>
-                <w:b/>
-                <w:bCs/>
-                <w:i w:val="false"/>
-                <w:iCs w:val="false"/>
-                <w:caps w:val="false"/>
-                <w:color w:val="2E7D45"/>
-                <w:sz w:val="20"/>
-                <w:szCs w:val="20"/>
-              </w:rPr>
-              <w:t xml:space="preserve">•  </w:t>
+                <w:sz w:val="24"/>
+                <w:szCs w:val="24"/>
+              </w:rPr>
+              <w:t xml:space="preserve">Wczesne wspomaganie rozwoju</w:t>
+            </w:r>
+          </w:p>
+        </w:tc>
+      </w:tr>
+      <w:tr>
+        <w:trPr>
+          <w:cantSplit/>
+        </w:trPr>
+        <w:tc>
+          <w:tcPr>
+            <w:tcW w:type="dxa" w:w="5103"/>
+            <w:tcBorders>
+              <w:top w:val="nil"/>
+              <w:left w:val="nil"/>
+              <w:bottom w:val="nil"/>
+              <w:right w:val="nil"/>
+            </w:tcBorders>
+            <w:tcMar>
+              <w:top w:type="dxa" w:w="15"/>
+              <w:left w:type="dxa" w:w="0"/>
+              <w:bottom w:type="dxa" w:w="15"/>
+              <w:right w:type="dxa" w:w="100"/>
+            </w:tcMar>
+            <w:vAlign w:val="top"/>
+          </w:tcPr>
+          <w:p>
+            <w:pPr>
+              <w:spacing w:after="0" w:before="0" w:line="276"/>
+              <w:jc w:val="left"/>
+            </w:pPr>
+            <w:r>
+              <w:rPr>
+                <w:rFonts w:ascii="Arial" w:cs="Arial" w:eastAsia="Arial" w:hAnsi="Arial"/>
+                <w:b w:val="false"/>
+                <w:bCs w:val="false"/>
+                <w:i w:val="false"/>
+                <w:iCs w:val="false"/>
+                <w:caps w:val="false"/>
+                <w:color w:val="B6A6DF"/>
+                <w:sz w:val="24"/>
+                <w:szCs w:val="24"/>
+              </w:rPr>
+              <w:t xml:space="preserve">☐  </w:t>
             </w:r>
             <w:r>
               <w:rPr>
@@ -6553,10 +6433,10 @@
                 <w:iCs w:val="false"/>
                 <w:caps w:val="false"/>
                 <w:color w:val="1A1530"/>
-                <w:sz w:val="20"/>
-                <w:szCs w:val="20"/>
-              </w:rPr>
-              <w:t xml:space="preserve">zaangażowani rodzice, spójny system komunikatów dom–placówka</w:t>
+                <w:sz w:val="24"/>
+                <w:szCs w:val="24"/>
+              </w:rPr>
+              <w:t xml:space="preserve">Inne: ……………………………………………</w:t>
             </w:r>
           </w:p>
         </w:tc>
@@ -6564,246 +6444,32 @@
           <w:tcPr>
             <w:tcW w:type="dxa" w:w="5103"/>
             <w:tcBorders>
-              <w:top w:val="single" w:color="E3E1EC" w:sz="4"/>
-              <w:left w:val="single" w:color="E3E1EC" w:sz="4"/>
-              <w:bottom w:val="single" w:color="E3E1EC" w:sz="4"/>
-              <w:right w:val="single" w:color="E3E1EC" w:sz="4"/>
-            </w:tcBorders>
-            <w:tcMar>
-              <w:top w:type="dxa" w:w="60"/>
-              <w:left w:type="dxa" w:w="140"/>
-              <w:bottom w:type="dxa" w:w="60"/>
-              <w:right w:type="dxa" w:w="120"/>
-            </w:tcMar>
-            <w:vAlign w:val="top"/>
-          </w:tcPr>
-          <w:p>
-            <w:pPr>
-              <w:spacing w:after="40" w:before="0" w:line="245"/>
-              <w:ind w:left="220" w:hanging="220"/>
-            </w:pPr>
-            <w:r>
-              <w:rPr>
-                <w:rFonts w:ascii="Arial" w:cs="Arial" w:eastAsia="Arial" w:hAnsi="Arial"/>
-                <w:b/>
-                <w:bCs/>
-                <w:i w:val="false"/>
-                <w:iCs w:val="false"/>
-                <w:caps w:val="false"/>
-                <w:color w:val="BF382A"/>
-                <w:sz w:val="20"/>
-                <w:szCs w:val="20"/>
-              </w:rPr>
-              <w:t xml:space="preserve">•  </w:t>
-            </w:r>
-            <w:r>
-              <w:rPr>
-                <w:rFonts w:ascii="Arial" w:cs="Arial" w:eastAsia="Arial" w:hAnsi="Arial"/>
-                <w:b w:val="false"/>
-                <w:bCs w:val="false"/>
-                <w:i w:val="false"/>
-                <w:iCs w:val="false"/>
-                <w:caps w:val="false"/>
-                <w:color w:val="1A1530"/>
-                <w:sz w:val="20"/>
-                <w:szCs w:val="20"/>
-              </w:rPr>
-              <w:t xml:space="preserve">hałas korytarza, gwar w szatni i na stołówce</w:t>
-            </w:r>
-          </w:p>
-          <w:p>
-            <w:pPr>
-              <w:spacing w:after="40" w:before="0" w:line="245"/>
-              <w:ind w:left="220" w:hanging="220"/>
-            </w:pPr>
-            <w:r>
-              <w:rPr>
-                <w:rFonts w:ascii="Arial" w:cs="Arial" w:eastAsia="Arial" w:hAnsi="Arial"/>
-                <w:b/>
-                <w:bCs/>
-                <w:i w:val="false"/>
-                <w:iCs w:val="false"/>
-                <w:caps w:val="false"/>
-                <w:color w:val="BF382A"/>
-                <w:sz w:val="20"/>
-                <w:szCs w:val="20"/>
-              </w:rPr>
-              <w:t xml:space="preserve">•  </w:t>
-            </w:r>
-            <w:r>
-              <w:rPr>
-                <w:rFonts w:ascii="Arial" w:cs="Arial" w:eastAsia="Arial" w:hAnsi="Arial"/>
-                <w:b w:val="false"/>
-                <w:bCs w:val="false"/>
-                <w:i w:val="false"/>
-                <w:iCs w:val="false"/>
-                <w:caps w:val="false"/>
-                <w:color w:val="1A1530"/>
-                <w:sz w:val="20"/>
-                <w:szCs w:val="20"/>
-              </w:rPr>
-              <w:t xml:space="preserve">apele, uroczystości i wyjścia zbiorowe bez przygotowania</w:t>
-            </w:r>
-          </w:p>
-          <w:p>
-            <w:pPr>
-              <w:spacing w:after="40" w:before="0" w:line="245"/>
-              <w:ind w:left="220" w:hanging="220"/>
-            </w:pPr>
-            <w:r>
-              <w:rPr>
-                <w:rFonts w:ascii="Arial" w:cs="Arial" w:eastAsia="Arial" w:hAnsi="Arial"/>
-                <w:b/>
-                <w:bCs/>
-                <w:i w:val="false"/>
-                <w:iCs w:val="false"/>
-                <w:caps w:val="false"/>
-                <w:color w:val="BF382A"/>
-                <w:sz w:val="20"/>
-                <w:szCs w:val="20"/>
-              </w:rPr>
-              <w:t xml:space="preserve">•  </w:t>
-            </w:r>
-            <w:r>
-              <w:rPr>
-                <w:rFonts w:ascii="Arial" w:cs="Arial" w:eastAsia="Arial" w:hAnsi="Arial"/>
-                <w:b w:val="false"/>
-                <w:bCs w:val="false"/>
-                <w:i w:val="false"/>
-                <w:iCs w:val="false"/>
-                <w:caps w:val="false"/>
-                <w:color w:val="1A1530"/>
-                <w:sz w:val="20"/>
-                <w:szCs w:val="20"/>
-              </w:rPr>
-              <w:t xml:space="preserve">polecenia wieloetapowe podawane wyłącznie słownie</w:t>
-            </w:r>
-          </w:p>
-          <w:p>
-            <w:pPr>
-              <w:spacing w:after="40" w:before="0" w:line="245"/>
-              <w:ind w:left="220" w:hanging="220"/>
-            </w:pPr>
-            <w:r>
-              <w:rPr>
-                <w:rFonts w:ascii="Arial" w:cs="Arial" w:eastAsia="Arial" w:hAnsi="Arial"/>
-                <w:b/>
-                <w:bCs/>
-                <w:i w:val="false"/>
-                <w:iCs w:val="false"/>
-                <w:caps w:val="false"/>
-                <w:color w:val="BF382A"/>
-                <w:sz w:val="20"/>
-                <w:szCs w:val="20"/>
-              </w:rPr>
-              <w:t xml:space="preserve">•  </w:t>
-            </w:r>
-            <w:r>
-              <w:rPr>
-                <w:rFonts w:ascii="Arial" w:cs="Arial" w:eastAsia="Arial" w:hAnsi="Arial"/>
-                <w:b w:val="false"/>
-                <w:bCs w:val="false"/>
-                <w:i w:val="false"/>
-                <w:iCs w:val="false"/>
-                <w:caps w:val="false"/>
-                <w:color w:val="1A1530"/>
-                <w:sz w:val="20"/>
-                <w:szCs w:val="20"/>
-              </w:rPr>
-              <w:t xml:space="preserve">nagłe zmiany planu, zastępstwa, zmiana sali</w:t>
-            </w:r>
-          </w:p>
-          <w:p>
-            <w:pPr>
-              <w:spacing w:after="40" w:before="0" w:line="245"/>
-              <w:ind w:left="220" w:hanging="220"/>
-            </w:pPr>
-            <w:r>
-              <w:rPr>
-                <w:rFonts w:ascii="Arial" w:cs="Arial" w:eastAsia="Arial" w:hAnsi="Arial"/>
-                <w:b/>
-                <w:bCs/>
-                <w:i w:val="false"/>
-                <w:iCs w:val="false"/>
-                <w:caps w:val="false"/>
-                <w:color w:val="BF382A"/>
-                <w:sz w:val="20"/>
-                <w:szCs w:val="20"/>
-              </w:rPr>
-              <w:t xml:space="preserve">•  </w:t>
-            </w:r>
-            <w:r>
-              <w:rPr>
-                <w:rFonts w:ascii="Arial" w:cs="Arial" w:eastAsia="Arial" w:hAnsi="Arial"/>
-                <w:b w:val="false"/>
-                <w:bCs w:val="false"/>
-                <w:i w:val="false"/>
-                <w:iCs w:val="false"/>
-                <w:caps w:val="false"/>
-                <w:color w:val="1A1530"/>
-                <w:sz w:val="20"/>
-                <w:szCs w:val="20"/>
-              </w:rPr>
-              <w:t xml:space="preserve">faktury klejące i mokre podczas zajęć plastycznych</w:t>
-            </w:r>
+              <w:top w:val="nil"/>
+              <w:left w:val="nil"/>
+              <w:bottom w:val="nil"/>
+              <w:right w:val="nil"/>
+            </w:tcBorders>
+            <w:tcMar>
+              <w:top w:type="dxa" w:w="15"/>
+              <w:left w:type="dxa" w:w="0"/>
+              <w:bottom w:type="dxa" w:w="15"/>
+              <w:right w:type="dxa" w:w="100"/>
+            </w:tcMar>
+            <w:vAlign w:val="top"/>
+          </w:tcPr>
+          <w:p>
+            <w:pPr>
+              <w:spacing w:after="0" w:before="0"/>
+            </w:pPr>
           </w:p>
         </w:tc>
       </w:tr>
     </w:tbl>
     <w:p>
       <w:pPr>
-        <w:spacing w:after="60" w:before="80" w:line="240"/>
+        <w:spacing w:after="0" w:before="40" w:line="240"/>
         <w:jc w:val="both"/>
       </w:pPr>
-      <w:r>
-        <w:rPr>
-          <w:rFonts w:ascii="Arial" w:cs="Arial" w:eastAsia="Arial" w:hAnsi="Arial"/>
-          <w:b/>
-          <w:bCs/>
-          <w:i w:val="false"/>
-          <w:iCs w:val="false"/>
-          <w:caps w:val="false"/>
-          <w:color w:val="2D1B69"/>
-          <w:sz w:val="20"/>
-          <w:szCs w:val="20"/>
-        </w:rPr>
-        <w:t xml:space="preserve">Informacje od dziecka i rodziców (§ 8 ust. 3 pkt 1 i 3): </w:t>
-      </w:r>
-      <w:r>
-        <w:rPr>
-          <w:rFonts w:ascii="Arial" w:cs="Arial" w:eastAsia="Arial" w:hAnsi="Arial"/>
-          <w:b w:val="false"/>
-          <w:bCs w:val="false"/>
-          <w:i w:val="false"/>
-          <w:iCs w:val="false"/>
-          <w:caps w:val="false"/>
-          <w:color w:val="1A1530"/>
-          <w:sz w:val="20"/>
-          <w:szCs w:val="20"/>
-        </w:rPr>
-        <w:t xml:space="preserve">Informacje od dziecka (w formie dostosowanej do rozwoju) i od rodziców: lubi klocki, tablet z aplikacją o kosmosie i huśtanie; najtrudniejsze są hałas, zmiany planu i mokre ręce; pomagają cisza, plan dnia, słuchawki i wsparcie nauczyciela. Rodzice potwierdzają obraz funkcjonowania i wskazują potrzebę stałej kadry.</w:t>
-      </w:r>
-    </w:p>
-    <w:p>
-      <w:pPr>
-        <w:keepNext/>
-        <w:spacing w:after="90" w:before="140"/>
-      </w:pPr>
-      <w:r>
-        <w:rPr>
-          <w:rFonts w:ascii="Arial" w:cs="Arial" w:eastAsia="Arial" w:hAnsi="Arial"/>
-          <w:b/>
-          <w:bCs/>
-          <w:i w:val="false"/>
-          <w:iCs w:val="false"/>
-          <w:caps w:val="false"/>
-          <w:color w:val="FFFFFF"/>
-          <w:sz w:val="24"/>
-          <w:szCs w:val="24"/>
-          <w:shd w:fill="2D6BB3" w:color="auto" w:val="clear"/>
-        </w:rPr>
-        <w:t xml:space="preserve"> ! </w:t>
-      </w:r>
       <w:r>
         <w:rPr>
           <w:rFonts w:ascii="Arial" w:cs="Arial" w:eastAsia="Arial" w:hAnsi="Arial"/>
@@ -6816,7 +6482,7 @@
           <w:sz w:val="24"/>
           <w:szCs w:val="24"/>
         </w:rPr>
-        <w:t xml:space="preserve">   Stanowisko placówki w sprawie potrzeb dziecka / ucznia (dla zespołu orzekającego)</w:t>
+        <w:t xml:space="preserve">Uzasadnienie: </w:t>
       </w:r>
       <w:r>
         <w:rPr>
@@ -6826,11 +6492,49 @@
           <w:i w:val="false"/>
           <w:iCs w:val="false"/>
           <w:caps w:val="false"/>
-          <w:color w:val="6B6378"/>
-          <w:sz w:val="20"/>
-          <w:szCs w:val="20"/>
+          <w:color w:val="1A1530"/>
+          <w:sz w:val="24"/>
+          <w:szCs w:val="24"/>
         </w:rPr>
-        <w:t xml:space="preserve"/>
+        <w:t xml:space="preserve">Wysoka potrzeba wsparcia w domenach d2, d7 i d9, potrzeba stałej komunikacji wspomagającej oraz ucieczkowa funkcja zachowań trudnych, którą kontroluje obecność przewidywalnego dorosłego. Dotychczasowe działania przyniosły mierzalną poprawę, co uzasadnia ich kontynuację i rozszerzenie w ramach kształcenia specjalnego.</w:t>
+      </w:r>
+    </w:p>
+    <w:p>
+      <w:pPr>
+        <w:keepNext/>
+        <w:pBdr>
+          <w:bottom w:val="single" w:color="D9D0F0" w:sz="24" w:space="4"/>
+        </w:pBdr>
+        <w:spacing w:after="100" w:before="180"/>
+      </w:pPr>
+      <w:r>
+        <w:rPr>
+          <w:rFonts w:ascii="Arial" w:cs="Arial" w:eastAsia="Arial" w:hAnsi="Arial"/>
+          <w:b/>
+          <w:bCs/>
+          <w:i w:val="false"/>
+          <w:iCs w:val="false"/>
+          <w:caps w:val="false"/>
+          <w:color w:val="E74509"/>
+          <w:sz w:val="24"/>
+          <w:szCs w:val="24"/>
+        </w:rPr>
+        <w:t xml:space="preserve">9.  </w:t>
+      </w:r>
+      <w:r>
+        <w:rPr>
+          <w:rFonts w:ascii="Arial" w:cs="Arial" w:eastAsia="Arial" w:hAnsi="Arial"/>
+          <w:b/>
+          <w:bCs/>
+          <w:i w:val="false"/>
+          <w:iCs w:val="false"/>
+          <w:caps w:val="false"/>
+          <w:color w:val="2D1B69"/>
+          <w:spacing w:val="8"/>
+          <w:sz w:val="24"/>
+          <w:szCs w:val="24"/>
+        </w:rPr>
+        <w:t xml:space="preserve">OSOBY, KTÓRE ROZPOZNAŁY TRUDNOŚCI, MOCNE STRONY I UZDOLNIENIA (NAUCZYCIELE, WYCHOWAWCY, SPECJALIŚCI PROWADZĄCY ZAJĘCIA)</w:t>
       </w:r>
     </w:p>
     <w:tbl>
@@ -6863,13 +6567,47 @@
               <w:right w:val="nil"/>
             </w:tcBorders>
             <w:tcMar>
-              <w:top w:type="dxa" w:w="15"/>
+              <w:top w:type="dxa" w:w="40"/>
               <w:left w:type="dxa" w:w="0"/>
-              <w:bottom w:type="dxa" w:w="15"/>
-              <w:right w:type="dxa" w:w="100"/>
-            </w:tcMar>
-            <w:vAlign w:val="top"/>
-          </w:tcPr>
+              <w:bottom w:type="dxa" w:w="40"/>
+              <w:right w:type="dxa" w:w="200"/>
+            </w:tcMar>
+            <w:vAlign w:val="top"/>
+          </w:tcPr>
+          <w:p>
+            <w:pPr>
+              <w:spacing w:after="10" w:before="0" w:line="276"/>
+              <w:jc w:val="left"/>
+            </w:pPr>
+            <w:r>
+              <w:rPr>
+                <w:rFonts w:ascii="Arial" w:cs="Arial" w:eastAsia="Arial" w:hAnsi="Arial"/>
+                <w:b/>
+                <w:bCs/>
+                <w:i w:val="false"/>
+                <w:iCs w:val="false"/>
+                <w:caps w:val="false"/>
+                <w:color w:val="2D1B69"/>
+                <w:sz w:val="24"/>
+                <w:szCs w:val="24"/>
+              </w:rPr>
+              <w:t xml:space="preserve">Wychowawca / nauczyciel: </w:t>
+            </w:r>
+            <w:r>
+              <w:rPr>
+                <w:rFonts w:ascii="Arial" w:cs="Arial" w:eastAsia="Arial" w:hAnsi="Arial"/>
+                <w:b w:val="false"/>
+                <w:bCs w:val="false"/>
+                <w:i w:val="false"/>
+                <w:iCs w:val="false"/>
+                <w:caps w:val="false"/>
+                <w:color w:val="1A1530"/>
+                <w:sz w:val="24"/>
+                <w:szCs w:val="24"/>
+              </w:rPr>
+              <w:t xml:space="preserve">[Imię i nazwisko]</w:t>
+            </w:r>
+          </w:p>
           <w:p>
             <w:pPr>
               <w:spacing w:after="0" w:before="0" w:line="276"/>
@@ -6883,25 +6621,11 @@
                 <w:i w:val="false"/>
                 <w:iCs w:val="false"/>
                 <w:caps w:val="false"/>
-                <w:color w:val="E74509"/>
-                <w:sz w:val="24"/>
-                <w:szCs w:val="24"/>
-              </w:rPr>
-              <w:t xml:space="preserve">☑  </w:t>
-            </w:r>
-            <w:r>
-              <w:rPr>
-                <w:rFonts w:ascii="Arial" w:cs="Arial" w:eastAsia="Arial" w:hAnsi="Arial"/>
-                <w:b w:val="false"/>
-                <w:bCs w:val="false"/>
-                <w:i w:val="false"/>
-                <w:iCs w:val="false"/>
-                <w:caps w:val="false"/>
-                <w:color w:val="1A1530"/>
-                <w:sz w:val="24"/>
-                <w:szCs w:val="24"/>
-              </w:rPr>
-              <w:t xml:space="preserve">Potrzeba kształcenia specjalnego (wydanie / aktualizacja orzeczenia) z uwagi na autyzm</w:t>
+                <w:color w:val="6B6378"/>
+                <w:sz w:val="24"/>
+                <w:szCs w:val="24"/>
+              </w:rPr>
+              <w:t xml:space="preserve">podpis: ………………………………………</w:t>
             </w:r>
           </w:p>
         </w:tc>
@@ -6915,13 +6639,47 @@
               <w:right w:val="nil"/>
             </w:tcBorders>
             <w:tcMar>
-              <w:top w:type="dxa" w:w="15"/>
+              <w:top w:type="dxa" w:w="40"/>
               <w:left w:type="dxa" w:w="0"/>
-              <w:bottom w:type="dxa" w:w="15"/>
-              <w:right w:type="dxa" w:w="100"/>
-            </w:tcMar>
-            <w:vAlign w:val="top"/>
-          </w:tcPr>
+              <w:bottom w:type="dxa" w:w="40"/>
+              <w:right w:type="dxa" w:w="200"/>
+            </w:tcMar>
+            <w:vAlign w:val="top"/>
+          </w:tcPr>
+          <w:p>
+            <w:pPr>
+              <w:spacing w:after="10" w:before="0" w:line="276"/>
+              <w:jc w:val="left"/>
+            </w:pPr>
+            <w:r>
+              <w:rPr>
+                <w:rFonts w:ascii="Arial" w:cs="Arial" w:eastAsia="Arial" w:hAnsi="Arial"/>
+                <w:b/>
+                <w:bCs/>
+                <w:i w:val="false"/>
+                <w:iCs w:val="false"/>
+                <w:caps w:val="false"/>
+                <w:color w:val="2D1B69"/>
+                <w:sz w:val="24"/>
+                <w:szCs w:val="24"/>
+              </w:rPr>
+              <w:t xml:space="preserve">Pedagog specjalny: </w:t>
+            </w:r>
+            <w:r>
+              <w:rPr>
+                <w:rFonts w:ascii="Arial" w:cs="Arial" w:eastAsia="Arial" w:hAnsi="Arial"/>
+                <w:b w:val="false"/>
+                <w:bCs w:val="false"/>
+                <w:i w:val="false"/>
+                <w:iCs w:val="false"/>
+                <w:caps w:val="false"/>
+                <w:color w:val="1A1530"/>
+                <w:sz w:val="24"/>
+                <w:szCs w:val="24"/>
+              </w:rPr>
+              <w:t xml:space="preserve">[Imię i nazwisko]</w:t>
+            </w:r>
+          </w:p>
           <w:p>
             <w:pPr>
               <w:spacing w:after="0" w:before="0" w:line="276"/>
@@ -6935,25 +6693,11 @@
                 <w:i w:val="false"/>
                 <w:iCs w:val="false"/>
                 <w:caps w:val="false"/>
-                <w:color w:val="E74509"/>
-                <w:sz w:val="24"/>
-                <w:szCs w:val="24"/>
-              </w:rPr>
-              <w:t xml:space="preserve">☑  </w:t>
-            </w:r>
-            <w:r>
-              <w:rPr>
-                <w:rFonts w:ascii="Arial" w:cs="Arial" w:eastAsia="Arial" w:hAnsi="Arial"/>
-                <w:b w:val="false"/>
-                <w:bCs w:val="false"/>
-                <w:i w:val="false"/>
-                <w:iCs w:val="false"/>
-                <w:caps w:val="false"/>
-                <w:color w:val="1A1530"/>
-                <w:sz w:val="24"/>
-                <w:szCs w:val="24"/>
-              </w:rPr>
-              <w:t xml:space="preserve">Zajęcia rewalidacyjne – wnioskowany zakres: komunikacja i AAC, umiejętności społeczne, motoryka mała</w:t>
+                <w:color w:val="6B6378"/>
+                <w:sz w:val="24"/>
+                <w:szCs w:val="24"/>
+              </w:rPr>
+              <w:t xml:space="preserve">podpis: ………………………………………</w:t>
             </w:r>
           </w:p>
         </w:tc>
@@ -6972,13 +6716,47 @@
               <w:right w:val="nil"/>
             </w:tcBorders>
             <w:tcMar>
-              <w:top w:type="dxa" w:w="15"/>
+              <w:top w:type="dxa" w:w="40"/>
               <w:left w:type="dxa" w:w="0"/>
-              <w:bottom w:type="dxa" w:w="15"/>
-              <w:right w:type="dxa" w:w="100"/>
-            </w:tcMar>
-            <w:vAlign w:val="top"/>
-          </w:tcPr>
+              <w:bottom w:type="dxa" w:w="40"/>
+              <w:right w:type="dxa" w:w="200"/>
+            </w:tcMar>
+            <w:vAlign w:val="top"/>
+          </w:tcPr>
+          <w:p>
+            <w:pPr>
+              <w:spacing w:after="10" w:before="0" w:line="276"/>
+              <w:jc w:val="left"/>
+            </w:pPr>
+            <w:r>
+              <w:rPr>
+                <w:rFonts w:ascii="Arial" w:cs="Arial" w:eastAsia="Arial" w:hAnsi="Arial"/>
+                <w:b/>
+                <w:bCs/>
+                <w:i w:val="false"/>
+                <w:iCs w:val="false"/>
+                <w:caps w:val="false"/>
+                <w:color w:val="2D1B69"/>
+                <w:sz w:val="24"/>
+                <w:szCs w:val="24"/>
+              </w:rPr>
+              <w:t xml:space="preserve">Psycholog: </w:t>
+            </w:r>
+            <w:r>
+              <w:rPr>
+                <w:rFonts w:ascii="Arial" w:cs="Arial" w:eastAsia="Arial" w:hAnsi="Arial"/>
+                <w:b w:val="false"/>
+                <w:bCs w:val="false"/>
+                <w:i w:val="false"/>
+                <w:iCs w:val="false"/>
+                <w:caps w:val="false"/>
+                <w:color w:val="1A1530"/>
+                <w:sz w:val="24"/>
+                <w:szCs w:val="24"/>
+              </w:rPr>
+              <w:t xml:space="preserve">[Imię i nazwisko]</w:t>
+            </w:r>
+          </w:p>
           <w:p>
             <w:pPr>
               <w:spacing w:after="0" w:before="0" w:line="276"/>
@@ -6992,25 +6770,11 @@
                 <w:i w:val="false"/>
                 <w:iCs w:val="false"/>
                 <w:caps w:val="false"/>
-                <w:color w:val="E74509"/>
-                <w:sz w:val="24"/>
-                <w:szCs w:val="24"/>
-              </w:rPr>
-              <w:t xml:space="preserve">☑  </w:t>
-            </w:r>
-            <w:r>
-              <w:rPr>
-                <w:rFonts w:ascii="Arial" w:cs="Arial" w:eastAsia="Arial" w:hAnsi="Arial"/>
-                <w:b w:val="false"/>
-                <w:bCs w:val="false"/>
-                <w:i w:val="false"/>
-                <w:iCs w:val="false"/>
-                <w:caps w:val="false"/>
-                <w:color w:val="1A1530"/>
-                <w:sz w:val="24"/>
-                <w:szCs w:val="24"/>
-              </w:rPr>
-              <w:t xml:space="preserve">Wsparcie dodatkowej osoby – nauczyciel współorganizujący kształcenie (zajęcia kierowane, przejścia, wydarzenia grupowe)</w:t>
+                <w:color w:val="6B6378"/>
+                <w:sz w:val="24"/>
+                <w:szCs w:val="24"/>
+              </w:rPr>
+              <w:t xml:space="preserve">podpis: ………………………………………</w:t>
             </w:r>
           </w:p>
         </w:tc>
@@ -7024,341 +6788,6 @@
               <w:right w:val="nil"/>
             </w:tcBorders>
             <w:tcMar>
-              <w:top w:type="dxa" w:w="15"/>
-              <w:left w:type="dxa" w:w="0"/>
-              <w:bottom w:type="dxa" w:w="15"/>
-              <w:right w:type="dxa" w:w="100"/>
-            </w:tcMar>
-            <w:vAlign w:val="top"/>
-          </w:tcPr>
-          <w:p>
-            <w:pPr>
-              <w:spacing w:after="0" w:before="0" w:line="276"/>
-              <w:jc w:val="left"/>
-            </w:pPr>
-            <w:r>
-              <w:rPr>
-                <w:rFonts w:ascii="Arial" w:cs="Arial" w:eastAsia="Arial" w:hAnsi="Arial"/>
-                <w:b w:val="false"/>
-                <w:bCs w:val="false"/>
-                <w:i w:val="false"/>
-                <w:iCs w:val="false"/>
-                <w:caps w:val="false"/>
-                <w:color w:val="E74509"/>
-                <w:sz w:val="24"/>
-                <w:szCs w:val="24"/>
-              </w:rPr>
-              <w:t xml:space="preserve">☑  </w:t>
-            </w:r>
-            <w:r>
-              <w:rPr>
-                <w:rFonts w:ascii="Arial" w:cs="Arial" w:eastAsia="Arial" w:hAnsi="Arial"/>
-                <w:b w:val="false"/>
-                <w:bCs w:val="false"/>
-                <w:i w:val="false"/>
-                <w:iCs w:val="false"/>
-                <w:caps w:val="false"/>
-                <w:color w:val="1A1530"/>
-                <w:sz w:val="24"/>
-                <w:szCs w:val="24"/>
-              </w:rPr>
-              <w:t xml:space="preserve">Kontynuacja pomocy psychologiczno-pedagogicznej w dotychczasowych formach</w:t>
-            </w:r>
-          </w:p>
-        </w:tc>
-      </w:tr>
-      <w:tr>
-        <w:trPr>
-          <w:cantSplit/>
-        </w:trPr>
-        <w:tc>
-          <w:tcPr>
-            <w:tcW w:type="dxa" w:w="5103"/>
-            <w:tcBorders>
-              <w:top w:val="nil"/>
-              <w:left w:val="nil"/>
-              <w:bottom w:val="nil"/>
-              <w:right w:val="nil"/>
-            </w:tcBorders>
-            <w:tcMar>
-              <w:top w:type="dxa" w:w="15"/>
-              <w:left w:type="dxa" w:w="0"/>
-              <w:bottom w:type="dxa" w:w="15"/>
-              <w:right w:type="dxa" w:w="100"/>
-            </w:tcMar>
-            <w:vAlign w:val="top"/>
-          </w:tcPr>
-          <w:p>
-            <w:pPr>
-              <w:spacing w:after="0" w:before="0" w:line="276"/>
-              <w:jc w:val="left"/>
-            </w:pPr>
-            <w:r>
-              <w:rPr>
-                <w:rFonts w:ascii="Arial" w:cs="Arial" w:eastAsia="Arial" w:hAnsi="Arial"/>
-                <w:b w:val="false"/>
-                <w:bCs w:val="false"/>
-                <w:i w:val="false"/>
-                <w:iCs w:val="false"/>
-                <w:caps w:val="false"/>
-                <w:color w:val="B6A6DF"/>
-                <w:sz w:val="24"/>
-                <w:szCs w:val="24"/>
-              </w:rPr>
-              <w:t xml:space="preserve">☐  </w:t>
-            </w:r>
-            <w:r>
-              <w:rPr>
-                <w:rFonts w:ascii="Arial" w:cs="Arial" w:eastAsia="Arial" w:hAnsi="Arial"/>
-                <w:b w:val="false"/>
-                <w:bCs w:val="false"/>
-                <w:i w:val="false"/>
-                <w:iCs w:val="false"/>
-                <w:caps w:val="false"/>
-                <w:color w:val="1A1530"/>
-                <w:sz w:val="24"/>
-                <w:szCs w:val="24"/>
-              </w:rPr>
-              <w:t xml:space="preserve">Indywidualne nauczanie / zindywidualizowana ścieżka kształcenia</w:t>
-            </w:r>
-          </w:p>
-        </w:tc>
-        <w:tc>
-          <w:tcPr>
-            <w:tcW w:type="dxa" w:w="5103"/>
-            <w:tcBorders>
-              <w:top w:val="nil"/>
-              <w:left w:val="nil"/>
-              <w:bottom w:val="nil"/>
-              <w:right w:val="nil"/>
-            </w:tcBorders>
-            <w:tcMar>
-              <w:top w:type="dxa" w:w="15"/>
-              <w:left w:type="dxa" w:w="0"/>
-              <w:bottom w:type="dxa" w:w="15"/>
-              <w:right w:type="dxa" w:w="100"/>
-            </w:tcMar>
-            <w:vAlign w:val="top"/>
-          </w:tcPr>
-          <w:p>
-            <w:pPr>
-              <w:spacing w:after="0" w:before="0" w:line="276"/>
-              <w:jc w:val="left"/>
-            </w:pPr>
-            <w:r>
-              <w:rPr>
-                <w:rFonts w:ascii="Arial" w:cs="Arial" w:eastAsia="Arial" w:hAnsi="Arial"/>
-                <w:b w:val="false"/>
-                <w:bCs w:val="false"/>
-                <w:i w:val="false"/>
-                <w:iCs w:val="false"/>
-                <w:caps w:val="false"/>
-                <w:color w:val="B6A6DF"/>
-                <w:sz w:val="24"/>
-                <w:szCs w:val="24"/>
-              </w:rPr>
-              <w:t xml:space="preserve">☐  </w:t>
-            </w:r>
-            <w:r>
-              <w:rPr>
-                <w:rFonts w:ascii="Arial" w:cs="Arial" w:eastAsia="Arial" w:hAnsi="Arial"/>
-                <w:b w:val="false"/>
-                <w:bCs w:val="false"/>
-                <w:i w:val="false"/>
-                <w:iCs w:val="false"/>
-                <w:caps w:val="false"/>
-                <w:color w:val="1A1530"/>
-                <w:sz w:val="24"/>
-                <w:szCs w:val="24"/>
-              </w:rPr>
-              <w:t xml:space="preserve">Wczesne wspomaganie rozwoju</w:t>
-            </w:r>
-          </w:p>
-        </w:tc>
-      </w:tr>
-      <w:tr>
-        <w:trPr>
-          <w:cantSplit/>
-        </w:trPr>
-        <w:tc>
-          <w:tcPr>
-            <w:tcW w:type="dxa" w:w="5103"/>
-            <w:tcBorders>
-              <w:top w:val="nil"/>
-              <w:left w:val="nil"/>
-              <w:bottom w:val="nil"/>
-              <w:right w:val="nil"/>
-            </w:tcBorders>
-            <w:tcMar>
-              <w:top w:type="dxa" w:w="15"/>
-              <w:left w:type="dxa" w:w="0"/>
-              <w:bottom w:type="dxa" w:w="15"/>
-              <w:right w:type="dxa" w:w="100"/>
-            </w:tcMar>
-            <w:vAlign w:val="top"/>
-          </w:tcPr>
-          <w:p>
-            <w:pPr>
-              <w:spacing w:after="0" w:before="0" w:line="276"/>
-              <w:jc w:val="left"/>
-            </w:pPr>
-            <w:r>
-              <w:rPr>
-                <w:rFonts w:ascii="Arial" w:cs="Arial" w:eastAsia="Arial" w:hAnsi="Arial"/>
-                <w:b w:val="false"/>
-                <w:bCs w:val="false"/>
-                <w:i w:val="false"/>
-                <w:iCs w:val="false"/>
-                <w:caps w:val="false"/>
-                <w:color w:val="B6A6DF"/>
-                <w:sz w:val="24"/>
-                <w:szCs w:val="24"/>
-              </w:rPr>
-              <w:t xml:space="preserve">☐  </w:t>
-            </w:r>
-            <w:r>
-              <w:rPr>
-                <w:rFonts w:ascii="Arial" w:cs="Arial" w:eastAsia="Arial" w:hAnsi="Arial"/>
-                <w:b w:val="false"/>
-                <w:bCs w:val="false"/>
-                <w:i w:val="false"/>
-                <w:iCs w:val="false"/>
-                <w:caps w:val="false"/>
-                <w:color w:val="1A1530"/>
-                <w:sz w:val="24"/>
-                <w:szCs w:val="24"/>
-              </w:rPr>
-              <w:t xml:space="preserve">Inne: ……………………………………………</w:t>
-            </w:r>
-          </w:p>
-        </w:tc>
-        <w:tc>
-          <w:tcPr>
-            <w:tcW w:type="dxa" w:w="5103"/>
-            <w:tcBorders>
-              <w:top w:val="nil"/>
-              <w:left w:val="nil"/>
-              <w:bottom w:val="nil"/>
-              <w:right w:val="nil"/>
-            </w:tcBorders>
-            <w:tcMar>
-              <w:top w:type="dxa" w:w="15"/>
-              <w:left w:type="dxa" w:w="0"/>
-              <w:bottom w:type="dxa" w:w="15"/>
-              <w:right w:type="dxa" w:w="100"/>
-            </w:tcMar>
-            <w:vAlign w:val="top"/>
-          </w:tcPr>
-          <w:p>
-            <w:pPr>
-              <w:spacing w:after="0" w:before="0"/>
-            </w:pPr>
-          </w:p>
-        </w:tc>
-      </w:tr>
-    </w:tbl>
-    <w:p>
-      <w:pPr>
-        <w:spacing w:after="0" w:before="40" w:line="240"/>
-        <w:jc w:val="both"/>
-      </w:pPr>
-      <w:r>
-        <w:rPr>
-          <w:rFonts w:ascii="Arial" w:cs="Arial" w:eastAsia="Arial" w:hAnsi="Arial"/>
-          <w:b/>
-          <w:bCs/>
-          <w:i w:val="false"/>
-          <w:iCs w:val="false"/>
-          <w:caps w:val="false"/>
-          <w:color w:val="2D1B69"/>
-          <w:sz w:val="20"/>
-          <w:szCs w:val="20"/>
-        </w:rPr>
-        <w:t xml:space="preserve">Uzasadnienie: </w:t>
-      </w:r>
-      <w:r>
-        <w:rPr>
-          <w:rFonts w:ascii="Arial" w:cs="Arial" w:eastAsia="Arial" w:hAnsi="Arial"/>
-          <w:b w:val="false"/>
-          <w:bCs w:val="false"/>
-          <w:i w:val="false"/>
-          <w:iCs w:val="false"/>
-          <w:caps w:val="false"/>
-          <w:color w:val="1A1530"/>
-          <w:sz w:val="20"/>
-          <w:szCs w:val="20"/>
-        </w:rPr>
-        <w:t xml:space="preserve">Wysoka potrzeba wsparcia w domenach d2, d7 i d9, potrzeba stałej komunikacji wspomagającej oraz ucieczkowa funkcja zachowań trudnych, którą kontroluje obecność przewidywalnego dorosłego. Dotychczasowe działania przyniosły mierzalną poprawę, co uzasadnia ich kontynuację i rozszerzenie w ramach kształcenia specjalnego.</w:t>
-      </w:r>
-    </w:p>
-    <w:p>
-      <w:pPr>
-        <w:keepNext/>
-        <w:pBdr>
-          <w:bottom w:val="single" w:color="D9D0F0" w:sz="20" w:space="4"/>
-        </w:pBdr>
-        <w:spacing w:after="100" w:before="180"/>
-      </w:pPr>
-      <w:r>
-        <w:rPr>
-          <w:rFonts w:ascii="Arial" w:cs="Arial" w:eastAsia="Arial" w:hAnsi="Arial"/>
-          <w:b/>
-          <w:bCs/>
-          <w:i w:val="false"/>
-          <w:iCs w:val="false"/>
-          <w:caps w:val="false"/>
-          <w:color w:val="E74509"/>
-          <w:sz w:val="24"/>
-          <w:szCs w:val="24"/>
-        </w:rPr>
-        <w:t xml:space="preserve">9.  </w:t>
-      </w:r>
-      <w:r>
-        <w:rPr>
-          <w:rFonts w:ascii="Arial" w:cs="Arial" w:eastAsia="Arial" w:hAnsi="Arial"/>
-          <w:b/>
-          <w:bCs/>
-          <w:i w:val="false"/>
-          <w:iCs w:val="false"/>
-          <w:caps w:val="false"/>
-          <w:color w:val="2D1B69"/>
-          <w:spacing w:val="8"/>
-          <w:sz w:val="24"/>
-          <w:szCs w:val="24"/>
-        </w:rPr>
-        <w:t xml:space="preserve">OSOBY, KTÓRE ROZPOZNAŁY TRUDNOŚCI, MOCNE STRONY I UZDOLNIENIA (NAUCZYCIELE, WYCHOWAWCY, SPECJALIŚCI PROWADZĄCY ZAJĘCIA)</w:t>
-      </w:r>
-    </w:p>
-    <w:tbl>
-      <w:tblPr>
-        <w:tblW w:type="dxa" w:w="10206"/>
-        <w:tblBorders>
-          <w:top w:val="single" w:color="auto" w:sz="4"/>
-          <w:left w:val="single" w:color="auto" w:sz="4"/>
-          <w:bottom w:val="single" w:color="auto" w:sz="4"/>
-          <w:right w:val="single" w:color="auto" w:sz="4"/>
-          <w:insideH w:val="single" w:color="auto" w:sz="4"/>
-          <w:insideV w:val="single" w:color="auto" w:sz="4"/>
-        </w:tblBorders>
-      </w:tblPr>
-      <w:tblGrid>
-        <w:gridCol w:w="5103"/>
-        <w:gridCol w:w="5103"/>
-      </w:tblGrid>
-      <w:tr>
-        <w:trPr>
-          <w:cantSplit/>
-        </w:trPr>
-        <w:tc>
-          <w:tcPr>
-            <w:tcW w:type="dxa" w:w="5103"/>
-            <w:tcBorders>
-              <w:top w:val="nil"/>
-              <w:left w:val="nil"/>
-              <w:bottom w:val="nil"/>
-              <w:right w:val="nil"/>
-            </w:tcBorders>
-            <w:tcMar>
               <w:top w:type="dxa" w:w="40"/>
               <w:left w:type="dxa" w:w="0"/>
               <w:bottom w:type="dxa" w:w="40"/>
@@ -7380,10 +6809,10 @@
                 <w:iCs w:val="false"/>
                 <w:caps w:val="false"/>
                 <w:color w:val="2D1B69"/>
-                <w:sz w:val="20"/>
-                <w:szCs w:val="20"/>
-              </w:rPr>
-              <w:t xml:space="preserve">Wychowawca / nauczyciel: </w:t>
+                <w:sz w:val="24"/>
+                <w:szCs w:val="24"/>
+              </w:rPr>
+              <w:t xml:space="preserve">Logopeda: </w:t>
             </w:r>
             <w:r>
               <w:rPr>
@@ -7394,8 +6823,8 @@
                 <w:iCs w:val="false"/>
                 <w:caps w:val="false"/>
                 <w:color w:val="1A1530"/>
-                <w:sz w:val="20"/>
-                <w:szCs w:val="20"/>
+                <w:sz w:val="24"/>
+                <w:szCs w:val="24"/>
               </w:rPr>
               <w:t xml:space="preserve">[Imię i nazwisko]</w:t>
             </w:r>
@@ -7414,229 +6843,8 @@
                 <w:iCs w:val="false"/>
                 <w:caps w:val="false"/>
                 <w:color w:val="6B6378"/>
-                <w:sz w:val="20"/>
-                <w:szCs w:val="20"/>
-              </w:rPr>
-              <w:t xml:space="preserve">podpis: ………………………………………</w:t>
-            </w:r>
-          </w:p>
-        </w:tc>
-        <w:tc>
-          <w:tcPr>
-            <w:tcW w:type="dxa" w:w="5103"/>
-            <w:tcBorders>
-              <w:top w:val="nil"/>
-              <w:left w:val="nil"/>
-              <w:bottom w:val="nil"/>
-              <w:right w:val="nil"/>
-            </w:tcBorders>
-            <w:tcMar>
-              <w:top w:type="dxa" w:w="40"/>
-              <w:left w:type="dxa" w:w="0"/>
-              <w:bottom w:type="dxa" w:w="40"/>
-              <w:right w:type="dxa" w:w="200"/>
-            </w:tcMar>
-            <w:vAlign w:val="top"/>
-          </w:tcPr>
-          <w:p>
-            <w:pPr>
-              <w:spacing w:after="10" w:before="0" w:line="276"/>
-              <w:jc w:val="left"/>
-            </w:pPr>
-            <w:r>
-              <w:rPr>
-                <w:rFonts w:ascii="Arial" w:cs="Arial" w:eastAsia="Arial" w:hAnsi="Arial"/>
-                <w:b/>
-                <w:bCs/>
-                <w:i w:val="false"/>
-                <w:iCs w:val="false"/>
-                <w:caps w:val="false"/>
-                <w:color w:val="2D1B69"/>
-                <w:sz w:val="20"/>
-                <w:szCs w:val="20"/>
-              </w:rPr>
-              <w:t xml:space="preserve">Pedagog specjalny: </w:t>
-            </w:r>
-            <w:r>
-              <w:rPr>
-                <w:rFonts w:ascii="Arial" w:cs="Arial" w:eastAsia="Arial" w:hAnsi="Arial"/>
-                <w:b w:val="false"/>
-                <w:bCs w:val="false"/>
-                <w:i w:val="false"/>
-                <w:iCs w:val="false"/>
-                <w:caps w:val="false"/>
-                <w:color w:val="1A1530"/>
-                <w:sz w:val="20"/>
-                <w:szCs w:val="20"/>
-              </w:rPr>
-              <w:t xml:space="preserve">[Imię i nazwisko]</w:t>
-            </w:r>
-          </w:p>
-          <w:p>
-            <w:pPr>
-              <w:spacing w:after="0" w:before="0" w:line="276"/>
-              <w:jc w:val="left"/>
-            </w:pPr>
-            <w:r>
-              <w:rPr>
-                <w:rFonts w:ascii="Arial" w:cs="Arial" w:eastAsia="Arial" w:hAnsi="Arial"/>
-                <w:b w:val="false"/>
-                <w:bCs w:val="false"/>
-                <w:i w:val="false"/>
-                <w:iCs w:val="false"/>
-                <w:caps w:val="false"/>
-                <w:color w:val="6B6378"/>
-                <w:sz w:val="20"/>
-                <w:szCs w:val="20"/>
-              </w:rPr>
-              <w:t xml:space="preserve">podpis: ………………………………………</w:t>
-            </w:r>
-          </w:p>
-        </w:tc>
-      </w:tr>
-      <w:tr>
-        <w:trPr>
-          <w:cantSplit/>
-        </w:trPr>
-        <w:tc>
-          <w:tcPr>
-            <w:tcW w:type="dxa" w:w="5103"/>
-            <w:tcBorders>
-              <w:top w:val="nil"/>
-              <w:left w:val="nil"/>
-              <w:bottom w:val="nil"/>
-              <w:right w:val="nil"/>
-            </w:tcBorders>
-            <w:tcMar>
-              <w:top w:type="dxa" w:w="40"/>
-              <w:left w:type="dxa" w:w="0"/>
-              <w:bottom w:type="dxa" w:w="40"/>
-              <w:right w:type="dxa" w:w="200"/>
-            </w:tcMar>
-            <w:vAlign w:val="top"/>
-          </w:tcPr>
-          <w:p>
-            <w:pPr>
-              <w:spacing w:after="10" w:before="0" w:line="276"/>
-              <w:jc w:val="left"/>
-            </w:pPr>
-            <w:r>
-              <w:rPr>
-                <w:rFonts w:ascii="Arial" w:cs="Arial" w:eastAsia="Arial" w:hAnsi="Arial"/>
-                <w:b/>
-                <w:bCs/>
-                <w:i w:val="false"/>
-                <w:iCs w:val="false"/>
-                <w:caps w:val="false"/>
-                <w:color w:val="2D1B69"/>
-                <w:sz w:val="20"/>
-                <w:szCs w:val="20"/>
-              </w:rPr>
-              <w:t xml:space="preserve">Psycholog: </w:t>
-            </w:r>
-            <w:r>
-              <w:rPr>
-                <w:rFonts w:ascii="Arial" w:cs="Arial" w:eastAsia="Arial" w:hAnsi="Arial"/>
-                <w:b w:val="false"/>
-                <w:bCs w:val="false"/>
-                <w:i w:val="false"/>
-                <w:iCs w:val="false"/>
-                <w:caps w:val="false"/>
-                <w:color w:val="1A1530"/>
-                <w:sz w:val="20"/>
-                <w:szCs w:val="20"/>
-              </w:rPr>
-              <w:t xml:space="preserve">[Imię i nazwisko]</w:t>
-            </w:r>
-          </w:p>
-          <w:p>
-            <w:pPr>
-              <w:spacing w:after="0" w:before="0" w:line="276"/>
-              <w:jc w:val="left"/>
-            </w:pPr>
-            <w:r>
-              <w:rPr>
-                <w:rFonts w:ascii="Arial" w:cs="Arial" w:eastAsia="Arial" w:hAnsi="Arial"/>
-                <w:b w:val="false"/>
-                <w:bCs w:val="false"/>
-                <w:i w:val="false"/>
-                <w:iCs w:val="false"/>
-                <w:caps w:val="false"/>
-                <w:color w:val="6B6378"/>
-                <w:sz w:val="20"/>
-                <w:szCs w:val="20"/>
-              </w:rPr>
-              <w:t xml:space="preserve">podpis: ………………………………………</w:t>
-            </w:r>
-          </w:p>
-        </w:tc>
-        <w:tc>
-          <w:tcPr>
-            <w:tcW w:type="dxa" w:w="5103"/>
-            <w:tcBorders>
-              <w:top w:val="nil"/>
-              <w:left w:val="nil"/>
-              <w:bottom w:val="nil"/>
-              <w:right w:val="nil"/>
-            </w:tcBorders>
-            <w:tcMar>
-              <w:top w:type="dxa" w:w="40"/>
-              <w:left w:type="dxa" w:w="0"/>
-              <w:bottom w:type="dxa" w:w="40"/>
-              <w:right w:type="dxa" w:w="200"/>
-            </w:tcMar>
-            <w:vAlign w:val="top"/>
-          </w:tcPr>
-          <w:p>
-            <w:pPr>
-              <w:spacing w:after="10" w:before="0" w:line="276"/>
-              <w:jc w:val="left"/>
-            </w:pPr>
-            <w:r>
-              <w:rPr>
-                <w:rFonts w:ascii="Arial" w:cs="Arial" w:eastAsia="Arial" w:hAnsi="Arial"/>
-                <w:b/>
-                <w:bCs/>
-                <w:i w:val="false"/>
-                <w:iCs w:val="false"/>
-                <w:caps w:val="false"/>
-                <w:color w:val="2D1B69"/>
-                <w:sz w:val="20"/>
-                <w:szCs w:val="20"/>
-              </w:rPr>
-              <w:t xml:space="preserve">Logopeda: </w:t>
-            </w:r>
-            <w:r>
-              <w:rPr>
-                <w:rFonts w:ascii="Arial" w:cs="Arial" w:eastAsia="Arial" w:hAnsi="Arial"/>
-                <w:b w:val="false"/>
-                <w:bCs w:val="false"/>
-                <w:i w:val="false"/>
-                <w:iCs w:val="false"/>
-                <w:caps w:val="false"/>
-                <w:color w:val="1A1530"/>
-                <w:sz w:val="20"/>
-                <w:szCs w:val="20"/>
-              </w:rPr>
-              <w:t xml:space="preserve">[Imię i nazwisko]</w:t>
-            </w:r>
-          </w:p>
-          <w:p>
-            <w:pPr>
-              <w:spacing w:after="0" w:before="0" w:line="276"/>
-              <w:jc w:val="left"/>
-            </w:pPr>
-            <w:r>
-              <w:rPr>
-                <w:rFonts w:ascii="Arial" w:cs="Arial" w:eastAsia="Arial" w:hAnsi="Arial"/>
-                <w:b w:val="false"/>
-                <w:bCs w:val="false"/>
-                <w:i w:val="false"/>
-                <w:iCs w:val="false"/>
-                <w:caps w:val="false"/>
-                <w:color w:val="6B6378"/>
-                <w:sz w:val="20"/>
-                <w:szCs w:val="20"/>
+                <w:sz w:val="24"/>
+                <w:szCs w:val="24"/>
               </w:rPr>
               <w:t xml:space="preserve">podpis: ………………………………………</w:t>
             </w:r>
@@ -7683,7 +6891,7 @@
           <w:p>
             <w:pPr>
               <w:pBdr>
-                <w:top w:val="single" w:color="2D1B69" w:sz="20" w:space="5"/>
+                <w:top w:val="single" w:color="2D1B69" w:sz="24" w:space="5"/>
               </w:pBdr>
               <w:spacing w:after="0" w:before="0"/>
               <w:jc w:val="center"/>
@@ -7717,8 +6925,8 @@
                 <w:iCs w:val="false"/>
                 <w:caps w:val="false"/>
                 <w:color w:val="6B6378"/>
-                <w:sz w:val="20"/>
-                <w:szCs w:val="20"/>
+                <w:sz w:val="24"/>
+                <w:szCs w:val="24"/>
               </w:rPr>
               <w:t xml:space="preserve">podpis i data</w:t>
             </w:r>
@@ -7755,8 +6963,8 @@
                 <w:iCs w:val="false"/>
                 <w:caps w:val="false"/>
                 <w:color w:val="6B6378"/>
-                <w:sz w:val="20"/>
-                <w:szCs w:val="20"/>
+                <w:sz w:val="24"/>
+                <w:szCs w:val="24"/>
               </w:rPr>
               <w:t xml:space="preserve">Kopię opinii przekazano rodzicom / pełnoletniemu uczniowi (§ 7 ust. 5) dnia ……………… · podpis rodzica / ucznia: ………………………………</w:t>
             </w:r>
@@ -7778,16 +6986,17 @@
           <w:iCs w:val="false"/>
           <w:caps w:val="false"/>
           <w:color w:val="6B6378"/>
-          <w:sz w:val="20"/>
-          <w:szCs w:val="20"/>
+          <w:sz w:val="24"/>
+          <w:szCs w:val="24"/>
         </w:rPr>
         <w:t xml:space="preserve">Załączniki: ocena funkcjonalna (raport, część I–III), arkusze obserwacji, dokumentacja pomocy psychologiczno-pedagogicznej – do wglądu zespołu orzekającego za zgodą rodzica. Opinia zawiera dane dotyczące zdrowia (art. 9 RODO) – dokument poufny.</w:t>
       </w:r>
     </w:p>
     <w:sectPr>
-      <w:footerReference w:type="default" r:id="rId7"/>
+      <w:headerReference w:type="default" r:id="rId7"/>
+      <w:footerReference w:type="default" r:id="rId8"/>
       <w:pgSz w:w="11906" w:h="16838" w:orient="portrait"/>
-      <w:pgMar w:top="1000" w:right="850" w:bottom="1100" w:left="850" w:header="708" w:footer="708" w:gutter="0"/>
+      <w:pgMar w:top="1100" w:right="850" w:bottom="1100" w:left="850" w:header="500" w:footer="500" w:gutter="0"/>
       <w:pgNumType/>
       <w:docGrid w:linePitch="360"/>
     </w:sectPr>
@@ -7841,7 +7050,7 @@
   <w:p>
     <w:pPr>
       <w:pBdr>
-        <w:top w:val="single" w:color="E3E1EC" w:sz="20" w:space="4"/>
+        <w:top w:val="single" w:color="E3E1EC" w:sz="24" w:space="4"/>
       </w:pBdr>
       <w:tabs>
         <w:tab w:val="right" w:pos="10206"/>
@@ -7857,8 +7066,8 @@
         <w:iCs w:val="false"/>
         <w:caps w:val="false"/>
         <w:color w:val="6B6378"/>
-        <w:sz w:val="20"/>
-        <w:szCs w:val="20"/>
+        <w:sz w:val="24"/>
+        <w:szCs w:val="24"/>
       </w:rPr>
       <w:t xml:space="preserve">Załącznik – opinia o funkcjonowaniu dziecka / ucznia · dokument poufny (RODO)</w:t>
     </w:r>
@@ -7885,8 +7094,8 @@
         <w:iCs w:val="false"/>
         <w:caps w:val="false"/>
         <w:color w:val="6B6378"/>
-        <w:sz w:val="20"/>
-        <w:szCs w:val="20"/>
+        <w:sz w:val="24"/>
+        <w:szCs w:val="24"/>
       </w:rPr>
       <w:t xml:space="preserve">Strona </w:t>
     </w:r>
@@ -7896,8 +7105,8 @@
         <w:b/>
         <w:bCs/>
         <w:color w:val="E74509"/>
-        <w:sz w:val="20"/>
-        <w:szCs w:val="20"/>
+        <w:sz w:val="24"/>
+        <w:szCs w:val="24"/>
       </w:rPr>
       <w:fldChar w:fldCharType="begin"/>
       <w:instrText xml:space="preserve">PAGE</w:instrText>
@@ -7913,8 +7122,8 @@
         <w:iCs w:val="false"/>
         <w:caps w:val="false"/>
         <w:color w:val="6B6378"/>
-        <w:sz w:val="20"/>
-        <w:szCs w:val="20"/>
+        <w:sz w:val="24"/>
+        <w:szCs w:val="24"/>
       </w:rPr>
       <w:t xml:space="preserve"> z </w:t>
     </w:r>
@@ -7924,8 +7133,8 @@
         <w:b/>
         <w:bCs/>
         <w:color w:val="2D1B69"/>
-        <w:sz w:val="20"/>
-        <w:szCs w:val="20"/>
+        <w:sz w:val="24"/>
+        <w:szCs w:val="24"/>
       </w:rPr>
       <w:fldChar w:fldCharType="begin"/>
       <w:instrText xml:space="preserve">NUMPAGES</w:instrText>
@@ -7971,6 +7180,64 @@
     </w:p>
   </w:footnote>
 </w:footnotes>
+</file>
+
+<file path=word/header1.xml><?xml version="1.0" encoding="utf-8"?>
+<w:hdr xmlns:wpc="http://schemas.microsoft.com/office/word/2010/wordprocessingCanvas" xmlns:mc="http://schemas.openxmlformats.org/markup-compatibility/2006" xmlns:o="urn:schemas-microsoft-com:office:office" xmlns:r="http://schemas.openxmlformats.org/officeDocument/2006/relationships" xmlns:m="http://schemas.openxmlformats.org/officeDocument/2006/math" xmlns:v="urn:schemas-microsoft-com:vml" xmlns:wp14="http://schemas.microsoft.com/office/word/2010/wordprocessingDrawing" xmlns:wp="http://schemas.openxmlformats.org/drawingml/2006/wordprocessingDrawing" xmlns:w10="urn:schemas-microsoft-com:office:word" xmlns:w="http://schemas.openxmlformats.org/wordprocessingml/2006/main" xmlns:w14="http://schemas.microsoft.com/office/word/2010/wordml" xmlns:w15="http://schemas.microsoft.com/office/word/2012/wordml" xmlns:wpg="http://schemas.microsoft.com/office/word/2010/wordprocessingGroup" xmlns:wpi="http://schemas.microsoft.com/office/word/2010/wordprocessingInk" xmlns:wne="http://schemas.microsoft.com/office/word/2006/wordml" xmlns:wps="http://schemas.microsoft.com/office/word/2010/wordprocessingShape" xmlns:cx="http://schemas.microsoft.com/office/drawing/2014/chartex" xmlns:cx1="http://schemas.microsoft.com/office/drawing/2015/9/8/chartex" xmlns:cx2="http://schemas.microsoft.com/office/drawing/2015/10/21/chartex" xmlns:cx3="http://schemas.microsoft.com/office/drawing/2016/5/9/chartex" xmlns:cx4="http://schemas.microsoft.com/office/drawing/2016/5/10/chartex" xmlns:cx5="http://schemas.microsoft.com/office/drawing/2016/5/11/chartex" xmlns:cx6="http://schemas.microsoft.com/office/drawing/2016/5/12/chartex" xmlns:cx7="http://schemas.microsoft.com/office/drawing/2016/5/13/chartex" xmlns:cx8="http://schemas.microsoft.com/office/drawing/2016/5/14/chartex" xmlns:w16cid="http://schemas.microsoft.com/office/word/2016/wordml/cid" xmlns:w16se="http://schemas.microsoft.com/office/word/2015/wordml/symex">
+  <w:p>
+    <w:pPr>
+      <w:pBdr>
+        <w:bottom w:val="single" w:color="D9D0F0" w:sz="4" w:space="4"/>
+      </w:pBdr>
+      <w:tabs>
+        <w:tab w:val="right" w:pos="10206"/>
+      </w:tabs>
+      <w:spacing w:after="0" w:before="0"/>
+    </w:pPr>
+    <w:r>
+      <w:rPr>
+        <w:rFonts w:ascii="Arial" w:cs="Arial" w:eastAsia="Arial" w:hAnsi="Arial"/>
+        <w:b w:val="false"/>
+        <w:bCs w:val="false"/>
+        <w:i w:val="false"/>
+        <w:iCs w:val="false"/>
+        <w:caps w:val="false"/>
+        <w:color w:val="7D6FB0"/>
+        <w:sz w:val="16"/>
+        <w:szCs w:val="16"/>
+      </w:rPr>
+      <w:t xml:space="preserve">Opinia o funkcjonowaniu dziecka / ucznia – załącznik</w:t>
+    </w:r>
+    <w:r>
+      <w:rPr>
+        <w:rFonts w:ascii="Arial" w:cs="Arial" w:eastAsia="Arial" w:hAnsi="Arial"/>
+        <w:b w:val="false"/>
+        <w:bCs w:val="false"/>
+        <w:i w:val="false"/>
+        <w:iCs w:val="false"/>
+        <w:caps w:val="false"/>
+        <w:color w:val="1A1530"/>
+        <w:sz w:val="20"/>
+        <w:szCs w:val="20"/>
+      </w:rPr>
+      <w:t xml:space="preserve">	</w:t>
+    </w:r>
+    <w:r>
+      <w:rPr>
+        <w:rFonts w:ascii="Arial" w:cs="Arial" w:eastAsia="Arial" w:hAnsi="Arial"/>
+        <w:b w:val="false"/>
+        <w:bCs w:val="false"/>
+        <w:i w:val="false"/>
+        <w:iCs w:val="false"/>
+        <w:caps w:val="false"/>
+        <w:color w:val="7D6FB0"/>
+        <w:sz w:val="16"/>
+        <w:szCs w:val="16"/>
+      </w:rPr>
+      <w:t xml:space="preserve">[Imię i nazwisko dziecka / ucznia]</w:t>
+    </w:r>
+  </w:p>
+</w:hdr>
 </file>
 
 <file path=word/numbering.xml><?xml version="1.0" encoding="utf-8"?>

</xml_diff>

<commit_message>
Ocena Funkcjonalna: 11 pt jednolicie, trzy edycje w roku, trzy rodzaje dokumentu
- Czcionka treści 11 pt w HTML/PDF i Word, jeden schemat rozmiarów.
- Okładka: zwarty spis treści i tabelka edycji 01/02/03 do zaznaczenia.
- Rodzaje dokumentu: całościowy, sama ocena funkcjonalna (WOPF + opinia),
  sam IPET – przełącznik w HTML, osobne PDF i DOCX.
- Układ: brak pustych stron (łamanie tylko po okładce, przed stroną 2
  i przed załącznikiem), 4-kolumnowa tabela PPP, szersza kolumna obszaru.

Co-Authored-By: Claude Fable 5.1 <noreply@anthropic.com>
Claude-Session: https://claude.ai/code/session_01FpF7vCSW7jSofte5z6wEKy
</commit_message>
<xml_diff>
--- a/eduplaner2026/raport_oceny_funkcjonalnej/Opinia_dla_poradni.docx
+++ b/eduplaner2026/raport_oceny_funkcjonalnej/Opinia_dla_poradni.docx
@@ -26,10 +26,10 @@
           <w:tcPr>
             <w:tcW w:type="dxa" w:w="5103"/>
             <w:tcBorders>
-              <w:top w:val="dashed" w:color="D9D0F0" w:sz="24"/>
-              <w:left w:val="dashed" w:color="D9D0F0" w:sz="24"/>
-              <w:bottom w:val="dashed" w:color="D9D0F0" w:sz="24"/>
-              <w:right w:val="dashed" w:color="D9D0F0" w:sz="24"/>
+              <w:top w:val="dashed" w:color="D9D0F0" w:sz="22"/>
+              <w:left w:val="dashed" w:color="D9D0F0" w:sz="22"/>
+              <w:bottom w:val="dashed" w:color="D9D0F0" w:sz="22"/>
+              <w:right w:val="dashed" w:color="D9D0F0" w:sz="22"/>
             </w:tcBorders>
             <w:tcMar>
               <w:top w:type="dxa" w:w="120"/>
@@ -53,8 +53,8 @@
                 <w:iCs w:val="false"/>
                 <w:caps w:val="false"/>
                 <w:color w:val="2D1B69"/>
-                <w:sz w:val="24"/>
-                <w:szCs w:val="24"/>
+                <w:sz w:val="22"/>
+                <w:szCs w:val="22"/>
               </w:rPr>
               <w:t xml:space="preserve">[Nazwa przedszkola / szkoły]</w:t>
             </w:r>
@@ -73,8 +73,8 @@
                 <w:iCs w:val="false"/>
                 <w:caps w:val="false"/>
                 <w:color w:val="6B6378"/>
-                <w:sz w:val="24"/>
-                <w:szCs w:val="24"/>
+                <w:sz w:val="22"/>
+                <w:szCs w:val="22"/>
               </w:rPr>
               <w:t xml:space="preserve">[Adres placówki, tel., e-mail]</w:t>
             </w:r>
@@ -93,8 +93,8 @@
                 <w:iCs w:val="false"/>
                 <w:caps w:val="false"/>
                 <w:color w:val="6B6378"/>
-                <w:sz w:val="24"/>
-                <w:szCs w:val="24"/>
+                <w:sz w:val="22"/>
+                <w:szCs w:val="22"/>
               </w:rPr>
               <w:t xml:space="preserve">(pieczęć placówki)</w:t>
             </w:r>
@@ -131,8 +131,8 @@
                 <w:iCs w:val="false"/>
                 <w:caps w:val="false"/>
                 <w:color w:val="6B6378"/>
-                <w:sz w:val="24"/>
-                <w:szCs w:val="24"/>
+                <w:sz w:val="22"/>
+                <w:szCs w:val="22"/>
               </w:rPr>
               <w:t xml:space="preserve">[Miejscowość], dnia ………………………</w:t>
             </w:r>
@@ -151,8 +151,8 @@
                 <w:iCs w:val="false"/>
                 <w:caps w:val="false"/>
                 <w:color w:val="6B6378"/>
-                <w:sz w:val="24"/>
-                <w:szCs w:val="24"/>
+                <w:sz w:val="22"/>
+                <w:szCs w:val="22"/>
               </w:rPr>
               <w:t xml:space="preserve">Znak sprawy: ………………………</w:t>
             </w:r>
@@ -171,8 +171,8 @@
                 <w:iCs w:val="false"/>
                 <w:caps w:val="false"/>
                 <w:color w:val="6B6378"/>
-                <w:sz w:val="24"/>
-                <w:szCs w:val="24"/>
+                <w:sz w:val="22"/>
+                <w:szCs w:val="22"/>
               </w:rPr>
               <w:t xml:space="preserve">Zespół orzekający: [Nazwa Poradni Psychologiczno-Pedagogicznej]</w:t>
             </w:r>
@@ -220,8 +220,8 @@
           <w:caps w:val="false"/>
           <w:color w:val="E74509"/>
           <w:spacing w:val="30"/>
-          <w:sz w:val="24"/>
-          <w:szCs w:val="24"/>
+          <w:sz w:val="22"/>
+          <w:szCs w:val="22"/>
         </w:rPr>
         <w:t xml:space="preserve">W PRZEDSZKOLU / SZKOLE – DLA ZESPOŁU ORZEKAJĄCEGO PORADNI PSYCHOLOGICZNO-PEDAGOGICZNEJ</w:t>
       </w:r>
@@ -276,8 +276,8 @@
                 <w:iCs w:val="false"/>
                 <w:caps w:val="false"/>
                 <w:color w:val="2D1B69"/>
-                <w:sz w:val="24"/>
-                <w:szCs w:val="24"/>
+                <w:sz w:val="22"/>
+                <w:szCs w:val="22"/>
               </w:rPr>
               <w:t xml:space="preserve">Podstawa prawna: </w:t>
             </w:r>
@@ -290,8 +290,8 @@
                 <w:iCs w:val="false"/>
                 <w:caps w:val="false"/>
                 <w:color w:val="6B6378"/>
-                <w:sz w:val="24"/>
-                <w:szCs w:val="24"/>
+                <w:sz w:val="22"/>
+                <w:szCs w:val="22"/>
               </w:rPr>
               <w:t xml:space="preserve">§ 7 ust. 2–7 rozporządzenia Ministra Edukacji z dnia 2 marca 2026 r. w sprawie orzeczeń i opinii wydawanych przez zespoły orzekające działające w publicznych poradniach psychologiczno-pedagogicznych (Dz. U. z 2026 r. poz. 428).</w:t>
             </w:r>
@@ -310,8 +310,8 @@
                 <w:iCs w:val="false"/>
                 <w:caps w:val="false"/>
                 <w:color w:val="2D1B69"/>
-                <w:sz w:val="24"/>
-                <w:szCs w:val="24"/>
+                <w:sz w:val="22"/>
+                <w:szCs w:val="22"/>
               </w:rPr>
               <w:t xml:space="preserve">Tryb: </w:t>
             </w:r>
@@ -324,8 +324,8 @@
                 <w:iCs w:val="false"/>
                 <w:caps w:val="false"/>
                 <w:color w:val="6B6378"/>
-                <w:sz w:val="24"/>
-                <w:szCs w:val="24"/>
+                <w:sz w:val="22"/>
+                <w:szCs w:val="22"/>
               </w:rPr>
               <w:t xml:space="preserve">Opinię wydaje dyrektor na prośbę przewodniczącego zespołu orzekającego (§ 7 ust. 2) lub wnioskodawcy (ust. 4), w terminie 10 dni od dnia otrzymania prośby (ust. 3). Opinia uwzględnia wyniki obserwacji funkcjonowania dziecka/ucznia i działań diagnostycznych prowadzonych w placówce (ust. 6). Kopię opinii przekazuje się rodzicom dziecka lub ucznia albo pełnoletniemu uczniowi (ust. 5).</w:t>
             </w:r>
@@ -337,7 +337,7 @@
       <w:pPr>
         <w:keepNext/>
         <w:pBdr>
-          <w:bottom w:val="single" w:color="D9D0F0" w:sz="24" w:space="4"/>
+          <w:bottom w:val="single" w:color="D9D0F0" w:sz="22" w:space="4"/>
         </w:pBdr>
         <w:spacing w:after="100" w:before="180"/>
       </w:pPr>
@@ -350,8 +350,8 @@
           <w:iCs w:val="false"/>
           <w:caps w:val="false"/>
           <w:color w:val="E74509"/>
-          <w:sz w:val="24"/>
-          <w:szCs w:val="24"/>
+          <w:sz w:val="22"/>
+          <w:szCs w:val="22"/>
         </w:rPr>
         <w:t xml:space="preserve">1.  </w:t>
       </w:r>
@@ -365,8 +365,8 @@
           <w:caps w:val="false"/>
           <w:color w:val="2D1B69"/>
           <w:spacing w:val="8"/>
-          <w:sz w:val="24"/>
-          <w:szCs w:val="24"/>
+          <w:sz w:val="22"/>
+          <w:szCs w:val="22"/>
         </w:rPr>
         <w:t xml:space="preserve">DATA WYDANIA OPINII I DANE DZIECKA / UCZNIA (§ 7 UST. 6 PKT 1–2)</w:t>
       </w:r>
@@ -411,7 +411,7 @@
           </w:tcPr>
           <w:p>
             <w:pPr>
-              <w:spacing w:after="0" w:before="0" w:line="270"/>
+              <w:spacing w:after="0" w:before="0" w:line="260"/>
               <w:jc w:val="left"/>
             </w:pPr>
             <w:r>
@@ -423,8 +423,8 @@
                 <w:iCs w:val="false"/>
                 <w:caps w:val="false"/>
                 <w:color w:val="2D1B69"/>
-                <w:sz w:val="24"/>
-                <w:szCs w:val="24"/>
+                <w:sz w:val="22"/>
+                <w:szCs w:val="22"/>
               </w:rPr>
               <w:t xml:space="preserve">Data wydania opinii (pkt 1)</w:t>
             </w:r>
@@ -449,7 +449,7 @@
           </w:tcPr>
           <w:p>
             <w:pPr>
-              <w:spacing w:after="0" w:before="0" w:line="270"/>
+              <w:spacing w:after="0" w:before="0" w:line="260"/>
               <w:jc w:val="left"/>
             </w:pPr>
             <w:r>
@@ -461,8 +461,8 @@
                 <w:iCs w:val="false"/>
                 <w:caps w:val="false"/>
                 <w:color w:val="1A1530"/>
-                <w:sz w:val="24"/>
-                <w:szCs w:val="24"/>
+                <w:sz w:val="22"/>
+                <w:szCs w:val="22"/>
               </w:rPr>
               <w:t xml:space="preserve">[Data wydania]</w:t>
             </w:r>
@@ -493,7 +493,7 @@
           </w:tcPr>
           <w:p>
             <w:pPr>
-              <w:spacing w:after="0" w:before="0" w:line="270"/>
+              <w:spacing w:after="0" w:before="0" w:line="260"/>
               <w:jc w:val="left"/>
             </w:pPr>
             <w:r>
@@ -505,8 +505,8 @@
                 <w:iCs w:val="false"/>
                 <w:caps w:val="false"/>
                 <w:color w:val="2D1B69"/>
-                <w:sz w:val="24"/>
-                <w:szCs w:val="24"/>
+                <w:sz w:val="22"/>
+                <w:szCs w:val="22"/>
               </w:rPr>
               <w:t xml:space="preserve">Imię i nazwisko dziecka / ucznia (pkt 2)</w:t>
             </w:r>
@@ -531,7 +531,7 @@
           </w:tcPr>
           <w:p>
             <w:pPr>
-              <w:spacing w:after="0" w:before="0" w:line="270"/>
+              <w:spacing w:after="0" w:before="0" w:line="260"/>
               <w:jc w:val="left"/>
             </w:pPr>
             <w:r>
@@ -543,8 +543,8 @@
                 <w:iCs w:val="false"/>
                 <w:caps w:val="false"/>
                 <w:color w:val="1A1530"/>
-                <w:sz w:val="24"/>
-                <w:szCs w:val="24"/>
+                <w:sz w:val="22"/>
+                <w:szCs w:val="22"/>
               </w:rPr>
               <w:t xml:space="preserve">[Imię i Nazwisko]</w:t>
             </w:r>
@@ -575,7 +575,7 @@
           </w:tcPr>
           <w:p>
             <w:pPr>
-              <w:spacing w:after="0" w:before="0" w:line="270"/>
+              <w:spacing w:after="0" w:before="0" w:line="260"/>
               <w:jc w:val="left"/>
             </w:pPr>
             <w:r>
@@ -587,8 +587,8 @@
                 <w:iCs w:val="false"/>
                 <w:caps w:val="false"/>
                 <w:color w:val="2D1B69"/>
-                <w:sz w:val="24"/>
-                <w:szCs w:val="24"/>
+                <w:sz w:val="22"/>
+                <w:szCs w:val="22"/>
               </w:rPr>
               <w:t xml:space="preserve">Data urodzenia · PESEL</w:t>
             </w:r>
@@ -613,7 +613,7 @@
           </w:tcPr>
           <w:p>
             <w:pPr>
-              <w:spacing w:after="0" w:before="0" w:line="270"/>
+              <w:spacing w:after="0" w:before="0" w:line="260"/>
               <w:jc w:val="left"/>
             </w:pPr>
             <w:r>
@@ -625,8 +625,8 @@
                 <w:iCs w:val="false"/>
                 <w:caps w:val="false"/>
                 <w:color w:val="1A1530"/>
-                <w:sz w:val="24"/>
-                <w:szCs w:val="24"/>
+                <w:sz w:val="22"/>
+                <w:szCs w:val="22"/>
               </w:rPr>
               <w:t xml:space="preserve">[Data urodzenia] · [PESEL]</w:t>
             </w:r>
@@ -657,7 +657,7 @@
           </w:tcPr>
           <w:p>
             <w:pPr>
-              <w:spacing w:after="0" w:before="0" w:line="270"/>
+              <w:spacing w:after="0" w:before="0" w:line="260"/>
               <w:jc w:val="left"/>
             </w:pPr>
             <w:r>
@@ -669,8 +669,8 @@
                 <w:iCs w:val="false"/>
                 <w:caps w:val="false"/>
                 <w:color w:val="2D1B69"/>
-                <w:sz w:val="24"/>
-                <w:szCs w:val="24"/>
+                <w:sz w:val="22"/>
+                <w:szCs w:val="22"/>
               </w:rPr>
               <w:t xml:space="preserve">Przedszkole / szkoła (nazwa, adres) · grupa / oddział</w:t>
             </w:r>
@@ -695,7 +695,7 @@
           </w:tcPr>
           <w:p>
             <w:pPr>
-              <w:spacing w:after="0" w:before="0" w:line="270"/>
+              <w:spacing w:after="0" w:before="0" w:line="260"/>
               <w:jc w:val="left"/>
             </w:pPr>
             <w:r>
@@ -707,8 +707,8 @@
                 <w:iCs w:val="false"/>
                 <w:caps w:val="false"/>
                 <w:color w:val="1A1530"/>
-                <w:sz w:val="24"/>
-                <w:szCs w:val="24"/>
+                <w:sz w:val="22"/>
+                <w:szCs w:val="22"/>
               </w:rPr>
               <w:t xml:space="preserve">[Nazwa i adres placówki] · [grupa / klasa] · ☐ dziecko do ukończenia wychowania przedszkolnego  ☐ uczeń</w:t>
             </w:r>
@@ -739,7 +739,7 @@
           </w:tcPr>
           <w:p>
             <w:pPr>
-              <w:spacing w:after="0" w:before="0" w:line="270"/>
+              <w:spacing w:after="0" w:before="0" w:line="260"/>
               <w:jc w:val="left"/>
             </w:pPr>
             <w:r>
@@ -751,8 +751,8 @@
                 <w:iCs w:val="false"/>
                 <w:caps w:val="false"/>
                 <w:color w:val="2D1B69"/>
-                <w:sz w:val="24"/>
-                <w:szCs w:val="24"/>
+                <w:sz w:val="22"/>
+                <w:szCs w:val="22"/>
               </w:rPr>
               <w:t xml:space="preserve">Rodzice / opiekunowie prawni (pełnoletni uczeń)</w:t>
             </w:r>
@@ -777,7 +777,7 @@
           </w:tcPr>
           <w:p>
             <w:pPr>
-              <w:spacing w:after="0" w:before="0" w:line="270"/>
+              <w:spacing w:after="0" w:before="0" w:line="260"/>
               <w:jc w:val="left"/>
             </w:pPr>
             <w:r>
@@ -789,8 +789,8 @@
                 <w:iCs w:val="false"/>
                 <w:caps w:val="false"/>
                 <w:color w:val="1A1530"/>
-                <w:sz w:val="24"/>
-                <w:szCs w:val="24"/>
+                <w:sz w:val="22"/>
+                <w:szCs w:val="22"/>
               </w:rPr>
               <w:t xml:space="preserve">[Imiona i nazwiska, adres do korespondencji]</w:t>
             </w:r>
@@ -821,7 +821,7 @@
           </w:tcPr>
           <w:p>
             <w:pPr>
-              <w:spacing w:after="0" w:before="0" w:line="270"/>
+              <w:spacing w:after="0" w:before="0" w:line="260"/>
               <w:jc w:val="left"/>
             </w:pPr>
             <w:r>
@@ -833,8 +833,8 @@
                 <w:iCs w:val="false"/>
                 <w:caps w:val="false"/>
                 <w:color w:val="2D1B69"/>
-                <w:sz w:val="24"/>
-                <w:szCs w:val="24"/>
+                <w:sz w:val="22"/>
+                <w:szCs w:val="22"/>
               </w:rPr>
               <w:t xml:space="preserve">Prośba o wydanie opinii</w:t>
             </w:r>
@@ -859,7 +859,7 @@
           </w:tcPr>
           <w:p>
             <w:pPr>
-              <w:spacing w:after="0" w:before="0" w:line="270"/>
+              <w:spacing w:after="0" w:before="0" w:line="260"/>
               <w:jc w:val="left"/>
             </w:pPr>
             <w:r>
@@ -871,8 +871,8 @@
                 <w:iCs w:val="false"/>
                 <w:caps w:val="false"/>
                 <w:color w:val="1A1530"/>
-                <w:sz w:val="24"/>
-                <w:szCs w:val="24"/>
+                <w:sz w:val="22"/>
+                <w:szCs w:val="22"/>
               </w:rPr>
               <w:t xml:space="preserve">☐ przewodniczący zespołu orzekającego (§ 7 ust. 2)  ☐ wnioskodawca (§ 7 ust. 4) · z dnia [Data otrzymania] · znak [Znak sprawy] · termin: 10 dni</w:t>
             </w:r>
@@ -903,7 +903,7 @@
           </w:tcPr>
           <w:p>
             <w:pPr>
-              <w:spacing w:after="0" w:before="0" w:line="270"/>
+              <w:spacing w:after="0" w:before="0" w:line="260"/>
               <w:jc w:val="left"/>
             </w:pPr>
             <w:r>
@@ -915,8 +915,8 @@
                 <w:iCs w:val="false"/>
                 <w:caps w:val="false"/>
                 <w:color w:val="2D1B69"/>
-                <w:sz w:val="24"/>
-                <w:szCs w:val="24"/>
+                <w:sz w:val="22"/>
+                <w:szCs w:val="22"/>
               </w:rPr>
               <w:t xml:space="preserve">Dotychczasowe orzeczenie / opinia poradni</w:t>
             </w:r>
@@ -941,7 +941,7 @@
           </w:tcPr>
           <w:p>
             <w:pPr>
-              <w:spacing w:after="0" w:before="0" w:line="270"/>
+              <w:spacing w:after="0" w:before="0" w:line="260"/>
               <w:jc w:val="left"/>
             </w:pPr>
             <w:r>
@@ -953,8 +953,8 @@
                 <w:iCs w:val="false"/>
                 <w:caps w:val="false"/>
                 <w:color w:val="1A1530"/>
-                <w:sz w:val="24"/>
-                <w:szCs w:val="24"/>
+                <w:sz w:val="22"/>
+                <w:szCs w:val="22"/>
               </w:rPr>
               <w:t xml:space="preserve">☐ brak  ☐ [Orzeczenie / Opinia] nr [Numer] z dnia [Data], wydane przez [Nazwa Poradni]</w:t>
             </w:r>
@@ -966,7 +966,7 @@
       <w:pPr>
         <w:keepNext/>
         <w:pBdr>
-          <w:bottom w:val="single" w:color="D9D0F0" w:sz="24" w:space="4"/>
+          <w:bottom w:val="single" w:color="D9D0F0" w:sz="22" w:space="4"/>
         </w:pBdr>
         <w:spacing w:after="100" w:before="180"/>
       </w:pPr>
@@ -979,8 +979,8 @@
           <w:iCs w:val="false"/>
           <w:caps w:val="false"/>
           <w:color w:val="E74509"/>
-          <w:sz w:val="24"/>
-          <w:szCs w:val="24"/>
+          <w:sz w:val="22"/>
+          <w:szCs w:val="22"/>
         </w:rPr>
         <w:t xml:space="preserve">2.  </w:t>
       </w:r>
@@ -994,8 +994,8 @@
           <w:caps w:val="false"/>
           <w:color w:val="2D1B69"/>
           <w:spacing w:val="8"/>
-          <w:sz w:val="24"/>
-          <w:szCs w:val="24"/>
+          <w:sz w:val="22"/>
+          <w:szCs w:val="22"/>
         </w:rPr>
         <w:t xml:space="preserve">PODSTAWA OPINII – WYNIKI OBSERWACJI I DZIAŁAŃ DIAGNOSTYCZNYCH PROWADZONYCH W PLACÓWCE (§ 7 UST. 6)</w:t>
       </w:r>
@@ -1040,7 +1040,7 @@
           </w:tcPr>
           <w:p>
             <w:pPr>
-              <w:spacing w:after="0" w:before="0" w:line="270"/>
+              <w:spacing w:after="0" w:before="0" w:line="260"/>
               <w:jc w:val="left"/>
             </w:pPr>
             <w:r>
@@ -1052,8 +1052,8 @@
                 <w:iCs w:val="false"/>
                 <w:caps w:val="false"/>
                 <w:color w:val="2D1B69"/>
-                <w:sz w:val="24"/>
-                <w:szCs w:val="24"/>
+                <w:sz w:val="22"/>
+                <w:szCs w:val="22"/>
               </w:rPr>
               <w:t xml:space="preserve">Okres obserwacji</w:t>
             </w:r>
@@ -1078,7 +1078,7 @@
           </w:tcPr>
           <w:p>
             <w:pPr>
-              <w:spacing w:after="0" w:before="0" w:line="270"/>
+              <w:spacing w:after="0" w:before="0" w:line="260"/>
               <w:jc w:val="left"/>
             </w:pPr>
             <w:r>
@@ -1090,8 +1090,8 @@
                 <w:iCs w:val="false"/>
                 <w:caps w:val="false"/>
                 <w:color w:val="1A1530"/>
-                <w:sz w:val="24"/>
-                <w:szCs w:val="24"/>
+                <w:sz w:val="22"/>
+                <w:szCs w:val="22"/>
               </w:rPr>
               <w:t xml:space="preserve">wrzesień [rok] – [miesiąc rok]; obserwacja wstępna i pogłębiona w naturalnych sytuacjach (zajęcia kierowane, zabawa swobodna, posiłki, przejścia, wydarzenia grupowe)</w:t>
             </w:r>
@@ -1122,7 +1122,7 @@
           </w:tcPr>
           <w:p>
             <w:pPr>
-              <w:spacing w:after="0" w:before="0" w:line="270"/>
+              <w:spacing w:after="0" w:before="0" w:line="260"/>
               <w:jc w:val="left"/>
             </w:pPr>
             <w:r>
@@ -1134,8 +1134,8 @@
                 <w:iCs w:val="false"/>
                 <w:caps w:val="false"/>
                 <w:color w:val="2D1B69"/>
-                <w:sz w:val="24"/>
-                <w:szCs w:val="24"/>
+                <w:sz w:val="22"/>
+                <w:szCs w:val="22"/>
               </w:rPr>
               <w:t xml:space="preserve">Narzędzia i działania diagnostyczne</w:t>
             </w:r>
@@ -1160,7 +1160,7 @@
           </w:tcPr>
           <w:p>
             <w:pPr>
-              <w:spacing w:after="0" w:before="0" w:line="270"/>
+              <w:spacing w:after="0" w:before="0" w:line="260"/>
               <w:jc w:val="left"/>
             </w:pPr>
             <w:r>
@@ -1172,8 +1172,8 @@
                 <w:iCs w:val="false"/>
                 <w:caps w:val="false"/>
                 <w:color w:val="1A1530"/>
-                <w:sz w:val="24"/>
-                <w:szCs w:val="24"/>
+                <w:sz w:val="22"/>
+                <w:szCs w:val="22"/>
               </w:rPr>
               <w:t xml:space="preserve">Kwestionariusz Przedszkolnej / Szkolnej Oceny Funkcjonalnej (KPOF / KSzOF – 9 domen ICF); Profil Biopsychospołeczny; Arkusz Obserwacji Behawioralnej ABC; Profil Sensoryczny; Arkusz Oceny Rozwoju Mowy i Komunikacji; Arkusz Poziomu Rozwoju Teorii Umysłu (ToM); analiza dokumentacji pomocy psychologiczno-pedagogicznej</w:t>
             </w:r>
@@ -1204,7 +1204,7 @@
           </w:tcPr>
           <w:p>
             <w:pPr>
-              <w:spacing w:after="0" w:before="0" w:line="270"/>
+              <w:spacing w:after="0" w:before="0" w:line="260"/>
               <w:jc w:val="left"/>
             </w:pPr>
             <w:r>
@@ -1216,8 +1216,8 @@
                 <w:iCs w:val="false"/>
                 <w:caps w:val="false"/>
                 <w:color w:val="2D1B69"/>
-                <w:sz w:val="24"/>
-                <w:szCs w:val="24"/>
+                <w:sz w:val="22"/>
+                <w:szCs w:val="22"/>
               </w:rPr>
               <w:t xml:space="preserve">Osoby rozpoznające trudności, mocne strony i uzdolnienia</w:t>
             </w:r>
@@ -1242,7 +1242,7 @@
           </w:tcPr>
           <w:p>
             <w:pPr>
-              <w:spacing w:after="0" w:before="0" w:line="270"/>
+              <w:spacing w:after="0" w:before="0" w:line="260"/>
               <w:jc w:val="left"/>
             </w:pPr>
             <w:r>
@@ -1254,8 +1254,8 @@
                 <w:iCs w:val="false"/>
                 <w:caps w:val="false"/>
                 <w:color w:val="1A1530"/>
-                <w:sz w:val="24"/>
-                <w:szCs w:val="24"/>
+                <w:sz w:val="22"/>
+                <w:szCs w:val="22"/>
               </w:rPr>
               <w:t xml:space="preserve">wychowawca / nauczyciele oddziału, pedagog specjalny, psycholog, logopeda, terapeuta SI (imiona i nazwiska w części 9); informacje uzupełniające od rodziców i od dziecka w formie dostosowanej do jego rozwoju</w:t>
             </w:r>
@@ -1272,7 +1272,7 @@
       <w:pPr>
         <w:keepNext/>
         <w:pBdr>
-          <w:bottom w:val="single" w:color="D9D0F0" w:sz="24" w:space="4"/>
+          <w:bottom w:val="single" w:color="D9D0F0" w:sz="22" w:space="4"/>
         </w:pBdr>
         <w:spacing w:after="100" w:before="180"/>
       </w:pPr>
@@ -1285,8 +1285,8 @@
           <w:iCs w:val="false"/>
           <w:caps w:val="false"/>
           <w:color w:val="E74509"/>
-          <w:sz w:val="24"/>
-          <w:szCs w:val="24"/>
+          <w:sz w:val="22"/>
+          <w:szCs w:val="22"/>
         </w:rPr>
         <w:t xml:space="preserve">3.  </w:t>
       </w:r>
@@ -1300,8 +1300,8 @@
           <w:caps w:val="false"/>
           <w:color w:val="2D1B69"/>
           <w:spacing w:val="8"/>
-          <w:sz w:val="24"/>
-          <w:szCs w:val="24"/>
+          <w:sz w:val="22"/>
+          <w:szCs w:val="22"/>
         </w:rPr>
         <w:t xml:space="preserve">INFORMACJA O FUNKCJONOWANIU DZIECKA / UCZNIA W PLACÓWCE – TRUDNOŚCI, MOCNE STRONY I UZDOLNIENIA (§ 7 UST. 6 PKT 3, UST. 7 PKT 1)</w:t>
       </w:r>
@@ -1320,8 +1320,8 @@
           <w:iCs w:val="false"/>
           <w:caps w:val="false"/>
           <w:color w:val="6B6378"/>
-          <w:sz w:val="24"/>
-          <w:szCs w:val="24"/>
+          <w:sz w:val="22"/>
+          <w:szCs w:val="22"/>
         </w:rPr>
         <w:t xml:space="preserve">Aktywność i uczestniczenie zgodnie z obszarami ICF, adekwatnie do wieku i poziomu rozwoju psychofizycznego. Wypełnia się tabelę A (dziecko do ukończenia wychowania przedszkolnego – 5 obszarów) albo B (uczeń – 7 obszarów). Poziom potrzeby wsparcia: średnia z KPOF / KSzOF w skali 0–5 (steny wyłącznie dla KSzOF).</w:t>
       </w:r>
@@ -1340,8 +1340,8 @@
           <w:iCs w:val="false"/>
           <w:caps w:val="false"/>
           <w:color w:val="FFFFFF"/>
-          <w:sz w:val="24"/>
-          <w:szCs w:val="24"/>
+          <w:sz w:val="22"/>
+          <w:szCs w:val="22"/>
           <w:shd w:fill="E74509" w:color="auto" w:val="clear"/>
         </w:rPr>
         <w:t xml:space="preserve"> A </w:t>
@@ -1355,8 +1355,8 @@
           <w:iCs w:val="false"/>
           <w:caps w:val="false"/>
           <w:color w:val="2D1B69"/>
-          <w:sz w:val="24"/>
-          <w:szCs w:val="24"/>
+          <w:sz w:val="22"/>
+          <w:szCs w:val="22"/>
         </w:rPr>
         <w:t xml:space="preserve">   A · Dziecko do ukończenia wychowania przedszkolnego – 5 obszarów (ust. 7 pkt 1 lit. a)</w:t>
       </w:r>
@@ -1369,8 +1369,8 @@
           <w:iCs w:val="false"/>
           <w:caps w:val="false"/>
           <w:color w:val="6B6378"/>
-          <w:sz w:val="24"/>
-          <w:szCs w:val="24"/>
+          <w:sz w:val="22"/>
+          <w:szCs w:val="22"/>
         </w:rPr>
         <w:t xml:space="preserve"/>
       </w:r>
@@ -1430,8 +1430,8 @@
                 <w:caps/>
                 <w:color w:val="2D1B69"/>
                 <w:spacing w:val="10"/>
-                <w:sz w:val="24"/>
-                <w:szCs w:val="24"/>
+                <w:sz w:val="22"/>
+                <w:szCs w:val="22"/>
               </w:rPr>
               <w:t xml:space="preserve">Obszar (ICF)</w:t>
             </w:r>
@@ -1470,8 +1470,8 @@
                 <w:caps/>
                 <w:color w:val="2E7D45"/>
                 <w:spacing w:val="10"/>
-                <w:sz w:val="24"/>
-                <w:szCs w:val="24"/>
+                <w:sz w:val="22"/>
+                <w:szCs w:val="22"/>
               </w:rPr>
               <w:t xml:space="preserve">Mocne strony i uzdolnienia</w:t>
             </w:r>
@@ -1510,8 +1510,8 @@
                 <w:caps/>
                 <w:color w:val="BF382A"/>
                 <w:spacing w:val="10"/>
-                <w:sz w:val="24"/>
-                <w:szCs w:val="24"/>
+                <w:sz w:val="22"/>
+                <w:szCs w:val="22"/>
               </w:rPr>
               <w:t xml:space="preserve">Trudności</w:t>
             </w:r>
@@ -1550,8 +1550,8 @@
                 <w:caps/>
                 <w:color w:val="2D1B69"/>
                 <w:spacing w:val="10"/>
-                <w:sz w:val="24"/>
-                <w:szCs w:val="24"/>
+                <w:sz w:val="22"/>
+                <w:szCs w:val="22"/>
               </w:rPr>
               <w:t xml:space="preserve">Poziom potrzeby wsparcia</w:t>
             </w:r>
@@ -1582,7 +1582,7 @@
           </w:tcPr>
           <w:p>
             <w:pPr>
-              <w:spacing w:after="0" w:before="0" w:line="270"/>
+              <w:spacing w:after="0" w:before="0" w:line="260"/>
               <w:jc w:val="left"/>
             </w:pPr>
             <w:r>
@@ -1594,8 +1594,8 @@
                 <w:iCs w:val="false"/>
                 <w:caps w:val="false"/>
                 <w:color w:val="2D1B69"/>
-                <w:sz w:val="24"/>
-                <w:szCs w:val="24"/>
+                <w:sz w:val="22"/>
+                <w:szCs w:val="22"/>
               </w:rPr>
               <w:t xml:space="preserve">1 · Uczenie się i stosowanie wiedzy</w:t>
             </w:r>
@@ -1620,7 +1620,7 @@
           </w:tcPr>
           <w:p>
             <w:pPr>
-              <w:spacing w:after="0" w:before="0" w:line="270"/>
+              <w:spacing w:after="0" w:before="0" w:line="260"/>
               <w:jc w:val="left"/>
             </w:pPr>
             <w:r>
@@ -1632,8 +1632,8 @@
                 <w:iCs w:val="false"/>
                 <w:caps w:val="false"/>
                 <w:color w:val="1A1530"/>
-                <w:sz w:val="24"/>
-                <w:szCs w:val="24"/>
+                <w:sz w:val="22"/>
+                <w:szCs w:val="22"/>
               </w:rPr>
               <w:t xml:space="preserve">pamięć wzrokowa, schematy graficzne, zainteresowania tematyczne, motywacja do pracy z ulubionymi pomocami</w:t>
             </w:r>
@@ -1658,7 +1658,7 @@
           </w:tcPr>
           <w:p>
             <w:pPr>
-              <w:spacing w:after="0" w:before="0" w:line="270"/>
+              <w:spacing w:after="0" w:before="0" w:line="260"/>
               <w:jc w:val="left"/>
             </w:pPr>
             <w:r>
@@ -1670,8 +1670,8 @@
                 <w:iCs w:val="false"/>
                 <w:caps w:val="false"/>
                 <w:color w:val="1A1530"/>
-                <w:sz w:val="24"/>
-                <w:szCs w:val="24"/>
+                <w:sz w:val="22"/>
+                <w:szCs w:val="22"/>
               </w:rPr>
               <w:t xml:space="preserve">przerzutność i podzielność uwagi, instrukcje wieloetapowe, uogólnianie wiedzy, stres przy zmianie planu, potrzeba nadzoru nauczyciela</w:t>
             </w:r>
@@ -1696,7 +1696,7 @@
           </w:tcPr>
           <w:p>
             <w:pPr>
-              <w:spacing w:after="0" w:before="0" w:line="270"/>
+              <w:spacing w:after="0" w:before="0" w:line="260"/>
               <w:jc w:val="left"/>
             </w:pPr>
             <w:r>
@@ -1708,8 +1708,8 @@
                 <w:iCs w:val="false"/>
                 <w:caps w:val="false"/>
                 <w:color w:val="2D1B69"/>
-                <w:sz w:val="24"/>
-                <w:szCs w:val="24"/>
+                <w:sz w:val="22"/>
+                <w:szCs w:val="22"/>
               </w:rPr>
               <w:t xml:space="preserve">d1 śr. 2,4 · d2 śr. 1,8 · d8 śr. 2,0 – poziom średni / wysoki</w:t>
             </w:r>
@@ -1740,7 +1740,7 @@
           </w:tcPr>
           <w:p>
             <w:pPr>
-              <w:spacing w:after="0" w:before="0" w:line="270"/>
+              <w:spacing w:after="0" w:before="0" w:line="260"/>
               <w:jc w:val="left"/>
             </w:pPr>
             <w:r>
@@ -1752,8 +1752,8 @@
                 <w:iCs w:val="false"/>
                 <w:caps w:val="false"/>
                 <w:color w:val="2D1B69"/>
-                <w:sz w:val="24"/>
-                <w:szCs w:val="24"/>
+                <w:sz w:val="22"/>
+                <w:szCs w:val="22"/>
               </w:rPr>
               <w:t xml:space="preserve">2 · Zachowania społeczne we wzajemnych kontaktach – przystosowanie społeczne i emocjonalne</w:t>
             </w:r>
@@ -1778,7 +1778,7 @@
           </w:tcPr>
           <w:p>
             <w:pPr>
-              <w:spacing w:after="0" w:before="0" w:line="270"/>
+              <w:spacing w:after="0" w:before="0" w:line="260"/>
               <w:jc w:val="left"/>
             </w:pPr>
             <w:r>
@@ -1790,8 +1790,8 @@
                 <w:iCs w:val="false"/>
                 <w:caps w:val="false"/>
                 <w:color w:val="1A1530"/>
-                <w:sz w:val="24"/>
-                <w:szCs w:val="24"/>
+                <w:sz w:val="22"/>
+                <w:szCs w:val="22"/>
               </w:rPr>
               <w:t xml:space="preserve">chęć przebywania blisko grupy, reakcja na stałych dorosłych, przestrzeganie zasad wizualnych</w:t>
             </w:r>
@@ -1816,7 +1816,7 @@
           </w:tcPr>
           <w:p>
             <w:pPr>
-              <w:spacing w:after="0" w:before="0" w:line="270"/>
+              <w:spacing w:after="0" w:before="0" w:line="260"/>
               <w:jc w:val="left"/>
             </w:pPr>
             <w:r>
@@ -1828,8 +1828,8 @@
                 <w:iCs w:val="false"/>
                 <w:caps w:val="false"/>
                 <w:color w:val="1A1530"/>
-                <w:sz w:val="24"/>
-                <w:szCs w:val="24"/>
+                <w:sz w:val="22"/>
+                <w:szCs w:val="22"/>
               </w:rPr>
               <w:t xml:space="preserve">odczytywanie emocji i intencji, tolerancja frustracji, wycofanie lub zachowania trudne w apelach i wyjściach</w:t>
             </w:r>
@@ -1854,7 +1854,7 @@
           </w:tcPr>
           <w:p>
             <w:pPr>
-              <w:spacing w:after="0" w:before="0" w:line="270"/>
+              <w:spacing w:after="0" w:before="0" w:line="260"/>
               <w:jc w:val="left"/>
             </w:pPr>
             <w:r>
@@ -1866,8 +1866,8 @@
                 <w:iCs w:val="false"/>
                 <w:caps w:val="false"/>
                 <w:color w:val="2D1B69"/>
-                <w:sz w:val="24"/>
-                <w:szCs w:val="24"/>
+                <w:sz w:val="22"/>
+                <w:szCs w:val="22"/>
               </w:rPr>
               <w:t xml:space="preserve">d7 śr. 1,6 · d9 śr. 1,8 – poziom wysoki</w:t>
             </w:r>
@@ -1898,7 +1898,7 @@
           </w:tcPr>
           <w:p>
             <w:pPr>
-              <w:spacing w:after="0" w:before="0" w:line="270"/>
+              <w:spacing w:after="0" w:before="0" w:line="260"/>
               <w:jc w:val="left"/>
             </w:pPr>
             <w:r>
@@ -1910,8 +1910,8 @@
                 <w:iCs w:val="false"/>
                 <w:caps w:val="false"/>
                 <w:color w:val="2D1B69"/>
-                <w:sz w:val="24"/>
-                <w:szCs w:val="24"/>
+                <w:sz w:val="22"/>
+                <w:szCs w:val="22"/>
               </w:rPr>
               <w:t xml:space="preserve">3 · Porozumiewanie się</w:t>
             </w:r>
@@ -1936,7 +1936,7 @@
           </w:tcPr>
           <w:p>
             <w:pPr>
-              <w:spacing w:after="0" w:before="0" w:line="270"/>
+              <w:spacing w:after="0" w:before="0" w:line="260"/>
               <w:jc w:val="left"/>
             </w:pPr>
             <w:r>
@@ -1948,8 +1948,8 @@
                 <w:iCs w:val="false"/>
                 <w:caps w:val="false"/>
                 <w:color w:val="1A1530"/>
-                <w:sz w:val="24"/>
-                <w:szCs w:val="24"/>
+                <w:sz w:val="22"/>
+                <w:szCs w:val="22"/>
               </w:rPr>
               <w:t xml:space="preserve">rozumienie prostych komunikatów wspartych gestem, sygnalizowanie potrzeb</w:t>
             </w:r>
@@ -1974,7 +1974,7 @@
           </w:tcPr>
           <w:p>
             <w:pPr>
-              <w:spacing w:after="0" w:before="0" w:line="270"/>
+              <w:spacing w:after="0" w:before="0" w:line="260"/>
               <w:jc w:val="left"/>
             </w:pPr>
             <w:r>
@@ -1986,8 +1986,8 @@
                 <w:iCs w:val="false"/>
                 <w:caps w:val="false"/>
                 <w:color w:val="1A1530"/>
-                <w:sz w:val="24"/>
-                <w:szCs w:val="24"/>
+                <w:sz w:val="22"/>
+                <w:szCs w:val="22"/>
               </w:rPr>
               <w:t xml:space="preserve">dosłowność, echolalie, inicjowanie i naprzemienność dialogu, potrzeba AAC</w:t>
             </w:r>
@@ -2012,7 +2012,7 @@
           </w:tcPr>
           <w:p>
             <w:pPr>
-              <w:spacing w:after="0" w:before="0" w:line="270"/>
+              <w:spacing w:after="0" w:before="0" w:line="260"/>
               <w:jc w:val="left"/>
             </w:pPr>
             <w:r>
@@ -2024,8 +2024,8 @@
                 <w:iCs w:val="false"/>
                 <w:caps w:val="false"/>
                 <w:color w:val="2D1B69"/>
-                <w:sz w:val="24"/>
-                <w:szCs w:val="24"/>
+                <w:sz w:val="22"/>
+                <w:szCs w:val="22"/>
               </w:rPr>
               <w:t xml:space="preserve">d3 śr. 2,0 – poziom średni</w:t>
             </w:r>
@@ -2056,7 +2056,7 @@
           </w:tcPr>
           <w:p>
             <w:pPr>
-              <w:spacing w:after="0" w:before="0" w:line="270"/>
+              <w:spacing w:after="0" w:before="0" w:line="260"/>
               <w:jc w:val="left"/>
             </w:pPr>
             <w:r>
@@ -2068,8 +2068,8 @@
                 <w:iCs w:val="false"/>
                 <w:caps w:val="false"/>
                 <w:color w:val="2D1B69"/>
-                <w:sz w:val="24"/>
-                <w:szCs w:val="24"/>
+                <w:sz w:val="22"/>
+                <w:szCs w:val="22"/>
               </w:rPr>
               <w:t xml:space="preserve">4 · Aktywność ruchowa – poruszanie się</w:t>
             </w:r>
@@ -2094,7 +2094,7 @@
           </w:tcPr>
           <w:p>
             <w:pPr>
-              <w:spacing w:after="0" w:before="0" w:line="270"/>
+              <w:spacing w:after="0" w:before="0" w:line="260"/>
               <w:jc w:val="left"/>
             </w:pPr>
             <w:r>
@@ -2106,8 +2106,8 @@
                 <w:iCs w:val="false"/>
                 <w:caps w:val="false"/>
                 <w:color w:val="1A1530"/>
-                <w:sz w:val="24"/>
-                <w:szCs w:val="24"/>
+                <w:sz w:val="22"/>
+                <w:szCs w:val="22"/>
               </w:rPr>
               <w:t xml:space="preserve">motoryka duża, chętny udział w zabawach ruchowych</w:t>
             </w:r>
@@ -2132,7 +2132,7 @@
           </w:tcPr>
           <w:p>
             <w:pPr>
-              <w:spacing w:after="0" w:before="0" w:line="270"/>
+              <w:spacing w:after="0" w:before="0" w:line="260"/>
               <w:jc w:val="left"/>
             </w:pPr>
             <w:r>
@@ -2144,8 +2144,8 @@
                 <w:iCs w:val="false"/>
                 <w:caps w:val="false"/>
                 <w:color w:val="1A1530"/>
-                <w:sz w:val="24"/>
-                <w:szCs w:val="24"/>
+                <w:sz w:val="22"/>
+                <w:szCs w:val="22"/>
               </w:rPr>
               <w:t xml:space="preserve">motoryka mała, koordynacja wzrokowo-ruchowa, chwyt, napięcie posturalne</w:t>
             </w:r>
@@ -2170,7 +2170,7 @@
           </w:tcPr>
           <w:p>
             <w:pPr>
-              <w:spacing w:after="0" w:before="0" w:line="270"/>
+              <w:spacing w:after="0" w:before="0" w:line="260"/>
               <w:jc w:val="left"/>
             </w:pPr>
             <w:r>
@@ -2182,8 +2182,8 @@
                 <w:iCs w:val="false"/>
                 <w:caps w:val="false"/>
                 <w:color w:val="2D1B69"/>
-                <w:sz w:val="24"/>
-                <w:szCs w:val="24"/>
+                <w:sz w:val="22"/>
+                <w:szCs w:val="22"/>
               </w:rPr>
               <w:t xml:space="preserve">d4 śr. 3,2 – poziom niski</w:t>
             </w:r>
@@ -2214,7 +2214,7 @@
           </w:tcPr>
           <w:p>
             <w:pPr>
-              <w:spacing w:after="0" w:before="0" w:line="270"/>
+              <w:spacing w:after="0" w:before="0" w:line="260"/>
               <w:jc w:val="left"/>
             </w:pPr>
             <w:r>
@@ -2226,8 +2226,8 @@
                 <w:iCs w:val="false"/>
                 <w:caps w:val="false"/>
                 <w:color w:val="2D1B69"/>
-                <w:sz w:val="24"/>
-                <w:szCs w:val="24"/>
+                <w:sz w:val="22"/>
+                <w:szCs w:val="22"/>
               </w:rPr>
               <w:t xml:space="preserve">5 · Dbanie o siebie</w:t>
             </w:r>
@@ -2252,7 +2252,7 @@
           </w:tcPr>
           <w:p>
             <w:pPr>
-              <w:spacing w:after="0" w:before="0" w:line="270"/>
+              <w:spacing w:after="0" w:before="0" w:line="260"/>
               <w:jc w:val="left"/>
             </w:pPr>
             <w:r>
@@ -2264,8 +2264,8 @@
                 <w:iCs w:val="false"/>
                 <w:caps w:val="false"/>
                 <w:color w:val="1A1530"/>
-                <w:sz w:val="24"/>
-                <w:szCs w:val="24"/>
+                <w:sz w:val="22"/>
+                <w:szCs w:val="22"/>
               </w:rPr>
               <w:t xml:space="preserve">podstawowe nawyki higieniczne i toaletowe, znajomość swoich rzeczy, obowiązki po przypomnieniu</w:t>
             </w:r>
@@ -2290,7 +2290,7 @@
           </w:tcPr>
           <w:p>
             <w:pPr>
-              <w:spacing w:after="0" w:before="0" w:line="270"/>
+              <w:spacing w:after="0" w:before="0" w:line="260"/>
               <w:jc w:val="left"/>
             </w:pPr>
             <w:r>
@@ -2302,8 +2302,8 @@
                 <w:iCs w:val="false"/>
                 <w:caps w:val="false"/>
                 <w:color w:val="1A1530"/>
-                <w:sz w:val="24"/>
-                <w:szCs w:val="24"/>
+                <w:sz w:val="22"/>
+                <w:szCs w:val="22"/>
               </w:rPr>
               <w:t xml:space="preserve">opór sensoryczny przy myciu rąk, wybiórczość pokarmowa, trudne zapięcia, brak inicjowania obowiązków</w:t>
             </w:r>
@@ -2328,7 +2328,7 @@
           </w:tcPr>
           <w:p>
             <w:pPr>
-              <w:spacing w:after="0" w:before="0" w:line="270"/>
+              <w:spacing w:after="0" w:before="0" w:line="260"/>
               <w:jc w:val="left"/>
             </w:pPr>
             <w:r>
@@ -2340,8 +2340,8 @@
                 <w:iCs w:val="false"/>
                 <w:caps w:val="false"/>
                 <w:color w:val="2D1B69"/>
-                <w:sz w:val="24"/>
-                <w:szCs w:val="24"/>
+                <w:sz w:val="22"/>
+                <w:szCs w:val="22"/>
               </w:rPr>
               <w:t xml:space="preserve">d5 śr. 2,2 · d6 śr. 2,8 – poziom średni / niski</w:t>
             </w:r>
@@ -2358,7 +2358,7 @@
       <w:pPr>
         <w:keepNext/>
         <w:pBdr>
-          <w:bottom w:val="single" w:color="D9D0F0" w:sz="24" w:space="4"/>
+          <w:bottom w:val="single" w:color="D9D0F0" w:sz="22" w:space="4"/>
         </w:pBdr>
         <w:spacing w:after="100" w:before="180"/>
       </w:pPr>
@@ -2371,8 +2371,8 @@
           <w:iCs w:val="false"/>
           <w:caps w:val="false"/>
           <w:color w:val="E74509"/>
-          <w:sz w:val="24"/>
-          <w:szCs w:val="24"/>
+          <w:sz w:val="22"/>
+          <w:szCs w:val="22"/>
         </w:rPr>
         <w:t xml:space="preserve">3.  </w:t>
       </w:r>
@@ -2386,8 +2386,8 @@
           <w:caps w:val="false"/>
           <w:color w:val="2D1B69"/>
           <w:spacing w:val="8"/>
-          <w:sz w:val="24"/>
-          <w:szCs w:val="24"/>
+          <w:sz w:val="22"/>
+          <w:szCs w:val="22"/>
         </w:rPr>
         <w:t xml:space="preserve">INFORMACJA O FUNKCJONOWANIU DZIECKA / UCZNIA W PLACÓWCE – TRUDNOŚCI, MOCNE STRONY I UZDOLNIENIA (§ 7 UST. 6 PKT 3, UST. 7 PKT 1) · CD.</w:t>
       </w:r>
@@ -2406,8 +2406,8 @@
           <w:iCs w:val="false"/>
           <w:caps w:val="false"/>
           <w:color w:val="FFFFFF"/>
-          <w:sz w:val="24"/>
-          <w:szCs w:val="24"/>
+          <w:sz w:val="22"/>
+          <w:szCs w:val="22"/>
           <w:shd w:fill="2D6BB3" w:color="auto" w:val="clear"/>
         </w:rPr>
         <w:t xml:space="preserve"> B </w:t>
@@ -2421,8 +2421,8 @@
           <w:iCs w:val="false"/>
           <w:caps w:val="false"/>
           <w:color w:val="2D1B69"/>
-          <w:sz w:val="24"/>
-          <w:szCs w:val="24"/>
+          <w:sz w:val="22"/>
+          <w:szCs w:val="22"/>
         </w:rPr>
         <w:t xml:space="preserve">   B · Uczeń – 7 obszarów (ust. 7 pkt 1 lit. b)</w:t>
       </w:r>
@@ -2435,8 +2435,8 @@
           <w:iCs w:val="false"/>
           <w:caps w:val="false"/>
           <w:color w:val="6B6378"/>
-          <w:sz w:val="24"/>
-          <w:szCs w:val="24"/>
+          <w:sz w:val="22"/>
+          <w:szCs w:val="22"/>
         </w:rPr>
         <w:t xml:space="preserve"/>
       </w:r>
@@ -2496,8 +2496,8 @@
                 <w:caps/>
                 <w:color w:val="2D1B69"/>
                 <w:spacing w:val="10"/>
-                <w:sz w:val="24"/>
-                <w:szCs w:val="24"/>
+                <w:sz w:val="22"/>
+                <w:szCs w:val="22"/>
               </w:rPr>
               <w:t xml:space="preserve">Obszar (ICF)</w:t>
             </w:r>
@@ -2536,8 +2536,8 @@
                 <w:caps/>
                 <w:color w:val="2E7D45"/>
                 <w:spacing w:val="10"/>
-                <w:sz w:val="24"/>
-                <w:szCs w:val="24"/>
+                <w:sz w:val="22"/>
+                <w:szCs w:val="22"/>
               </w:rPr>
               <w:t xml:space="preserve">Mocne strony i uzdolnienia</w:t>
             </w:r>
@@ -2576,8 +2576,8 @@
                 <w:caps/>
                 <w:color w:val="BF382A"/>
                 <w:spacing w:val="10"/>
-                <w:sz w:val="24"/>
-                <w:szCs w:val="24"/>
+                <w:sz w:val="22"/>
+                <w:szCs w:val="22"/>
               </w:rPr>
               <w:t xml:space="preserve">Trudności</w:t>
             </w:r>
@@ -2616,8 +2616,8 @@
                 <w:caps/>
                 <w:color w:val="2D1B69"/>
                 <w:spacing w:val="10"/>
-                <w:sz w:val="24"/>
-                <w:szCs w:val="24"/>
+                <w:sz w:val="22"/>
+                <w:szCs w:val="22"/>
               </w:rPr>
               <w:t xml:space="preserve">Poziom potrzeby wsparcia</w:t>
             </w:r>
@@ -2648,7 +2648,7 @@
           </w:tcPr>
           <w:p>
             <w:pPr>
-              <w:spacing w:after="0" w:before="0" w:line="270"/>
+              <w:spacing w:after="0" w:before="0" w:line="260"/>
               <w:jc w:val="left"/>
             </w:pPr>
             <w:r>
@@ -2660,8 +2660,8 @@
                 <w:iCs w:val="false"/>
                 <w:caps w:val="false"/>
                 <w:color w:val="2D1B69"/>
-                <w:sz w:val="24"/>
-                <w:szCs w:val="24"/>
+                <w:sz w:val="22"/>
+                <w:szCs w:val="22"/>
               </w:rPr>
               <w:t xml:space="preserve">1 · Uczenie się i stosowanie wiedzy</w:t>
             </w:r>
@@ -2686,7 +2686,7 @@
           </w:tcPr>
           <w:p>
             <w:pPr>
-              <w:spacing w:after="0" w:before="0" w:line="270"/>
+              <w:spacing w:after="0" w:before="0" w:line="260"/>
               <w:jc w:val="left"/>
             </w:pPr>
             <w:r>
@@ -2698,8 +2698,8 @@
                 <w:iCs w:val="false"/>
                 <w:caps w:val="false"/>
                 <w:color w:val="1A1530"/>
-                <w:sz w:val="24"/>
-                <w:szCs w:val="24"/>
+                <w:sz w:val="22"/>
+                <w:szCs w:val="22"/>
               </w:rPr>
               <w:t xml:space="preserve">pamięć wzrokowa, schematy graficzne, zainteresowania, zaangażowanie przy zadaniach z obrazem</w:t>
             </w:r>
@@ -2724,7 +2724,7 @@
           </w:tcPr>
           <w:p>
             <w:pPr>
-              <w:spacing w:after="0" w:before="0" w:line="270"/>
+              <w:spacing w:after="0" w:before="0" w:line="260"/>
               <w:jc w:val="left"/>
             </w:pPr>
             <w:r>
@@ -2736,8 +2736,8 @@
                 <w:iCs w:val="false"/>
                 <w:caps w:val="false"/>
                 <w:color w:val="1A1530"/>
-                <w:sz w:val="24"/>
-                <w:szCs w:val="24"/>
+                <w:sz w:val="22"/>
+                <w:szCs w:val="22"/>
               </w:rPr>
               <w:t xml:space="preserve">uwaga, instrukcje wieloetapowe, uogólnianie, męczliwość przy pisaniu, potrzeba nadzoru</w:t>
             </w:r>
@@ -2762,7 +2762,7 @@
           </w:tcPr>
           <w:p>
             <w:pPr>
-              <w:spacing w:after="0" w:before="0" w:line="270"/>
+              <w:spacing w:after="0" w:before="0" w:line="260"/>
               <w:jc w:val="left"/>
             </w:pPr>
             <w:r>
@@ -2774,8 +2774,8 @@
                 <w:iCs w:val="false"/>
                 <w:caps w:val="false"/>
                 <w:color w:val="2D1B69"/>
-                <w:sz w:val="24"/>
-                <w:szCs w:val="24"/>
+                <w:sz w:val="22"/>
+                <w:szCs w:val="22"/>
               </w:rPr>
               <w:t xml:space="preserve">d1 śr. 2,4 · d8 śr. 2,0 – średni</w:t>
             </w:r>
@@ -2806,7 +2806,7 @@
           </w:tcPr>
           <w:p>
             <w:pPr>
-              <w:spacing w:after="0" w:before="0" w:line="270"/>
+              <w:spacing w:after="0" w:before="0" w:line="260"/>
               <w:jc w:val="left"/>
             </w:pPr>
             <w:r>
@@ -2818,8 +2818,8 @@
                 <w:iCs w:val="false"/>
                 <w:caps w:val="false"/>
                 <w:color w:val="2D1B69"/>
-                <w:sz w:val="24"/>
-                <w:szCs w:val="24"/>
+                <w:sz w:val="22"/>
+                <w:szCs w:val="22"/>
               </w:rPr>
               <w:t xml:space="preserve">2 · Ogólne zadania i obowiązki</w:t>
             </w:r>
@@ -2844,7 +2844,7 @@
           </w:tcPr>
           <w:p>
             <w:pPr>
-              <w:spacing w:after="0" w:before="0" w:line="270"/>
+              <w:spacing w:after="0" w:before="0" w:line="260"/>
               <w:jc w:val="left"/>
             </w:pPr>
             <w:r>
@@ -2856,8 +2856,8 @@
                 <w:iCs w:val="false"/>
                 <w:caps w:val="false"/>
                 <w:color w:val="1A1530"/>
-                <w:sz w:val="24"/>
-                <w:szCs w:val="24"/>
+                <w:sz w:val="22"/>
+                <w:szCs w:val="22"/>
               </w:rPr>
               <w:t xml:space="preserve">zadania o stałej strukturze, zasady wizualne</w:t>
             </w:r>
@@ -2882,7 +2882,7 @@
           </w:tcPr>
           <w:p>
             <w:pPr>
-              <w:spacing w:after="0" w:before="0" w:line="270"/>
+              <w:spacing w:after="0" w:before="0" w:line="260"/>
               <w:jc w:val="left"/>
             </w:pPr>
             <w:r>
@@ -2894,8 +2894,8 @@
                 <w:iCs w:val="false"/>
                 <w:caps w:val="false"/>
                 <w:color w:val="1A1530"/>
-                <w:sz w:val="24"/>
-                <w:szCs w:val="24"/>
+                <w:sz w:val="22"/>
+                <w:szCs w:val="22"/>
               </w:rPr>
               <w:t xml:space="preserve">organizacja pracy, zadania wieloetapowe, stres przy zmianach</w:t>
             </w:r>
@@ -2920,7 +2920,7 @@
           </w:tcPr>
           <w:p>
             <w:pPr>
-              <w:spacing w:after="0" w:before="0" w:line="270"/>
+              <w:spacing w:after="0" w:before="0" w:line="260"/>
               <w:jc w:val="left"/>
             </w:pPr>
             <w:r>
@@ -2932,8 +2932,8 @@
                 <w:iCs w:val="false"/>
                 <w:caps w:val="false"/>
                 <w:color w:val="2D1B69"/>
-                <w:sz w:val="24"/>
-                <w:szCs w:val="24"/>
+                <w:sz w:val="22"/>
+                <w:szCs w:val="22"/>
               </w:rPr>
               <w:t xml:space="preserve">d2 śr. 1,8 – wysoki</w:t>
             </w:r>
@@ -2964,7 +2964,7 @@
           </w:tcPr>
           <w:p>
             <w:pPr>
-              <w:spacing w:after="0" w:before="0" w:line="270"/>
+              <w:spacing w:after="0" w:before="0" w:line="260"/>
               <w:jc w:val="left"/>
             </w:pPr>
             <w:r>
@@ -2976,8 +2976,8 @@
                 <w:iCs w:val="false"/>
                 <w:caps w:val="false"/>
                 <w:color w:val="2D1B69"/>
-                <w:sz w:val="24"/>
-                <w:szCs w:val="24"/>
+                <w:sz w:val="22"/>
+                <w:szCs w:val="22"/>
               </w:rPr>
               <w:t xml:space="preserve">3 · Porozumiewanie się</w:t>
             </w:r>
@@ -3002,7 +3002,7 @@
           </w:tcPr>
           <w:p>
             <w:pPr>
-              <w:spacing w:after="0" w:before="0" w:line="270"/>
+              <w:spacing w:after="0" w:before="0" w:line="260"/>
               <w:jc w:val="left"/>
             </w:pPr>
             <w:r>
@@ -3014,8 +3014,8 @@
                 <w:iCs w:val="false"/>
                 <w:caps w:val="false"/>
                 <w:color w:val="1A1530"/>
-                <w:sz w:val="24"/>
-                <w:szCs w:val="24"/>
+                <w:sz w:val="22"/>
+                <w:szCs w:val="22"/>
               </w:rPr>
               <w:t xml:space="preserve">rozumienie prostych komunikatów z gestem, sygnalizowanie potrzeb</w:t>
             </w:r>
@@ -3040,7 +3040,7 @@
           </w:tcPr>
           <w:p>
             <w:pPr>
-              <w:spacing w:after="0" w:before="0" w:line="270"/>
+              <w:spacing w:after="0" w:before="0" w:line="260"/>
               <w:jc w:val="left"/>
             </w:pPr>
             <w:r>
@@ -3052,8 +3052,8 @@
                 <w:iCs w:val="false"/>
                 <w:caps w:val="false"/>
                 <w:color w:val="1A1530"/>
-                <w:sz w:val="24"/>
-                <w:szCs w:val="24"/>
+                <w:sz w:val="22"/>
+                <w:szCs w:val="22"/>
               </w:rPr>
               <w:t xml:space="preserve">dosłowność, echolalie, inicjowanie dialogu, potrzeba AAC</w:t>
             </w:r>
@@ -3078,7 +3078,7 @@
           </w:tcPr>
           <w:p>
             <w:pPr>
-              <w:spacing w:after="0" w:before="0" w:line="270"/>
+              <w:spacing w:after="0" w:before="0" w:line="260"/>
               <w:jc w:val="left"/>
             </w:pPr>
             <w:r>
@@ -3090,8 +3090,8 @@
                 <w:iCs w:val="false"/>
                 <w:caps w:val="false"/>
                 <w:color w:val="2D1B69"/>
-                <w:sz w:val="24"/>
-                <w:szCs w:val="24"/>
+                <w:sz w:val="22"/>
+                <w:szCs w:val="22"/>
               </w:rPr>
               <w:t xml:space="preserve">d3 śr. 2,0 – średni</w:t>
             </w:r>
@@ -3122,7 +3122,7 @@
           </w:tcPr>
           <w:p>
             <w:pPr>
-              <w:spacing w:after="0" w:before="0" w:line="270"/>
+              <w:spacing w:after="0" w:before="0" w:line="260"/>
               <w:jc w:val="left"/>
             </w:pPr>
             <w:r>
@@ -3134,8 +3134,8 @@
                 <w:iCs w:val="false"/>
                 <w:caps w:val="false"/>
                 <w:color w:val="2D1B69"/>
-                <w:sz w:val="24"/>
-                <w:szCs w:val="24"/>
+                <w:sz w:val="22"/>
+                <w:szCs w:val="22"/>
               </w:rPr>
               <w:t xml:space="preserve">4 · Motoryka, poruszanie się, w tym mobilność i aktywność manualna</w:t>
             </w:r>
@@ -3160,7 +3160,7 @@
           </w:tcPr>
           <w:p>
             <w:pPr>
-              <w:spacing w:after="0" w:before="0" w:line="270"/>
+              <w:spacing w:after="0" w:before="0" w:line="260"/>
               <w:jc w:val="left"/>
             </w:pPr>
             <w:r>
@@ -3172,8 +3172,8 @@
                 <w:iCs w:val="false"/>
                 <w:caps w:val="false"/>
                 <w:color w:val="1A1530"/>
-                <w:sz w:val="24"/>
-                <w:szCs w:val="24"/>
+                <w:sz w:val="22"/>
+                <w:szCs w:val="22"/>
               </w:rPr>
               <w:t xml:space="preserve">motoryka duża, zabawy ruchowe</w:t>
             </w:r>
@@ -3198,7 +3198,7 @@
           </w:tcPr>
           <w:p>
             <w:pPr>
-              <w:spacing w:after="0" w:before="0" w:line="270"/>
+              <w:spacing w:after="0" w:before="0" w:line="260"/>
               <w:jc w:val="left"/>
             </w:pPr>
             <w:r>
@@ -3210,8 +3210,8 @@
                 <w:iCs w:val="false"/>
                 <w:caps w:val="false"/>
                 <w:color w:val="1A1530"/>
-                <w:sz w:val="24"/>
-                <w:szCs w:val="24"/>
+                <w:sz w:val="22"/>
+                <w:szCs w:val="22"/>
               </w:rPr>
               <w:t xml:space="preserve">motoryka mała, koordynacja, chwyt</w:t>
             </w:r>
@@ -3236,7 +3236,7 @@
           </w:tcPr>
           <w:p>
             <w:pPr>
-              <w:spacing w:after="0" w:before="0" w:line="270"/>
+              <w:spacing w:after="0" w:before="0" w:line="260"/>
               <w:jc w:val="left"/>
             </w:pPr>
             <w:r>
@@ -3248,8 +3248,8 @@
                 <w:iCs w:val="false"/>
                 <w:caps w:val="false"/>
                 <w:color w:val="2D1B69"/>
-                <w:sz w:val="24"/>
-                <w:szCs w:val="24"/>
+                <w:sz w:val="22"/>
+                <w:szCs w:val="22"/>
               </w:rPr>
               <w:t xml:space="preserve">d4 śr. 3,2 – niski</w:t>
             </w:r>
@@ -3280,7 +3280,7 @@
           </w:tcPr>
           <w:p>
             <w:pPr>
-              <w:spacing w:after="0" w:before="0" w:line="270"/>
+              <w:spacing w:after="0" w:before="0" w:line="260"/>
               <w:jc w:val="left"/>
             </w:pPr>
             <w:r>
@@ -3292,8 +3292,8 @@
                 <w:iCs w:val="false"/>
                 <w:caps w:val="false"/>
                 <w:color w:val="2D1B69"/>
-                <w:sz w:val="24"/>
-                <w:szCs w:val="24"/>
+                <w:sz w:val="22"/>
+                <w:szCs w:val="22"/>
               </w:rPr>
               <w:t xml:space="preserve">5 · Dbanie o siebie, samoobsługa i samodzielność</w:t>
             </w:r>
@@ -3318,7 +3318,7 @@
           </w:tcPr>
           <w:p>
             <w:pPr>
-              <w:spacing w:after="0" w:before="0" w:line="270"/>
+              <w:spacing w:after="0" w:before="0" w:line="260"/>
               <w:jc w:val="left"/>
             </w:pPr>
             <w:r>
@@ -3330,8 +3330,8 @@
                 <w:iCs w:val="false"/>
                 <w:caps w:val="false"/>
                 <w:color w:val="1A1530"/>
-                <w:sz w:val="24"/>
-                <w:szCs w:val="24"/>
+                <w:sz w:val="22"/>
+                <w:szCs w:val="22"/>
               </w:rPr>
               <w:t xml:space="preserve">higiena i toaleta, znajomość swoich rzeczy</w:t>
             </w:r>
@@ -3356,7 +3356,7 @@
           </w:tcPr>
           <w:p>
             <w:pPr>
-              <w:spacing w:after="0" w:before="0" w:line="270"/>
+              <w:spacing w:after="0" w:before="0" w:line="260"/>
               <w:jc w:val="left"/>
             </w:pPr>
             <w:r>
@@ -3368,8 +3368,8 @@
                 <w:iCs w:val="false"/>
                 <w:caps w:val="false"/>
                 <w:color w:val="1A1530"/>
-                <w:sz w:val="24"/>
-                <w:szCs w:val="24"/>
+                <w:sz w:val="22"/>
+                <w:szCs w:val="22"/>
               </w:rPr>
               <w:t xml:space="preserve">opór sensoryczny przy myciu rąk, wybiórczość pokarmowa, zapięcia</w:t>
             </w:r>
@@ -3394,7 +3394,7 @@
           </w:tcPr>
           <w:p>
             <w:pPr>
-              <w:spacing w:after="0" w:before="0" w:line="270"/>
+              <w:spacing w:after="0" w:before="0" w:line="260"/>
               <w:jc w:val="left"/>
             </w:pPr>
             <w:r>
@@ -3406,8 +3406,8 @@
                 <w:iCs w:val="false"/>
                 <w:caps w:val="false"/>
                 <w:color w:val="2D1B69"/>
-                <w:sz w:val="24"/>
-                <w:szCs w:val="24"/>
+                <w:sz w:val="22"/>
+                <w:szCs w:val="22"/>
               </w:rPr>
               <w:t xml:space="preserve">d5 śr. 2,2 – średni</w:t>
             </w:r>
@@ -3438,7 +3438,7 @@
           </w:tcPr>
           <w:p>
             <w:pPr>
-              <w:spacing w:after="0" w:before="0" w:line="270"/>
+              <w:spacing w:after="0" w:before="0" w:line="260"/>
               <w:jc w:val="left"/>
             </w:pPr>
             <w:r>
@@ -3450,8 +3450,8 @@
                 <w:iCs w:val="false"/>
                 <w:caps w:val="false"/>
                 <w:color w:val="2D1B69"/>
-                <w:sz w:val="24"/>
-                <w:szCs w:val="24"/>
+                <w:sz w:val="22"/>
+                <w:szCs w:val="22"/>
               </w:rPr>
               <w:t xml:space="preserve">6 · Życie domowe</w:t>
             </w:r>
@@ -3476,7 +3476,7 @@
           </w:tcPr>
           <w:p>
             <w:pPr>
-              <w:spacing w:after="0" w:before="0" w:line="270"/>
+              <w:spacing w:after="0" w:before="0" w:line="260"/>
               <w:jc w:val="left"/>
             </w:pPr>
             <w:r>
@@ -3488,8 +3488,8 @@
                 <w:iCs w:val="false"/>
                 <w:caps w:val="false"/>
                 <w:color w:val="1A1530"/>
-                <w:sz w:val="24"/>
-                <w:szCs w:val="24"/>
+                <w:sz w:val="22"/>
+                <w:szCs w:val="22"/>
               </w:rPr>
               <w:t xml:space="preserve">dyżur i sprzątanie po przypomnieniu</w:t>
             </w:r>
@@ -3514,7 +3514,7 @@
           </w:tcPr>
           <w:p>
             <w:pPr>
-              <w:spacing w:after="0" w:before="0" w:line="270"/>
+              <w:spacing w:after="0" w:before="0" w:line="260"/>
               <w:jc w:val="left"/>
             </w:pPr>
             <w:r>
@@ -3526,8 +3526,8 @@
                 <w:iCs w:val="false"/>
                 <w:caps w:val="false"/>
                 <w:color w:val="1A1530"/>
-                <w:sz w:val="24"/>
-                <w:szCs w:val="24"/>
+                <w:sz w:val="22"/>
+                <w:szCs w:val="22"/>
               </w:rPr>
               <w:t xml:space="preserve">brak inicjowania, niedoprowadzanie do końca</w:t>
             </w:r>
@@ -3552,7 +3552,7 @@
           </w:tcPr>
           <w:p>
             <w:pPr>
-              <w:spacing w:after="0" w:before="0" w:line="270"/>
+              <w:spacing w:after="0" w:before="0" w:line="260"/>
               <w:jc w:val="left"/>
             </w:pPr>
             <w:r>
@@ -3564,8 +3564,8 @@
                 <w:iCs w:val="false"/>
                 <w:caps w:val="false"/>
                 <w:color w:val="2D1B69"/>
-                <w:sz w:val="24"/>
-                <w:szCs w:val="24"/>
+                <w:sz w:val="22"/>
+                <w:szCs w:val="22"/>
               </w:rPr>
               <w:t xml:space="preserve">d6 śr. 2,8 – niski</w:t>
             </w:r>
@@ -3596,7 +3596,7 @@
           </w:tcPr>
           <w:p>
             <w:pPr>
-              <w:spacing w:after="0" w:before="0" w:line="270"/>
+              <w:spacing w:after="0" w:before="0" w:line="260"/>
               <w:jc w:val="left"/>
             </w:pPr>
             <w:r>
@@ -3608,8 +3608,8 @@
                 <w:iCs w:val="false"/>
                 <w:caps w:val="false"/>
                 <w:color w:val="2D1B69"/>
-                <w:sz w:val="24"/>
-                <w:szCs w:val="24"/>
+                <w:sz w:val="22"/>
+                <w:szCs w:val="22"/>
               </w:rPr>
               <w:t xml:space="preserve">7 · Wzajemne kontakty i związki międzyludzkie, życie w społeczności szkolnej i lokalnej</w:t>
             </w:r>
@@ -3634,7 +3634,7 @@
           </w:tcPr>
           <w:p>
             <w:pPr>
-              <w:spacing w:after="0" w:before="0" w:line="270"/>
+              <w:spacing w:after="0" w:before="0" w:line="260"/>
               <w:jc w:val="left"/>
             </w:pPr>
             <w:r>
@@ -3646,8 +3646,8 @@
                 <w:iCs w:val="false"/>
                 <w:caps w:val="false"/>
                 <w:color w:val="1A1530"/>
-                <w:sz w:val="24"/>
-                <w:szCs w:val="24"/>
+                <w:sz w:val="22"/>
+                <w:szCs w:val="22"/>
               </w:rPr>
               <w:t xml:space="preserve">bliskość grupy, reakcja na stałych dorosłych; udział w wydarzeniach po przygotowaniu</w:t>
             </w:r>
@@ -3672,7 +3672,7 @@
           </w:tcPr>
           <w:p>
             <w:pPr>
-              <w:spacing w:after="0" w:before="0" w:line="270"/>
+              <w:spacing w:after="0" w:before="0" w:line="260"/>
               <w:jc w:val="left"/>
             </w:pPr>
             <w:r>
@@ -3684,8 +3684,8 @@
                 <w:iCs w:val="false"/>
                 <w:caps w:val="false"/>
                 <w:color w:val="1A1530"/>
-                <w:sz w:val="24"/>
-                <w:szCs w:val="24"/>
+                <w:sz w:val="22"/>
+                <w:szCs w:val="22"/>
               </w:rPr>
               <w:t xml:space="preserve">odczytywanie emocji i intencji, tolerancja frustracji, konflikty; przeciążenie w apelach i wyjściach – wycofanie lub zachowania trudne</w:t>
             </w:r>
@@ -3710,7 +3710,7 @@
           </w:tcPr>
           <w:p>
             <w:pPr>
-              <w:spacing w:after="0" w:before="0" w:line="270"/>
+              <w:spacing w:after="0" w:before="0" w:line="260"/>
               <w:jc w:val="left"/>
             </w:pPr>
             <w:r>
@@ -3722,8 +3722,8 @@
                 <w:iCs w:val="false"/>
                 <w:caps w:val="false"/>
                 <w:color w:val="2D1B69"/>
-                <w:sz w:val="24"/>
-                <w:szCs w:val="24"/>
+                <w:sz w:val="22"/>
+                <w:szCs w:val="22"/>
               </w:rPr>
               <w:t xml:space="preserve">d7 śr. 1,6 · d9 śr. 1,8 – wysoki</w:t>
             </w:r>
@@ -3745,8 +3745,8 @@
           <w:iCs w:val="false"/>
           <w:caps w:val="false"/>
           <w:color w:val="2D1B69"/>
-          <w:sz w:val="24"/>
-          <w:szCs w:val="24"/>
+          <w:sz w:val="22"/>
+          <w:szCs w:val="22"/>
         </w:rPr>
         <w:t xml:space="preserve">Wynik ogólny: 68 / 180 pkt, średnia 2,1 (skala 0–5) – umiarkowana potrzeba wsparcia; trzy domeny na poziomie wysokim (d2, d7, d9).</w:t>
       </w:r>
@@ -3755,7 +3755,7 @@
       <w:pPr>
         <w:keepNext/>
         <w:pBdr>
-          <w:bottom w:val="single" w:color="D9D0F0" w:sz="24" w:space="4"/>
+          <w:bottom w:val="single" w:color="D9D0F0" w:sz="22" w:space="4"/>
         </w:pBdr>
         <w:spacing w:after="100" w:before="180"/>
       </w:pPr>
@@ -3768,8 +3768,8 @@
           <w:iCs w:val="false"/>
           <w:caps w:val="false"/>
           <w:color w:val="E74509"/>
-          <w:sz w:val="24"/>
-          <w:szCs w:val="24"/>
+          <w:sz w:val="22"/>
+          <w:szCs w:val="22"/>
         </w:rPr>
         <w:t xml:space="preserve">4.  </w:t>
       </w:r>
@@ -3783,8 +3783,8 @@
           <w:caps w:val="false"/>
           <w:color w:val="2D1B69"/>
           <w:spacing w:val="8"/>
-          <w:sz w:val="24"/>
-          <w:szCs w:val="24"/>
+          <w:sz w:val="22"/>
+          <w:szCs w:val="22"/>
         </w:rPr>
         <w:t xml:space="preserve">ZAKRES I RODZAJ TRUDNOŚCI W REALIZACJI PROGRAMU WYCHOWANIA PRZEDSZKOLNEGO / PROGRAMÓW NAUCZANIA REALIZOWANYCH W ODDZIALE (§ 7 UST. 7 PKT 2)</w:t>
       </w:r>
@@ -3803,8 +3803,8 @@
           <w:iCs w:val="false"/>
           <w:caps w:val="false"/>
           <w:color w:val="E74509"/>
-          <w:sz w:val="24"/>
-          <w:szCs w:val="24"/>
+          <w:sz w:val="22"/>
+          <w:szCs w:val="22"/>
         </w:rPr>
         <w:t xml:space="preserve">•  </w:t>
       </w:r>
@@ -3817,8 +3817,8 @@
           <w:iCs w:val="false"/>
           <w:caps w:val="false"/>
           <w:color w:val="1A1530"/>
-          <w:sz w:val="24"/>
-          <w:szCs w:val="24"/>
+          <w:sz w:val="22"/>
+          <w:szCs w:val="22"/>
         </w:rPr>
         <w:t xml:space="preserve">Program wychowania przedszkolnego / programy nauczania: [nazwa programu, oddział].</w:t>
       </w:r>
@@ -3837,8 +3837,8 @@
           <w:iCs w:val="false"/>
           <w:caps w:val="false"/>
           <w:color w:val="E74509"/>
-          <w:sz w:val="24"/>
-          <w:szCs w:val="24"/>
+          <w:sz w:val="22"/>
+          <w:szCs w:val="22"/>
         </w:rPr>
         <w:t xml:space="preserve">•  </w:t>
       </w:r>
@@ -3851,8 +3851,8 @@
           <w:iCs w:val="false"/>
           <w:caps w:val="false"/>
           <w:color w:val="1A1530"/>
-          <w:sz w:val="24"/>
-          <w:szCs w:val="24"/>
+          <w:sz w:val="22"/>
+          <w:szCs w:val="22"/>
         </w:rPr>
         <w:t xml:space="preserve">Rozumienie poleceń złożonych i samodzielna organizacja pracy – wymaga instrukcji krok po kroku wspartych obrazem; bez dostosowania rezygnuje z zadania.</w:t>
       </w:r>
@@ -3871,8 +3871,8 @@
           <w:iCs w:val="false"/>
           <w:caps w:val="false"/>
           <w:color w:val="E74509"/>
-          <w:sz w:val="24"/>
-          <w:szCs w:val="24"/>
+          <w:sz w:val="22"/>
+          <w:szCs w:val="22"/>
         </w:rPr>
         <w:t xml:space="preserve">•  </w:t>
       </w:r>
@@ -3885,8 +3885,8 @@
           <w:iCs w:val="false"/>
           <w:caps w:val="false"/>
           <w:color w:val="1A1530"/>
-          <w:sz w:val="24"/>
-          <w:szCs w:val="24"/>
+          <w:sz w:val="22"/>
+          <w:szCs w:val="22"/>
         </w:rPr>
         <w:t xml:space="preserve">Utrzymanie uwagi na zadaniu (obecnie do 8 min po dostosowaniu środowiska) i szybka męczliwość przy zadaniach pisemnych i wykonawczych.</w:t>
       </w:r>
@@ -3905,8 +3905,8 @@
           <w:iCs w:val="false"/>
           <w:caps w:val="false"/>
           <w:color w:val="E74509"/>
-          <w:sz w:val="24"/>
-          <w:szCs w:val="24"/>
+          <w:sz w:val="22"/>
+          <w:szCs w:val="22"/>
         </w:rPr>
         <w:t xml:space="preserve">•  </w:t>
       </w:r>
@@ -3919,8 +3919,8 @@
           <w:iCs w:val="false"/>
           <w:caps w:val="false"/>
           <w:color w:val="1A1530"/>
-          <w:sz w:val="24"/>
-          <w:szCs w:val="24"/>
+          <w:sz w:val="22"/>
+          <w:szCs w:val="22"/>
         </w:rPr>
         <w:t xml:space="preserve">Uczestnictwo w zajęciach grupowych, apelach i wyjściach – przeciążenie sensoryczne prowadzi do wycofania lub zachowań trudnych.</w:t>
       </w:r>
@@ -3939,8 +3939,8 @@
           <w:iCs w:val="false"/>
           <w:caps w:val="false"/>
           <w:color w:val="E74509"/>
-          <w:sz w:val="24"/>
-          <w:szCs w:val="24"/>
+          <w:sz w:val="22"/>
+          <w:szCs w:val="22"/>
         </w:rPr>
         <w:t xml:space="preserve">•  </w:t>
       </w:r>
@@ -3953,8 +3953,8 @@
           <w:iCs w:val="false"/>
           <w:caps w:val="false"/>
           <w:color w:val="1A1530"/>
-          <w:sz w:val="24"/>
-          <w:szCs w:val="24"/>
+          <w:sz w:val="22"/>
+          <w:szCs w:val="22"/>
         </w:rPr>
         <w:t xml:space="preserve">Komunikacja z rówieśnikami i nauczycielem w sytuacjach swobodnych – potrzeba wsparcia AAC i skryptów dialogowych.</w:t>
       </w:r>
@@ -3973,8 +3973,8 @@
           <w:iCs w:val="false"/>
           <w:caps w:val="false"/>
           <w:color w:val="E74509"/>
-          <w:sz w:val="24"/>
-          <w:szCs w:val="24"/>
+          <w:sz w:val="22"/>
+          <w:szCs w:val="22"/>
         </w:rPr>
         <w:t xml:space="preserve">•  </w:t>
       </w:r>
@@ -3987,8 +3987,8 @@
           <w:iCs w:val="false"/>
           <w:caps w:val="false"/>
           <w:color w:val="1A1530"/>
-          <w:sz w:val="24"/>
-          <w:szCs w:val="24"/>
+          <w:sz w:val="22"/>
+          <w:szCs w:val="22"/>
         </w:rPr>
         <w:t xml:space="preserve">Grafomotoryka, czynności manualne (chwyt, wycinanie) oraz samoobsługa przy posiłkach i toalecie – realizowane w wydłużonym czasie z dostosowanymi przyborami.</w:t>
       </w:r>
@@ -4007,8 +4007,8 @@
           <w:iCs w:val="false"/>
           <w:caps w:val="false"/>
           <w:color w:val="E74509"/>
-          <w:sz w:val="24"/>
-          <w:szCs w:val="24"/>
+          <w:sz w:val="22"/>
+          <w:szCs w:val="22"/>
         </w:rPr>
         <w:t xml:space="preserve">•  </w:t>
       </w:r>
@@ -4021,8 +4021,8 @@
           <w:iCs w:val="false"/>
           <w:caps w:val="false"/>
           <w:color w:val="1A1530"/>
-          <w:sz w:val="24"/>
-          <w:szCs w:val="24"/>
+          <w:sz w:val="22"/>
+          <w:szCs w:val="22"/>
         </w:rPr>
         <w:t xml:space="preserve">Wprowadzone dostosowania w toku realizacji programu: plany aktywności, instrukcje jednoetapowe, wydłużony czas, przerwy sensoryczne, ocena postępu względem samego siebie.</w:t>
       </w:r>
@@ -4036,7 +4036,7 @@
       <w:pPr>
         <w:keepNext/>
         <w:pBdr>
-          <w:bottom w:val="single" w:color="D9D0F0" w:sz="24" w:space="4"/>
+          <w:bottom w:val="single" w:color="D9D0F0" w:sz="22" w:space="4"/>
         </w:pBdr>
         <w:spacing w:after="100" w:before="180"/>
       </w:pPr>
@@ -4049,8 +4049,8 @@
           <w:iCs w:val="false"/>
           <w:caps w:val="false"/>
           <w:color w:val="E74509"/>
-          <w:sz w:val="24"/>
-          <w:szCs w:val="24"/>
+          <w:sz w:val="22"/>
+          <w:szCs w:val="22"/>
         </w:rPr>
         <w:t xml:space="preserve">5.  </w:t>
       </w:r>
@@ -4064,8 +4064,8 @@
           <w:caps w:val="false"/>
           <w:color w:val="2D1B69"/>
           <w:spacing w:val="8"/>
-          <w:sz w:val="24"/>
-          <w:szCs w:val="24"/>
+          <w:sz w:val="22"/>
+          <w:szCs w:val="22"/>
         </w:rPr>
         <w:t xml:space="preserve">ZAŁĄCZNIKI EWALUACYJNE (§ 7 UST. 6 PKT 4–5)</w:t>
       </w:r>
@@ -4078,14 +4078,9 @@
       <w:r>
         <w:rPr>
           <w:rFonts w:ascii="Arial" w:cs="Arial" w:eastAsia="Arial" w:hAnsi="Arial"/>
-          <w:b w:val="false"/>
-          <w:bCs w:val="false"/>
-          <w:i w:val="false"/>
-          <w:iCs w:val="false"/>
-          <w:caps w:val="false"/>
           <w:color w:val="E74509"/>
-          <w:sz w:val="24"/>
-          <w:szCs w:val="24"/>
+          <w:sz w:val="22"/>
+          <w:szCs w:val="22"/>
         </w:rPr>
         <w:t xml:space="preserve">☑  </w:t>
       </w:r>
@@ -4098,8 +4093,8 @@
           <w:iCs w:val="false"/>
           <w:caps w:val="false"/>
           <w:color w:val="1A1530"/>
-          <w:sz w:val="24"/>
-          <w:szCs w:val="24"/>
+          <w:sz w:val="22"/>
+          <w:szCs w:val="22"/>
         </w:rPr>
         <w:t xml:space="preserve">Aktualna wielospecjalistyczna ocena poziomu funkcjonowania dziecka / ucznia (WOPF) – dziecko / uczeń objęty kształceniem specjalnym (pkt 4)</w:t>
       </w:r>
@@ -4112,14 +4107,9 @@
       <w:r>
         <w:rPr>
           <w:rFonts w:ascii="Arial" w:cs="Arial" w:eastAsia="Arial" w:hAnsi="Arial"/>
-          <w:b w:val="false"/>
-          <w:bCs w:val="false"/>
-          <w:i w:val="false"/>
-          <w:iCs w:val="false"/>
-          <w:caps w:val="false"/>
           <w:color w:val="B6A6DF"/>
-          <w:sz w:val="24"/>
-          <w:szCs w:val="24"/>
+          <w:sz w:val="22"/>
+          <w:szCs w:val="22"/>
         </w:rPr>
         <w:t xml:space="preserve">☐  </w:t>
       </w:r>
@@ -4132,8 +4122,8 @@
           <w:iCs w:val="false"/>
           <w:caps w:val="false"/>
           <w:color w:val="1A1530"/>
-          <w:sz w:val="24"/>
-          <w:szCs w:val="24"/>
+          <w:sz w:val="22"/>
+          <w:szCs w:val="22"/>
         </w:rPr>
         <w:t xml:space="preserve">Aktualna okresowa ocena funkcjonowania – dziecko / uczeń objęty zajęciami rewalidacyjno-wychowawczymi (pkt 5)</w:t>
       </w:r>
@@ -4146,14 +4136,9 @@
       <w:r>
         <w:rPr>
           <w:rFonts w:ascii="Arial" w:cs="Arial" w:eastAsia="Arial" w:hAnsi="Arial"/>
-          <w:b w:val="false"/>
-          <w:bCs w:val="false"/>
-          <w:i w:val="false"/>
-          <w:iCs w:val="false"/>
-          <w:caps w:val="false"/>
           <w:color w:val="B6A6DF"/>
-          <w:sz w:val="24"/>
-          <w:szCs w:val="24"/>
+          <w:sz w:val="22"/>
+          <w:szCs w:val="22"/>
         </w:rPr>
         <w:t xml:space="preserve">☐  </w:t>
       </w:r>
@@ -4166,8 +4151,8 @@
           <w:iCs w:val="false"/>
           <w:caps w:val="false"/>
           <w:color w:val="1A1530"/>
-          <w:sz w:val="24"/>
-          <w:szCs w:val="24"/>
+          <w:sz w:val="22"/>
+          <w:szCs w:val="22"/>
         </w:rPr>
         <w:t xml:space="preserve">Nie dotyczy – dziecko / uczeń nieobjęty kształceniem specjalnym ani zajęciami rewalidacyjno-wychowawczymi</w:t>
       </w:r>
@@ -4176,7 +4161,7 @@
       <w:pPr>
         <w:keepNext/>
         <w:pBdr>
-          <w:bottom w:val="single" w:color="D9D0F0" w:sz="24" w:space="4"/>
+          <w:bottom w:val="single" w:color="D9D0F0" w:sz="22" w:space="4"/>
         </w:pBdr>
         <w:spacing w:after="100" w:before="180"/>
       </w:pPr>
@@ -4189,8 +4174,8 @@
           <w:iCs w:val="false"/>
           <w:caps w:val="false"/>
           <w:color w:val="E74509"/>
-          <w:sz w:val="24"/>
-          <w:szCs w:val="24"/>
+          <w:sz w:val="22"/>
+          <w:szCs w:val="22"/>
         </w:rPr>
         <w:t xml:space="preserve">6.  </w:t>
       </w:r>
@@ -4204,8 +4189,8 @@
           <w:caps w:val="false"/>
           <w:color w:val="2D1B69"/>
           <w:spacing w:val="8"/>
-          <w:sz w:val="24"/>
-          <w:szCs w:val="24"/>
+          <w:sz w:val="22"/>
+          <w:szCs w:val="22"/>
         </w:rPr>
         <w:t xml:space="preserve">DZIAŁANIA PODJĘTE PRZEZ NAUCZYCIELI, WYCHOWAWCÓW I SPECJALISTÓW W CELU POPRAWY FUNKCJONOWANIA; FORMY I ZAKRES POMOCY W RAMACH WCZESNEGO WSPOMAGANIA ROZWOJU LUB POMOCY PSYCHOLOGICZNO-PEDAGOGICZNEJ, OKRES ICH UDZIELANIA ORAZ EFEKTY (§ 7 UST. 6 PKT 6)</w:t>
       </w:r>
@@ -4265,8 +4250,8 @@
                 <w:caps/>
                 <w:color w:val="2D1B69"/>
                 <w:spacing w:val="10"/>
-                <w:sz w:val="24"/>
-                <w:szCs w:val="24"/>
+                <w:sz w:val="22"/>
+                <w:szCs w:val="22"/>
               </w:rPr>
               <w:t xml:space="preserve">Działanie / forma pomocy</w:t>
             </w:r>
@@ -4305,8 +4290,8 @@
                 <w:caps/>
                 <w:color w:val="2D1B69"/>
                 <w:spacing w:val="10"/>
-                <w:sz w:val="24"/>
-                <w:szCs w:val="24"/>
+                <w:sz w:val="22"/>
+                <w:szCs w:val="22"/>
               </w:rPr>
               <w:t xml:space="preserve">Zakres i wymiar</w:t>
             </w:r>
@@ -4345,8 +4330,8 @@
                 <w:caps/>
                 <w:color w:val="2D1B69"/>
                 <w:spacing w:val="10"/>
-                <w:sz w:val="24"/>
-                <w:szCs w:val="24"/>
+                <w:sz w:val="22"/>
+                <w:szCs w:val="22"/>
               </w:rPr>
               <w:t xml:space="preserve">Okres udzielania</w:t>
             </w:r>
@@ -4385,8 +4370,8 @@
                 <w:caps/>
                 <w:color w:val="2D1B69"/>
                 <w:spacing w:val="10"/>
-                <w:sz w:val="24"/>
-                <w:szCs w:val="24"/>
+                <w:sz w:val="22"/>
+                <w:szCs w:val="22"/>
               </w:rPr>
               <w:t xml:space="preserve">Efekty</w:t>
             </w:r>
@@ -4417,7 +4402,7 @@
           </w:tcPr>
           <w:p>
             <w:pPr>
-              <w:spacing w:after="0" w:before="0" w:line="270"/>
+              <w:spacing w:after="0" w:before="0" w:line="260"/>
               <w:jc w:val="left"/>
             </w:pPr>
             <w:r>
@@ -4429,8 +4414,8 @@
                 <w:iCs w:val="false"/>
                 <w:caps w:val="false"/>
                 <w:color w:val="2D1B69"/>
-                <w:sz w:val="24"/>
-                <w:szCs w:val="24"/>
+                <w:sz w:val="22"/>
+                <w:szCs w:val="22"/>
               </w:rPr>
               <w:t xml:space="preserve">Dostosowania środowiskowe i dydaktyczne</w:t>
             </w:r>
@@ -4455,7 +4440,7 @@
           </w:tcPr>
           <w:p>
             <w:pPr>
-              <w:spacing w:after="0" w:before="0" w:line="270"/>
+              <w:spacing w:after="0" w:before="0" w:line="260"/>
               <w:jc w:val="left"/>
             </w:pPr>
             <w:r>
@@ -4467,8 +4452,8 @@
                 <w:iCs w:val="false"/>
                 <w:caps w:val="false"/>
                 <w:color w:val="1A1530"/>
-                <w:sz w:val="24"/>
-                <w:szCs w:val="24"/>
+                <w:sz w:val="22"/>
+                <w:szCs w:val="22"/>
               </w:rPr>
               <w:t xml:space="preserve">strefa wyciszenia, redukcja bodźców, słuchawki wygłuszające, wizualny plan dnia, instrukcje krok po kroku</w:t>
             </w:r>
@@ -4493,7 +4478,7 @@
           </w:tcPr>
           <w:p>
             <w:pPr>
-              <w:spacing w:after="0" w:before="0" w:line="270"/>
+              <w:spacing w:after="0" w:before="0" w:line="260"/>
               <w:jc w:val="left"/>
             </w:pPr>
             <w:r>
@@ -4505,8 +4490,8 @@
                 <w:iCs w:val="false"/>
                 <w:caps w:val="false"/>
                 <w:color w:val="1A1530"/>
-                <w:sz w:val="24"/>
-                <w:szCs w:val="24"/>
+                <w:sz w:val="22"/>
+                <w:szCs w:val="22"/>
               </w:rPr>
               <w:t xml:space="preserve">od IX 2025 · codziennie · nadal</w:t>
             </w:r>
@@ -4531,7 +4516,7 @@
           </w:tcPr>
           <w:p>
             <w:pPr>
-              <w:spacing w:after="0" w:before="0" w:line="270"/>
+              <w:spacing w:after="0" w:before="0" w:line="260"/>
               <w:jc w:val="left"/>
             </w:pPr>
             <w:r>
@@ -4543,8 +4528,8 @@
                 <w:iCs w:val="false"/>
                 <w:caps w:val="false"/>
                 <w:color w:val="1A1530"/>
-                <w:sz w:val="24"/>
-                <w:szCs w:val="24"/>
+                <w:sz w:val="22"/>
+                <w:szCs w:val="22"/>
               </w:rPr>
               <w:t xml:space="preserve">spadek epizodów zachowań trudnych o ok. 40%; wydłużenie skupienia z 3 do 8 min</w:t>
             </w:r>
@@ -4575,7 +4560,7 @@
           </w:tcPr>
           <w:p>
             <w:pPr>
-              <w:spacing w:after="0" w:before="0" w:line="270"/>
+              <w:spacing w:after="0" w:before="0" w:line="260"/>
               <w:jc w:val="left"/>
             </w:pPr>
             <w:r>
@@ -4587,8 +4572,8 @@
                 <w:iCs w:val="false"/>
                 <w:caps w:val="false"/>
                 <w:color w:val="2D1B69"/>
-                <w:sz w:val="24"/>
-                <w:szCs w:val="24"/>
+                <w:sz w:val="22"/>
+                <w:szCs w:val="22"/>
               </w:rPr>
               <w:t xml:space="preserve">Pomoc psychologiczno-pedagogiczna</w:t>
             </w:r>
@@ -4613,7 +4598,7 @@
           </w:tcPr>
           <w:p>
             <w:pPr>
-              <w:spacing w:after="0" w:before="0" w:line="270"/>
+              <w:spacing w:after="0" w:before="0" w:line="260"/>
               <w:jc w:val="left"/>
             </w:pPr>
             <w:r>
@@ -4625,8 +4610,8 @@
                 <w:iCs w:val="false"/>
                 <w:caps w:val="false"/>
                 <w:color w:val="1A1530"/>
-                <w:sz w:val="24"/>
-                <w:szCs w:val="24"/>
+                <w:sz w:val="22"/>
+                <w:szCs w:val="22"/>
               </w:rPr>
               <w:t xml:space="preserve">zajęcia rozwijające kompetencje emocjonalno-społeczne 1 × 45 min; logopedyczne 1 × 45 min; korekcyjno-kompensacyjne 1 × 45 min; integracja sensoryczna 1 × 45 min; porady i konsultacje dla rodziców 1 × 30 min tygodniowo</w:t>
             </w:r>
@@ -4651,7 +4636,7 @@
           </w:tcPr>
           <w:p>
             <w:pPr>
-              <w:spacing w:after="0" w:before="0" w:line="270"/>
+              <w:spacing w:after="0" w:before="0" w:line="260"/>
               <w:jc w:val="left"/>
             </w:pPr>
             <w:r>
@@ -4663,8 +4648,8 @@
                 <w:iCs w:val="false"/>
                 <w:caps w:val="false"/>
                 <w:color w:val="1A1530"/>
-                <w:sz w:val="24"/>
-                <w:szCs w:val="24"/>
+                <w:sz w:val="22"/>
+                <w:szCs w:val="22"/>
               </w:rPr>
               <w:t xml:space="preserve">od X 2025 · 10 miesięcy · nadal</w:t>
             </w:r>
@@ -4689,7 +4674,7 @@
           </w:tcPr>
           <w:p>
             <w:pPr>
-              <w:spacing w:after="0" w:before="0" w:line="270"/>
+              <w:spacing w:after="0" w:before="0" w:line="260"/>
               <w:jc w:val="left"/>
             </w:pPr>
             <w:r>
@@ -4701,8 +4686,8 @@
                 <w:iCs w:val="false"/>
                 <w:caps w:val="false"/>
                 <w:color w:val="1A1530"/>
-                <w:sz w:val="24"/>
-                <w:szCs w:val="24"/>
+                <w:sz w:val="22"/>
+                <w:szCs w:val="22"/>
               </w:rPr>
               <w:t xml:space="preserve">lepsze tolerowanie obecności dzieci w zajęciach kierowanych; pierwsze prośby o przerwę gestem / piktogramem</w:t>
             </w:r>
@@ -4733,7 +4718,7 @@
           </w:tcPr>
           <w:p>
             <w:pPr>
-              <w:spacing w:after="0" w:before="0" w:line="270"/>
+              <w:spacing w:after="0" w:before="0" w:line="260"/>
               <w:jc w:val="left"/>
             </w:pPr>
             <w:r>
@@ -4745,8 +4730,8 @@
                 <w:iCs w:val="false"/>
                 <w:caps w:val="false"/>
                 <w:color w:val="2D1B69"/>
-                <w:sz w:val="24"/>
-                <w:szCs w:val="24"/>
+                <w:sz w:val="22"/>
+                <w:szCs w:val="22"/>
               </w:rPr>
               <w:t xml:space="preserve">Zajęcia rewalidacyjne (dziecko z orzeczeniem)</w:t>
             </w:r>
@@ -4771,7 +4756,7 @@
           </w:tcPr>
           <w:p>
             <w:pPr>
-              <w:spacing w:after="0" w:before="0" w:line="270"/>
+              <w:spacing w:after="0" w:before="0" w:line="260"/>
               <w:jc w:val="left"/>
             </w:pPr>
             <w:r>
@@ -4783,8 +4768,8 @@
                 <w:iCs w:val="false"/>
                 <w:caps w:val="false"/>
                 <w:color w:val="1A1530"/>
-                <w:sz w:val="24"/>
-                <w:szCs w:val="24"/>
+                <w:sz w:val="22"/>
+                <w:szCs w:val="22"/>
               </w:rPr>
               <w:t xml:space="preserve">2 godz. tygodniowo: komunikacja i AAC, umiejętności społeczne i ToM, motoryka mała</w:t>
             </w:r>
@@ -4809,7 +4794,7 @@
           </w:tcPr>
           <w:p>
             <w:pPr>
-              <w:spacing w:after="0" w:before="0" w:line="270"/>
+              <w:spacing w:after="0" w:before="0" w:line="260"/>
               <w:jc w:val="left"/>
             </w:pPr>
             <w:r>
@@ -4821,8 +4806,8 @@
                 <w:iCs w:val="false"/>
                 <w:caps w:val="false"/>
                 <w:color w:val="1A1530"/>
-                <w:sz w:val="24"/>
-                <w:szCs w:val="24"/>
+                <w:sz w:val="22"/>
+                <w:szCs w:val="22"/>
               </w:rPr>
               <w:t xml:space="preserve">od IX 2025 · 1 rok szkolny</w:t>
             </w:r>
@@ -4847,7 +4832,7 @@
           </w:tcPr>
           <w:p>
             <w:pPr>
-              <w:spacing w:after="0" w:before="0" w:line="270"/>
+              <w:spacing w:after="0" w:before="0" w:line="260"/>
               <w:jc w:val="left"/>
             </w:pPr>
             <w:r>
@@ -4859,8 +4844,8 @@
                 <w:iCs w:val="false"/>
                 <w:caps w:val="false"/>
                 <w:color w:val="1A1530"/>
-                <w:sz w:val="24"/>
-                <w:szCs w:val="24"/>
+                <w:sz w:val="22"/>
+                <w:szCs w:val="22"/>
               </w:rPr>
               <w:t xml:space="preserve">wzrost liczby komunikatów intencjonalnych; poprawa chwytu</w:t>
             </w:r>
@@ -4891,7 +4876,7 @@
           </w:tcPr>
           <w:p>
             <w:pPr>
-              <w:spacing w:after="0" w:before="0" w:line="270"/>
+              <w:spacing w:after="0" w:before="0" w:line="260"/>
               <w:jc w:val="left"/>
             </w:pPr>
             <w:r>
@@ -4903,8 +4888,8 @@
                 <w:iCs w:val="false"/>
                 <w:caps w:val="false"/>
                 <w:color w:val="2D1B69"/>
-                <w:sz w:val="24"/>
-                <w:szCs w:val="24"/>
+                <w:sz w:val="22"/>
+                <w:szCs w:val="22"/>
               </w:rPr>
               <w:t xml:space="preserve">Wczesne wspomaganie rozwoju (WWRD)</w:t>
             </w:r>
@@ -4929,7 +4914,7 @@
           </w:tcPr>
           <w:p>
             <w:pPr>
-              <w:spacing w:after="0" w:before="0" w:line="270"/>
+              <w:spacing w:after="0" w:before="0" w:line="260"/>
               <w:jc w:val="left"/>
             </w:pPr>
             <w:r>
@@ -4941,8 +4926,8 @@
                 <w:iCs w:val="false"/>
                 <w:caps w:val="false"/>
                 <w:color w:val="1A1530"/>
-                <w:sz w:val="24"/>
-                <w:szCs w:val="24"/>
+                <w:sz w:val="22"/>
+                <w:szCs w:val="22"/>
               </w:rPr>
               <w:t xml:space="preserve">☐ nie dotyczy  ☐ realizowane w: [placówka] – zakres: [zakres]</w:t>
             </w:r>
@@ -4967,7 +4952,7 @@
           </w:tcPr>
           <w:p>
             <w:pPr>
-              <w:spacing w:after="0" w:before="0" w:line="270"/>
+              <w:spacing w:after="0" w:before="0" w:line="260"/>
               <w:jc w:val="left"/>
             </w:pPr>
             <w:r>
@@ -4979,8 +4964,8 @@
                 <w:iCs w:val="false"/>
                 <w:caps w:val="false"/>
                 <w:color w:val="1A1530"/>
-                <w:sz w:val="24"/>
-                <w:szCs w:val="24"/>
+                <w:sz w:val="22"/>
+                <w:szCs w:val="22"/>
               </w:rPr>
               <w:t xml:space="preserve">[od – do]</w:t>
             </w:r>
@@ -5005,7 +4990,7 @@
           </w:tcPr>
           <w:p>
             <w:pPr>
-              <w:spacing w:after="0" w:before="0" w:line="270"/>
+              <w:spacing w:after="0" w:before="0" w:line="260"/>
               <w:jc w:val="left"/>
             </w:pPr>
             <w:r>
@@ -5017,8 +5002,8 @@
                 <w:iCs w:val="false"/>
                 <w:caps w:val="false"/>
                 <w:color w:val="1A1530"/>
-                <w:sz w:val="24"/>
-                <w:szCs w:val="24"/>
+                <w:sz w:val="22"/>
+                <w:szCs w:val="22"/>
               </w:rPr>
               <w:t xml:space="preserve">[efekty]</w:t>
             </w:r>
@@ -5049,7 +5034,7 @@
           </w:tcPr>
           <w:p>
             <w:pPr>
-              <w:spacing w:after="0" w:before="0" w:line="270"/>
+              <w:spacing w:after="0" w:before="0" w:line="260"/>
               <w:jc w:val="left"/>
             </w:pPr>
             <w:r>
@@ -5061,8 +5046,8 @@
                 <w:iCs w:val="false"/>
                 <w:caps w:val="false"/>
                 <w:color w:val="2D1B69"/>
-                <w:sz w:val="24"/>
-                <w:szCs w:val="24"/>
+                <w:sz w:val="22"/>
+                <w:szCs w:val="22"/>
               </w:rPr>
               <w:t xml:space="preserve">Współpraca z rodzicami</w:t>
             </w:r>
@@ -5087,7 +5072,7 @@
           </w:tcPr>
           <w:p>
             <w:pPr>
-              <w:spacing w:after="0" w:before="0" w:line="270"/>
+              <w:spacing w:after="0" w:before="0" w:line="260"/>
               <w:jc w:val="left"/>
             </w:pPr>
             <w:r>
@@ -5099,8 +5084,8 @@
                 <w:iCs w:val="false"/>
                 <w:caps w:val="false"/>
                 <w:color w:val="1A1530"/>
-                <w:sz w:val="24"/>
-                <w:szCs w:val="24"/>
+                <w:sz w:val="22"/>
+                <w:szCs w:val="22"/>
               </w:rPr>
               <w:t xml:space="preserve">konsultacje cotygodniowe, zeszyt korespondencji, wspólny system komunikatów i wzmocnień, instruktaż AAC w domu</w:t>
             </w:r>
@@ -5125,7 +5110,7 @@
           </w:tcPr>
           <w:p>
             <w:pPr>
-              <w:spacing w:after="0" w:before="0" w:line="270"/>
+              <w:spacing w:after="0" w:before="0" w:line="260"/>
               <w:jc w:val="left"/>
             </w:pPr>
             <w:r>
@@ -5137,8 +5122,8 @@
                 <w:iCs w:val="false"/>
                 <w:caps w:val="false"/>
                 <w:color w:val="1A1530"/>
-                <w:sz w:val="24"/>
-                <w:szCs w:val="24"/>
+                <w:sz w:val="22"/>
+                <w:szCs w:val="22"/>
               </w:rPr>
               <w:t xml:space="preserve">od IX 2025 · nadal</w:t>
             </w:r>
@@ -5163,7 +5148,7 @@
           </w:tcPr>
           <w:p>
             <w:pPr>
-              <w:spacing w:after="0" w:before="0" w:line="270"/>
+              <w:spacing w:after="0" w:before="0" w:line="260"/>
               <w:jc w:val="left"/>
             </w:pPr>
             <w:r>
@@ -5175,8 +5160,8 @@
                 <w:iCs w:val="false"/>
                 <w:caps w:val="false"/>
                 <w:color w:val="1A1530"/>
-                <w:sz w:val="24"/>
-                <w:szCs w:val="24"/>
+                <w:sz w:val="22"/>
+                <w:szCs w:val="22"/>
               </w:rPr>
               <w:t xml:space="preserve">spójne reakcje dorosłych; wzrost poczucia bezpieczeństwa dziecka</w:t>
             </w:r>
@@ -5188,7 +5173,7 @@
       <w:pPr>
         <w:keepNext/>
         <w:pBdr>
-          <w:bottom w:val="single" w:color="D9D0F0" w:sz="24" w:space="4"/>
+          <w:bottom w:val="single" w:color="D9D0F0" w:sz="22" w:space="4"/>
         </w:pBdr>
         <w:spacing w:after="100" w:before="180"/>
       </w:pPr>
@@ -5201,8 +5186,8 @@
           <w:iCs w:val="false"/>
           <w:caps w:val="false"/>
           <w:color w:val="E74509"/>
-          <w:sz w:val="24"/>
-          <w:szCs w:val="24"/>
+          <w:sz w:val="22"/>
+          <w:szCs w:val="22"/>
         </w:rPr>
         <w:t xml:space="preserve">7.  </w:t>
       </w:r>
@@ -5216,8 +5201,8 @@
           <w:caps w:val="false"/>
           <w:color w:val="2D1B69"/>
           <w:spacing w:val="8"/>
-          <w:sz w:val="24"/>
-          <w:szCs w:val="24"/>
+          <w:sz w:val="22"/>
+          <w:szCs w:val="22"/>
         </w:rPr>
         <w:t xml:space="preserve">WNIOSKI DOTYCZĄCE DALSZEJ PRACY Z DZIECKIEM / UCZNIEM MAJĄCE NA CELU POPRAWĘ FUNKCJONOWANIA (§ 7 UST. 6 PKT 7)</w:t>
       </w:r>
@@ -5236,8 +5221,8 @@
           <w:iCs w:val="false"/>
           <w:caps w:val="false"/>
           <w:color w:val="2E7D45"/>
-          <w:sz w:val="24"/>
-          <w:szCs w:val="24"/>
+          <w:sz w:val="22"/>
+          <w:szCs w:val="22"/>
         </w:rPr>
         <w:t xml:space="preserve">•  </w:t>
       </w:r>
@@ -5250,8 +5235,8 @@
           <w:iCs w:val="false"/>
           <w:caps w:val="false"/>
           <w:color w:val="1A1530"/>
-          <w:sz w:val="24"/>
-          <w:szCs w:val="24"/>
+          <w:sz w:val="22"/>
+          <w:szCs w:val="22"/>
         </w:rPr>
         <w:t xml:space="preserve">Utrzymanie struktury dnia, strefy wyciszenia i przygotowania do wydarzeń grupowych; stopniowe wydłużanie udziału.</w:t>
       </w:r>
@@ -5270,8 +5255,8 @@
           <w:iCs w:val="false"/>
           <w:caps w:val="false"/>
           <w:color w:val="2E7D45"/>
-          <w:sz w:val="24"/>
-          <w:szCs w:val="24"/>
+          <w:sz w:val="22"/>
+          <w:szCs w:val="22"/>
         </w:rPr>
         <w:t xml:space="preserve">•  </w:t>
       </w:r>
@@ -5284,8 +5269,8 @@
           <w:iCs w:val="false"/>
           <w:caps w:val="false"/>
           <w:color w:val="1A1530"/>
-          <w:sz w:val="24"/>
-          <w:szCs w:val="24"/>
+          <w:sz w:val="22"/>
+          <w:szCs w:val="22"/>
         </w:rPr>
         <w:t xml:space="preserve">Rozwijanie komunikacji funkcjonalnej z tablicą AAC w placówce i w domu; trening komunikatu zastępczego zamiast zachowania trudnego.</w:t>
       </w:r>
@@ -5304,8 +5289,8 @@
           <w:iCs w:val="false"/>
           <w:caps w:val="false"/>
           <w:color w:val="2E7D45"/>
-          <w:sz w:val="24"/>
-          <w:szCs w:val="24"/>
+          <w:sz w:val="22"/>
+          <w:szCs w:val="22"/>
         </w:rPr>
         <w:t xml:space="preserve">•  </w:t>
       </w:r>
@@ -5318,8 +5303,8 @@
           <w:iCs w:val="false"/>
           <w:caps w:val="false"/>
           <w:color w:val="1A1530"/>
-          <w:sz w:val="24"/>
-          <w:szCs w:val="24"/>
+          <w:sz w:val="22"/>
+          <w:szCs w:val="22"/>
         </w:rPr>
         <w:t xml:space="preserve">Trening umiejętności społecznych i teorii umysłu w małej grupie z przeniesieniem na zabawy swobodne (rówieśnik-mentor).</w:t>
       </w:r>
@@ -5338,8 +5323,8 @@
           <w:iCs w:val="false"/>
           <w:caps w:val="false"/>
           <w:color w:val="2E7D45"/>
-          <w:sz w:val="24"/>
-          <w:szCs w:val="24"/>
+          <w:sz w:val="22"/>
+          <w:szCs w:val="22"/>
         </w:rPr>
         <w:t xml:space="preserve">•  </w:t>
       </w:r>
@@ -5352,8 +5337,8 @@
           <w:iCs w:val="false"/>
           <w:caps w:val="false"/>
           <w:color w:val="1A1530"/>
-          <w:sz w:val="24"/>
-          <w:szCs w:val="24"/>
+          <w:sz w:val="22"/>
+          <w:szCs w:val="22"/>
         </w:rPr>
         <w:t xml:space="preserve">Usprawnianie motoryki małej i samoobsługi z dostosowanymi przyborami i paskiem wizualnym czynności.</w:t>
       </w:r>
@@ -5372,8 +5357,8 @@
           <w:iCs w:val="false"/>
           <w:caps w:val="false"/>
           <w:color w:val="2E7D45"/>
-          <w:sz w:val="24"/>
-          <w:szCs w:val="24"/>
+          <w:sz w:val="22"/>
+          <w:szCs w:val="22"/>
         </w:rPr>
         <w:t xml:space="preserve">•  </w:t>
       </w:r>
@@ -5386,8 +5371,8 @@
           <w:iCs w:val="false"/>
           <w:caps w:val="false"/>
           <w:color w:val="1A1530"/>
-          <w:sz w:val="24"/>
-          <w:szCs w:val="24"/>
+          <w:sz w:val="22"/>
+          <w:szCs w:val="22"/>
         </w:rPr>
         <w:t xml:space="preserve">Ocena efektów w styczniu i czerwcu; aktualizacja programu wspólnie z rodzicami.</w:t>
       </w:r>
@@ -5401,7 +5386,7 @@
       <w:pPr>
         <w:keepNext/>
         <w:pBdr>
-          <w:bottom w:val="single" w:color="D9D0F0" w:sz="24" w:space="4"/>
+          <w:bottom w:val="single" w:color="D9D0F0" w:sz="22" w:space="4"/>
         </w:pBdr>
         <w:spacing w:after="100" w:before="180"/>
       </w:pPr>
@@ -5414,8 +5399,8 @@
           <w:iCs w:val="false"/>
           <w:caps w:val="false"/>
           <w:color w:val="E74509"/>
-          <w:sz w:val="24"/>
-          <w:szCs w:val="24"/>
+          <w:sz w:val="22"/>
+          <w:szCs w:val="22"/>
         </w:rPr>
         <w:t xml:space="preserve">8.  </w:t>
       </w:r>
@@ -5429,8 +5414,8 @@
           <w:caps w:val="false"/>
           <w:color w:val="2D1B69"/>
           <w:spacing w:val="8"/>
-          <w:sz w:val="24"/>
-          <w:szCs w:val="24"/>
+          <w:sz w:val="22"/>
+          <w:szCs w:val="22"/>
         </w:rPr>
         <w:t xml:space="preserve">INFORMACJE UZUPEŁNIAJĄCE DLA ZESPOŁU ORZEKAJĄCEGO – FAKULTATYWNE, NA POTRZEBY OCENY FUNKCJONOWANIA (§ 8 UST. 2–3)</w:t>
       </w:r>
@@ -5449,8 +5434,8 @@
           <w:iCs w:val="false"/>
           <w:caps w:val="false"/>
           <w:color w:val="6B6378"/>
-          <w:sz w:val="24"/>
-          <w:szCs w:val="24"/>
+          <w:sz w:val="22"/>
+          <w:szCs w:val="22"/>
         </w:rPr>
         <w:t xml:space="preserve">Zespół orzekający dokonuje własnej oceny funkcjonowania (§ 8); poniższe informacje placówka przekazuje dodatkowo, aby ją ułatwić.</w:t>
       </w:r>
@@ -5469,8 +5454,8 @@
           <w:iCs w:val="false"/>
           <w:caps w:val="false"/>
           <w:color w:val="1A1530"/>
-          <w:sz w:val="24"/>
-          <w:szCs w:val="24"/>
+          <w:sz w:val="22"/>
+          <w:szCs w:val="22"/>
         </w:rPr>
         <w:t xml:space="preserve">Funkcje i struktury ciała (§ 8 ust. 2 pkt 2): zdrowie psychiczne – lęk przed zmianą, sztywność poznawcza, zaburzenia snu; percepcja – nadwrażliwość słuchowa i dotykowa, poszukiwanie stymulacji przedsionkowej; motoryka – obniżona precyzja motoryki małej, nieprawidłowy chwyt; mowa – echolalie, trudności pragmatyczne, korzysta z gestu i piktogramów; funkcje poznawcze – bardzo dobra pamięć wzrokowa, trudności z uwagą i uogólnianiem; funkcje emocjonalno-społeczne – teoria umysłu poniżej normy wiekowej, zachowania trudne o funkcji ucieczkowej; cechy indywidualne – głębokie zainteresowania, pozytywna reakcja na strukturę i stałych dorosłych.</w:t>
       </w:r>
@@ -5528,8 +5513,8 @@
                 <w:caps/>
                 <w:color w:val="2E7D45"/>
                 <w:spacing w:val="10"/>
-                <w:sz w:val="24"/>
-                <w:szCs w:val="24"/>
+                <w:sz w:val="22"/>
+                <w:szCs w:val="22"/>
               </w:rPr>
               <w:t xml:space="preserve">Ułatwienia w środowisku placówki (co pomaga)</w:t>
             </w:r>
@@ -5568,8 +5553,8 @@
                 <w:caps/>
                 <w:color w:val="BF382A"/>
                 <w:spacing w:val="10"/>
-                <w:sz w:val="24"/>
-                <w:szCs w:val="24"/>
+                <w:sz w:val="22"/>
+                <w:szCs w:val="22"/>
               </w:rPr>
               <w:t xml:space="preserve">Bariery (co utrudnia)</w:t>
             </w:r>
@@ -5611,8 +5596,8 @@
                 <w:iCs w:val="false"/>
                 <w:caps w:val="false"/>
                 <w:color w:val="2E7D45"/>
-                <w:sz w:val="24"/>
-                <w:szCs w:val="24"/>
+                <w:sz w:val="22"/>
+                <w:szCs w:val="22"/>
               </w:rPr>
               <w:t xml:space="preserve">•  </w:t>
             </w:r>
@@ -5625,8 +5610,8 @@
                 <w:iCs w:val="false"/>
                 <w:caps w:val="false"/>
                 <w:color w:val="1A1530"/>
-                <w:sz w:val="24"/>
-                <w:szCs w:val="24"/>
+                <w:sz w:val="22"/>
+                <w:szCs w:val="22"/>
               </w:rPr>
               <w:t xml:space="preserve">stały skład kadry i przewidywalny plan dnia (wizualny)</w:t>
             </w:r>
@@ -5645,8 +5630,8 @@
                 <w:iCs w:val="false"/>
                 <w:caps w:val="false"/>
                 <w:color w:val="2E7D45"/>
-                <w:sz w:val="24"/>
-                <w:szCs w:val="24"/>
+                <w:sz w:val="22"/>
+                <w:szCs w:val="22"/>
               </w:rPr>
               <w:t xml:space="preserve">•  </w:t>
             </w:r>
@@ -5659,8 +5644,8 @@
                 <w:iCs w:val="false"/>
                 <w:caps w:val="false"/>
                 <w:color w:val="1A1530"/>
-                <w:sz w:val="24"/>
-                <w:szCs w:val="24"/>
+                <w:sz w:val="22"/>
+                <w:szCs w:val="22"/>
               </w:rPr>
               <w:t xml:space="preserve">strefa wyciszenia w sali, słuchawki wygłuszające, przerwy sensoryczne</w:t>
             </w:r>
@@ -5679,8 +5664,8 @@
                 <w:iCs w:val="false"/>
                 <w:caps w:val="false"/>
                 <w:color w:val="2E7D45"/>
-                <w:sz w:val="24"/>
-                <w:szCs w:val="24"/>
+                <w:sz w:val="22"/>
+                <w:szCs w:val="22"/>
               </w:rPr>
               <w:t xml:space="preserve">•  </w:t>
             </w:r>
@@ -5693,8 +5678,8 @@
                 <w:iCs w:val="false"/>
                 <w:caps w:val="false"/>
                 <w:color w:val="1A1530"/>
-                <w:sz w:val="24"/>
-                <w:szCs w:val="24"/>
+                <w:sz w:val="22"/>
+                <w:szCs w:val="22"/>
               </w:rPr>
               <w:t xml:space="preserve">tablica wyboru AAC dostępna w sali i w domu</w:t>
             </w:r>
@@ -5713,8 +5698,8 @@
                 <w:iCs w:val="false"/>
                 <w:caps w:val="false"/>
                 <w:color w:val="2E7D45"/>
-                <w:sz w:val="24"/>
-                <w:szCs w:val="24"/>
+                <w:sz w:val="22"/>
+                <w:szCs w:val="22"/>
               </w:rPr>
               <w:t xml:space="preserve">•  </w:t>
             </w:r>
@@ -5727,8 +5712,8 @@
                 <w:iCs w:val="false"/>
                 <w:caps w:val="false"/>
                 <w:color w:val="1A1530"/>
-                <w:sz w:val="24"/>
-                <w:szCs w:val="24"/>
+                <w:sz w:val="22"/>
+                <w:szCs w:val="22"/>
               </w:rPr>
               <w:t xml:space="preserve">rówieśnik-mentor w zabawach; jasne zasady wizualne</w:t>
             </w:r>
@@ -5747,8 +5732,8 @@
                 <w:iCs w:val="false"/>
                 <w:caps w:val="false"/>
                 <w:color w:val="2E7D45"/>
-                <w:sz w:val="24"/>
-                <w:szCs w:val="24"/>
+                <w:sz w:val="22"/>
+                <w:szCs w:val="22"/>
               </w:rPr>
               <w:t xml:space="preserve">•  </w:t>
             </w:r>
@@ -5761,8 +5746,8 @@
                 <w:iCs w:val="false"/>
                 <w:caps w:val="false"/>
                 <w:color w:val="1A1530"/>
-                <w:sz w:val="24"/>
-                <w:szCs w:val="24"/>
+                <w:sz w:val="22"/>
+                <w:szCs w:val="22"/>
               </w:rPr>
               <w:t xml:space="preserve">zaangażowani rodzice, spójny system komunikatów dom–placówka</w:t>
             </w:r>
@@ -5799,8 +5784,8 @@
                 <w:iCs w:val="false"/>
                 <w:caps w:val="false"/>
                 <w:color w:val="BF382A"/>
-                <w:sz w:val="24"/>
-                <w:szCs w:val="24"/>
+                <w:sz w:val="22"/>
+                <w:szCs w:val="22"/>
               </w:rPr>
               <w:t xml:space="preserve">•  </w:t>
             </w:r>
@@ -5813,8 +5798,8 @@
                 <w:iCs w:val="false"/>
                 <w:caps w:val="false"/>
                 <w:color w:val="1A1530"/>
-                <w:sz w:val="24"/>
-                <w:szCs w:val="24"/>
+                <w:sz w:val="22"/>
+                <w:szCs w:val="22"/>
               </w:rPr>
               <w:t xml:space="preserve">hałas korytarza, gwar w szatni i na stołówce</w:t>
             </w:r>
@@ -5833,8 +5818,8 @@
                 <w:iCs w:val="false"/>
                 <w:caps w:val="false"/>
                 <w:color w:val="BF382A"/>
-                <w:sz w:val="24"/>
-                <w:szCs w:val="24"/>
+                <w:sz w:val="22"/>
+                <w:szCs w:val="22"/>
               </w:rPr>
               <w:t xml:space="preserve">•  </w:t>
             </w:r>
@@ -5847,8 +5832,8 @@
                 <w:iCs w:val="false"/>
                 <w:caps w:val="false"/>
                 <w:color w:val="1A1530"/>
-                <w:sz w:val="24"/>
-                <w:szCs w:val="24"/>
+                <w:sz w:val="22"/>
+                <w:szCs w:val="22"/>
               </w:rPr>
               <w:t xml:space="preserve">apele, uroczystości i wyjścia zbiorowe bez przygotowania</w:t>
             </w:r>
@@ -5867,8 +5852,8 @@
                 <w:iCs w:val="false"/>
                 <w:caps w:val="false"/>
                 <w:color w:val="BF382A"/>
-                <w:sz w:val="24"/>
-                <w:szCs w:val="24"/>
+                <w:sz w:val="22"/>
+                <w:szCs w:val="22"/>
               </w:rPr>
               <w:t xml:space="preserve">•  </w:t>
             </w:r>
@@ -5881,8 +5866,8 @@
                 <w:iCs w:val="false"/>
                 <w:caps w:val="false"/>
                 <w:color w:val="1A1530"/>
-                <w:sz w:val="24"/>
-                <w:szCs w:val="24"/>
+                <w:sz w:val="22"/>
+                <w:szCs w:val="22"/>
               </w:rPr>
               <w:t xml:space="preserve">polecenia wieloetapowe podawane wyłącznie słownie</w:t>
             </w:r>
@@ -5901,8 +5886,8 @@
                 <w:iCs w:val="false"/>
                 <w:caps w:val="false"/>
                 <w:color w:val="BF382A"/>
-                <w:sz w:val="24"/>
-                <w:szCs w:val="24"/>
+                <w:sz w:val="22"/>
+                <w:szCs w:val="22"/>
               </w:rPr>
               <w:t xml:space="preserve">•  </w:t>
             </w:r>
@@ -5915,8 +5900,8 @@
                 <w:iCs w:val="false"/>
                 <w:caps w:val="false"/>
                 <w:color w:val="1A1530"/>
-                <w:sz w:val="24"/>
-                <w:szCs w:val="24"/>
+                <w:sz w:val="22"/>
+                <w:szCs w:val="22"/>
               </w:rPr>
               <w:t xml:space="preserve">nagłe zmiany planu, zastępstwa, zmiana sali</w:t>
             </w:r>
@@ -5935,8 +5920,8 @@
                 <w:iCs w:val="false"/>
                 <w:caps w:val="false"/>
                 <w:color w:val="BF382A"/>
-                <w:sz w:val="24"/>
-                <w:szCs w:val="24"/>
+                <w:sz w:val="22"/>
+                <w:szCs w:val="22"/>
               </w:rPr>
               <w:t xml:space="preserve">•  </w:t>
             </w:r>
@@ -5949,8 +5934,8 @@
                 <w:iCs w:val="false"/>
                 <w:caps w:val="false"/>
                 <w:color w:val="1A1530"/>
-                <w:sz w:val="24"/>
-                <w:szCs w:val="24"/>
+                <w:sz w:val="22"/>
+                <w:szCs w:val="22"/>
               </w:rPr>
               <w:t xml:space="preserve">faktury klejące i mokre podczas zajęć plastycznych</w:t>
             </w:r>
@@ -5972,8 +5957,8 @@
           <w:iCs w:val="false"/>
           <w:caps w:val="false"/>
           <w:color w:val="2D1B69"/>
-          <w:sz w:val="24"/>
-          <w:szCs w:val="24"/>
+          <w:sz w:val="22"/>
+          <w:szCs w:val="22"/>
         </w:rPr>
         <w:t xml:space="preserve">Informacje od dziecka i rodziców (§ 8 ust. 3 pkt 1 i 3): </w:t>
       </w:r>
@@ -5986,8 +5971,8 @@
           <w:iCs w:val="false"/>
           <w:caps w:val="false"/>
           <w:color w:val="1A1530"/>
-          <w:sz w:val="24"/>
-          <w:szCs w:val="24"/>
+          <w:sz w:val="22"/>
+          <w:szCs w:val="22"/>
         </w:rPr>
         <w:t xml:space="preserve">Informacje od dziecka (w formie dostosowanej do rozwoju) i od rodziców: lubi klocki, tablet z aplikacją o kosmosie i huśtanie; najtrudniejsze są hałas, zmiany planu i mokre ręce; pomagają cisza, plan dnia, słuchawki i wsparcie nauczyciela. Rodzice potwierdzają obraz funkcjonowania i wskazują potrzebę stałej kadry.</w:t>
       </w:r>
@@ -6006,8 +5991,8 @@
           <w:iCs w:val="false"/>
           <w:caps w:val="false"/>
           <w:color w:val="FFFFFF"/>
-          <w:sz w:val="24"/>
-          <w:szCs w:val="24"/>
+          <w:sz w:val="22"/>
+          <w:szCs w:val="22"/>
           <w:shd w:fill="2D6BB3" w:color="auto" w:val="clear"/>
         </w:rPr>
         <w:t xml:space="preserve"> ! </w:t>
@@ -6021,8 +6006,8 @@
           <w:iCs w:val="false"/>
           <w:caps w:val="false"/>
           <w:color w:val="2D1B69"/>
-          <w:sz w:val="24"/>
-          <w:szCs w:val="24"/>
+          <w:sz w:val="22"/>
+          <w:szCs w:val="22"/>
         </w:rPr>
         <w:t xml:space="preserve">   Stanowisko placówki w sprawie potrzeb dziecka / ucznia (dla zespołu orzekającego)</w:t>
       </w:r>
@@ -6035,8 +6020,8 @@
           <w:iCs w:val="false"/>
           <w:caps w:val="false"/>
           <w:color w:val="6B6378"/>
-          <w:sz w:val="24"/>
-          <w:szCs w:val="24"/>
+          <w:sz w:val="22"/>
+          <w:szCs w:val="22"/>
         </w:rPr>
         <w:t xml:space="preserve"/>
       </w:r>
@@ -6086,14 +6071,9 @@
             <w:r>
               <w:rPr>
                 <w:rFonts w:ascii="Arial" w:cs="Arial" w:eastAsia="Arial" w:hAnsi="Arial"/>
-                <w:b w:val="false"/>
-                <w:bCs w:val="false"/>
-                <w:i w:val="false"/>
-                <w:iCs w:val="false"/>
-                <w:caps w:val="false"/>
                 <w:color w:val="E74509"/>
-                <w:sz w:val="24"/>
-                <w:szCs w:val="24"/>
+                <w:sz w:val="22"/>
+                <w:szCs w:val="22"/>
               </w:rPr>
               <w:t xml:space="preserve">☑  </w:t>
             </w:r>
@@ -6106,8 +6086,8 @@
                 <w:iCs w:val="false"/>
                 <w:caps w:val="false"/>
                 <w:color w:val="1A1530"/>
-                <w:sz w:val="24"/>
-                <w:szCs w:val="24"/>
+                <w:sz w:val="22"/>
+                <w:szCs w:val="22"/>
               </w:rPr>
               <w:t xml:space="preserve">Potrzeba kształcenia specjalnego (wydanie / aktualizacja orzeczenia) z uwagi na autyzm</w:t>
             </w:r>
@@ -6138,14 +6118,9 @@
             <w:r>
               <w:rPr>
                 <w:rFonts w:ascii="Arial" w:cs="Arial" w:eastAsia="Arial" w:hAnsi="Arial"/>
-                <w:b w:val="false"/>
-                <w:bCs w:val="false"/>
-                <w:i w:val="false"/>
-                <w:iCs w:val="false"/>
-                <w:caps w:val="false"/>
                 <w:color w:val="E74509"/>
-                <w:sz w:val="24"/>
-                <w:szCs w:val="24"/>
+                <w:sz w:val="22"/>
+                <w:szCs w:val="22"/>
               </w:rPr>
               <w:t xml:space="preserve">☑  </w:t>
             </w:r>
@@ -6158,8 +6133,8 @@
                 <w:iCs w:val="false"/>
                 <w:caps w:val="false"/>
                 <w:color w:val="1A1530"/>
-                <w:sz w:val="24"/>
-                <w:szCs w:val="24"/>
+                <w:sz w:val="22"/>
+                <w:szCs w:val="22"/>
               </w:rPr>
               <w:t xml:space="preserve">Zajęcia rewalidacyjne – wnioskowany zakres: komunikacja i AAC, umiejętności społeczne, motoryka mała</w:t>
             </w:r>
@@ -6195,14 +6170,9 @@
             <w:r>
               <w:rPr>
                 <w:rFonts w:ascii="Arial" w:cs="Arial" w:eastAsia="Arial" w:hAnsi="Arial"/>
-                <w:b w:val="false"/>
-                <w:bCs w:val="false"/>
-                <w:i w:val="false"/>
-                <w:iCs w:val="false"/>
-                <w:caps w:val="false"/>
                 <w:color w:val="E74509"/>
-                <w:sz w:val="24"/>
-                <w:szCs w:val="24"/>
+                <w:sz w:val="22"/>
+                <w:szCs w:val="22"/>
               </w:rPr>
               <w:t xml:space="preserve">☑  </w:t>
             </w:r>
@@ -6215,8 +6185,8 @@
                 <w:iCs w:val="false"/>
                 <w:caps w:val="false"/>
                 <w:color w:val="1A1530"/>
-                <w:sz w:val="24"/>
-                <w:szCs w:val="24"/>
+                <w:sz w:val="22"/>
+                <w:szCs w:val="22"/>
               </w:rPr>
               <w:t xml:space="preserve">Wsparcie dodatkowej osoby – nauczyciel współorganizujący kształcenie (zajęcia kierowane, przejścia, wydarzenia grupowe)</w:t>
             </w:r>
@@ -6247,14 +6217,9 @@
             <w:r>
               <w:rPr>
                 <w:rFonts w:ascii="Arial" w:cs="Arial" w:eastAsia="Arial" w:hAnsi="Arial"/>
-                <w:b w:val="false"/>
-                <w:bCs w:val="false"/>
-                <w:i w:val="false"/>
-                <w:iCs w:val="false"/>
-                <w:caps w:val="false"/>
                 <w:color w:val="E74509"/>
-                <w:sz w:val="24"/>
-                <w:szCs w:val="24"/>
+                <w:sz w:val="22"/>
+                <w:szCs w:val="22"/>
               </w:rPr>
               <w:t xml:space="preserve">☑  </w:t>
             </w:r>
@@ -6267,8 +6232,8 @@
                 <w:iCs w:val="false"/>
                 <w:caps w:val="false"/>
                 <w:color w:val="1A1530"/>
-                <w:sz w:val="24"/>
-                <w:szCs w:val="24"/>
+                <w:sz w:val="22"/>
+                <w:szCs w:val="22"/>
               </w:rPr>
               <w:t xml:space="preserve">Kontynuacja pomocy psychologiczno-pedagogicznej w dotychczasowych formach</w:t>
             </w:r>
@@ -6304,14 +6269,9 @@
             <w:r>
               <w:rPr>
                 <w:rFonts w:ascii="Arial" w:cs="Arial" w:eastAsia="Arial" w:hAnsi="Arial"/>
-                <w:b w:val="false"/>
-                <w:bCs w:val="false"/>
-                <w:i w:val="false"/>
-                <w:iCs w:val="false"/>
-                <w:caps w:val="false"/>
                 <w:color w:val="B6A6DF"/>
-                <w:sz w:val="24"/>
-                <w:szCs w:val="24"/>
+                <w:sz w:val="22"/>
+                <w:szCs w:val="22"/>
               </w:rPr>
               <w:t xml:space="preserve">☐  </w:t>
             </w:r>
@@ -6324,8 +6284,8 @@
                 <w:iCs w:val="false"/>
                 <w:caps w:val="false"/>
                 <w:color w:val="1A1530"/>
-                <w:sz w:val="24"/>
-                <w:szCs w:val="24"/>
+                <w:sz w:val="22"/>
+                <w:szCs w:val="22"/>
               </w:rPr>
               <w:t xml:space="preserve">Indywidualne nauczanie / zindywidualizowana ścieżka kształcenia</w:t>
             </w:r>
@@ -6356,14 +6316,9 @@
             <w:r>
               <w:rPr>
                 <w:rFonts w:ascii="Arial" w:cs="Arial" w:eastAsia="Arial" w:hAnsi="Arial"/>
-                <w:b w:val="false"/>
-                <w:bCs w:val="false"/>
-                <w:i w:val="false"/>
-                <w:iCs w:val="false"/>
-                <w:caps w:val="false"/>
                 <w:color w:val="B6A6DF"/>
-                <w:sz w:val="24"/>
-                <w:szCs w:val="24"/>
+                <w:sz w:val="22"/>
+                <w:szCs w:val="22"/>
               </w:rPr>
               <w:t xml:space="preserve">☐  </w:t>
             </w:r>
@@ -6376,8 +6331,8 @@
                 <w:iCs w:val="false"/>
                 <w:caps w:val="false"/>
                 <w:color w:val="1A1530"/>
-                <w:sz w:val="24"/>
-                <w:szCs w:val="24"/>
+                <w:sz w:val="22"/>
+                <w:szCs w:val="22"/>
               </w:rPr>
               <w:t xml:space="preserve">Wczesne wspomaganie rozwoju</w:t>
             </w:r>
@@ -6413,14 +6368,9 @@
             <w:r>
               <w:rPr>
                 <w:rFonts w:ascii="Arial" w:cs="Arial" w:eastAsia="Arial" w:hAnsi="Arial"/>
-                <w:b w:val="false"/>
-                <w:bCs w:val="false"/>
-                <w:i w:val="false"/>
-                <w:iCs w:val="false"/>
-                <w:caps w:val="false"/>
                 <w:color w:val="B6A6DF"/>
-                <w:sz w:val="24"/>
-                <w:szCs w:val="24"/>
+                <w:sz w:val="22"/>
+                <w:szCs w:val="22"/>
               </w:rPr>
               <w:t xml:space="preserve">☐  </w:t>
             </w:r>
@@ -6433,8 +6383,8 @@
                 <w:iCs w:val="false"/>
                 <w:caps w:val="false"/>
                 <w:color w:val="1A1530"/>
-                <w:sz w:val="24"/>
-                <w:szCs w:val="24"/>
+                <w:sz w:val="22"/>
+                <w:szCs w:val="22"/>
               </w:rPr>
               <w:t xml:space="preserve">Inne: ……………………………………………</w:t>
             </w:r>
@@ -6479,8 +6429,8 @@
           <w:iCs w:val="false"/>
           <w:caps w:val="false"/>
           <w:color w:val="2D1B69"/>
-          <w:sz w:val="24"/>
-          <w:szCs w:val="24"/>
+          <w:sz w:val="22"/>
+          <w:szCs w:val="22"/>
         </w:rPr>
         <w:t xml:space="preserve">Uzasadnienie: </w:t>
       </w:r>
@@ -6493,8 +6443,8 @@
           <w:iCs w:val="false"/>
           <w:caps w:val="false"/>
           <w:color w:val="1A1530"/>
-          <w:sz w:val="24"/>
-          <w:szCs w:val="24"/>
+          <w:sz w:val="22"/>
+          <w:szCs w:val="22"/>
         </w:rPr>
         <w:t xml:space="preserve">Wysoka potrzeba wsparcia w domenach d2, d7 i d9, potrzeba stałej komunikacji wspomagającej oraz ucieczkowa funkcja zachowań trudnych, którą kontroluje obecność przewidywalnego dorosłego. Dotychczasowe działania przyniosły mierzalną poprawę, co uzasadnia ich kontynuację i rozszerzenie w ramach kształcenia specjalnego.</w:t>
       </w:r>
@@ -6503,7 +6453,7 @@
       <w:pPr>
         <w:keepNext/>
         <w:pBdr>
-          <w:bottom w:val="single" w:color="D9D0F0" w:sz="24" w:space="4"/>
+          <w:bottom w:val="single" w:color="D9D0F0" w:sz="22" w:space="4"/>
         </w:pBdr>
         <w:spacing w:after="100" w:before="180"/>
       </w:pPr>
@@ -6516,8 +6466,8 @@
           <w:iCs w:val="false"/>
           <w:caps w:val="false"/>
           <w:color w:val="E74509"/>
-          <w:sz w:val="24"/>
-          <w:szCs w:val="24"/>
+          <w:sz w:val="22"/>
+          <w:szCs w:val="22"/>
         </w:rPr>
         <w:t xml:space="preserve">9.  </w:t>
       </w:r>
@@ -6531,8 +6481,8 @@
           <w:caps w:val="false"/>
           <w:color w:val="2D1B69"/>
           <w:spacing w:val="8"/>
-          <w:sz w:val="24"/>
-          <w:szCs w:val="24"/>
+          <w:sz w:val="22"/>
+          <w:szCs w:val="22"/>
         </w:rPr>
         <w:t xml:space="preserve">OSOBY, KTÓRE ROZPOZNAŁY TRUDNOŚCI, MOCNE STRONY I UZDOLNIENIA (NAUCZYCIELE, WYCHOWAWCY, SPECJALIŚCI PROWADZĄCY ZAJĘCIA)</w:t>
       </w:r>
@@ -6588,8 +6538,8 @@
                 <w:iCs w:val="false"/>
                 <w:caps w:val="false"/>
                 <w:color w:val="2D1B69"/>
-                <w:sz w:val="24"/>
-                <w:szCs w:val="24"/>
+                <w:sz w:val="22"/>
+                <w:szCs w:val="22"/>
               </w:rPr>
               <w:t xml:space="preserve">Wychowawca / nauczyciel: </w:t>
             </w:r>
@@ -6602,8 +6552,8 @@
                 <w:iCs w:val="false"/>
                 <w:caps w:val="false"/>
                 <w:color w:val="1A1530"/>
-                <w:sz w:val="24"/>
-                <w:szCs w:val="24"/>
+                <w:sz w:val="22"/>
+                <w:szCs w:val="22"/>
               </w:rPr>
               <w:t xml:space="preserve">[Imię i nazwisko]</w:t>
             </w:r>
@@ -6622,8 +6572,8 @@
                 <w:iCs w:val="false"/>
                 <w:caps w:val="false"/>
                 <w:color w:val="6B6378"/>
-                <w:sz w:val="24"/>
-                <w:szCs w:val="24"/>
+                <w:sz w:val="22"/>
+                <w:szCs w:val="22"/>
               </w:rPr>
               <w:t xml:space="preserve">podpis: ………………………………………</w:t>
             </w:r>
@@ -6660,8 +6610,8 @@
                 <w:iCs w:val="false"/>
                 <w:caps w:val="false"/>
                 <w:color w:val="2D1B69"/>
-                <w:sz w:val="24"/>
-                <w:szCs w:val="24"/>
+                <w:sz w:val="22"/>
+                <w:szCs w:val="22"/>
               </w:rPr>
               <w:t xml:space="preserve">Pedagog specjalny: </w:t>
             </w:r>
@@ -6674,8 +6624,8 @@
                 <w:iCs w:val="false"/>
                 <w:caps w:val="false"/>
                 <w:color w:val="1A1530"/>
-                <w:sz w:val="24"/>
-                <w:szCs w:val="24"/>
+                <w:sz w:val="22"/>
+                <w:szCs w:val="22"/>
               </w:rPr>
               <w:t xml:space="preserve">[Imię i nazwisko]</w:t>
             </w:r>
@@ -6694,8 +6644,8 @@
                 <w:iCs w:val="false"/>
                 <w:caps w:val="false"/>
                 <w:color w:val="6B6378"/>
-                <w:sz w:val="24"/>
-                <w:szCs w:val="24"/>
+                <w:sz w:val="22"/>
+                <w:szCs w:val="22"/>
               </w:rPr>
               <w:t xml:space="preserve">podpis: ………………………………………</w:t>
             </w:r>
@@ -6737,8 +6687,8 @@
                 <w:iCs w:val="false"/>
                 <w:caps w:val="false"/>
                 <w:color w:val="2D1B69"/>
-                <w:sz w:val="24"/>
-                <w:szCs w:val="24"/>
+                <w:sz w:val="22"/>
+                <w:szCs w:val="22"/>
               </w:rPr>
               <w:t xml:space="preserve">Psycholog: </w:t>
             </w:r>
@@ -6751,8 +6701,8 @@
                 <w:iCs w:val="false"/>
                 <w:caps w:val="false"/>
                 <w:color w:val="1A1530"/>
-                <w:sz w:val="24"/>
-                <w:szCs w:val="24"/>
+                <w:sz w:val="22"/>
+                <w:szCs w:val="22"/>
               </w:rPr>
               <w:t xml:space="preserve">[Imię i nazwisko]</w:t>
             </w:r>
@@ -6771,8 +6721,8 @@
                 <w:iCs w:val="false"/>
                 <w:caps w:val="false"/>
                 <w:color w:val="6B6378"/>
-                <w:sz w:val="24"/>
-                <w:szCs w:val="24"/>
+                <w:sz w:val="22"/>
+                <w:szCs w:val="22"/>
               </w:rPr>
               <w:t xml:space="preserve">podpis: ………………………………………</w:t>
             </w:r>
@@ -6809,8 +6759,8 @@
                 <w:iCs w:val="false"/>
                 <w:caps w:val="false"/>
                 <w:color w:val="2D1B69"/>
-                <w:sz w:val="24"/>
-                <w:szCs w:val="24"/>
+                <w:sz w:val="22"/>
+                <w:szCs w:val="22"/>
               </w:rPr>
               <w:t xml:space="preserve">Logopeda: </w:t>
             </w:r>
@@ -6823,8 +6773,8 @@
                 <w:iCs w:val="false"/>
                 <w:caps w:val="false"/>
                 <w:color w:val="1A1530"/>
-                <w:sz w:val="24"/>
-                <w:szCs w:val="24"/>
+                <w:sz w:val="22"/>
+                <w:szCs w:val="22"/>
               </w:rPr>
               <w:t xml:space="preserve">[Imię i nazwisko]</w:t>
             </w:r>
@@ -6843,8 +6793,8 @@
                 <w:iCs w:val="false"/>
                 <w:caps w:val="false"/>
                 <w:color w:val="6B6378"/>
-                <w:sz w:val="24"/>
-                <w:szCs w:val="24"/>
+                <w:sz w:val="22"/>
+                <w:szCs w:val="22"/>
               </w:rPr>
               <w:t xml:space="preserve">podpis: ………………………………………</w:t>
             </w:r>
@@ -6891,7 +6841,7 @@
           <w:p>
             <w:pPr>
               <w:pBdr>
-                <w:top w:val="single" w:color="2D1B69" w:sz="24" w:space="5"/>
+                <w:top w:val="single" w:color="2D1B69" w:sz="22" w:space="5"/>
               </w:pBdr>
               <w:spacing w:after="0" w:before="0"/>
               <w:jc w:val="center"/>
@@ -6905,8 +6855,8 @@
                 <w:iCs w:val="false"/>
                 <w:caps w:val="false"/>
                 <w:color w:val="2D1B69"/>
-                <w:sz w:val="24"/>
-                <w:szCs w:val="24"/>
+                <w:sz w:val="22"/>
+                <w:szCs w:val="22"/>
               </w:rPr>
               <w:t xml:space="preserve">Dyrektor przedszkola / szkoły · podpis i pieczęć · data</w:t>
             </w:r>
@@ -6925,8 +6875,8 @@
                 <w:iCs w:val="false"/>
                 <w:caps w:val="false"/>
                 <w:color w:val="6B6378"/>
-                <w:sz w:val="24"/>
-                <w:szCs w:val="24"/>
+                <w:sz w:val="22"/>
+                <w:szCs w:val="22"/>
               </w:rPr>
               <w:t xml:space="preserve">podpis i data</w:t>
             </w:r>
@@ -6963,8 +6913,8 @@
                 <w:iCs w:val="false"/>
                 <w:caps w:val="false"/>
                 <w:color w:val="6B6378"/>
-                <w:sz w:val="24"/>
-                <w:szCs w:val="24"/>
+                <w:sz w:val="22"/>
+                <w:szCs w:val="22"/>
               </w:rPr>
               <w:t xml:space="preserve">Kopię opinii przekazano rodzicom / pełnoletniemu uczniowi (§ 7 ust. 5) dnia ……………… · podpis rodzica / ucznia: ………………………………</w:t>
             </w:r>
@@ -6986,8 +6936,8 @@
           <w:iCs w:val="false"/>
           <w:caps w:val="false"/>
           <w:color w:val="6B6378"/>
-          <w:sz w:val="24"/>
-          <w:szCs w:val="24"/>
+          <w:sz w:val="22"/>
+          <w:szCs w:val="22"/>
         </w:rPr>
         <w:t xml:space="preserve">Załączniki: ocena funkcjonalna (raport, część I–III), arkusze obserwacji, dokumentacja pomocy psychologiczno-pedagogicznej – do wglądu zespołu orzekającego za zgodą rodzica. Opinia zawiera dane dotyczące zdrowia (art. 9 RODO) – dokument poufny.</w:t>
       </w:r>
@@ -7050,7 +7000,7 @@
   <w:p>
     <w:pPr>
       <w:pBdr>
-        <w:top w:val="single" w:color="E3E1EC" w:sz="24" w:space="4"/>
+        <w:top w:val="single" w:color="E3E1EC" w:sz="22" w:space="4"/>
       </w:pBdr>
       <w:tabs>
         <w:tab w:val="right" w:pos="10206"/>
@@ -7066,8 +7016,8 @@
         <w:iCs w:val="false"/>
         <w:caps w:val="false"/>
         <w:color w:val="6B6378"/>
-        <w:sz w:val="24"/>
-        <w:szCs w:val="24"/>
+        <w:sz w:val="22"/>
+        <w:szCs w:val="22"/>
       </w:rPr>
       <w:t xml:space="preserve">Załącznik – opinia o funkcjonowaniu dziecka / ucznia · dokument poufny (RODO)</w:t>
     </w:r>
@@ -7094,8 +7044,8 @@
         <w:iCs w:val="false"/>
         <w:caps w:val="false"/>
         <w:color w:val="6B6378"/>
-        <w:sz w:val="24"/>
-        <w:szCs w:val="24"/>
+        <w:sz w:val="22"/>
+        <w:szCs w:val="22"/>
       </w:rPr>
       <w:t xml:space="preserve">Strona </w:t>
     </w:r>
@@ -7105,8 +7055,8 @@
         <w:b/>
         <w:bCs/>
         <w:color w:val="E74509"/>
-        <w:sz w:val="24"/>
-        <w:szCs w:val="24"/>
+        <w:sz w:val="22"/>
+        <w:szCs w:val="22"/>
       </w:rPr>
       <w:fldChar w:fldCharType="begin"/>
       <w:instrText xml:space="preserve">PAGE</w:instrText>
@@ -7122,8 +7072,8 @@
         <w:iCs w:val="false"/>
         <w:caps w:val="false"/>
         <w:color w:val="6B6378"/>
-        <w:sz w:val="24"/>
-        <w:szCs w:val="24"/>
+        <w:sz w:val="22"/>
+        <w:szCs w:val="22"/>
       </w:rPr>
       <w:t xml:space="preserve"> z </w:t>
     </w:r>
@@ -7133,8 +7083,8 @@
         <w:b/>
         <w:bCs/>
         <w:color w:val="2D1B69"/>
-        <w:sz w:val="24"/>
-        <w:szCs w:val="24"/>
+        <w:sz w:val="22"/>
+        <w:szCs w:val="22"/>
       </w:rPr>
       <w:fldChar w:fldCharType="begin"/>
       <w:instrText xml:space="preserve">NUMPAGES</w:instrText>
@@ -7342,8 +7292,8 @@
       <w:rPr>
         <w:rFonts w:ascii="Arial" w:cs="Arial" w:eastAsia="Arial" w:hAnsi="Arial"/>
         <w:color w:val="1A1530"/>
-        <w:sz w:val="24"/>
-        <w:szCs w:val="24"/>
+        <w:sz w:val="22"/>
+        <w:szCs w:val="22"/>
       </w:rPr>
     </w:rPrDefault>
     <w:pPrDefault/>

</xml_diff>